<commit_message>
Incorporate manager notes into combined contribution doc
GIS table: added FEMA effective vs. preliminary distinction, Army Corps
coastal damage modeling row

Research-needed table: added two new items —
- SMR/DoD microreactors (Project Pele, ENRIL follow-up, DOE contact)
- Electrical infrastructure insurance (PSC filings, NFIP applicability)

New section 2.7 — Data Availability and Project Timeline:
- Two-tier GIS approach (public data now vs. data agreements Aug-Sept)
- Low-resolution data documentation practice
- Note on contacting dataset researchers via metadata

Sources updated: added USACE Jacksonville District, DOE, Florida PSC,
FEMA preliminary maps

https://claude.ai/code/session_01FS9333VimrXDDCapeqZFSA
</commit_message>
<xml_diff>
--- a/resilience_review/MIRR_Energy_Combined_Contribution.docx
+++ b/resilience_review/MIRR_Energy_Combined_Contribution.docx
@@ -2038,6 +2038,88 @@
                 <w:i w:val="0"/>
                 <w:sz w:val="19"/>
               </w:rPr>
+              <w:t>FEMA flood zones — effective vs. preliminary</w:t>
+            </w:r>
+          </w:p>
+        </w:tc>
+        <w:tc>
+          <w:tcPr>
+            <w:tcW w:type="dxa" w:w="2160"/>
+          </w:tcPr>
+          <w:p>
+            <w:pPr>
+              <w:spacing w:after="40"/>
+            </w:pPr>
+            <w:r/>
+            <w:r>
+              <w:rPr>
+                <w:rFonts w:ascii="Calibri" w:hAnsi="Calibri"/>
+                <w:b w:val="0"/>
+                <w:i w:val="0"/>
+                <w:sz w:val="19"/>
+              </w:rPr>
+              <w:t>FEMA NFHL effective maps; FEMA preliminary maps where updated</w:t>
+            </w:r>
+          </w:p>
+        </w:tc>
+        <w:tc>
+          <w:tcPr>
+            <w:tcW w:type="dxa" w:w="2160"/>
+          </w:tcPr>
+          <w:p>
+            <w:pPr>
+              <w:spacing w:after="40"/>
+            </w:pPr>
+            <w:r/>
+            <w:r>
+              <w:rPr>
+                <w:rFonts w:ascii="Calibri" w:hAnsi="Calibri"/>
+                <w:b w:val="0"/>
+                <w:i w:val="0"/>
+                <w:sz w:val="19"/>
+              </w:rPr>
+              <w:t>FEMA Flood Map Service Center</w:t>
+            </w:r>
+          </w:p>
+        </w:tc>
+        <w:tc>
+          <w:tcPr>
+            <w:tcW w:type="dxa" w:w="2160"/>
+          </w:tcPr>
+          <w:p>
+            <w:pPr>
+              <w:spacing w:after="40"/>
+            </w:pPr>
+            <w:r/>
+            <w:r>
+              <w:rPr>
+                <w:rFonts w:ascii="Calibri" w:hAnsi="Calibri"/>
+                <w:b w:val="0"/>
+                <w:i w:val="0"/>
+                <w:sz w:val="19"/>
+              </w:rPr>
+              <w:t>Whether flood zone designations near substations have been updated in preliminary maps — preliminary maps often show higher risk than effective</w:t>
+            </w:r>
+          </w:p>
+        </w:tc>
+      </w:tr>
+      <w:tr>
+        <w:tc>
+          <w:tcPr>
+            <w:tcW w:type="dxa" w:w="2160"/>
+          </w:tcPr>
+          <w:p>
+            <w:pPr>
+              <w:spacing w:after="40"/>
+            </w:pPr>
+            <w:r/>
+            <w:r>
+              <w:rPr>
+                <w:rFonts w:ascii="Calibri" w:hAnsi="Calibri"/>
+                <w:b w:val="0"/>
+                <w:i w:val="0"/>
+                <w:sz w:val="19"/>
+              </w:rPr>
               <w:t>Access corridors vs. flood zones</w:t>
             </w:r>
           </w:p>
@@ -2431,6 +2513,88 @@
           </w:p>
         </w:tc>
       </w:tr>
+      <w:tr>
+        <w:tc>
+          <w:tcPr>
+            <w:tcW w:type="dxa" w:w="2160"/>
+          </w:tcPr>
+          <w:p>
+            <w:pPr>
+              <w:spacing w:after="40"/>
+            </w:pPr>
+            <w:r/>
+            <w:r>
+              <w:rPr>
+                <w:rFonts w:ascii="Calibri" w:hAnsi="Calibri"/>
+                <w:b w:val="0"/>
+                <w:i w:val="0"/>
+                <w:sz w:val="19"/>
+              </w:rPr>
+              <w:t>Coastal infrastructure damage estimates — Mayport and Blount Island</w:t>
+            </w:r>
+          </w:p>
+        </w:tc>
+        <w:tc>
+          <w:tcPr>
+            <w:tcW w:type="dxa" w:w="2160"/>
+          </w:tcPr>
+          <w:p>
+            <w:pPr>
+              <w:spacing w:after="40"/>
+            </w:pPr>
+            <w:r/>
+            <w:r>
+              <w:rPr>
+                <w:rFonts w:ascii="Calibri" w:hAnsi="Calibri"/>
+                <w:b w:val="0"/>
+                <w:i w:val="0"/>
+                <w:sz w:val="19"/>
+              </w:rPr>
+              <w:t>Army Corps of Engineers coastal damage models</w:t>
+            </w:r>
+          </w:p>
+        </w:tc>
+        <w:tc>
+          <w:tcPr>
+            <w:tcW w:type="dxa" w:w="2160"/>
+          </w:tcPr>
+          <w:p>
+            <w:pPr>
+              <w:spacing w:after="40"/>
+            </w:pPr>
+            <w:r/>
+            <w:r>
+              <w:rPr>
+                <w:rFonts w:ascii="Calibri" w:hAnsi="Calibri"/>
+                <w:b w:val="0"/>
+                <w:i w:val="0"/>
+                <w:sz w:val="19"/>
+              </w:rPr>
+              <w:t>USACE Jacksonville District</w:t>
+            </w:r>
+          </w:p>
+        </w:tc>
+        <w:tc>
+          <w:tcPr>
+            <w:tcW w:type="dxa" w:w="2160"/>
+          </w:tcPr>
+          <w:p>
+            <w:pPr>
+              <w:spacing w:after="40"/>
+            </w:pPr>
+            <w:r/>
+            <w:r>
+              <w:rPr>
+                <w:rFonts w:ascii="Calibri" w:hAnsi="Calibri"/>
+                <w:b w:val="0"/>
+                <w:i w:val="0"/>
+                <w:sz w:val="19"/>
+              </w:rPr>
+              <w:t>Estimated infrastructure damage under surge scenarios; co-benefit analysis for coastal protection investments</w:t>
+            </w:r>
+          </w:p>
+        </w:tc>
+      </w:tr>
     </w:tbl>
     <w:p/>
     <w:p>
@@ -2557,6 +2721,130 @@
                 <w:sz w:val="19"/>
               </w:rPr>
               <w:t>What Is Needed Before Use</w:t>
+            </w:r>
+          </w:p>
+        </w:tc>
+      </w:tr>
+      <w:tr>
+        <w:tc>
+          <w:tcPr>
+            <w:tcW w:type="dxa" w:w="2880"/>
+          </w:tcPr>
+          <w:p>
+            <w:pPr>
+              <w:spacing w:after="40"/>
+            </w:pPr>
+            <w:r/>
+            <w:r>
+              <w:rPr>
+                <w:rFonts w:ascii="Calibri" w:hAnsi="Calibri"/>
+                <w:b w:val="0"/>
+                <w:i w:val="0"/>
+                <w:sz w:val="19"/>
+              </w:rPr>
+              <w:t>Small Modular Reactors (SMRs) / DoD microreactors</w:t>
+            </w:r>
+          </w:p>
+        </w:tc>
+        <w:tc>
+          <w:tcPr>
+            <w:tcW w:type="dxa" w:w="2880"/>
+          </w:tcPr>
+          <w:p>
+            <w:pPr>
+              <w:spacing w:after="40"/>
+            </w:pPr>
+            <w:r/>
+            <w:r>
+              <w:rPr>
+                <w:rFonts w:ascii="Calibri" w:hAnsi="Calibri"/>
+                <w:b w:val="0"/>
+                <w:i w:val="0"/>
+                <w:sz w:val="19"/>
+              </w:rPr>
+              <w:t>DoD is actively pursuing on-site microreactors through Project Pele. Would eliminate single substation dependency entirely — true on-site redundancy independent of civilian grid. Most complete redundancy solution identified, also most complex and regulatory-intensive.</w:t>
+            </w:r>
+          </w:p>
+        </w:tc>
+        <w:tc>
+          <w:tcPr>
+            <w:tcW w:type="dxa" w:w="2880"/>
+          </w:tcPr>
+          <w:p>
+            <w:pPr>
+              <w:spacing w:after="40"/>
+            </w:pPr>
+            <w:r/>
+            <w:r>
+              <w:rPr>
+                <w:rFonts w:ascii="Calibri" w:hAnsi="Calibri"/>
+                <w:b w:val="0"/>
+                <w:i w:val="0"/>
+                <w:sz w:val="19"/>
+              </w:rPr>
+              <w:t>Research DoD Project Pele program and current status. Review NRC SMR design approvals. Contact DOE and confirm ENRIL organization (verify correct name with manager). Assess regulatory pathway for military installations specifically.</w:t>
+            </w:r>
+          </w:p>
+        </w:tc>
+      </w:tr>
+      <w:tr>
+        <w:tc>
+          <w:tcPr>
+            <w:tcW w:type="dxa" w:w="2880"/>
+          </w:tcPr>
+          <w:p>
+            <w:pPr>
+              <w:spacing w:after="40"/>
+            </w:pPr>
+            <w:r/>
+            <w:r>
+              <w:rPr>
+                <w:rFonts w:ascii="Calibri" w:hAnsi="Calibri"/>
+                <w:b w:val="0"/>
+                <w:i w:val="0"/>
+                <w:sz w:val="19"/>
+              </w:rPr>
+              <w:t>Electrical infrastructure insurance coverage</w:t>
+            </w:r>
+          </w:p>
+        </w:tc>
+        <w:tc>
+          <w:tcPr>
+            <w:tcW w:type="dxa" w:w="2880"/>
+          </w:tcPr>
+          <w:p>
+            <w:pPr>
+              <w:spacing w:after="40"/>
+            </w:pPr>
+            <w:r/>
+            <w:r>
+              <w:rPr>
+                <w:rFonts w:ascii="Calibri" w:hAnsi="Calibri"/>
+                <w:b w:val="0"/>
+                <w:i w:val="0"/>
+                <w:sz w:val="19"/>
+              </w:rPr>
+              <w:t>Type of insurance JEA and FPL carry on substations serving these installations is unknown. Claims timeline after a storm event affects how quickly damaged infrastructure gets repaired — directly extends outage duration beyond the physical repair window.</w:t>
+            </w:r>
+          </w:p>
+        </w:tc>
+        <w:tc>
+          <w:tcPr>
+            <w:tcW w:type="dxa" w:w="2880"/>
+          </w:tcPr>
+          <w:p>
+            <w:pPr>
+              <w:spacing w:after="40"/>
+            </w:pPr>
+            <w:r/>
+            <w:r>
+              <w:rPr>
+                <w:rFonts w:ascii="Calibri" w:hAnsi="Calibri"/>
+                <w:b w:val="0"/>
+                <w:i w:val="0"/>
+                <w:sz w:val="19"/>
+              </w:rPr>
+              <w:t>Contact Florida PSC for utility insurance filing requirements. Review JEA and FPL annual reports for insurance disclosures. Determine whether FEMA NFIP covers utility substations or whether separate commercial flood insurance applies.</w:t>
             </w:r>
           </w:p>
         </w:tc>
@@ -2885,7 +3173,171 @@
           <w:color w:val="1F497D"/>
           <w:sz w:val="26"/>
         </w:rPr>
-        <w:t>2.7  Sources</w:t>
+        <w:t>2.7  Data Availability and Project Timeline</w:t>
+      </w:r>
+    </w:p>
+    <w:p>
+      <w:pPr>
+        <w:spacing w:after="120"/>
+      </w:pPr>
+      <w:r>
+        <w:rPr>
+          <w:rFonts w:ascii="Calibri" w:hAnsi="Calibri"/>
+          <w:b w:val="0"/>
+          <w:i w:val="0"/>
+          <w:sz w:val="22"/>
+        </w:rPr>
+        <w:t>Not all data needed for a complete redundancy assessment is publicly available or immediately accessible. The following reflects the project's current data situation and planned timeline.</w:t>
+      </w:r>
+    </w:p>
+    <w:p>
+      <w:pPr>
+        <w:spacing w:before="160" w:after="80"/>
+      </w:pPr>
+      <w:r>
+        <w:rPr>
+          <w:rFonts w:ascii="Calibri" w:hAnsi="Calibri"/>
+          <w:b/>
+          <w:i w:val="0"/>
+          <w:color w:val="376092"/>
+          <w:sz w:val="22"/>
+        </w:rPr>
+        <w:t>Two-Tier GIS Approach</w:t>
+      </w:r>
+    </w:p>
+    <w:p>
+      <w:pPr>
+        <w:spacing w:after="120"/>
+      </w:pPr>
+      <w:r>
+        <w:rPr>
+          <w:rFonts w:ascii="Calibri" w:hAnsi="Calibri"/>
+          <w:b w:val="0"/>
+          <w:i w:val="0"/>
+          <w:sz w:val="22"/>
+        </w:rPr>
+        <w:t>GIS analysis will proceed in two tiers based on data availability:</w:t>
+      </w:r>
+    </w:p>
+    <w:p>
+      <w:pPr>
+        <w:pStyle w:val="ListBullet"/>
+        <w:spacing w:after="80"/>
+        <w:ind w:left="360"/>
+      </w:pPr>
+      <w:r>
+        <w:rPr>
+          <w:rFonts w:ascii="Calibri" w:hAnsi="Calibri"/>
+          <w:b/>
+          <w:i w:val="0"/>
+          <w:sz w:val="22"/>
+        </w:rPr>
+        <w:t xml:space="preserve">Tier 1 — Available now: </w:t>
+      </w:r>
+      <w:r>
+        <w:rPr>
+          <w:rFonts w:ascii="Calibri" w:hAnsi="Calibri"/>
+          <w:b w:val="0"/>
+          <w:i w:val="0"/>
+          <w:sz w:val="22"/>
+        </w:rPr>
+        <w:t>Publicly accessible federal datasets: HIFLD, EIA Form 860, NOAA Digital Coast (SLOSH, SLR), FEMA NFHL (effective and preliminary), USDA FS wildfire, FDOT road network, USGS groundwater. These can be run immediately and will confirm the spatial extent of confirmed MIRR vulnerabilities.</w:t>
+      </w:r>
+    </w:p>
+    <w:p>
+      <w:pPr>
+        <w:pStyle w:val="ListBullet"/>
+        <w:spacing w:after="80"/>
+        <w:ind w:left="360"/>
+      </w:pPr>
+      <w:r>
+        <w:rPr>
+          <w:rFonts w:ascii="Calibri" w:hAnsi="Calibri"/>
+          <w:b/>
+          <w:i w:val="0"/>
+          <w:sz w:val="22"/>
+        </w:rPr>
+        <w:t xml:space="preserve">Tier 2 — Requires data agreements: </w:t>
+      </w:r>
+      <w:r>
+        <w:rPr>
+          <w:rFonts w:ascii="Calibri" w:hAnsi="Calibri"/>
+          <w:b w:val="0"/>
+          <w:i w:val="0"/>
+          <w:sz w:val="22"/>
+        </w:rPr>
+        <w:t>JEA and FPL infrastructure routing, on-installation asset data, NAVFAC outage history, Army Corps damage model outputs. Budget approval expected August–September 2026 will enable formal data sharing agreements for these sources.</w:t>
+      </w:r>
+    </w:p>
+    <w:p>
+      <w:pPr>
+        <w:spacing w:before="160" w:after="80"/>
+      </w:pPr>
+      <w:r>
+        <w:rPr>
+          <w:rFonts w:ascii="Calibri" w:hAnsi="Calibri"/>
+          <w:b/>
+          <w:i w:val="0"/>
+          <w:color w:val="376092"/>
+          <w:sz w:val="22"/>
+        </w:rPr>
+        <w:t>Low-Resolution Data — Documented Uncertainty</w:t>
+      </w:r>
+    </w:p>
+    <w:p>
+      <w:pPr>
+        <w:spacing w:after="120"/>
+      </w:pPr>
+      <w:r>
+        <w:rPr>
+          <w:rFonts w:ascii="Calibri" w:hAnsi="Calibri"/>
+          <w:b w:val="0"/>
+          <w:i w:val="0"/>
+          <w:sz w:val="22"/>
+        </w:rPr>
+        <w:t>Risk datasets in this space are often lower resolution than ideal for substation-level analysis. Where dataset resolution limits precision, analysis outputs will include explicit uncertainty bounds and the limitation will be documented in methodology notes. This is standard practice and does not invalidate the findings — it accurately represents what the data can and cannot show.</w:t>
+      </w:r>
+    </w:p>
+    <w:p>
+      <w:pPr>
+        <w:spacing w:after="120"/>
+        <w:ind w:left="432" w:right="432"/>
+        <w:shd w:val="clear" w:color="auto" w:fill="FFF4E5"/>
+      </w:pPr>
+      <w:r>
+        <w:rPr>
+          <w:rFonts w:ascii="Calibri" w:hAnsi="Calibri"/>
+          <w:b/>
+          <w:i w:val="0"/>
+          <w:color w:val="663300"/>
+          <w:sz w:val="20"/>
+        </w:rPr>
+        <w:t xml:space="preserve">Needs GIS: </w:t>
+      </w:r>
+      <w:r>
+        <w:rPr>
+          <w:rFonts w:ascii="Calibri" w:hAnsi="Calibri"/>
+          <w:b w:val="0"/>
+          <w:i/>
+          <w:color w:val="663300"/>
+          <w:sz w:val="20"/>
+        </w:rPr>
+        <w:t>When downloading any dataset, read the methodology paper and contact the lead researcher with questions about resolution limitations and appropriate use cases. Researcher contact information is typically in dataset metadata.</w:t>
+      </w:r>
+    </w:p>
+    <w:p>
+      <w:pPr>
+        <w:spacing w:before="280" w:after="80"/>
+      </w:pPr>
+      <w:r>
+        <w:rPr>
+          <w:rFonts w:ascii="Calibri" w:hAnsi="Calibri"/>
+          <w:b/>
+          <w:i w:val="0"/>
+          <w:color w:val="1F497D"/>
+          <w:sz w:val="26"/>
+        </w:rPr>
+        <w:t>2.8  Sources</w:t>
       </w:r>
     </w:p>
     <w:p>
@@ -3183,7 +3635,7 @@
           <w:i w:val="0"/>
           <w:sz w:val="22"/>
         </w:rPr>
-        <w:t>FEMA Flood Map Service Center — National Flood Hazard Layer</w:t>
+        <w:t>FEMA Flood Map Service Center — National Flood Hazard Layer (effective and preliminary)</w:t>
       </w:r>
     </w:p>
     <w:p>
@@ -3264,6 +3716,54 @@
           <w:sz w:val="22"/>
         </w:rPr>
         <w:t>Resilient Jacksonville — NEFRC CDBG compound flood model outputs</w:t>
+      </w:r>
+    </w:p>
+    <w:p>
+      <w:pPr>
+        <w:pStyle w:val="ListBullet"/>
+        <w:spacing w:after="60"/>
+        <w:ind w:left="360"/>
+      </w:pPr>
+      <w:r>
+        <w:rPr>
+          <w:rFonts w:ascii="Calibri" w:hAnsi="Calibri"/>
+          <w:b w:val="0"/>
+          <w:i w:val="0"/>
+          <w:sz w:val="22"/>
+        </w:rPr>
+        <w:t>USACE Jacksonville District — coastal damage modeling and infrastructure data</w:t>
+      </w:r>
+    </w:p>
+    <w:p>
+      <w:pPr>
+        <w:pStyle w:val="ListBullet"/>
+        <w:spacing w:after="60"/>
+        <w:ind w:left="360"/>
+      </w:pPr>
+      <w:r>
+        <w:rPr>
+          <w:rFonts w:ascii="Calibri" w:hAnsi="Calibri"/>
+          <w:b w:val="0"/>
+          <w:i w:val="0"/>
+          <w:sz w:val="22"/>
+        </w:rPr>
+        <w:t>Department of Energy — energy resilience and infrastructure research</w:t>
+      </w:r>
+    </w:p>
+    <w:p>
+      <w:pPr>
+        <w:pStyle w:val="ListBullet"/>
+        <w:spacing w:after="60"/>
+        <w:ind w:left="360"/>
+      </w:pPr>
+      <w:r>
+        <w:rPr>
+          <w:rFonts w:ascii="Calibri" w:hAnsi="Calibri"/>
+          <w:b w:val="0"/>
+          <w:i w:val="0"/>
+          <w:sz w:val="22"/>
+        </w:rPr>
+        <w:t>Florida PSC — utility storm hardening filings and niche utility data</w:t>
       </w:r>
     </w:p>
     <w:sectPr>

</xml_diff>

<commit_message>
Reformat combined energy report with cleaner style and tighter content
- Replace heavy shaded heading blocks with h1 (navy bottom-border rule) and h2 (bold slate)
- Replace large status boxes with inline colored tags (● Confirmed / ◐ Pending GIS / ○ Needs verification)
- Replace indented italic quotes with left-border blockquote style
- Add annotation key to cover page
- Alternating row shading on all tables
- Remove unexplained/unhelpful content; consolidate GIS table to 6 rows
- Research table: 6 rows with explicit verification steps per item
- Add SMR/nuclear and insurance rows to research table
- Sources reorganized into three subsections (Confirmed MIRR / To Verify / GIS Datasets)

https://claude.ai/code/session_01FS9333VimrXDDCapeqZFSA
</commit_message>
<xml_diff>
--- a/resilience_review/MIRR_Energy_Combined_Contribution.docx
+++ b/resilience_review/MIRR_Energy_Combined_Contribution.docx
@@ -4,7 +4,7 @@
   <w:body>
     <w:p>
       <w:pPr>
-        <w:spacing w:before="400" w:after="80"/>
+        <w:spacing w:before="360" w:after="60"/>
         <w:jc w:val="center"/>
       </w:pPr>
       <w:r>
@@ -13,14 +13,14 @@
           <w:b/>
           <w:i w:val="0"/>
           <w:color w:val="1F497D"/>
-          <w:sz w:val="32"/>
+          <w:sz w:val="30"/>
         </w:rPr>
         <w:t>Northeast Florida Military Installation Resilience Review</w:t>
       </w:r>
     </w:p>
     <w:p>
       <w:pPr>
-        <w:spacing w:before="0" w:after="80"/>
+        <w:spacing w:before="0" w:after="60"/>
         <w:jc w:val="center"/>
       </w:pPr>
       <w:r>
@@ -29,14 +29,14 @@
           <w:b/>
           <w:i w:val="0"/>
           <w:color w:val="376092"/>
-          <w:sz w:val="26"/>
+          <w:sz w:val="24"/>
         </w:rPr>
         <w:t>Energy Redundancy — Combined Intern Research Contribution</w:t>
       </w:r>
     </w:p>
     <w:p>
       <w:pPr>
-        <w:spacing w:before="0" w:after="80"/>
+        <w:spacing w:before="0" w:after="40"/>
         <w:jc w:val="center"/>
       </w:pPr>
       <w:r>
@@ -45,18 +45,14 @@
           <w:b w:val="0"/>
           <w:i w:val="0"/>
           <w:color w:val="595959"/>
-          <w:sz w:val="20"/>
+          <w:sz w:val="19"/>
         </w:rPr>
-        <w:t>Naval Air Station Jacksonville  |  Naval Station Mayport</w:t>
-        <w:br/>
-        <w:t>MCSF Blount Island  |  Camp Blanding JTF</w:t>
-        <w:br/>
-        <w:t>Duval County and Clay County, Florida</w:t>
+        <w:t>NAS Jacksonville  ·  NS Mayport  ·  MCSF Blount Island  ·  Camp Blanding JTF</w:t>
       </w:r>
     </w:p>
     <w:p>
       <w:pPr>
-        <w:spacing w:before="0" w:after="200"/>
+        <w:spacing w:before="0" w:after="240"/>
         <w:jc w:val="center"/>
       </w:pPr>
       <w:r>
@@ -65,42 +61,115 @@
           <w:b w:val="0"/>
           <w:i/>
           <w:color w:val="595959"/>
-          <w:sz w:val="20"/>
+          <w:sz w:val="19"/>
         </w:rPr>
-        <w:t>Prepared for Supervisor Review — May 2026</w:t>
+        <w:t>Duval County and Clay County, Florida  ·  Supervisor Review Draft  ·  May 2026</w:t>
       </w:r>
     </w:p>
     <w:p>
       <w:pPr>
-        <w:spacing w:after="200"/>
-        <w:ind w:left="432" w:right="432"/>
-        <w:shd w:val="clear" w:color="auto" w:fill="EAF0F8"/>
+        <w:spacing w:after="280"/>
+        <w:jc w:val="center"/>
       </w:pPr>
       <w:r>
         <w:rPr>
           <w:rFonts w:ascii="Calibri" w:hAnsi="Calibri"/>
           <w:b/>
           <w:i w:val="0"/>
-          <w:color w:val="1F497D"/>
-          <w:sz w:val="20"/>
+          <w:color w:val="006100"/>
+          <w:sz w:val="18"/>
         </w:rPr>
-        <w:t>About This Document</w:t>
-        <w:br/>
+        <w:t>● Confirmed</w:t>
       </w:r>
       <w:r>
         <w:rPr>
           <w:rFonts w:ascii="Calibri" w:hAnsi="Calibri"/>
           <w:b w:val="0"/>
           <w:i/>
-          <w:color w:val="1F497D"/>
-          <w:sz w:val="20"/>
+          <w:color w:val="595959"/>
+          <w:sz w:val="18"/>
         </w:rPr>
-        <w:t>This document combines two intern research contributions focused specifically on energy redundancy. Part 1 preserves the first intern's research findings verbatim. Part 2 adds geographic and vulnerability context developed through MIRR document review. No GIS analysis has been performed yet — GIS work is in progress and will spatially confirm or refine the findings stated here. No solutions or strategies are proposed. Items requiring verification before any proposal can be made are clearly labeled.</w:t>
+        <w:t xml:space="preserve"> sourced to confirmed MIRR documents</w:t>
+      </w:r>
+      <w:r>
+        <w:rPr>
+          <w:rFonts w:ascii="Calibri" w:hAnsi="Calibri"/>
+          <w:b w:val="0"/>
+          <w:i w:val="0"/>
+          <w:color w:val="595959"/>
+          <w:sz w:val="18"/>
+        </w:rPr>
+        <w:t xml:space="preserve">  </w:t>
+      </w:r>
+      <w:r>
+        <w:rPr>
+          <w:rFonts w:ascii="Calibri" w:hAnsi="Calibri"/>
+          <w:b/>
+          <w:i w:val="0"/>
+          <w:color w:val="663300"/>
+          <w:sz w:val="18"/>
+        </w:rPr>
+        <w:t>◐ Pending GIS</w:t>
+      </w:r>
+      <w:r>
+        <w:rPr>
+          <w:rFonts w:ascii="Calibri" w:hAnsi="Calibri"/>
+          <w:b w:val="0"/>
+          <w:i/>
+          <w:color w:val="595959"/>
+          <w:sz w:val="18"/>
+        </w:rPr>
+        <w:t xml:space="preserve"> needs GIS to verify spatially</w:t>
+      </w:r>
+      <w:r>
+        <w:rPr>
+          <w:rFonts w:ascii="Calibri" w:hAnsi="Calibri"/>
+          <w:b w:val="0"/>
+          <w:i w:val="0"/>
+          <w:color w:val="595959"/>
+          <w:sz w:val="18"/>
+        </w:rPr>
+        <w:t xml:space="preserve">  </w:t>
+      </w:r>
+      <w:r>
+        <w:rPr>
+          <w:rFonts w:ascii="Calibri" w:hAnsi="Calibri"/>
+          <w:b/>
+          <w:i w:val="0"/>
+          <w:color w:val="780000"/>
+          <w:sz w:val="18"/>
+        </w:rPr>
+        <w:t>○ Needs verification</w:t>
+      </w:r>
+      <w:r>
+        <w:rPr>
+          <w:rFonts w:ascii="Calibri" w:hAnsi="Calibri"/>
+          <w:b w:val="0"/>
+          <w:i/>
+          <w:color w:val="595959"/>
+          <w:sz w:val="18"/>
+        </w:rPr>
+        <w:t xml:space="preserve"> needs external source before use</w:t>
       </w:r>
     </w:p>
     <w:p>
       <w:pPr>
-        <w:spacing w:before="320" w:after="80"/>
+        <w:spacing w:after="100"/>
+      </w:pPr>
+      <w:r>
+        <w:rPr>
+          <w:rFonts w:ascii="Calibri" w:hAnsi="Calibri"/>
+          <w:b w:val="0"/>
+          <w:i/>
+          <w:color w:val="595959"/>
+          <w:sz w:val="21"/>
+        </w:rPr>
+        <w:t>Part 1 preserves the first intern's findings verbatim. Part 2 adds geographic and vulnerability context developed through MIRR document review. No GIS analysis has been performed yet — that work is in progress. No solutions are proposed.</w:t>
+      </w:r>
+    </w:p>
+    <w:p>
+      <w:pPr>
+        <w:spacing w:before="360" w:after="120"/>
         <w:shd w:val="clear" w:color="auto" w:fill="1F497D"/>
       </w:pPr>
       <w:r>
@@ -109,7 +178,7 @@
           <w:b/>
           <w:i w:val="0"/>
           <w:color w:val="FFFFFF"/>
-          <w:sz w:val="24"/>
+          <w:sz w:val="22"/>
         </w:rPr>
         <w:t xml:space="preserve">  PART 1 — First Intern's Research Findings  (preserved verbatim)</w:t>
       </w:r>
@@ -117,7 +186,10 @@
     <w:p/>
     <w:p>
       <w:pPr>
-        <w:spacing w:before="280" w:after="80"/>
+        <w:spacing w:before="320" w:after="40"/>
+        <w:pBdr>
+          <w:bottom w:val="single" w:sz="4" w:space="1" w:color="1F497D"/>
+        </w:pBdr>
       </w:pPr>
       <w:r>
         <w:rPr>
@@ -125,70 +197,62 @@
           <w:b/>
           <w:i w:val="0"/>
           <w:color w:val="1F497D"/>
-          <w:sz w:val="26"/>
+          <w:sz w:val="22"/>
         </w:rPr>
-        <w:t>Energy Resilience Overview</w:t>
+        <w:t>ENERGY RESILIENCE OVERVIEW</w:t>
       </w:r>
     </w:p>
     <w:p>
       <w:pPr>
-        <w:spacing w:after="120"/>
+        <w:spacing w:after="100"/>
       </w:pPr>
       <w:r>
         <w:rPr>
           <w:rFonts w:ascii="Calibri" w:hAnsi="Calibri"/>
           <w:b w:val="0"/>
           <w:i w:val="0"/>
-          <w:sz w:val="22"/>
+          <w:color w:val="000000"/>
+          <w:sz w:val="21"/>
         </w:rPr>
         <w:t>Common themes across the sites include dependence on outside grid and exposure to its shortcomings, namely single-point utility failures outside of these military sites that could cause failures that cascade onto military sites and threaten mission success. These failure points are typically substations or lines along the U.S. 17 highway.</w:t>
       </w:r>
     </w:p>
     <w:p>
       <w:pPr>
-        <w:spacing w:after="120"/>
+        <w:spacing w:after="100"/>
       </w:pPr>
       <w:r>
         <w:rPr>
           <w:rFonts w:ascii="Calibri" w:hAnsi="Calibri"/>
           <w:b w:val="0"/>
           <w:i w:val="0"/>
-          <w:sz w:val="22"/>
+          <w:color w:val="000000"/>
+          <w:sz w:val="21"/>
         </w:rPr>
-        <w:t>These risks are exasperated by increasing energy demand throughout the region and lack of redundancy of power supply to installations.</w:t>
+        <w:t>These risks are exasperated by increasing energy demand throughout the region and lack of redundancy of power supply to installations. There are reports of aging infrastructure serving the installations which only increases the likelihood of single-point failure.</w:t>
       </w:r>
     </w:p>
     <w:p>
       <w:pPr>
-        <w:spacing w:after="120"/>
+        <w:spacing w:after="100"/>
       </w:pPr>
       <w:r>
         <w:rPr>
           <w:rFonts w:ascii="Calibri" w:hAnsi="Calibri"/>
           <w:b w:val="0"/>
           <w:i w:val="0"/>
-          <w:sz w:val="22"/>
-        </w:rPr>
-        <w:t>There are reports of aging infrastructure serving the installations which only increases the likelihood of single-point failure.</w:t>
-      </w:r>
-    </w:p>
-    <w:p>
-      <w:pPr>
-        <w:spacing w:after="120"/>
-      </w:pPr>
-      <w:r>
-        <w:rPr>
-          <w:rFonts w:ascii="Calibri" w:hAnsi="Calibri"/>
-          <w:b w:val="0"/>
-          <w:i w:val="0"/>
-          <w:sz w:val="22"/>
+          <w:color w:val="000000"/>
+          <w:sz w:val="21"/>
         </w:rPr>
         <w:t>It's worth noting that one of the bases, Camp Blanding, relies on four separate power providers and Seminole Electric for generation. The Florida Power &amp; Light (FPL) substation north of the base is a high-risk asset vulnerable to natural hazards and a lack of redundancy.</w:t>
       </w:r>
     </w:p>
     <w:p>
       <w:pPr>
-        <w:spacing w:before="280" w:after="80"/>
+        <w:spacing w:before="320" w:after="40"/>
+        <w:pBdr>
+          <w:bottom w:val="single" w:sz="4" w:space="1" w:color="1F497D"/>
+        </w:pBdr>
       </w:pPr>
       <w:r>
         <w:rPr>
@@ -196,28 +260,29 @@
           <w:b/>
           <w:i w:val="0"/>
           <w:color w:val="1F497D"/>
-          <w:sz w:val="26"/>
+          <w:sz w:val="22"/>
         </w:rPr>
-        <w:t>Adaptation Strategies</w:t>
+        <w:t>ADAPTATION STRATEGIES</w:t>
       </w:r>
     </w:p>
     <w:p>
       <w:pPr>
-        <w:spacing w:after="120"/>
+        <w:spacing w:after="100"/>
       </w:pPr>
       <w:r>
         <w:rPr>
           <w:rFonts w:ascii="Calibri" w:hAnsi="Calibri"/>
           <w:b w:val="0"/>
           <w:i w:val="0"/>
-          <w:sz w:val="22"/>
+          <w:color w:val="000000"/>
+          <w:sz w:val="21"/>
         </w:rPr>
         <w:t>The general theme of strategies discussed is moving from isolated but dependent islands into more connected hubs capable of both offering and accepting support to and from the larger grid. This shift was motivated by Hurricane Michael's effect on Tyndall AF Base in 2018.</w:t>
       </w:r>
     </w:p>
     <w:p>
       <w:pPr>
-        <w:spacing w:before="160" w:after="80"/>
+        <w:spacing w:before="200" w:after="40"/>
       </w:pPr>
       <w:r>
         <w:rPr>
@@ -225,7 +290,7 @@
           <w:b/>
           <w:i w:val="0"/>
           <w:color w:val="376092"/>
-          <w:sz w:val="22"/>
+          <w:sz w:val="21"/>
         </w:rPr>
         <w:t>Short Term</w:t>
       </w:r>
@@ -233,70 +298,70 @@
     <w:p>
       <w:pPr>
         <w:pStyle w:val="ListBullet"/>
-        <w:spacing w:after="60"/>
-        <w:ind w:left="360"/>
+        <w:spacing w:after="40"/>
+        <w:ind w:left="288"/>
       </w:pPr>
       <w:r>
         <w:rPr>
           <w:rFonts w:ascii="Calibri" w:hAnsi="Calibri"/>
           <w:b w:val="0"/>
           <w:i w:val="0"/>
-          <w:sz w:val="22"/>
+          <w:sz w:val="21"/>
         </w:rPr>
-        <w:t>Flood-proofing substations and supply lines are the most pressing short term adaptation strategy. Mutual Support Agreements (MSAs) are drafted to formalize collaboration between utility companies, local government agencies, and the installations themselves.</w:t>
+        <w:t>Flood-proofing substations and supply lines — most pressing near-term priority. Mutual Support Agreements (MSAs) to formalize collaboration between utilities, local government, and installations.</w:t>
       </w:r>
     </w:p>
     <w:p>
       <w:pPr>
         <w:pStyle w:val="ListBullet"/>
-        <w:spacing w:after="60"/>
-        <w:ind w:left="360"/>
+        <w:spacing w:after="40"/>
+        <w:ind w:left="288"/>
       </w:pPr>
       <w:r>
         <w:rPr>
           <w:rFonts w:ascii="Calibri" w:hAnsi="Calibri"/>
           <w:b w:val="0"/>
           <w:i w:val="0"/>
-          <w:sz w:val="22"/>
+          <w:sz w:val="21"/>
         </w:rPr>
-        <w:t>Flood proofing and undergrounding may provide more cost-effective resilience than large scale sea-walling measures.</w:t>
+        <w:t>Flood proofing and undergrounding may be more cost-effective than large-scale sea-walling.</w:t>
       </w:r>
     </w:p>
     <w:p>
       <w:pPr>
         <w:pStyle w:val="ListBullet"/>
-        <w:spacing w:after="60"/>
-        <w:ind w:left="360"/>
+        <w:spacing w:after="40"/>
+        <w:ind w:left="288"/>
       </w:pPr>
       <w:r>
         <w:rPr>
           <w:rFonts w:ascii="Calibri" w:hAnsi="Calibri"/>
           <w:b w:val="0"/>
           <w:i w:val="0"/>
-          <w:sz w:val="22"/>
+          <w:sz w:val="21"/>
         </w:rPr>
-        <w:t>Formalizing loose MSA agreements for current and future adaptation projects may improve efficiency.</w:t>
+        <w:t>Formalizing loose MSA agreements for current and future adaptation projects.</w:t>
       </w:r>
     </w:p>
     <w:p>
       <w:pPr>
         <w:pStyle w:val="ListBullet"/>
-        <w:spacing w:after="60"/>
-        <w:ind w:left="360"/>
+        <w:spacing w:after="40"/>
+        <w:ind w:left="288"/>
       </w:pPr>
       <w:r>
         <w:rPr>
           <w:rFonts w:ascii="Calibri" w:hAnsi="Calibri"/>
           <w:b w:val="0"/>
           <w:i w:val="0"/>
-          <w:sz w:val="22"/>
+          <w:sz w:val="21"/>
         </w:rPr>
-        <w:t>Addressing redundancy gaps in both electrical and fuel systems by creating backup paths and stocks.</w:t>
+        <w:t>Addressing redundancy gaps in electrical and fuel systems — backup paths and stocks.</w:t>
       </w:r>
     </w:p>
     <w:p>
       <w:pPr>
-        <w:spacing w:before="160" w:after="80"/>
+        <w:spacing w:before="200" w:after="40"/>
       </w:pPr>
       <w:r>
         <w:rPr>
@@ -304,7 +369,7 @@
           <w:b/>
           <w:i w:val="0"/>
           <w:color w:val="376092"/>
-          <w:sz w:val="22"/>
+          <w:sz w:val="21"/>
         </w:rPr>
         <w:t>Long Term</w:t>
       </w:r>
@@ -312,38 +377,38 @@
     <w:p>
       <w:pPr>
         <w:pStyle w:val="ListBullet"/>
-        <w:spacing w:after="60"/>
-        <w:ind w:left="360"/>
+        <w:spacing w:after="40"/>
+        <w:ind w:left="288"/>
       </w:pPr>
       <w:r>
         <w:rPr>
           <w:rFonts w:ascii="Calibri" w:hAnsi="Calibri"/>
           <w:b w:val="0"/>
           <w:i w:val="0"/>
-          <w:sz w:val="22"/>
+          <w:sz w:val="21"/>
         </w:rPr>
-        <w:t>Expand monitoring systems and data collection of grid and other infrastructure to better predict outages and manage performance. This data can be used to assess effectiveness of adaptation projects in terms of outages avoided and guide future projects.</w:t>
+        <w:t>Expand monitoring and data collection to predict outages and measure adaptation effectiveness.</w:t>
       </w:r>
     </w:p>
     <w:p>
       <w:pPr>
         <w:pStyle w:val="ListBullet"/>
-        <w:spacing w:after="60"/>
-        <w:ind w:left="360"/>
+        <w:spacing w:after="40"/>
+        <w:ind w:left="288"/>
       </w:pPr>
       <w:r>
         <w:rPr>
           <w:rFonts w:ascii="Calibri" w:hAnsi="Calibri"/>
           <w:b w:val="0"/>
           <w:i w:val="0"/>
-          <w:sz w:val="22"/>
+          <w:sz w:val="21"/>
         </w:rPr>
-        <w:t>Microgrids could offer both independent resilience and eventually the ability to support the larger grid with BESS infrastructure. Microgrid feasibility studies are already underway.</w:t>
+        <w:t>Microgrids with BESS infrastructure — feasibility studies already underway.</w:t>
       </w:r>
     </w:p>
     <w:p>
       <w:pPr>
-        <w:spacing w:before="160" w:after="80"/>
+        <w:spacing w:before="200" w:after="40"/>
       </w:pPr>
       <w:r>
         <w:rPr>
@@ -351,7 +416,7 @@
           <w:b/>
           <w:i w:val="0"/>
           <w:color w:val="376092"/>
-          <w:sz w:val="22"/>
+          <w:sz w:val="21"/>
         </w:rPr>
         <w:t>Areas to Explore More</w:t>
       </w:r>
@@ -359,70 +424,54 @@
     <w:p>
       <w:pPr>
         <w:pStyle w:val="ListBullet"/>
-        <w:spacing w:after="60"/>
-        <w:ind w:left="360"/>
+        <w:spacing w:after="40"/>
+        <w:ind w:left="288"/>
       </w:pPr>
       <w:r>
         <w:rPr>
           <w:rFonts w:ascii="Calibri" w:hAnsi="Calibri"/>
           <w:b w:val="0"/>
           <w:i w:val="0"/>
-          <w:sz w:val="22"/>
+          <w:sz w:val="21"/>
         </w:rPr>
-        <w:t>Prices of battery storage and Solar PV have both fallen dramatically in recent years. Minimal mention of either technology, but could a feasibility study be completed? The two in tandem could be beneficial.</w:t>
+        <w:t>Solar PV and battery storage costs have fallen dramatically — feasibility study warranted.</w:t>
       </w:r>
     </w:p>
     <w:p>
       <w:pPr>
         <w:pStyle w:val="ListBullet"/>
-        <w:spacing w:after="60"/>
-        <w:ind w:left="360"/>
+        <w:spacing w:after="40"/>
+        <w:ind w:left="288"/>
       </w:pPr>
       <w:r>
         <w:rPr>
           <w:rFonts w:ascii="Calibri" w:hAnsi="Calibri"/>
           <w:b w:val="0"/>
           <w:i w:val="0"/>
-          <w:sz w:val="22"/>
+          <w:sz w:val="21"/>
         </w:rPr>
-        <w:t>Miramar MC Air Station outside San Diego, CA uses a blend of energy sources and BESS to provide up to 21 days of islanded energy resilience. Methane gas from landfills is a significant energy source. Could the several landfills surrounding Jacksonville provide similar energy sources or redundancy?</w:t>
+        <w:t>Miramar MC Air Station uses a blend of energy sources and BESS for up to 21 days of islanded resilience. Landfill methane is noted as a fuel source. Could Jacksonville-area landfills provide similar redundancy?</w:t>
       </w:r>
     </w:p>
     <w:p>
       <w:pPr>
         <w:pStyle w:val="ListBullet"/>
-        <w:spacing w:after="60"/>
-        <w:ind w:left="360"/>
+        <w:spacing w:after="40"/>
+        <w:ind w:left="288"/>
       </w:pPr>
       <w:r>
         <w:rPr>
           <w:rFonts w:ascii="Calibri" w:hAnsi="Calibri"/>
           <w:b w:val="0"/>
           <w:i w:val="0"/>
-          <w:sz w:val="22"/>
+          <w:sz w:val="21"/>
         </w:rPr>
-        <w:t>Marine Corp Story</w:t>
+        <w:t>Marine Corps Story — Full CA State Project Report</w:t>
       </w:r>
     </w:p>
     <w:p>
       <w:pPr>
-        <w:pStyle w:val="ListBullet"/>
-        <w:spacing w:after="60"/>
-        <w:ind w:left="360"/>
-      </w:pPr>
-      <w:r>
-        <w:rPr>
-          <w:rFonts w:ascii="Calibri" w:hAnsi="Calibri"/>
-          <w:b w:val="0"/>
-          <w:i w:val="0"/>
-          <w:sz w:val="22"/>
-        </w:rPr>
-        <w:t>Full CA State Project Report</w:t>
-      </w:r>
-    </w:p>
-    <w:p>
-      <w:pPr>
-        <w:spacing w:before="320" w:after="80"/>
+        <w:spacing w:before="360" w:after="120"/>
         <w:shd w:val="clear" w:color="auto" w:fill="1F497D"/>
       </w:pPr>
       <w:r>
@@ -431,7 +480,7 @@
           <w:b/>
           <w:i w:val="0"/>
           <w:color w:val="FFFFFF"/>
-          <w:sz w:val="24"/>
+          <w:sz w:val="22"/>
         </w:rPr>
         <w:t xml:space="preserve">  PART 2 — Second Intern's Research Contribution</w:t>
       </w:r>
@@ -439,35 +488,10 @@
     <w:p/>
     <w:p>
       <w:pPr>
-        <w:spacing w:after="200"/>
-        <w:ind w:left="432" w:right="432"/>
-        <w:shd w:val="clear" w:color="auto" w:fill="FFF4E5"/>
-      </w:pPr>
-      <w:r>
-        <w:rPr>
-          <w:rFonts w:ascii="Calibri" w:hAnsi="Calibri"/>
-          <w:b/>
-          <w:i w:val="0"/>
-          <w:color w:val="663300"/>
-          <w:sz w:val="20"/>
-        </w:rPr>
-        <w:t>Scope Notice</w:t>
-        <w:br/>
-      </w:r>
-      <w:r>
-        <w:rPr>
-          <w:rFonts w:ascii="Calibri" w:hAnsi="Calibri"/>
-          <w:b w:val="0"/>
-          <w:i/>
-          <w:color w:val="663300"/>
-          <w:sz w:val="20"/>
-        </w:rPr>
-        <w:t>All vulnerability findings in Part 2 are cited from confirmed MIRR project documents. No independent GIS analysis has been performed. Color-coded notes throughout indicate whether each point is confirmed (green), needs GIS to verify spatially (orange), or needs external source verification before it can be used (red).</w:t>
-      </w:r>
-    </w:p>
-    <w:p>
-      <w:pPr>
-        <w:spacing w:before="280" w:after="80"/>
+        <w:spacing w:before="320" w:after="40"/>
+        <w:pBdr>
+          <w:bottom w:val="single" w:sz="4" w:space="1" w:color="1F497D"/>
+        </w:pBdr>
       </w:pPr>
       <w:r>
         <w:rPr>
@@ -475,29 +499,33 @@
           <w:b/>
           <w:i w:val="0"/>
           <w:color w:val="1F497D"/>
-          <w:sz w:val="26"/>
+          <w:sz w:val="22"/>
         </w:rPr>
-        <w:t>2.1  The Core Problem: Zero Electrical Redundancy</w:t>
+        <w:t>2.1  THE CORE PROBLEM: ZERO ELECTRICAL REDUNDANCY</w:t>
       </w:r>
     </w:p>
     <w:p>
       <w:pPr>
-        <w:spacing w:after="120"/>
+        <w:spacing w:after="100"/>
       </w:pPr>
       <w:r>
         <w:rPr>
           <w:rFonts w:ascii="Calibri" w:hAnsi="Calibri"/>
           <w:b w:val="0"/>
           <w:i w:val="0"/>
-          <w:sz w:val="22"/>
+          <w:color w:val="000000"/>
+          <w:sz w:val="21"/>
         </w:rPr>
-        <w:t>The MIRR vulnerability assessment identifies a single finding that frames everything else about energy at these installations. It is not a broad energy risk — it is a specific structural gap:</w:t>
+        <w:t>All four installations draw power from a single external substation with no backup supply path. If that substation fails, the installation loses commercial power entirely. Utility agreements (IGSAs) cover operations and maintenance only — no resilience or redundancy obligation exists.</w:t>
       </w:r>
     </w:p>
     <w:p>
       <w:pPr>
-        <w:spacing w:after="120"/>
-        <w:ind w:left="576"/>
+        <w:spacing w:after="100"/>
+        <w:ind w:left="504" w:right="288"/>
+        <w:pBdr>
+          <w:left w:val="single" w:sz="12" w:space="4" w:color="1F497D"/>
+        </w:pBdr>
       </w:pPr>
       <w:r>
         <w:rPr>
@@ -505,7 +533,7 @@
           <w:b w:val="0"/>
           <w:i/>
           <w:color w:val="404040"/>
-          <w:sz w:val="22"/>
+          <w:sz w:val="21"/>
         </w:rPr>
         <w:t>"At the asset systems level there is no immediate risk to mission other than single points of failure at each installation."</w:t>
       </w:r>
@@ -514,66 +542,36 @@
           <w:rFonts w:ascii="Calibri" w:hAnsi="Calibri"/>
           <w:b w:val="0"/>
           <w:i/>
-          <w:color w:val="7F7F7F"/>
-          <w:sz w:val="19"/>
+          <w:color w:val="595959"/>
+          <w:sz w:val="18"/>
         </w:rPr>
-        <w:br/>
-        <w:t>— MIRR Vulnerability Assessment, January 2026 Steering Committee</w:t>
+        <w:t xml:space="preserve">  — MIRR Vulnerability Assessment, January 2026 Steering Committee</w:t>
       </w:r>
     </w:p>
     <w:p>
       <w:pPr>
-        <w:spacing w:after="120"/>
-      </w:pPr>
-      <w:r>
-        <w:rPr>
-          <w:rFonts w:ascii="Calibri" w:hAnsi="Calibri"/>
-          <w:b w:val="0"/>
-          <w:i w:val="0"/>
-          <w:sz w:val="22"/>
-        </w:rPr>
-        <w:t>All four installations draw power from a single external substation with no backup supply path. If that substation fails — for any reason — the installation loses commercial power entirely. There is no second line, no alternative feed, no redundant path. The utility agreements (IGSAs) at NAS JAX and NS Mayport cover operations and maintenance only — they include no resilience or redundancy obligation on JEA's part.  (MIRR Mutual Support Assessment, February 2026 TAC)</w:t>
-      </w:r>
-    </w:p>
-    <w:p>
-      <w:pPr>
-        <w:spacing w:after="120"/>
-        <w:ind w:left="432" w:right="432"/>
-        <w:shd w:val="clear" w:color="auto" w:fill="EAF4EA"/>
+        <w:spacing w:after="100"/>
+        <w:ind w:left="360"/>
       </w:pPr>
       <w:r>
         <w:rPr>
           <w:rFonts w:ascii="Calibri" w:hAnsi="Calibri"/>
           <w:b/>
           <w:i w:val="0"/>
-          <w:color w:val="005000"/>
-          <w:sz w:val="20"/>
+          <w:color w:val="006100"/>
+          <w:sz w:val="19"/>
         </w:rPr>
-        <w:t xml:space="preserve">Confirmed: </w:t>
+        <w:t xml:space="preserve">● Confirmed  </w:t>
       </w:r>
       <w:r>
         <w:rPr>
           <w:rFonts w:ascii="Calibri" w:hAnsi="Calibri"/>
           <w:b w:val="0"/>
           <w:i/>
-          <w:color w:val="005000"/>
-          <w:sz w:val="20"/>
+          <w:color w:val="595959"/>
+          <w:sz w:val="19"/>
         </w:rPr>
-        <w:t>Confirmed by MIRR VA and Mutual Support Assessment. No GIS needed to state this finding.</w:t>
-      </w:r>
-    </w:p>
-    <w:p>
-      <w:pPr>
-        <w:spacing w:after="120"/>
-      </w:pPr>
-      <w:r>
-        <w:rPr>
-          <w:rFonts w:ascii="Calibri" w:hAnsi="Calibri"/>
-          <w:b w:val="0"/>
-          <w:i w:val="0"/>
-          <w:sz w:val="22"/>
-        </w:rPr>
-        <w:t>Confirmed substation locations and risk ratings from the MIRR VA:</w:t>
+        <w:t>Risk ratings and IGSA gap confirmed by MIRR VA and Mutual Support Assessment, Feb 2026 TAC.</w:t>
       </w:r>
     </w:p>
     <w:tbl>
@@ -583,33 +581,33 @@
         <w:tblLook w:firstColumn="1" w:firstRow="1" w:lastColumn="0" w:lastRow="0" w:noHBand="0" w:noVBand="1" w:val="04A0"/>
       </w:tblPr>
       <w:tblGrid>
-        <w:gridCol w:w="2160"/>
-        <w:gridCol w:w="2160"/>
-        <w:gridCol w:w="2160"/>
-        <w:gridCol w:w="2160"/>
+        <w:gridCol w:w="2196"/>
+        <w:gridCol w:w="2196"/>
+        <w:gridCol w:w="2196"/>
+        <w:gridCol w:w="2196"/>
       </w:tblGrid>
       <w:tr>
         <w:tc>
           <w:tcPr>
-            <w:tcW w:type="dxa" w:w="2160"/>
+            <w:tcW w:type="dxa" w:w="2196"/>
           </w:tcPr>
           <w:p/>
         </w:tc>
         <w:tc>
           <w:tcPr>
-            <w:tcW w:type="dxa" w:w="2160"/>
+            <w:tcW w:type="dxa" w:w="2196"/>
           </w:tcPr>
           <w:p/>
         </w:tc>
         <w:tc>
           <w:tcPr>
-            <w:tcW w:type="dxa" w:w="2160"/>
+            <w:tcW w:type="dxa" w:w="2196"/>
           </w:tcPr>
           <w:p/>
         </w:tc>
         <w:tc>
           <w:tcPr>
-            <w:tcW w:type="dxa" w:w="2160"/>
+            <w:tcW w:type="dxa" w:w="2196"/>
           </w:tcPr>
           <w:p/>
         </w:tc>
@@ -617,12 +615,12 @@
       <w:tr>
         <w:tc>
           <w:tcPr>
-            <w:tcW w:type="dxa" w:w="2160"/>
+            <w:tcW w:type="dxa" w:w="2196"/>
             <w:shd w:val="clear" w:color="auto" w:fill="1F497D"/>
           </w:tcPr>
           <w:p>
             <w:pPr>
-              <w:spacing w:after="40"/>
+              <w:spacing w:after="20"/>
             </w:pPr>
             <w:r/>
             <w:r>
@@ -639,12 +637,12 @@
         </w:tc>
         <w:tc>
           <w:tcPr>
-            <w:tcW w:type="dxa" w:w="2160"/>
+            <w:tcW w:type="dxa" w:w="2196"/>
             <w:shd w:val="clear" w:color="auto" w:fill="1F497D"/>
           </w:tcPr>
           <w:p>
             <w:pPr>
-              <w:spacing w:after="40"/>
+              <w:spacing w:after="20"/>
             </w:pPr>
             <w:r/>
             <w:r>
@@ -661,12 +659,12 @@
         </w:tc>
         <w:tc>
           <w:tcPr>
-            <w:tcW w:type="dxa" w:w="2160"/>
+            <w:tcW w:type="dxa" w:w="2196"/>
             <w:shd w:val="clear" w:color="auto" w:fill="1F497D"/>
           </w:tcPr>
           <w:p>
             <w:pPr>
-              <w:spacing w:after="40"/>
+              <w:spacing w:after="20"/>
             </w:pPr>
             <w:r/>
             <w:r>
@@ -683,12 +681,12 @@
         </w:tc>
         <w:tc>
           <w:tcPr>
-            <w:tcW w:type="dxa" w:w="2160"/>
+            <w:tcW w:type="dxa" w:w="2196"/>
             <w:shd w:val="clear" w:color="auto" w:fill="1F497D"/>
           </w:tcPr>
           <w:p>
             <w:pPr>
-              <w:spacing w:after="40"/>
+              <w:spacing w:after="20"/>
             </w:pPr>
             <w:r/>
             <w:r>
@@ -707,11 +705,11 @@
       <w:tr>
         <w:tc>
           <w:tcPr>
-            <w:tcW w:type="dxa" w:w="2160"/>
+            <w:tcW w:type="dxa" w:w="2196"/>
           </w:tcPr>
           <w:p>
             <w:pPr>
-              <w:spacing w:after="40"/>
+              <w:spacing w:after="20"/>
             </w:pPr>
             <w:r/>
             <w:r>
@@ -727,11 +725,11 @@
         </w:tc>
         <w:tc>
           <w:tcPr>
-            <w:tcW w:type="dxa" w:w="2160"/>
+            <w:tcW w:type="dxa" w:w="2196"/>
           </w:tcPr>
           <w:p>
             <w:pPr>
-              <w:spacing w:after="40"/>
+              <w:spacing w:after="20"/>
             </w:pPr>
             <w:r/>
             <w:r>
@@ -747,11 +745,11 @@
         </w:tc>
         <w:tc>
           <w:tcPr>
-            <w:tcW w:type="dxa" w:w="2160"/>
+            <w:tcW w:type="dxa" w:w="2196"/>
           </w:tcPr>
           <w:p>
             <w:pPr>
-              <w:spacing w:after="40"/>
+              <w:spacing w:after="20"/>
             </w:pPr>
             <w:r/>
             <w:r>
@@ -767,11 +765,11 @@
         </w:tc>
         <w:tc>
           <w:tcPr>
-            <w:tcW w:type="dxa" w:w="2160"/>
+            <w:tcW w:type="dxa" w:w="2196"/>
           </w:tcPr>
           <w:p>
             <w:pPr>
-              <w:spacing w:after="40"/>
+              <w:spacing w:after="20"/>
             </w:pPr>
             <w:r/>
             <w:r>
@@ -789,11 +787,12 @@
       <w:tr>
         <w:tc>
           <w:tcPr>
-            <w:tcW w:type="dxa" w:w="2160"/>
+            <w:tcW w:type="dxa" w:w="2196"/>
+            <w:shd w:val="clear" w:color="auto" w:fill="F2F5FA"/>
           </w:tcPr>
           <w:p>
             <w:pPr>
-              <w:spacing w:after="40"/>
+              <w:spacing w:after="20"/>
             </w:pPr>
             <w:r/>
             <w:r>
@@ -809,11 +808,12 @@
         </w:tc>
         <w:tc>
           <w:tcPr>
-            <w:tcW w:type="dxa" w:w="2160"/>
+            <w:tcW w:type="dxa" w:w="2196"/>
+            <w:shd w:val="clear" w:color="auto" w:fill="F2F5FA"/>
           </w:tcPr>
           <w:p>
             <w:pPr>
-              <w:spacing w:after="40"/>
+              <w:spacing w:after="20"/>
             </w:pPr>
             <w:r/>
             <w:r>
@@ -829,11 +829,12 @@
         </w:tc>
         <w:tc>
           <w:tcPr>
-            <w:tcW w:type="dxa" w:w="2160"/>
+            <w:tcW w:type="dxa" w:w="2196"/>
+            <w:shd w:val="clear" w:color="auto" w:fill="F2F5FA"/>
           </w:tcPr>
           <w:p>
             <w:pPr>
-              <w:spacing w:after="40"/>
+              <w:spacing w:after="20"/>
             </w:pPr>
             <w:r/>
             <w:r>
@@ -849,11 +850,12 @@
         </w:tc>
         <w:tc>
           <w:tcPr>
-            <w:tcW w:type="dxa" w:w="2160"/>
+            <w:tcW w:type="dxa" w:w="2196"/>
+            <w:shd w:val="clear" w:color="auto" w:fill="F2F5FA"/>
           </w:tcPr>
           <w:p>
             <w:pPr>
-              <w:spacing w:after="40"/>
+              <w:spacing w:after="20"/>
             </w:pPr>
             <w:r/>
             <w:r>
@@ -871,11 +873,11 @@
       <w:tr>
         <w:tc>
           <w:tcPr>
-            <w:tcW w:type="dxa" w:w="2160"/>
+            <w:tcW w:type="dxa" w:w="2196"/>
           </w:tcPr>
           <w:p>
             <w:pPr>
-              <w:spacing w:after="40"/>
+              <w:spacing w:after="20"/>
             </w:pPr>
             <w:r/>
             <w:r>
@@ -891,11 +893,11 @@
         </w:tc>
         <w:tc>
           <w:tcPr>
-            <w:tcW w:type="dxa" w:w="2160"/>
+            <w:tcW w:type="dxa" w:w="2196"/>
           </w:tcPr>
           <w:p>
             <w:pPr>
-              <w:spacing w:after="40"/>
+              <w:spacing w:after="20"/>
             </w:pPr>
             <w:r/>
             <w:r>
@@ -911,11 +913,11 @@
         </w:tc>
         <w:tc>
           <w:tcPr>
-            <w:tcW w:type="dxa" w:w="2160"/>
+            <w:tcW w:type="dxa" w:w="2196"/>
           </w:tcPr>
           <w:p>
             <w:pPr>
-              <w:spacing w:after="40"/>
+              <w:spacing w:after="20"/>
             </w:pPr>
             <w:r/>
             <w:r>
@@ -931,11 +933,11 @@
         </w:tc>
         <w:tc>
           <w:tcPr>
-            <w:tcW w:type="dxa" w:w="2160"/>
+            <w:tcW w:type="dxa" w:w="2196"/>
           </w:tcPr>
           <w:p>
             <w:pPr>
-              <w:spacing w:after="40"/>
+              <w:spacing w:after="20"/>
             </w:pPr>
             <w:r/>
             <w:r>
@@ -953,11 +955,12 @@
       <w:tr>
         <w:tc>
           <w:tcPr>
-            <w:tcW w:type="dxa" w:w="2160"/>
+            <w:tcW w:type="dxa" w:w="2196"/>
+            <w:shd w:val="clear" w:color="auto" w:fill="F2F5FA"/>
           </w:tcPr>
           <w:p>
             <w:pPr>
-              <w:spacing w:after="40"/>
+              <w:spacing w:after="20"/>
             </w:pPr>
             <w:r/>
             <w:r>
@@ -973,11 +976,12 @@
         </w:tc>
         <w:tc>
           <w:tcPr>
-            <w:tcW w:type="dxa" w:w="2160"/>
+            <w:tcW w:type="dxa" w:w="2196"/>
+            <w:shd w:val="clear" w:color="auto" w:fill="F2F5FA"/>
           </w:tcPr>
           <w:p>
             <w:pPr>
-              <w:spacing w:after="40"/>
+              <w:spacing w:after="20"/>
             </w:pPr>
             <w:r/>
             <w:r>
@@ -993,11 +997,12 @@
         </w:tc>
         <w:tc>
           <w:tcPr>
-            <w:tcW w:type="dxa" w:w="2160"/>
+            <w:tcW w:type="dxa" w:w="2196"/>
+            <w:shd w:val="clear" w:color="auto" w:fill="F2F5FA"/>
           </w:tcPr>
           <w:p>
             <w:pPr>
-              <w:spacing w:after="40"/>
+              <w:spacing w:after="20"/>
             </w:pPr>
             <w:r/>
             <w:r>
@@ -1013,11 +1018,12 @@
         </w:tc>
         <w:tc>
           <w:tcPr>
-            <w:tcW w:type="dxa" w:w="2160"/>
+            <w:tcW w:type="dxa" w:w="2196"/>
+            <w:shd w:val="clear" w:color="auto" w:fill="F2F5FA"/>
           </w:tcPr>
           <w:p>
             <w:pPr>
-              <w:spacing w:after="40"/>
+              <w:spacing w:after="20"/>
             </w:pPr>
             <w:r/>
             <w:r>
@@ -1036,7 +1042,10 @@
     <w:p/>
     <w:p>
       <w:pPr>
-        <w:spacing w:before="280" w:after="80"/>
+        <w:spacing w:before="320" w:after="40"/>
+        <w:pBdr>
+          <w:bottom w:val="single" w:sz="4" w:space="1" w:color="1F497D"/>
+        </w:pBdr>
       </w:pPr>
       <w:r>
         <w:rPr>
@@ -1044,28 +1053,14 @@
           <w:b/>
           <w:i w:val="0"/>
           <w:color w:val="1F497D"/>
-          <w:sz w:val="26"/>
+          <w:sz w:val="22"/>
         </w:rPr>
-        <w:t>2.2  Why Redundancy Is Harder Here Than Elsewhere</w:t>
+        <w:t>2.2  WHY REDUNDANCY IS HARDER HERE — REGIONAL GEOGRAPHY</w:t>
       </w:r>
     </w:p>
     <w:p>
       <w:pPr>
-        <w:spacing w:after="120"/>
-      </w:pPr>
-      <w:r>
-        <w:rPr>
-          <w:rFonts w:ascii="Calibri" w:hAnsi="Calibri"/>
-          <w:b w:val="0"/>
-          <w:i w:val="0"/>
-          <w:sz w:val="22"/>
-        </w:rPr>
-        <w:t>The specific geography of Northeast Florida creates constraints that make standard redundancy solutions more complex than they would be in other regions. These are not general observations — they are specific to this area.</w:t>
-      </w:r>
-    </w:p>
-    <w:p>
-      <w:pPr>
-        <w:spacing w:before="160" w:after="80"/>
+        <w:spacing w:before="200" w:after="40"/>
       </w:pPr>
       <w:r>
         <w:rPr>
@@ -1073,30 +1068,30 @@
           <w:b/>
           <w:i w:val="0"/>
           <w:color w:val="376092"/>
-          <w:sz w:val="22"/>
+          <w:sz w:val="21"/>
         </w:rPr>
-        <w:t>Shallow Water Table — Complicates Undergrounding</w:t>
+        <w:t>Shallow Water Table</w:t>
       </w:r>
     </w:p>
     <w:p>
       <w:pPr>
-        <w:spacing w:after="120"/>
+        <w:spacing w:after="100"/>
       </w:pPr>
       <w:r>
         <w:rPr>
           <w:rFonts w:ascii="Calibri" w:hAnsi="Calibri"/>
           <w:b w:val="0"/>
           <w:i w:val="0"/>
-          <w:sz w:val="22"/>
+          <w:color w:val="000000"/>
+          <w:sz w:val="21"/>
         </w:rPr>
-        <w:t>Part 1 correctly identifies undergrounding as a potential resilience measure. In coastal Duval County the water table in many areas sits only a few feet below grade. Underground cables in a high water table environment face groundwater intrusion, saltwater corrosion from below, and significantly harder fault location and repair when failures occur. JEA has been selectively undergrounding in northeast Florida but has proceeded cautiously precisely because of these conditions. Undergrounding trades wind and debris vulnerability for below-grade flood and corrosion vulnerability — it is not a clean redundancy solution in this specific region.</w:t>
+        <w:t>Undergrounding is often proposed as a wind and debris solution. In coastal Duval County the water table sits only a few feet below grade in many areas. Underground cables here face groundwater intrusion, saltwater corrosion from below, and difficult fault repair when failures occur. JEA has undergrounded selectively but cautiously for this reason. Undergrounding trades one vulnerability for another — it is not a clean redundancy fix in this region.</w:t>
       </w:r>
     </w:p>
     <w:p>
       <w:pPr>
-        <w:spacing w:after="120"/>
-        <w:ind w:left="432" w:right="432"/>
-        <w:shd w:val="clear" w:color="auto" w:fill="FFF4E5"/>
+        <w:spacing w:after="100"/>
+        <w:ind w:left="360"/>
       </w:pPr>
       <w:r>
         <w:rPr>
@@ -1104,24 +1099,24 @@
           <w:b/>
           <w:i w:val="0"/>
           <w:color w:val="663300"/>
-          <w:sz w:val="20"/>
+          <w:sz w:val="19"/>
         </w:rPr>
-        <w:t xml:space="preserve">Needs GIS: </w:t>
+        <w:t xml:space="preserve">◐ Pending GIS  </w:t>
       </w:r>
       <w:r>
         <w:rPr>
           <w:rFonts w:ascii="Calibri" w:hAnsi="Calibri"/>
           <w:b w:val="0"/>
           <w:i/>
-          <w:color w:val="663300"/>
-          <w:sz w:val="20"/>
+          <w:color w:val="595959"/>
+          <w:sz w:val="19"/>
         </w:rPr>
-        <w:t>The shallow water table is a confirmed regional condition. Specific depths at substation locations and along potential redundant feed corridors need GIS and geotechnical data to confirm.</w:t>
+        <w:t>Specific water table depths at substation locations need USGS groundwater data and SJRWMD mapping.</w:t>
       </w:r>
     </w:p>
     <w:p>
       <w:pPr>
-        <w:spacing w:before="160" w:after="80"/>
+        <w:spacing w:before="200" w:after="40"/>
       </w:pPr>
       <w:r>
         <w:rPr>
@@ -1129,29 +1124,129 @@
           <w:b/>
           <w:i w:val="0"/>
           <w:color w:val="376092"/>
-          <w:sz w:val="22"/>
+          <w:sz w:val="21"/>
         </w:rPr>
-        <w:t>Limited Access Corridors — Compounds Restoration Timelines</w:t>
+        <w:t>Limited Access Corridors</w:t>
       </w:r>
     </w:p>
     <w:p>
       <w:pPr>
-        <w:spacing w:after="120"/>
+        <w:spacing w:after="100"/>
       </w:pPr>
       <w:r>
         <w:rPr>
           <w:rFonts w:ascii="Calibri" w:hAnsi="Calibri"/>
           <w:b w:val="0"/>
           <w:i w:val="0"/>
-          <w:sz w:val="22"/>
+          <w:color w:val="000000"/>
+          <w:sz w:val="21"/>
         </w:rPr>
-        <w:t>The installations' geographic positions create inherent access constraints that directly affect how long an outage lasts once it occurs:</w:t>
+        <w:t>Each installation's geography creates hard constraints on restoration crew access:</w:t>
       </w:r>
     </w:p>
     <w:p>
       <w:pPr>
         <w:pStyle w:val="ListBullet"/>
-        <w:spacing w:after="80"/>
+        <w:spacing w:after="60"/>
+        <w:ind w:left="288"/>
+      </w:pPr>
+      <w:r>
+        <w:rPr>
+          <w:rFonts w:ascii="Calibri" w:hAnsi="Calibri"/>
+          <w:b/>
+          <w:i w:val="0"/>
+          <w:sz w:val="21"/>
+        </w:rPr>
+        <w:t xml:space="preserve">NS Mayport — </w:t>
+      </w:r>
+      <w:r>
+        <w:rPr>
+          <w:rFonts w:ascii="Calibri" w:hAnsi="Calibri"/>
+          <w:b w:val="0"/>
+          <w:i w:val="0"/>
+          <w:sz w:val="21"/>
+        </w:rPr>
+        <w:t>A1A only. Coastal peninsula — A1A flooding isolates the substation entirely.</w:t>
+      </w:r>
+    </w:p>
+    <w:p>
+      <w:pPr>
+        <w:pStyle w:val="ListBullet"/>
+        <w:spacing w:after="60"/>
+        <w:ind w:left="288"/>
+      </w:pPr>
+      <w:r>
+        <w:rPr>
+          <w:rFonts w:ascii="Calibri" w:hAnsi="Calibri"/>
+          <w:b/>
+          <w:i w:val="0"/>
+          <w:sz w:val="21"/>
+        </w:rPr>
+        <w:t xml:space="preserve">Blount Island — </w:t>
+      </w:r>
+      <w:r>
+        <w:rPr>
+          <w:rFonts w:ascii="Calibri" w:hAnsi="Calibri"/>
+          <w:b w:val="0"/>
+          <w:i w:val="0"/>
+          <w:sz w:val="21"/>
+        </w:rPr>
+        <w:t>Heckscher Drive only. River island — structural access limitation.</w:t>
+      </w:r>
+    </w:p>
+    <w:p>
+      <w:pPr>
+        <w:pStyle w:val="ListBullet"/>
+        <w:spacing w:after="60"/>
+        <w:ind w:left="288"/>
+      </w:pPr>
+      <w:r>
+        <w:rPr>
+          <w:rFonts w:ascii="Calibri" w:hAnsi="Calibri"/>
+          <w:b/>
+          <w:i w:val="0"/>
+          <w:sz w:val="21"/>
+        </w:rPr>
+        <w:t xml:space="preserve">NAS Jacksonville — </w:t>
+      </w:r>
+      <w:r>
+        <w:rPr>
+          <w:rFonts w:ascii="Calibri" w:hAnsi="Calibri"/>
+          <w:b w:val="0"/>
+          <w:i w:val="0"/>
+          <w:sz w:val="21"/>
+        </w:rPr>
+        <w:t>Roosevelt Blvd / US-17. Both run through St. Johns River floodplain.</w:t>
+      </w:r>
+    </w:p>
+    <w:p>
+      <w:pPr>
+        <w:pStyle w:val="ListBullet"/>
+        <w:spacing w:after="60"/>
+        <w:ind w:left="288"/>
+      </w:pPr>
+      <w:r>
+        <w:rPr>
+          <w:rFonts w:ascii="Calibri" w:hAnsi="Calibri"/>
+          <w:b/>
+          <w:i w:val="0"/>
+          <w:sz w:val="21"/>
+        </w:rPr>
+        <w:t xml:space="preserve">Camp Blanding — </w:t>
+      </w:r>
+      <w:r>
+        <w:rPr>
+          <w:rFonts w:ascii="Calibri" w:hAnsi="Calibri"/>
+          <w:b w:val="0"/>
+          <w:i w:val="0"/>
+          <w:sz w:val="21"/>
+        </w:rPr>
+        <w:t>SR-16. Black Creek flooding closes surrounding roads in tropical storm conditions.</w:t>
+      </w:r>
+    </w:p>
+    <w:p>
+      <w:pPr>
+        <w:spacing w:after="100"/>
         <w:ind w:left="360"/>
       </w:pPr>
       <w:r>
@@ -1159,24 +1254,55 @@
           <w:rFonts w:ascii="Calibri" w:hAnsi="Calibri"/>
           <w:b/>
           <w:i w:val="0"/>
-          <w:sz w:val="22"/>
+          <w:color w:val="663300"/>
+          <w:sz w:val="19"/>
         </w:rPr>
-        <w:t xml:space="preserve">NS Mayport: </w:t>
+        <w:t xml:space="preserve">◐ Pending GIS  </w:t>
       </w:r>
       <w:r>
         <w:rPr>
           <w:rFonts w:ascii="Calibri" w:hAnsi="Calibri"/>
           <w:b w:val="0"/>
-          <w:i w:val="0"/>
-          <w:sz w:val="22"/>
+          <w:i/>
+          <w:color w:val="595959"/>
+          <w:sz w:val="19"/>
         </w:rPr>
-        <w:t>A1A is the primary southern access corridor. The installation sits on a coastal peninsula — flooding of A1A isolates restoration crews regardless of substation condition.</w:t>
+        <w:t>FDOT road network overlaid against SLOSH and CDBG flood models will confirm which corridors close and at what storm frequency.</w:t>
       </w:r>
     </w:p>
     <w:p>
       <w:pPr>
-        <w:pStyle w:val="ListBullet"/>
-        <w:spacing w:after="80"/>
+        <w:spacing w:before="200" w:after="40"/>
+      </w:pPr>
+      <w:r>
+        <w:rPr>
+          <w:rFonts w:ascii="Calibri" w:hAnsi="Calibri"/>
+          <w:b/>
+          <w:i w:val="0"/>
+          <w:color w:val="376092"/>
+          <w:sz w:val="21"/>
+        </w:rPr>
+        <w:t>Upstream Grid Topology</w:t>
+      </w:r>
+    </w:p>
+    <w:p>
+      <w:pPr>
+        <w:spacing w:after="100"/>
+      </w:pPr>
+      <w:r>
+        <w:rPr>
+          <w:rFonts w:ascii="Calibri" w:hAnsi="Calibri"/>
+          <w:b w:val="0"/>
+          <w:i w:val="0"/>
+          <w:color w:val="000000"/>
+          <w:sz w:val="21"/>
+        </w:rPr>
+        <w:t>A regional storm can cut power to a substation even if the substation is physically intact — by knocking out an upstream node in the grid. How many such nodes exist between the regional grid and each installation's substation, and how much of that path runs through flood-exposed terrain, is unknown. JEA has not shared transmission routing data with the MIRR team as of September 2025 TAC.</w:t>
+      </w:r>
+    </w:p>
+    <w:p>
+      <w:pPr>
+        <w:spacing w:after="100"/>
         <w:ind w:left="360"/>
       </w:pPr>
       <w:r>
@@ -1184,24 +1310,88 @@
           <w:rFonts w:ascii="Calibri" w:hAnsi="Calibri"/>
           <w:b/>
           <w:i w:val="0"/>
-          <w:sz w:val="22"/>
+          <w:color w:val="663300"/>
+          <w:sz w:val="19"/>
         </w:rPr>
-        <w:t xml:space="preserve">MCSF Blount Island: </w:t>
+        <w:t xml:space="preserve">◐ Pending GIS  </w:t>
       </w:r>
       <w:r>
         <w:rPr>
           <w:rFonts w:ascii="Calibri" w:hAnsi="Calibri"/>
           <w:b w:val="0"/>
-          <w:i w:val="0"/>
-          <w:sz w:val="22"/>
+          <w:i/>
+          <w:color w:val="595959"/>
+          <w:sz w:val="19"/>
         </w:rPr>
-        <w:t>Heckscher Drive is the primary industrial access route. The installation is on an island in the St. Johns River — road access is structurally limited by geography.</w:t>
+        <w:t>EIA Form 860 and HIFLD transmission layers will be used as proxy. JEA data sharing needed for full picture.</w:t>
       </w:r>
     </w:p>
     <w:p>
       <w:pPr>
-        <w:pStyle w:val="ListBullet"/>
-        <w:spacing w:after="80"/>
+        <w:spacing w:before="320" w:after="40"/>
+        <w:pBdr>
+          <w:bottom w:val="single" w:sz="4" w:space="1" w:color="1F497D"/>
+        </w:pBdr>
+      </w:pPr>
+      <w:r>
+        <w:rPr>
+          <w:rFonts w:ascii="Calibri" w:hAnsi="Calibri"/>
+          <w:b/>
+          <w:i w:val="0"/>
+          <w:color w:val="1F497D"/>
+          <w:sz w:val="22"/>
+        </w:rPr>
+        <w:t>2.3  REGIONAL HAZARDS THAT ACTIVATE THE REDUNDANCY GAP</w:t>
+      </w:r>
+    </w:p>
+    <w:p>
+      <w:pPr>
+        <w:spacing w:after="100"/>
+      </w:pPr>
+      <w:r>
+        <w:rPr>
+          <w:rFonts w:ascii="Calibri" w:hAnsi="Calibri"/>
+          <w:b w:val="0"/>
+          <w:i w:val="0"/>
+          <w:color w:val="000000"/>
+          <w:sz w:val="21"/>
+        </w:rPr>
+        <w:t>These hazards are confirmed by MIRR VA as region-specific — not generic national risks.</w:t>
+      </w:r>
+    </w:p>
+    <w:p>
+      <w:pPr>
+        <w:spacing w:before="200" w:after="40"/>
+      </w:pPr>
+      <w:r>
+        <w:rPr>
+          <w:rFonts w:ascii="Calibri" w:hAnsi="Calibri"/>
+          <w:b/>
+          <w:i w:val="0"/>
+          <w:color w:val="376092"/>
+          <w:sz w:val="21"/>
+        </w:rPr>
+        <w:t>Storm Surge — NS Mayport and Blount Island</w:t>
+      </w:r>
+    </w:p>
+    <w:p>
+      <w:pPr>
+        <w:spacing w:after="100"/>
+      </w:pPr>
+      <w:r>
+        <w:rPr>
+          <w:rFonts w:ascii="Calibri" w:hAnsi="Calibri"/>
+          <w:b w:val="0"/>
+          <w:i w:val="0"/>
+          <w:color w:val="000000"/>
+          <w:sz w:val="21"/>
+        </w:rPr>
+        <w:t>Both installations sit adjacent to the St. Johns River mouth and the Atlantic coast. NHC SLOSH Cat 3–5 surge reaches the substations serving these installations. Surge simultaneously threatens the substation physically and inundates the access corridors restoration crews depend on — extending outage duration beyond the storm window.</w:t>
+      </w:r>
+    </w:p>
+    <w:p>
+      <w:pPr>
+        <w:spacing w:after="100"/>
         <w:ind w:left="360"/>
       </w:pPr>
       <w:r>
@@ -1209,24 +1399,25 @@
           <w:rFonts w:ascii="Calibri" w:hAnsi="Calibri"/>
           <w:b/>
           <w:i w:val="0"/>
-          <w:sz w:val="22"/>
+          <w:color w:val="006100"/>
+          <w:sz w:val="19"/>
         </w:rPr>
-        <w:t xml:space="preserve">NAS Jacksonville: </w:t>
+        <w:t xml:space="preserve">● Confirmed  </w:t>
       </w:r>
       <w:r>
         <w:rPr>
           <w:rFonts w:ascii="Calibri" w:hAnsi="Calibri"/>
           <w:b w:val="0"/>
-          <w:i w:val="0"/>
-          <w:sz w:val="22"/>
+          <w:i/>
+          <w:color w:val="595959"/>
+          <w:sz w:val="19"/>
         </w:rPr>
-        <w:t>Roosevelt Boulevard and US-17 are the primary corridors. Both run through low-lying terrain along the St. Johns River floodplain.</w:t>
+        <w:t>SLOSH confirmed as MIRR data source. NS Mayport substation: HIGH / Immediate.</w:t>
       </w:r>
     </w:p>
     <w:p>
       <w:pPr>
-        <w:pStyle w:val="ListBullet"/>
-        <w:spacing w:after="80"/>
+        <w:spacing w:after="100"/>
         <w:ind w:left="360"/>
       </w:pPr>
       <w:r>
@@ -1234,25 +1425,82 @@
           <w:rFonts w:ascii="Calibri" w:hAnsi="Calibri"/>
           <w:b/>
           <w:i w:val="0"/>
-          <w:sz w:val="22"/>
+          <w:color w:val="663300"/>
+          <w:sz w:val="19"/>
         </w:rPr>
-        <w:t xml:space="preserve">Camp Blanding: </w:t>
+        <w:t xml:space="preserve">◐ Pending GIS  </w:t>
       </w:r>
       <w:r>
         <w:rPr>
           <w:rFonts w:ascii="Calibri" w:hAnsi="Calibri"/>
           <w:b w:val="0"/>
-          <w:i w:val="0"/>
-          <w:sz w:val="22"/>
+          <w:i/>
+          <w:color w:val="595959"/>
+          <w:sz w:val="19"/>
         </w:rPr>
-        <w:t>SR-16 is the primary access route through Clay County. Black Creek flooding closes surrounding roads even in tropical storm conditions.</w:t>
+        <w:t>Spatial overlay of substation locations against Cat 3/5 surge extents — viewable now via NOAA Digital Coast.</w:t>
       </w:r>
     </w:p>
     <w:p>
       <w:pPr>
-        <w:spacing w:after="120"/>
-        <w:ind w:left="432" w:right="432"/>
-        <w:shd w:val="clear" w:color="auto" w:fill="FFF4E5"/>
+        <w:spacing w:before="200" w:after="40"/>
+      </w:pPr>
+      <w:r>
+        <w:rPr>
+          <w:rFonts w:ascii="Calibri" w:hAnsi="Calibri"/>
+          <w:b/>
+          <w:i w:val="0"/>
+          <w:color w:val="376092"/>
+          <w:sz w:val="21"/>
+        </w:rPr>
+        <w:t>Compound Rainfall Flooding — NAS Jacksonville</w:t>
+      </w:r>
+    </w:p>
+    <w:p>
+      <w:pPr>
+        <w:spacing w:after="100"/>
+      </w:pPr>
+      <w:r>
+        <w:rPr>
+          <w:rFonts w:ascii="Calibri" w:hAnsi="Calibri"/>
+          <w:b w:val="0"/>
+          <w:i w:val="0"/>
+          <w:color w:val="000000"/>
+          <w:sz w:val="21"/>
+        </w:rPr>
+        <w:t>NAS JAX sits on the St. Johns River floodplain. NEFRC CDBG flood modeling confirms 100-year present, 2040, and 2070 rainfall flood scenarios. Compound flooding — rainfall compounded by tidal backflow — is an increasing risk in coastal Duval County. Both primary access corridors (Roosevelt Blvd and US-17) run through this terrain.</w:t>
+      </w:r>
+    </w:p>
+    <w:p>
+      <w:pPr>
+        <w:spacing w:after="100"/>
+        <w:ind w:left="360"/>
+      </w:pPr>
+      <w:r>
+        <w:rPr>
+          <w:rFonts w:ascii="Calibri" w:hAnsi="Calibri"/>
+          <w:b/>
+          <w:i w:val="0"/>
+          <w:color w:val="006100"/>
+          <w:sz w:val="19"/>
+        </w:rPr>
+        <w:t xml:space="preserve">● Confirmed  </w:t>
+      </w:r>
+      <w:r>
+        <w:rPr>
+          <w:rFonts w:ascii="Calibri" w:hAnsi="Calibri"/>
+          <w:b w:val="0"/>
+          <w:i/>
+          <w:color w:val="595959"/>
+          <w:sz w:val="19"/>
+        </w:rPr>
+        <w:t>CDBG compound flood model confirmed as MIRR data source.</w:t>
+      </w:r>
+    </w:p>
+    <w:p>
+      <w:pPr>
+        <w:spacing w:after="100"/>
+        <w:ind w:left="360"/>
       </w:pPr>
       <w:r>
         <w:rPr>
@@ -1260,24 +1508,24 @@
           <w:b/>
           <w:i w:val="0"/>
           <w:color w:val="663300"/>
-          <w:sz w:val="20"/>
+          <w:sz w:val="19"/>
         </w:rPr>
-        <w:t xml:space="preserve">Needs GIS: </w:t>
+        <w:t xml:space="preserve">◐ Pending GIS  </w:t>
       </w:r>
       <w:r>
         <w:rPr>
           <w:rFonts w:ascii="Calibri" w:hAnsi="Calibri"/>
           <w:b w:val="0"/>
           <w:i/>
-          <w:color w:val="663300"/>
-          <w:sz w:val="20"/>
+          <w:color w:val="595959"/>
+          <w:sz w:val="19"/>
         </w:rPr>
-        <w:t>Access corridor flood exposure needs GIS overlay against SLOSH and CDBG flood models to confirm at which storm frequencies each corridor becomes impassable.</w:t>
+        <w:t>Road corridor intersection with flood extents needs GIS overlay.</w:t>
       </w:r>
     </w:p>
     <w:p>
       <w:pPr>
-        <w:spacing w:before="160" w:after="80"/>
+        <w:spacing w:before="200" w:after="40"/>
       </w:pPr>
       <w:r>
         <w:rPr>
@@ -1285,30 +1533,56 @@
           <w:b/>
           <w:i w:val="0"/>
           <w:color w:val="376092"/>
-          <w:sz w:val="22"/>
+          <w:sz w:val="21"/>
         </w:rPr>
-        <w:t>Grid Topology Upstream of Each Substation — Unconfirmed</w:t>
+        <w:t>Wildfire — Camp Blanding Transmission Corridor</w:t>
       </w:r>
     </w:p>
     <w:p>
       <w:pPr>
-        <w:spacing w:after="120"/>
+        <w:spacing w:after="100"/>
       </w:pPr>
       <w:r>
         <w:rPr>
           <w:rFonts w:ascii="Calibri" w:hAnsi="Calibri"/>
           <w:b w:val="0"/>
           <w:i w:val="0"/>
-          <w:sz w:val="22"/>
+          <w:color w:val="000000"/>
+          <w:sz w:val="21"/>
         </w:rPr>
-        <w:t>The installations depend on whatever grid infrastructure feeds their substations from upstream. A regional storm event can cut power to a substation even if the substation itself is physically intact — if a node upstream in the grid fails, the substation goes dark. The exact routing of transmission feeding each substation, how many upstream nodes exist, and how much of that path runs through flood-exposed terrain is not documented in the MIRR materials. JEA has not shared detailed infrastructure data with the MIRR team as of the September 2025 TAC.</w:t>
+        <w:t>Camp Blanding's 73,000 acres sit in Florida's wildland-urban interface. The FPL transmission corridor runs through scrub and longleaf pine terrain confirmed as wildfire-exposed by USDA FS data cited in the MIRR. Unlike storm events, wildfire can sever the corridor with no weather warning.</w:t>
       </w:r>
     </w:p>
     <w:p>
       <w:pPr>
-        <w:spacing w:after="120"/>
-        <w:ind w:left="432" w:right="432"/>
-        <w:shd w:val="clear" w:color="auto" w:fill="FFF4E5"/>
+        <w:spacing w:after="100"/>
+        <w:ind w:left="360"/>
+      </w:pPr>
+      <w:r>
+        <w:rPr>
+          <w:rFonts w:ascii="Calibri" w:hAnsi="Calibri"/>
+          <w:b/>
+          <w:i w:val="0"/>
+          <w:color w:val="006100"/>
+          <w:sz w:val="19"/>
+        </w:rPr>
+        <w:t xml:space="preserve">● Confirmed  </w:t>
+      </w:r>
+      <w:r>
+        <w:rPr>
+          <w:rFonts w:ascii="Calibri" w:hAnsi="Calibri"/>
+          <w:b w:val="0"/>
+          <w:i/>
+          <w:color w:val="595959"/>
+          <w:sz w:val="19"/>
+        </w:rPr>
+        <w:t>USDA FS wildfire hazard confirmed as MIRR data source. Camp Blanding FPL substation: HIGH / Near-Term.</w:t>
+      </w:r>
+    </w:p>
+    <w:p>
+      <w:pPr>
+        <w:spacing w:after="100"/>
+        <w:ind w:left="360"/>
       </w:pPr>
       <w:r>
         <w:rPr>
@@ -1316,24 +1590,27 @@
           <w:b/>
           <w:i w:val="0"/>
           <w:color w:val="663300"/>
-          <w:sz w:val="20"/>
+          <w:sz w:val="19"/>
         </w:rPr>
-        <w:t xml:space="preserve">Needs GIS: </w:t>
+        <w:t xml:space="preserve">◐ Pending GIS  </w:t>
       </w:r>
       <w:r>
         <w:rPr>
           <w:rFonts w:ascii="Calibri" w:hAnsi="Calibri"/>
           <w:b w:val="0"/>
           <w:i/>
-          <w:color w:val="663300"/>
-          <w:sz w:val="20"/>
+          <w:color w:val="595959"/>
+          <w:sz w:val="19"/>
         </w:rPr>
-        <w:t>JEA utility infrastructure data is a confirmed MIRR data gap. Transmission routing upstream of each substation needs JEA coordination and GIS mapping before the full redundancy picture can be understood.</w:t>
+        <w:t>Spatial extent of wildfire hazard along FPL corridor needs GIS overlay.</w:t>
       </w:r>
     </w:p>
     <w:p>
       <w:pPr>
-        <w:spacing w:before="280" w:after="80"/>
+        <w:spacing w:before="320" w:after="40"/>
+        <w:pBdr>
+          <w:bottom w:val="single" w:sz="4" w:space="1" w:color="1F497D"/>
+        </w:pBdr>
       </w:pPr>
       <w:r>
         <w:rPr>
@@ -1341,28 +1618,14 @@
           <w:b/>
           <w:i w:val="0"/>
           <w:color w:val="1F497D"/>
-          <w:sz w:val="26"/>
+          <w:sz w:val="22"/>
         </w:rPr>
-        <w:t>2.3  Regional Hazards That Trigger the Redundancy Gap</w:t>
+        <w:t>2.4  HISTORICAL EVENTS — EVIDENCE THE RISK IS REAL</w:t>
       </w:r>
     </w:p>
     <w:p>
       <w:pPr>
-        <w:spacing w:after="120"/>
-      </w:pPr>
-      <w:r>
-        <w:rPr>
-          <w:rFonts w:ascii="Calibri" w:hAnsi="Calibri"/>
-          <w:b w:val="0"/>
-          <w:i w:val="0"/>
-          <w:sz w:val="22"/>
-        </w:rPr>
-        <w:t>The redundancy gap becomes a mission risk when a hazard event disrupts the single supply path. The following hazards are confirmed by the MIRR vulnerability assessment as relevant to this specific region — they are not generic national risks.</w:t>
-      </w:r>
-    </w:p>
-    <w:p>
-      <w:pPr>
-        <w:spacing w:before="160" w:after="80"/>
+        <w:spacing w:before="200" w:after="40"/>
       </w:pPr>
       <w:r>
         <w:rPr>
@@ -1370,204 +1633,7 @@
           <w:b/>
           <w:i w:val="0"/>
           <w:color w:val="376092"/>
-          <w:sz w:val="22"/>
-        </w:rPr>
-        <w:t>Storm Surge — NS Mayport and Blount Island</w:t>
-      </w:r>
-    </w:p>
-    <w:p>
-      <w:pPr>
-        <w:spacing w:after="120"/>
-      </w:pPr>
-      <w:r>
-        <w:rPr>
-          <w:rFonts w:ascii="Calibri" w:hAnsi="Calibri"/>
-          <w:b w:val="0"/>
-          <w:i w:val="0"/>
-          <w:sz w:val="22"/>
-        </w:rPr>
-        <w:t>Both installations sit adjacent to the St. Johns River mouth and the Atlantic coast. NHC SLOSH modeling confirms Cat 3–5 surge reaches the substations serving these installations. NS Mayport's JEA substation carries the highest urgency rating in the entire region — HIGH / Immediate — specifically because of surge exposure combined with zero redundancy. Storm surge does not just threaten the substation physically; it also inundates the access corridors that restoration crews depend on, extending the outage duration beyond the physical damage window.</w:t>
-      </w:r>
-    </w:p>
-    <w:p>
-      <w:pPr>
-        <w:spacing w:after="120"/>
-        <w:ind w:left="432" w:right="432"/>
-        <w:shd w:val="clear" w:color="auto" w:fill="FFF4E5"/>
-      </w:pPr>
-      <w:r>
-        <w:rPr>
-          <w:rFonts w:ascii="Calibri" w:hAnsi="Calibri"/>
-          <w:b/>
-          <w:i w:val="0"/>
-          <w:color w:val="663300"/>
-          <w:sz w:val="20"/>
-        </w:rPr>
-        <w:t xml:space="preserve">Needs GIS: </w:t>
-      </w:r>
-      <w:r>
-        <w:rPr>
-          <w:rFonts w:ascii="Calibri" w:hAnsi="Calibri"/>
-          <w:b w:val="0"/>
-          <w:i/>
-          <w:color w:val="663300"/>
-          <w:sz w:val="20"/>
-        </w:rPr>
-        <w:t>SLOSH surge extents confirmed as MIRR data source. Spatial overlay of substation locations against Cat 3/5 surge zones needs GIS confirmation — viewable now through NOAA Digital Coast web viewer without ArcGIS.</w:t>
-      </w:r>
-    </w:p>
-    <w:p>
-      <w:pPr>
-        <w:spacing w:before="160" w:after="80"/>
-      </w:pPr>
-      <w:r>
-        <w:rPr>
-          <w:rFonts w:ascii="Calibri" w:hAnsi="Calibri"/>
-          <w:b/>
-          <w:i w:val="0"/>
-          <w:color w:val="376092"/>
-          <w:sz w:val="22"/>
-        </w:rPr>
-        <w:t>Rainfall Flooding and Compound Events — NAS Jacksonville</w:t>
-      </w:r>
-    </w:p>
-    <w:p>
-      <w:pPr>
-        <w:spacing w:after="120"/>
-      </w:pPr>
-      <w:r>
-        <w:rPr>
-          <w:rFonts w:ascii="Calibri" w:hAnsi="Calibri"/>
-          <w:b w:val="0"/>
-          <w:i w:val="0"/>
-          <w:sz w:val="22"/>
-        </w:rPr>
-        <w:t>NAS Jacksonville sits along the St. Johns River floodplain. The NEFRC CDBG flood model confirms 100-year present, 2040, and 2070 rainfall flood scenarios for this area. Compound flooding — where rainfall runoff cannot drain because tidal backflow holds water levels elevated — is a confirmed and increasing risk in coastal Duval County. Roosevelt Boulevard and US-17, the primary restoration access corridors for NAS JAX, run through this terrain.</w:t>
-      </w:r>
-    </w:p>
-    <w:p>
-      <w:pPr>
-        <w:spacing w:after="120"/>
-        <w:ind w:left="432" w:right="432"/>
-        <w:shd w:val="clear" w:color="auto" w:fill="FFF4E5"/>
-      </w:pPr>
-      <w:r>
-        <w:rPr>
-          <w:rFonts w:ascii="Calibri" w:hAnsi="Calibri"/>
-          <w:b/>
-          <w:i w:val="0"/>
-          <w:color w:val="663300"/>
-          <w:sz w:val="20"/>
-        </w:rPr>
-        <w:t xml:space="preserve">Needs GIS: </w:t>
-      </w:r>
-      <w:r>
-        <w:rPr>
-          <w:rFonts w:ascii="Calibri" w:hAnsi="Calibri"/>
-          <w:b w:val="0"/>
-          <w:i/>
-          <w:color w:val="663300"/>
-          <w:sz w:val="20"/>
-        </w:rPr>
-        <w:t>CDBG compound flood model is a confirmed MIRR data source. Road corridor intersection with flood zones needs GIS overlay.</w:t>
-      </w:r>
-    </w:p>
-    <w:p>
-      <w:pPr>
-        <w:spacing w:before="160" w:after="80"/>
-      </w:pPr>
-      <w:r>
-        <w:rPr>
-          <w:rFonts w:ascii="Calibri" w:hAnsi="Calibri"/>
-          <w:b/>
-          <w:i w:val="0"/>
-          <w:color w:val="376092"/>
-          <w:sz w:val="22"/>
-        </w:rPr>
-        <w:t>Wildfire — Camp Blanding Transmission Corridor</w:t>
-      </w:r>
-    </w:p>
-    <w:p>
-      <w:pPr>
-        <w:spacing w:after="120"/>
-      </w:pPr>
-      <w:r>
-        <w:rPr>
-          <w:rFonts w:ascii="Calibri" w:hAnsi="Calibri"/>
-          <w:b w:val="0"/>
-          <w:i w:val="0"/>
-          <w:sz w:val="22"/>
-        </w:rPr>
-        <w:t>Camp Blanding's 73,000 acres sit within Florida's wildland-urban interface in Clay County. The FPL transmission corridor serving the base runs through scrub and longleaf pine terrain confirmed as wildfire-exposed by USDA Forest Service data cited in the MIRR. Unlike storm events, wildfire can cut the transmission corridor without weather warning and during periods of clear operational tempo — making it a distinct and unpredictable trigger for the redundancy gap.</w:t>
-      </w:r>
-    </w:p>
-    <w:p>
-      <w:pPr>
-        <w:spacing w:after="120"/>
-        <w:ind w:left="432" w:right="432"/>
-        <w:shd w:val="clear" w:color="auto" w:fill="FFF4E5"/>
-      </w:pPr>
-      <w:r>
-        <w:rPr>
-          <w:rFonts w:ascii="Calibri" w:hAnsi="Calibri"/>
-          <w:b/>
-          <w:i w:val="0"/>
-          <w:color w:val="663300"/>
-          <w:sz w:val="20"/>
-        </w:rPr>
-        <w:t xml:space="preserve">Needs GIS: </w:t>
-      </w:r>
-      <w:r>
-        <w:rPr>
-          <w:rFonts w:ascii="Calibri" w:hAnsi="Calibri"/>
-          <w:b w:val="0"/>
-          <w:i/>
-          <w:color w:val="663300"/>
-          <w:sz w:val="20"/>
-        </w:rPr>
-        <w:t>USDA FS wildfire hazard is a confirmed MIRR data source. Spatial extent of wildfire hazard along the specific FPL corridor to Blanding needs GIS overlay.</w:t>
-      </w:r>
-    </w:p>
-    <w:p>
-      <w:pPr>
-        <w:spacing w:before="280" w:after="80"/>
-      </w:pPr>
-      <w:r>
-        <w:rPr>
-          <w:rFonts w:ascii="Calibri" w:hAnsi="Calibri"/>
-          <w:b/>
-          <w:i w:val="0"/>
-          <w:color w:val="1F497D"/>
-          <w:sz w:val="26"/>
-        </w:rPr>
-        <w:t>2.4  Historical Events — Evidence the Risk Is Real</w:t>
-      </w:r>
-    </w:p>
-    <w:p>
-      <w:pPr>
-        <w:spacing w:after="120"/>
-      </w:pPr>
-      <w:r>
-        <w:rPr>
-          <w:rFonts w:ascii="Calibri" w:hAnsi="Calibri"/>
-          <w:b w:val="0"/>
-          <w:i w:val="0"/>
-          <w:sz w:val="22"/>
-        </w:rPr>
-        <w:t>The following events document that the hazards identified above have occurred in this specific region and caused the types of disruption the redundancy gap makes dangerous. Items confirmed in MIRR documents are labeled. Items from public record that need primary source citation before use in a formal deliverable are labeled separately.</w:t>
-      </w:r>
-    </w:p>
-    <w:p>
-      <w:pPr>
-        <w:spacing w:before="160" w:after="80"/>
-      </w:pPr>
-      <w:r>
-        <w:rPr>
-          <w:rFonts w:ascii="Calibri" w:hAnsi="Calibri"/>
-          <w:b/>
-          <w:i w:val="0"/>
-          <w:color w:val="376092"/>
-          <w:sz w:val="22"/>
+          <w:sz w:val="21"/>
         </w:rPr>
         <w:t>Confirmed in MIRR Documents</w:t>
       </w:r>
@@ -1575,15 +1641,15 @@
     <w:p>
       <w:pPr>
         <w:pStyle w:val="ListBullet"/>
-        <w:spacing w:after="80"/>
-        <w:ind w:left="360"/>
+        <w:spacing w:after="60"/>
+        <w:ind w:left="288"/>
       </w:pPr>
       <w:r>
         <w:rPr>
           <w:rFonts w:ascii="Calibri" w:hAnsi="Calibri"/>
           <w:b/>
           <w:i w:val="0"/>
-          <w:sz w:val="22"/>
+          <w:sz w:val="21"/>
         </w:rPr>
         <w:t xml:space="preserve">NS Mayport — recurring flooding: </w:t>
       </w:r>
@@ -1592,23 +1658,23 @@
           <w:rFonts w:ascii="Calibri" w:hAnsi="Calibri"/>
           <w:b w:val="0"/>
           <w:i w:val="0"/>
-          <w:sz w:val="22"/>
+          <w:sz w:val="21"/>
         </w:rPr>
-        <w:t>Multiple flooding events per year confirmed as the commanding officer's most pressing operational concern. (MIRR Stakeholder Workshop 1 Summary V2)</w:t>
+        <w:t>Multiple flooding events per year. Commanding officer cited as most pressing operational concern. (Stakeholder Workshop 1 Summary V2)</w:t>
       </w:r>
     </w:p>
     <w:p>
       <w:pPr>
         <w:pStyle w:val="ListBullet"/>
-        <w:spacing w:after="80"/>
-        <w:ind w:left="360"/>
+        <w:spacing w:after="60"/>
+        <w:ind w:left="288"/>
       </w:pPr>
       <w:r>
         <w:rPr>
           <w:rFonts w:ascii="Calibri" w:hAnsi="Calibri"/>
           <w:b/>
           <w:i w:val="0"/>
-          <w:sz w:val="22"/>
+          <w:sz w:val="21"/>
         </w:rPr>
         <w:t xml:space="preserve">NAS Jacksonville — 106 mph wind gust, 1997: </w:t>
       </w:r>
@@ -1617,48 +1683,48 @@
           <w:rFonts w:ascii="Calibri" w:hAnsi="Calibri"/>
           <w:b w:val="0"/>
           <w:i w:val="0"/>
-          <w:sz w:val="22"/>
+          <w:sz w:val="21"/>
         </w:rPr>
-        <w:t>Confirmed in MIRR evaluation methodology as documented regional wind event. Establishes hurricane-force wind as a demonstrated, not theoretical, hazard.</w:t>
+        <w:t>Documented in MIRR evaluation methodology. Establishes hurricane-force wind as a demonstrated regional hazard.</w:t>
       </w:r>
     </w:p>
     <w:p>
       <w:pPr>
         <w:pStyle w:val="ListBullet"/>
-        <w:spacing w:after="80"/>
-        <w:ind w:left="360"/>
+        <w:spacing w:after="60"/>
+        <w:ind w:left="288"/>
       </w:pPr>
       <w:r>
         <w:rPr>
           <w:rFonts w:ascii="Calibri" w:hAnsi="Calibri"/>
           <w:b/>
           <w:i w:val="0"/>
-          <w:sz w:val="22"/>
+          <w:sz w:val="21"/>
         </w:rPr>
-        <w:t xml:space="preserve">MCSF Blount Island — active water intrusion: </w:t>
+        <w:t xml:space="preserve">Blount Island — active water intrusion: </w:t>
       </w:r>
       <w:r>
         <w:rPr>
           <w:rFonts w:ascii="Calibri" w:hAnsi="Calibri"/>
           <w:b w:val="0"/>
           <w:i w:val="0"/>
-          <w:sz w:val="22"/>
+          <w:sz w:val="21"/>
         </w:rPr>
-        <w:t>Water intrusion already threatening electrical systems confirmed in Kickoff Briefing, April 2025. This is ongoing degradation, not a past event.</w:t>
+        <w:t>Water intrusion already threatening electrical systems. Current ongoing degradation, not a future scenario. (Kickoff Briefing, April 2025)</w:t>
       </w:r>
     </w:p>
     <w:p>
       <w:pPr>
         <w:pStyle w:val="ListBullet"/>
-        <w:spacing w:after="80"/>
-        <w:ind w:left="360"/>
+        <w:spacing w:after="60"/>
+        <w:ind w:left="288"/>
       </w:pPr>
       <w:r>
         <w:rPr>
           <w:rFonts w:ascii="Calibri" w:hAnsi="Calibri"/>
           <w:b/>
           <w:i w:val="0"/>
-          <w:sz w:val="22"/>
+          <w:sz w:val="21"/>
         </w:rPr>
         <w:t xml:space="preserve">Tyndall AFB — Hurricane Michael, 2018: </w:t>
       </w:r>
@@ -1667,14 +1733,40 @@
           <w:rFonts w:ascii="Calibri" w:hAnsi="Calibri"/>
           <w:b w:val="0"/>
           <w:i w:val="0"/>
-          <w:sz w:val="22"/>
+          <w:sz w:val="21"/>
         </w:rPr>
-        <w:t>Confirmed in APTIM memo Section 1.1. On-base hardening proved insufficient when surrounding utilities, roads, and civilian infrastructure failed. Established the regional dependency lesson that frames this entire assessment.</w:t>
+        <w:t>On-base hardening proved insufficient when surrounding utilities and roads failed. Established the regional dependency lesson. (APTIM memo, Section 1.1)</w:t>
       </w:r>
     </w:p>
     <w:p>
       <w:pPr>
-        <w:spacing w:before="160" w:after="80"/>
+        <w:spacing w:after="100"/>
+        <w:ind w:left="360"/>
+      </w:pPr>
+      <w:r>
+        <w:rPr>
+          <w:rFonts w:ascii="Calibri" w:hAnsi="Calibri"/>
+          <w:b/>
+          <w:i w:val="0"/>
+          <w:color w:val="006100"/>
+          <w:sz w:val="19"/>
+        </w:rPr>
+        <w:t xml:space="preserve">● Confirmed  </w:t>
+      </w:r>
+      <w:r>
+        <w:rPr>
+          <w:rFonts w:ascii="Calibri" w:hAnsi="Calibri"/>
+          <w:b w:val="0"/>
+          <w:i/>
+          <w:color w:val="595959"/>
+          <w:sz w:val="19"/>
+        </w:rPr>
+        <w:t>All four items sourced to confirmed MIRR project documents.</w:t>
+      </w:r>
+    </w:p>
+    <w:p>
+      <w:pPr>
+        <w:spacing w:before="200" w:after="40"/>
       </w:pPr>
       <w:r>
         <w:rPr>
@@ -1682,29 +1774,68 @@
           <w:b/>
           <w:i w:val="0"/>
           <w:color w:val="376092"/>
-          <w:sz w:val="22"/>
+          <w:sz w:val="21"/>
         </w:rPr>
         <w:t>From Public Record — Needs Primary Source Before Formal Use</w:t>
       </w:r>
     </w:p>
     <w:p>
       <w:pPr>
-        <w:spacing w:after="120"/>
+        <w:pStyle w:val="ListBullet"/>
+        <w:spacing w:after="60"/>
+        <w:ind w:left="288"/>
       </w:pPr>
+      <w:r>
+        <w:rPr>
+          <w:rFonts w:ascii="Calibri" w:hAnsi="Calibri"/>
+          <w:b/>
+          <w:i w:val="0"/>
+          <w:sz w:val="21"/>
+        </w:rPr>
+        <w:t xml:space="preserve">Hurricane Matthew, October 2016 — </w:t>
+      </w:r>
       <w:r>
         <w:rPr>
           <w:rFonts w:ascii="Calibri" w:hAnsi="Calibri"/>
           <w:b w:val="0"/>
           <w:i w:val="0"/>
-          <w:sz w:val="22"/>
+          <w:sz w:val="21"/>
         </w:rPr>
-        <w:t>The following events are well-documented in public records and directly relevant to this project. They should be verified through the sources listed before being cited in any client-facing document.</w:t>
+        <w:t>Historic St. Johns River flooding in Jacksonville. A1A flooded. JEA reported widespread Duval County outages.</w:t>
+        <w:br/>
+        <w:t xml:space="preserve">         Verify: NOAA NHC report AL142016, Florida PSC JEA storm filing, NOAA Storm Events Database (Duval, Oct 2016)</w:t>
       </w:r>
     </w:p>
     <w:p>
       <w:pPr>
         <w:pStyle w:val="ListBullet"/>
-        <w:spacing w:after="80"/>
+        <w:spacing w:after="60"/>
+        <w:ind w:left="288"/>
+      </w:pPr>
+      <w:r>
+        <w:rPr>
+          <w:rFonts w:ascii="Calibri" w:hAnsi="Calibri"/>
+          <w:b/>
+          <w:i w:val="0"/>
+          <w:sz w:val="21"/>
+        </w:rPr>
+        <w:t xml:space="preserve">Hurricane Irma, September 2017 — </w:t>
+      </w:r>
+      <w:r>
+        <w:rPr>
+          <w:rFonts w:ascii="Calibri" w:hAnsi="Calibri"/>
+          <w:b w:val="0"/>
+          <w:i w:val="0"/>
+          <w:sz w:val="21"/>
+        </w:rPr>
+        <w:t>JEA reported 200,000+ customers without power at peak across Jacksonville.</w:t>
+        <w:br/>
+        <w:t xml:space="preserve">         Verify: NOAA NHC report AL112017, Florida PSC JEA storm filing, FEMA declaration DR-4337</w:t>
+      </w:r>
+    </w:p>
+    <w:p>
+      <w:pPr>
+        <w:spacing w:after="100"/>
         <w:ind w:left="360"/>
       </w:pPr>
       <w:r>
@@ -1712,79 +1843,28 @@
           <w:rFonts w:ascii="Calibri" w:hAnsi="Calibri"/>
           <w:b/>
           <w:i w:val="0"/>
-          <w:sz w:val="22"/>
+          <w:color w:val="780000"/>
+          <w:sz w:val="19"/>
         </w:rPr>
-        <w:t xml:space="preserve">Hurricane Matthew, October 2016: </w:t>
-      </w:r>
-      <w:r>
-        <w:rPr>
-          <w:rFonts w:ascii="Calibri" w:hAnsi="Calibri"/>
-          <w:b w:val="0"/>
-          <w:i w:val="0"/>
-          <w:sz w:val="22"/>
-        </w:rPr>
-        <w:t>Made near-landfall north of Jacksonville. Caused historic St. Johns River flooding described as the worst in decades. A1A — NS Mayport's primary access corridor — flooded significantly. JEA reported widespread Duval County outages.</w:t>
-        <w:br/>
-        <w:t xml:space="preserve">     Verify through: NOAA NHC post-storm report, Florida PSC JEA storm filing, NOAA Storm Events Database (Duval County, October 2016)</w:t>
-      </w:r>
-    </w:p>
-    <w:p>
-      <w:pPr>
-        <w:pStyle w:val="ListBullet"/>
-        <w:spacing w:after="80"/>
-        <w:ind w:left="360"/>
-      </w:pPr>
-      <w:r>
-        <w:rPr>
-          <w:rFonts w:ascii="Calibri" w:hAnsi="Calibri"/>
-          <w:b/>
-          <w:i w:val="0"/>
-          <w:sz w:val="22"/>
-        </w:rPr>
-        <w:t xml:space="preserve">Hurricane Irma, September 2017: </w:t>
-      </w:r>
-      <w:r>
-        <w:rPr>
-          <w:rFonts w:ascii="Calibri" w:hAnsi="Calibri"/>
-          <w:b w:val="0"/>
-          <w:i w:val="0"/>
-          <w:sz w:val="22"/>
-        </w:rPr>
-        <w:t>JEA reported over 200,000 customers without power at peak across Jacksonville. Demonstrates regional grid vulnerability to storms tracking up the peninsula.</w:t>
-        <w:br/>
-        <w:t xml:space="preserve">     Verify through: NOAA NHC post-storm report, Florida PSC JEA storm filing, FEMA disaster declaration FL-4337</w:t>
-      </w:r>
-    </w:p>
-    <w:p>
-      <w:pPr>
-        <w:spacing w:after="120"/>
-        <w:ind w:left="432" w:right="432"/>
-        <w:shd w:val="clear" w:color="auto" w:fill="FFF0F0"/>
-      </w:pPr>
-      <w:r>
-        <w:rPr>
-          <w:rFonts w:ascii="Calibri" w:hAnsi="Calibri"/>
-          <w:b/>
-          <w:i w:val="0"/>
-          <w:color w:val="780000"/>
-          <w:sz w:val="20"/>
-        </w:rPr>
-        <w:t xml:space="preserve">Needs verification: </w:t>
+        <w:t xml:space="preserve">○ Needs verification  </w:t>
       </w:r>
       <w:r>
         <w:rPr>
           <w:rFonts w:ascii="Calibri" w:hAnsi="Calibri"/>
           <w:b w:val="0"/>
           <w:i/>
-          <w:color w:val="780000"/>
-          <w:sz w:val="20"/>
+          <w:color w:val="595959"/>
+          <w:sz w:val="19"/>
         </w:rPr>
-        <w:t>Until Matthew and Irma outage data is pulled from Florida PSC filings and NOAA NHC reports, these should not be stated as confirmed findings in client documents. They are included here as research direction.</w:t>
+        <w:t>Do not cite Matthew or Irma in formal deliverables until PSC filings and NHC reports are pulled.</w:t>
       </w:r>
     </w:p>
     <w:p>
       <w:pPr>
-        <w:spacing w:before="280" w:after="80"/>
+        <w:spacing w:before="320" w:after="40"/>
+        <w:pBdr>
+          <w:bottom w:val="single" w:sz="4" w:space="1" w:color="1F497D"/>
+        </w:pBdr>
       </w:pPr>
       <w:r>
         <w:rPr>
@@ -1792,23 +1872,24 @@
           <w:b/>
           <w:i w:val="0"/>
           <w:color w:val="1F497D"/>
-          <w:sz w:val="26"/>
+          <w:sz w:val="22"/>
         </w:rPr>
-        <w:t>2.5  What GIS Will Confirm — Specific Analyses Planned</w:t>
+        <w:t>2.5  GIS ANALYSES PLANNED</w:t>
       </w:r>
     </w:p>
     <w:p>
       <w:pPr>
-        <w:spacing w:after="120"/>
+        <w:spacing w:after="100"/>
       </w:pPr>
       <w:r>
         <w:rPr>
           <w:rFonts w:ascii="Calibri" w:hAnsi="Calibri"/>
           <w:b w:val="0"/>
           <w:i w:val="0"/>
-          <w:sz w:val="22"/>
+          <w:color w:val="000000"/>
+          <w:sz w:val="21"/>
         </w:rPr>
-        <w:t>GIS does not create the vulnerabilities documented above — the MIRR has already confirmed those qualitatively. GIS will spatially verify, quantify, and visually communicate each finding. The following table lists the specific analyses planned and the datasets required.</w:t>
+        <w:t>The following will spatially confirm and quantify the vulnerabilities documented above.</w:t>
       </w:r>
     </w:p>
     <w:tbl>
@@ -1818,33 +1899,26 @@
         <w:tblLook w:firstColumn="1" w:firstRow="1" w:lastColumn="0" w:lastRow="0" w:noHBand="0" w:noVBand="1" w:val="04A0"/>
       </w:tblPr>
       <w:tblGrid>
-        <w:gridCol w:w="2160"/>
-        <w:gridCol w:w="2160"/>
-        <w:gridCol w:w="2160"/>
-        <w:gridCol w:w="2160"/>
+        <w:gridCol w:w="2928"/>
+        <w:gridCol w:w="2928"/>
+        <w:gridCol w:w="2928"/>
       </w:tblGrid>
       <w:tr>
         <w:tc>
           <w:tcPr>
-            <w:tcW w:type="dxa" w:w="2160"/>
+            <w:tcW w:type="dxa" w:w="2928"/>
           </w:tcPr>
           <w:p/>
         </w:tc>
         <w:tc>
           <w:tcPr>
-            <w:tcW w:type="dxa" w:w="2160"/>
+            <w:tcW w:type="dxa" w:w="2928"/>
           </w:tcPr>
           <w:p/>
         </w:tc>
         <w:tc>
           <w:tcPr>
-            <w:tcW w:type="dxa" w:w="2160"/>
-          </w:tcPr>
-          <w:p/>
-        </w:tc>
-        <w:tc>
-          <w:tcPr>
-            <w:tcW w:type="dxa" w:w="2160"/>
+            <w:tcW w:type="dxa" w:w="2928"/>
           </w:tcPr>
           <w:p/>
         </w:tc>
@@ -1852,12 +1926,12 @@
       <w:tr>
         <w:tc>
           <w:tcPr>
-            <w:tcW w:type="dxa" w:w="2160"/>
+            <w:tcW w:type="dxa" w:w="2928"/>
             <w:shd w:val="clear" w:color="auto" w:fill="1F497D"/>
           </w:tcPr>
           <w:p>
             <w:pPr>
-              <w:spacing w:after="40"/>
+              <w:spacing w:after="20"/>
             </w:pPr>
             <w:r/>
             <w:r>
@@ -1874,12 +1948,12 @@
         </w:tc>
         <w:tc>
           <w:tcPr>
-            <w:tcW w:type="dxa" w:w="2160"/>
+            <w:tcW w:type="dxa" w:w="2928"/>
             <w:shd w:val="clear" w:color="auto" w:fill="1F497D"/>
           </w:tcPr>
           <w:p>
             <w:pPr>
-              <w:spacing w:after="40"/>
+              <w:spacing w:after="20"/>
             </w:pPr>
             <w:r/>
             <w:r>
@@ -1890,18 +1964,18 @@
                 <w:color w:val="FFFFFF"/>
                 <w:sz w:val="19"/>
               </w:rPr>
-              <w:t>Datasets</w:t>
+              <w:t>Primary Dataset / Source</w:t>
             </w:r>
           </w:p>
         </w:tc>
         <w:tc>
           <w:tcPr>
-            <w:tcW w:type="dxa" w:w="2160"/>
+            <w:tcW w:type="dxa" w:w="2928"/>
             <w:shd w:val="clear" w:color="auto" w:fill="1F497D"/>
           </w:tcPr>
           <w:p>
             <w:pPr>
-              <w:spacing w:after="40"/>
+              <w:spacing w:after="20"/>
             </w:pPr>
             <w:r/>
             <w:r>
@@ -1912,29 +1986,7 @@
                 <w:color w:val="FFFFFF"/>
                 <w:sz w:val="19"/>
               </w:rPr>
-              <w:t>Source</w:t>
-            </w:r>
-          </w:p>
-        </w:tc>
-        <w:tc>
-          <w:tcPr>
-            <w:tcW w:type="dxa" w:w="2160"/>
-            <w:shd w:val="clear" w:color="auto" w:fill="1F497D"/>
-          </w:tcPr>
-          <w:p>
-            <w:pPr>
-              <w:spacing w:after="40"/>
-            </w:pPr>
-            <w:r/>
-            <w:r>
-              <w:rPr>
-                <w:rFonts w:ascii="Calibri" w:hAnsi="Calibri"/>
-                <w:b/>
-                <w:i w:val="0"/>
-                <w:color w:val="FFFFFF"/>
-                <w:sz w:val="19"/>
-              </w:rPr>
-              <w:t>What It Confirms</w:t>
+              <w:t>What It Will Confirm</w:t>
             </w:r>
           </w:p>
         </w:tc>
@@ -1942,11 +1994,11 @@
       <w:tr>
         <w:tc>
           <w:tcPr>
-            <w:tcW w:type="dxa" w:w="2160"/>
+            <w:tcW w:type="dxa" w:w="2928"/>
           </w:tcPr>
           <w:p>
             <w:pPr>
-              <w:spacing w:after="40"/>
+              <w:spacing w:after="20"/>
             </w:pPr>
             <w:r/>
             <w:r>
@@ -1957,16 +2009,18 @@
                 <w:sz w:val="19"/>
               </w:rPr>
               <w:t>Substation locations vs. surge zones</w:t>
+              <w:br/>
+              <w:t>(check FEMA effective and preliminary maps)</w:t>
             </w:r>
           </w:p>
         </w:tc>
         <w:tc>
           <w:tcPr>
-            <w:tcW w:type="dxa" w:w="2160"/>
+            <w:tcW w:type="dxa" w:w="2928"/>
           </w:tcPr>
           <w:p>
             <w:pPr>
-              <w:spacing w:after="40"/>
+              <w:spacing w:after="20"/>
             </w:pPr>
             <w:r/>
             <w:r>
@@ -1976,17 +2030,19 @@
                 <w:i w:val="0"/>
                 <w:sz w:val="19"/>
               </w:rPr>
-              <w:t>HIFLD substations, NHC SLOSH Cat 3/5</w:t>
+              <w:t>HIFLD substations; NHC SLOSH</w:t>
+              <w:br/>
+              <w:t>FEMA MSC (both versions)</w:t>
             </w:r>
           </w:p>
         </w:tc>
         <w:tc>
           <w:tcPr>
-            <w:tcW w:type="dxa" w:w="2160"/>
+            <w:tcW w:type="dxa" w:w="2928"/>
           </w:tcPr>
           <w:p>
             <w:pPr>
-              <w:spacing w:after="40"/>
+              <w:spacing w:after="20"/>
             </w:pPr>
             <w:r/>
             <w:r>
@@ -1996,27 +2052,7 @@
                 <w:i w:val="0"/>
                 <w:sz w:val="19"/>
               </w:rPr>
-              <w:t>HIFLD Open; NOAA Digital Coast</w:t>
-            </w:r>
-          </w:p>
-        </w:tc>
-        <w:tc>
-          <w:tcPr>
-            <w:tcW w:type="dxa" w:w="2160"/>
-          </w:tcPr>
-          <w:p>
-            <w:pPr>
-              <w:spacing w:after="40"/>
-            </w:pPr>
-            <w:r/>
-            <w:r>
-              <w:rPr>
-                <w:rFonts w:ascii="Calibri" w:hAnsi="Calibri"/>
-                <w:b w:val="0"/>
-                <w:i w:val="0"/>
-                <w:sz w:val="19"/>
-              </w:rPr>
-              <w:t>Which substations fall within confirmed surge extents</w:t>
+              <w:t>Which substations fall within Cat 3/5 surge; whether preliminary maps show higher risk than effective</w:t>
             </w:r>
           </w:p>
         </w:tc>
@@ -2024,93 +2060,12 @@
       <w:tr>
         <w:tc>
           <w:tcPr>
-            <w:tcW w:type="dxa" w:w="2160"/>
+            <w:tcW w:type="dxa" w:w="2928"/>
+            <w:shd w:val="clear" w:color="auto" w:fill="F2F5FA"/>
           </w:tcPr>
           <w:p>
             <w:pPr>
-              <w:spacing w:after="40"/>
-            </w:pPr>
-            <w:r/>
-            <w:r>
-              <w:rPr>
-                <w:rFonts w:ascii="Calibri" w:hAnsi="Calibri"/>
-                <w:b w:val="0"/>
-                <w:i w:val="0"/>
-                <w:sz w:val="19"/>
-              </w:rPr>
-              <w:t>FEMA flood zones — effective vs. preliminary</w:t>
-            </w:r>
-          </w:p>
-        </w:tc>
-        <w:tc>
-          <w:tcPr>
-            <w:tcW w:type="dxa" w:w="2160"/>
-          </w:tcPr>
-          <w:p>
-            <w:pPr>
-              <w:spacing w:after="40"/>
-            </w:pPr>
-            <w:r/>
-            <w:r>
-              <w:rPr>
-                <w:rFonts w:ascii="Calibri" w:hAnsi="Calibri"/>
-                <w:b w:val="0"/>
-                <w:i w:val="0"/>
-                <w:sz w:val="19"/>
-              </w:rPr>
-              <w:t>FEMA NFHL effective maps; FEMA preliminary maps where updated</w:t>
-            </w:r>
-          </w:p>
-        </w:tc>
-        <w:tc>
-          <w:tcPr>
-            <w:tcW w:type="dxa" w:w="2160"/>
-          </w:tcPr>
-          <w:p>
-            <w:pPr>
-              <w:spacing w:after="40"/>
-            </w:pPr>
-            <w:r/>
-            <w:r>
-              <w:rPr>
-                <w:rFonts w:ascii="Calibri" w:hAnsi="Calibri"/>
-                <w:b w:val="0"/>
-                <w:i w:val="0"/>
-                <w:sz w:val="19"/>
-              </w:rPr>
-              <w:t>FEMA Flood Map Service Center</w:t>
-            </w:r>
-          </w:p>
-        </w:tc>
-        <w:tc>
-          <w:tcPr>
-            <w:tcW w:type="dxa" w:w="2160"/>
-          </w:tcPr>
-          <w:p>
-            <w:pPr>
-              <w:spacing w:after="40"/>
-            </w:pPr>
-            <w:r/>
-            <w:r>
-              <w:rPr>
-                <w:rFonts w:ascii="Calibri" w:hAnsi="Calibri"/>
-                <w:b w:val="0"/>
-                <w:i w:val="0"/>
-                <w:sz w:val="19"/>
-              </w:rPr>
-              <w:t>Whether flood zone designations near substations have been updated in preliminary maps — preliminary maps often show higher risk than effective</w:t>
-            </w:r>
-          </w:p>
-        </w:tc>
-      </w:tr>
-      <w:tr>
-        <w:tc>
-          <w:tcPr>
-            <w:tcW w:type="dxa" w:w="2160"/>
-          </w:tcPr>
-          <w:p>
-            <w:pPr>
-              <w:spacing w:after="40"/>
+              <w:spacing w:after="20"/>
             </w:pPr>
             <w:r/>
             <w:r>
@@ -2126,11 +2081,12 @@
         </w:tc>
         <w:tc>
           <w:tcPr>
-            <w:tcW w:type="dxa" w:w="2160"/>
+            <w:tcW w:type="dxa" w:w="2928"/>
+            <w:shd w:val="clear" w:color="auto" w:fill="F2F5FA"/>
           </w:tcPr>
           <w:p>
             <w:pPr>
-              <w:spacing w:after="40"/>
+              <w:spacing w:after="20"/>
             </w:pPr>
             <w:r/>
             <w:r>
@@ -2140,37 +2096,20 @@
                 <w:i w:val="0"/>
                 <w:sz w:val="19"/>
               </w:rPr>
-              <w:t>FDOT road network, NEFRC CDBG, FEMA NFHL</w:t>
+              <w:t>FDOT road network; NEFRC CDBG</w:t>
+              <w:br/>
+              <w:t>FEMA NFHL; Resilient Jax</w:t>
             </w:r>
           </w:p>
         </w:tc>
         <w:tc>
           <w:tcPr>
-            <w:tcW w:type="dxa" w:w="2160"/>
+            <w:tcW w:type="dxa" w:w="2928"/>
+            <w:shd w:val="clear" w:color="auto" w:fill="F2F5FA"/>
           </w:tcPr>
           <w:p>
             <w:pPr>
-              <w:spacing w:after="40"/>
-            </w:pPr>
-            <w:r/>
-            <w:r>
-              <w:rPr>
-                <w:rFonts w:ascii="Calibri" w:hAnsi="Calibri"/>
-                <w:b w:val="0"/>
-                <w:i w:val="0"/>
-                <w:sz w:val="19"/>
-              </w:rPr>
-              <w:t>FDOT GIS; FEMA MSC; Resilient Jax</w:t>
-            </w:r>
-          </w:p>
-        </w:tc>
-        <w:tc>
-          <w:tcPr>
-            <w:tcW w:type="dxa" w:w="2160"/>
-          </w:tcPr>
-          <w:p>
-            <w:pPr>
-              <w:spacing w:after="40"/>
+              <w:spacing w:after="20"/>
             </w:pPr>
             <w:r/>
             <w:r>
@@ -2188,11 +2127,11 @@
       <w:tr>
         <w:tc>
           <w:tcPr>
-            <w:tcW w:type="dxa" w:w="2160"/>
+            <w:tcW w:type="dxa" w:w="2928"/>
           </w:tcPr>
           <w:p>
             <w:pPr>
-              <w:spacing w:after="40"/>
+              <w:spacing w:after="20"/>
             </w:pPr>
             <w:r/>
             <w:r>
@@ -2202,17 +2141,17 @@
                 <w:i w:val="0"/>
                 <w:sz w:val="19"/>
               </w:rPr>
-              <w:t>Transmission routing — upstream of each substation</w:t>
+              <w:t>Transmission routing upstream of substations</w:t>
             </w:r>
           </w:p>
         </w:tc>
         <w:tc>
           <w:tcPr>
-            <w:tcW w:type="dxa" w:w="2160"/>
+            <w:tcW w:type="dxa" w:w="2928"/>
           </w:tcPr>
           <w:p>
             <w:pPr>
-              <w:spacing w:after="40"/>
+              <w:spacing w:after="20"/>
             </w:pPr>
             <w:r/>
             <w:r>
@@ -2222,17 +2161,19 @@
                 <w:i w:val="0"/>
                 <w:sz w:val="19"/>
               </w:rPr>
-              <w:t>EIA Form 860, HIFLD transmission lines</w:t>
+              <w:t>EIA Form 860; HIFLD transmission lines</w:t>
+              <w:br/>
+              <w:t>US-17 corridor verification</w:t>
             </w:r>
           </w:p>
         </w:tc>
         <w:tc>
           <w:tcPr>
-            <w:tcW w:type="dxa" w:w="2160"/>
+            <w:tcW w:type="dxa" w:w="2928"/>
           </w:tcPr>
           <w:p>
             <w:pPr>
-              <w:spacing w:after="40"/>
+              <w:spacing w:after="20"/>
             </w:pPr>
             <w:r/>
             <w:r>
@@ -2242,27 +2183,7 @@
                 <w:i w:val="0"/>
                 <w:sz w:val="19"/>
               </w:rPr>
-              <w:t>EIA.gov; HIFLD Open</w:t>
-            </w:r>
-          </w:p>
-        </w:tc>
-        <w:tc>
-          <w:tcPr>
-            <w:tcW w:type="dxa" w:w="2160"/>
-          </w:tcPr>
-          <w:p>
-            <w:pPr>
-              <w:spacing w:after="40"/>
-            </w:pPr>
-            <w:r/>
-            <w:r>
-              <w:rPr>
-                <w:rFonts w:ascii="Calibri" w:hAnsi="Calibri"/>
-                <w:b w:val="0"/>
-                <w:i w:val="0"/>
-                <w:sz w:val="19"/>
-              </w:rPr>
-              <w:t>How many upstream nodes exist and their flood exposure</w:t>
+              <w:t>Upstream node count and flood exposure; confirms or refutes Part 1 US-17 SPOF claim</w:t>
             </w:r>
           </w:p>
         </w:tc>
@@ -2270,93 +2191,12 @@
       <w:tr>
         <w:tc>
           <w:tcPr>
-            <w:tcW w:type="dxa" w:w="2160"/>
+            <w:tcW w:type="dxa" w:w="2928"/>
+            <w:shd w:val="clear" w:color="auto" w:fill="F2F5FA"/>
           </w:tcPr>
           <w:p>
             <w:pPr>
-              <w:spacing w:after="40"/>
-            </w:pPr>
-            <w:r/>
-            <w:r>
-              <w:rPr>
-                <w:rFonts w:ascii="Calibri" w:hAnsi="Calibri"/>
-                <w:b w:val="0"/>
-                <w:i w:val="0"/>
-                <w:sz w:val="19"/>
-              </w:rPr>
-              <w:t>US-17 transmission corridor</w:t>
-            </w:r>
-          </w:p>
-        </w:tc>
-        <w:tc>
-          <w:tcPr>
-            <w:tcW w:type="dxa" w:w="2160"/>
-          </w:tcPr>
-          <w:p>
-            <w:pPr>
-              <w:spacing w:after="40"/>
-            </w:pPr>
-            <w:r/>
-            <w:r>
-              <w:rPr>
-                <w:rFonts w:ascii="Calibri" w:hAnsi="Calibri"/>
-                <w:b w:val="0"/>
-                <w:i w:val="0"/>
-                <w:sz w:val="19"/>
-              </w:rPr>
-              <w:t>EIA / HIFLD transmission lines</w:t>
-            </w:r>
-          </w:p>
-        </w:tc>
-        <w:tc>
-          <w:tcPr>
-            <w:tcW w:type="dxa" w:w="2160"/>
-          </w:tcPr>
-          <w:p>
-            <w:pPr>
-              <w:spacing w:after="40"/>
-            </w:pPr>
-            <w:r/>
-            <w:r>
-              <w:rPr>
-                <w:rFonts w:ascii="Calibri" w:hAnsi="Calibri"/>
-                <w:b w:val="0"/>
-                <w:i w:val="0"/>
-                <w:sz w:val="19"/>
-              </w:rPr>
-              <w:t>HIFLD Open</w:t>
-            </w:r>
-          </w:p>
-        </w:tc>
-        <w:tc>
-          <w:tcPr>
-            <w:tcW w:type="dxa" w:w="2160"/>
-          </w:tcPr>
-          <w:p>
-            <w:pPr>
-              <w:spacing w:after="40"/>
-            </w:pPr>
-            <w:r/>
-            <w:r>
-              <w:rPr>
-                <w:rFonts w:ascii="Calibri" w:hAnsi="Calibri"/>
-                <w:b w:val="0"/>
-                <w:i w:val="0"/>
-                <w:sz w:val="19"/>
-              </w:rPr>
-              <w:t>Whether lines along US-17 serve these installations</w:t>
-            </w:r>
-          </w:p>
-        </w:tc>
-      </w:tr>
-      <w:tr>
-        <w:tc>
-          <w:tcPr>
-            <w:tcW w:type="dxa" w:w="2160"/>
-          </w:tcPr>
-          <w:p>
-            <w:pPr>
-              <w:spacing w:after="40"/>
+              <w:spacing w:after="20"/>
             </w:pPr>
             <w:r/>
             <w:r>
@@ -2372,11 +2212,12 @@
         </w:tc>
         <w:tc>
           <w:tcPr>
-            <w:tcW w:type="dxa" w:w="2160"/>
+            <w:tcW w:type="dxa" w:w="2928"/>
+            <w:shd w:val="clear" w:color="auto" w:fill="F2F5FA"/>
           </w:tcPr>
           <w:p>
             <w:pPr>
-              <w:spacing w:after="40"/>
+              <w:spacing w:after="20"/>
             </w:pPr>
             <w:r/>
             <w:r>
@@ -2386,37 +2227,20 @@
                 <w:i w:val="0"/>
                 <w:sz w:val="19"/>
               </w:rPr>
-              <w:t>USDA FS wildfire hazard, EIA lines</w:t>
+              <w:t>USDA FS Wildfire Hazard Potential</w:t>
+              <w:br/>
+              <w:t>HIFLD transmission lines</w:t>
             </w:r>
           </w:p>
         </w:tc>
         <w:tc>
           <w:tcPr>
-            <w:tcW w:type="dxa" w:w="2160"/>
+            <w:tcW w:type="dxa" w:w="2928"/>
+            <w:shd w:val="clear" w:color="auto" w:fill="F2F5FA"/>
           </w:tcPr>
           <w:p>
             <w:pPr>
-              <w:spacing w:after="40"/>
-            </w:pPr>
-            <w:r/>
-            <w:r>
-              <w:rPr>
-                <w:rFonts w:ascii="Calibri" w:hAnsi="Calibri"/>
-                <w:b w:val="0"/>
-                <w:i w:val="0"/>
-                <w:sz w:val="19"/>
-              </w:rPr>
-              <w:t>USDA FS Research Data; HIFLD</w:t>
-            </w:r>
-          </w:p>
-        </w:tc>
-        <w:tc>
-          <w:tcPr>
-            <w:tcW w:type="dxa" w:w="2160"/>
-          </w:tcPr>
-          <w:p>
-            <w:pPr>
-              <w:spacing w:after="40"/>
+              <w:spacing w:after="20"/>
             </w:pPr>
             <w:r/>
             <w:r>
@@ -2434,11 +2258,11 @@
       <w:tr>
         <w:tc>
           <w:tcPr>
-            <w:tcW w:type="dxa" w:w="2160"/>
+            <w:tcW w:type="dxa" w:w="2928"/>
           </w:tcPr>
           <w:p>
             <w:pPr>
-              <w:spacing w:after="40"/>
+              <w:spacing w:after="20"/>
             </w:pPr>
             <w:r/>
             <w:r>
@@ -2448,17 +2272,17 @@
                 <w:i w:val="0"/>
                 <w:sz w:val="19"/>
               </w:rPr>
-              <w:t>Water table depth at substation locations</w:t>
+              <w:t>Water table at substation locations</w:t>
             </w:r>
           </w:p>
         </w:tc>
         <w:tc>
           <w:tcPr>
-            <w:tcW w:type="dxa" w:w="2160"/>
+            <w:tcW w:type="dxa" w:w="2928"/>
           </w:tcPr>
           <w:p>
             <w:pPr>
-              <w:spacing w:after="40"/>
+              <w:spacing w:after="20"/>
             </w:pPr>
             <w:r/>
             <w:r>
@@ -2468,17 +2292,19 @@
                 <w:i w:val="0"/>
                 <w:sz w:val="19"/>
               </w:rPr>
-              <w:t>USGS groundwater data, SJRWMD</w:t>
+              <w:t>USGS National Map / 3DEP</w:t>
+              <w:br/>
+              <w:t>SJRWMD groundwater data</w:t>
             </w:r>
           </w:p>
         </w:tc>
         <w:tc>
           <w:tcPr>
-            <w:tcW w:type="dxa" w:w="2160"/>
+            <w:tcW w:type="dxa" w:w="2928"/>
           </w:tcPr>
           <w:p>
             <w:pPr>
-              <w:spacing w:after="40"/>
+              <w:spacing w:after="20"/>
             </w:pPr>
             <w:r/>
             <w:r>
@@ -2488,17 +2314,20 @@
                 <w:i w:val="0"/>
                 <w:sz w:val="19"/>
               </w:rPr>
-              <w:t>USGS National Map; SJRWMD portal</w:t>
+              <w:t>Undergrounding feasibility constraints at each site</w:t>
             </w:r>
           </w:p>
         </w:tc>
+      </w:tr>
+      <w:tr>
         <w:tc>
           <w:tcPr>
-            <w:tcW w:type="dxa" w:w="2160"/>
+            <w:tcW w:type="dxa" w:w="2928"/>
+            <w:shd w:val="clear" w:color="auto" w:fill="F2F5FA"/>
           </w:tcPr>
           <w:p>
             <w:pPr>
-              <w:spacing w:after="40"/>
+              <w:spacing w:after="20"/>
             </w:pPr>
             <w:r/>
             <w:r>
@@ -2508,59 +2337,18 @@
                 <w:i w:val="0"/>
                 <w:sz w:val="19"/>
               </w:rPr>
-              <w:t>Feasibility constraints for undergrounding at each site</w:t>
-            </w:r>
-          </w:p>
-        </w:tc>
-      </w:tr>
-      <w:tr>
-        <w:tc>
-          <w:tcPr>
-            <w:tcW w:type="dxa" w:w="2160"/>
-          </w:tcPr>
-          <w:p>
-            <w:pPr>
-              <w:spacing w:after="40"/>
-            </w:pPr>
-            <w:r/>
-            <w:r>
-              <w:rPr>
-                <w:rFonts w:ascii="Calibri" w:hAnsi="Calibri"/>
-                <w:b w:val="0"/>
-                <w:i w:val="0"/>
-                <w:sz w:val="19"/>
-              </w:rPr>
-              <w:t>Coastal infrastructure damage estimates — Mayport and Blount Island</w:t>
+              <w:t>Coastal damage estimates — Mayport and Blount Island</w:t>
             </w:r>
           </w:p>
         </w:tc>
         <w:tc>
           <w:tcPr>
-            <w:tcW w:type="dxa" w:w="2160"/>
+            <w:tcW w:type="dxa" w:w="2928"/>
+            <w:shd w:val="clear" w:color="auto" w:fill="F2F5FA"/>
           </w:tcPr>
           <w:p>
             <w:pPr>
-              <w:spacing w:after="40"/>
-            </w:pPr>
-            <w:r/>
-            <w:r>
-              <w:rPr>
-                <w:rFonts w:ascii="Calibri" w:hAnsi="Calibri"/>
-                <w:b w:val="0"/>
-                <w:i w:val="0"/>
-                <w:sz w:val="19"/>
-              </w:rPr>
-              <w:t>Army Corps of Engineers coastal damage models</w:t>
-            </w:r>
-          </w:p>
-        </w:tc>
-        <w:tc>
-          <w:tcPr>
-            <w:tcW w:type="dxa" w:w="2160"/>
-          </w:tcPr>
-          <w:p>
-            <w:pPr>
-              <w:spacing w:after="40"/>
+              <w:spacing w:after="20"/>
             </w:pPr>
             <w:r/>
             <w:r>
@@ -2571,16 +2359,19 @@
                 <w:sz w:val="19"/>
               </w:rPr>
               <w:t>USACE Jacksonville District</w:t>
+              <w:br/>
+              <w:t>coastal damage models</w:t>
             </w:r>
           </w:p>
         </w:tc>
         <w:tc>
           <w:tcPr>
-            <w:tcW w:type="dxa" w:w="2160"/>
+            <w:tcW w:type="dxa" w:w="2928"/>
+            <w:shd w:val="clear" w:color="auto" w:fill="F2F5FA"/>
           </w:tcPr>
           <w:p>
             <w:pPr>
-              <w:spacing w:after="40"/>
+              <w:spacing w:after="20"/>
             </w:pPr>
             <w:r/>
             <w:r>
@@ -2590,7 +2381,7 @@
                 <w:i w:val="0"/>
                 <w:sz w:val="19"/>
               </w:rPr>
-              <w:t>Estimated infrastructure damage under surge scenarios; co-benefit analysis for coastal protection investments</w:t>
+              <w:t>Infrastructure damage estimates under surge scenarios</w:t>
             </w:r>
           </w:p>
         </w:tc>
@@ -2599,7 +2390,36 @@
     <w:p/>
     <w:p>
       <w:pPr>
-        <w:spacing w:before="280" w:after="80"/>
+        <w:spacing w:after="100"/>
+        <w:ind w:left="360"/>
+      </w:pPr>
+      <w:r>
+        <w:rPr>
+          <w:rFonts w:ascii="Calibri" w:hAnsi="Calibri"/>
+          <w:b/>
+          <w:i w:val="0"/>
+          <w:color w:val="663300"/>
+          <w:sz w:val="19"/>
+        </w:rPr>
+        <w:t xml:space="preserve">◐ Pending GIS  </w:t>
+      </w:r>
+      <w:r>
+        <w:rPr>
+          <w:rFonts w:ascii="Calibri" w:hAnsi="Calibri"/>
+          <w:b w:val="0"/>
+          <w:i/>
+          <w:color w:val="595959"/>
+          <w:sz w:val="19"/>
+        </w:rPr>
+        <w:t>Tier 1 (public data, available now): HIFLD, EIA, NOAA, FEMA, USDA FS, FDOT, USGS. Tier 2 (needs data agreements, August–September budget approval): JEA routing, NAVFAC outage history, USACE detailed models.</w:t>
+      </w:r>
+    </w:p>
+    <w:p>
+      <w:pPr>
+        <w:spacing w:before="320" w:after="40"/>
+        <w:pBdr>
+          <w:bottom w:val="single" w:sz="4" w:space="1" w:color="1F497D"/>
+        </w:pBdr>
       </w:pPr>
       <w:r>
         <w:rPr>
@@ -2607,23 +2427,24 @@
           <w:b/>
           <w:i w:val="0"/>
           <w:color w:val="1F497D"/>
-          <w:sz w:val="26"/>
+          <w:sz w:val="22"/>
         </w:rPr>
-        <w:t>2.6  Items Requiring Research Before Any Proposal Can Be Made</w:t>
+        <w:t>2.6  ITEMS REQUIRING RESEARCH BEFORE ANY PROPOSAL CAN BE MADE</w:t>
       </w:r>
     </w:p>
     <w:p>
       <w:pPr>
-        <w:spacing w:after="120"/>
+        <w:spacing w:after="100"/>
       </w:pPr>
       <w:r>
         <w:rPr>
           <w:rFonts w:ascii="Calibri" w:hAnsi="Calibri"/>
           <w:b w:val="0"/>
           <w:i w:val="0"/>
-          <w:sz w:val="22"/>
+          <w:color w:val="000000"/>
+          <w:sz w:val="21"/>
         </w:rPr>
-        <w:t>The following items were raised in prior research but cannot be included in any professional deliverable until the work below is completed. They are documented here so the research path is clear.</w:t>
+        <w:t>These items have been raised in prior research but are not ready for any formal deliverable. Each entry documents what is known and exactly what work is needed next.</w:t>
       </w:r>
     </w:p>
     <w:tbl>
@@ -2633,26 +2454,26 @@
         <w:tblLook w:firstColumn="1" w:firstRow="1" w:lastColumn="0" w:lastRow="0" w:noHBand="0" w:noVBand="1" w:val="04A0"/>
       </w:tblPr>
       <w:tblGrid>
-        <w:gridCol w:w="2880"/>
-        <w:gridCol w:w="2880"/>
-        <w:gridCol w:w="2880"/>
+        <w:gridCol w:w="2928"/>
+        <w:gridCol w:w="2928"/>
+        <w:gridCol w:w="2928"/>
       </w:tblGrid>
       <w:tr>
         <w:tc>
           <w:tcPr>
-            <w:tcW w:type="dxa" w:w="2880"/>
+            <w:tcW w:type="dxa" w:w="2928"/>
           </w:tcPr>
           <w:p/>
         </w:tc>
         <w:tc>
           <w:tcPr>
-            <w:tcW w:type="dxa" w:w="2880"/>
+            <w:tcW w:type="dxa" w:w="2928"/>
           </w:tcPr>
           <w:p/>
         </w:tc>
         <w:tc>
           <w:tcPr>
-            <w:tcW w:type="dxa" w:w="2880"/>
+            <w:tcW w:type="dxa" w:w="2928"/>
           </w:tcPr>
           <w:p/>
         </w:tc>
@@ -2660,12 +2481,12 @@
       <w:tr>
         <w:tc>
           <w:tcPr>
-            <w:tcW w:type="dxa" w:w="2880"/>
+            <w:tcW w:type="dxa" w:w="2928"/>
             <w:shd w:val="clear" w:color="auto" w:fill="1F497D"/>
           </w:tcPr>
           <w:p>
             <w:pPr>
-              <w:spacing w:after="40"/>
+              <w:spacing w:after="20"/>
             </w:pPr>
             <w:r/>
             <w:r>
@@ -2682,12 +2503,12 @@
         </w:tc>
         <w:tc>
           <w:tcPr>
-            <w:tcW w:type="dxa" w:w="2880"/>
+            <w:tcW w:type="dxa" w:w="2928"/>
             <w:shd w:val="clear" w:color="auto" w:fill="1F497D"/>
           </w:tcPr>
           <w:p>
             <w:pPr>
-              <w:spacing w:after="40"/>
+              <w:spacing w:after="20"/>
             </w:pPr>
             <w:r/>
             <w:r>
@@ -2704,12 +2525,12 @@
         </w:tc>
         <w:tc>
           <w:tcPr>
-            <w:tcW w:type="dxa" w:w="2880"/>
+            <w:tcW w:type="dxa" w:w="2928"/>
             <w:shd w:val="clear" w:color="auto" w:fill="1F497D"/>
           </w:tcPr>
           <w:p>
             <w:pPr>
-              <w:spacing w:after="40"/>
+              <w:spacing w:after="20"/>
             </w:pPr>
             <w:r/>
             <w:r>
@@ -2720,7 +2541,7 @@
                 <w:color w:val="FFFFFF"/>
                 <w:sz w:val="19"/>
               </w:rPr>
-              <w:t>What Is Needed Before Use</w:t>
+              <w:t>Next Steps Required</w:t>
             </w:r>
           </w:p>
         </w:tc>
@@ -2728,11 +2549,11 @@
       <w:tr>
         <w:tc>
           <w:tcPr>
-            <w:tcW w:type="dxa" w:w="2880"/>
+            <w:tcW w:type="dxa" w:w="2928"/>
           </w:tcPr>
           <w:p>
             <w:pPr>
-              <w:spacing w:after="40"/>
+              <w:spacing w:after="20"/>
             </w:pPr>
             <w:r/>
             <w:r>
@@ -2742,17 +2563,17 @@
                 <w:i w:val="0"/>
                 <w:sz w:val="19"/>
               </w:rPr>
-              <w:t>Small Modular Reactors (SMRs) / DoD microreactors</w:t>
+              <w:t>Small Modular Reactors / DoD Microreactors</w:t>
             </w:r>
           </w:p>
         </w:tc>
         <w:tc>
           <w:tcPr>
-            <w:tcW w:type="dxa" w:w="2880"/>
+            <w:tcW w:type="dxa" w:w="2928"/>
           </w:tcPr>
           <w:p>
             <w:pPr>
-              <w:spacing w:after="40"/>
+              <w:spacing w:after="20"/>
             </w:pPr>
             <w:r/>
             <w:r>
@@ -2762,17 +2583,17 @@
                 <w:i w:val="0"/>
                 <w:sz w:val="19"/>
               </w:rPr>
-              <w:t>DoD is actively pursuing on-site microreactors through Project Pele. Would eliminate single substation dependency entirely — true on-site redundancy independent of civilian grid. Most complete redundancy solution identified, also most complex and regulatory-intensive.</w:t>
+              <w:t>DoD's Project Pele pursues on-site microreactors for military installations — would eliminate civilian grid dependency entirely. Most complete redundancy solution; also most complex and regulatory-intensive.</w:t>
             </w:r>
           </w:p>
         </w:tc>
         <w:tc>
           <w:tcPr>
-            <w:tcW w:type="dxa" w:w="2880"/>
+            <w:tcW w:type="dxa" w:w="2928"/>
           </w:tcPr>
           <w:p>
             <w:pPr>
-              <w:spacing w:after="40"/>
+              <w:spacing w:after="20"/>
             </w:pPr>
             <w:r/>
             <w:r>
@@ -2782,7 +2603,7 @@
                 <w:i w:val="0"/>
                 <w:sz w:val="19"/>
               </w:rPr>
-              <w:t>Research DoD Project Pele program and current status. Review NRC SMR design approvals. Contact DOE and confirm ENRIL organization (verify correct name with manager). Assess regulatory pathway for military installations specifically.</w:t>
+              <w:t>Research Project Pele status and applicable installations. Contact DOE and confirm ENRIL organization name with manager. Assess NRC regulatory pathway.</w:t>
             </w:r>
           </w:p>
         </w:tc>
@@ -2790,11 +2611,12 @@
       <w:tr>
         <w:tc>
           <w:tcPr>
-            <w:tcW w:type="dxa" w:w="2880"/>
+            <w:tcW w:type="dxa" w:w="2928"/>
+            <w:shd w:val="clear" w:color="auto" w:fill="F2F5FA"/>
           </w:tcPr>
           <w:p>
             <w:pPr>
-              <w:spacing w:after="40"/>
+              <w:spacing w:after="20"/>
             </w:pPr>
             <w:r/>
             <w:r>
@@ -2804,17 +2626,18 @@
                 <w:i w:val="0"/>
                 <w:sz w:val="19"/>
               </w:rPr>
-              <w:t>Electrical infrastructure insurance coverage</w:t>
+              <w:t>Electrical infrastructure insurance</w:t>
             </w:r>
           </w:p>
         </w:tc>
         <w:tc>
           <w:tcPr>
-            <w:tcW w:type="dxa" w:w="2880"/>
+            <w:tcW w:type="dxa" w:w="2928"/>
+            <w:shd w:val="clear" w:color="auto" w:fill="F2F5FA"/>
           </w:tcPr>
           <w:p>
             <w:pPr>
-              <w:spacing w:after="40"/>
+              <w:spacing w:after="20"/>
             </w:pPr>
             <w:r/>
             <w:r>
@@ -2824,17 +2647,18 @@
                 <w:i w:val="0"/>
                 <w:sz w:val="19"/>
               </w:rPr>
-              <w:t>Type of insurance JEA and FPL carry on substations serving these installations is unknown. Claims timeline after a storm event affects how quickly damaged infrastructure gets repaired — directly extends outage duration beyond the physical repair window.</w:t>
+              <w:t>Type and scope of insurance JEA and FPL carry on these substations is unknown. Claims timeline after storm events directly affects how long outages last.</w:t>
             </w:r>
           </w:p>
         </w:tc>
         <w:tc>
           <w:tcPr>
-            <w:tcW w:type="dxa" w:w="2880"/>
+            <w:tcW w:type="dxa" w:w="2928"/>
+            <w:shd w:val="clear" w:color="auto" w:fill="F2F5FA"/>
           </w:tcPr>
           <w:p>
             <w:pPr>
-              <w:spacing w:after="40"/>
+              <w:spacing w:after="20"/>
             </w:pPr>
             <w:r/>
             <w:r>
@@ -2844,7 +2668,7 @@
                 <w:i w:val="0"/>
                 <w:sz w:val="19"/>
               </w:rPr>
-              <w:t>Contact Florida PSC for utility insurance filing requirements. Review JEA and FPL annual reports for insurance disclosures. Determine whether FEMA NFIP covers utility substations or whether separate commercial flood insurance applies.</w:t>
+              <w:t>Review Florida PSC utility insurance filings. Check JEA and FPL annual reports. Determine whether FEMA NFIP covers utility substations.</w:t>
             </w:r>
           </w:p>
         </w:tc>
@@ -2852,11 +2676,11 @@
       <w:tr>
         <w:tc>
           <w:tcPr>
-            <w:tcW w:type="dxa" w:w="2880"/>
+            <w:tcW w:type="dxa" w:w="2928"/>
           </w:tcPr>
           <w:p>
             <w:pPr>
-              <w:spacing w:after="40"/>
+              <w:spacing w:after="20"/>
             </w:pPr>
             <w:r/>
             <w:r>
@@ -2872,11 +2696,11 @@
         </w:tc>
         <w:tc>
           <w:tcPr>
-            <w:tcW w:type="dxa" w:w="2880"/>
+            <w:tcW w:type="dxa" w:w="2928"/>
           </w:tcPr>
           <w:p>
             <w:pPr>
-              <w:spacing w:after="40"/>
+              <w:spacing w:after="20"/>
             </w:pPr>
             <w:r/>
             <w:r>
@@ -2886,17 +2710,17 @@
                 <w:i w:val="0"/>
                 <w:sz w:val="19"/>
               </w:rPr>
-              <w:t>First intern identified Miramar as a potential model. APTIM memo confirms only 'microgrid and energy resilience investments' at Miramar — no landfill methane or islanding duration confirmed.</w:t>
+              <w:t>APTIM memo confirms only 'microgrid and energy resilience investments' at Miramar. 21-day figure and landfill methane source unconfirmed.</w:t>
             </w:r>
           </w:p>
         </w:tc>
         <w:tc>
           <w:tcPr>
-            <w:tcW w:type="dxa" w:w="2880"/>
+            <w:tcW w:type="dxa" w:w="2928"/>
           </w:tcPr>
           <w:p>
             <w:pPr>
-              <w:spacing w:after="40"/>
+              <w:spacing w:after="20"/>
             </w:pPr>
             <w:r/>
             <w:r>
@@ -2906,7 +2730,7 @@
                 <w:i w:val="0"/>
                 <w:sz w:val="19"/>
               </w:rPr>
-              <w:t>Primary source (DOE 2022 report cited in APTIM). GIS mapping of Jacksonville-area landfill proximity to installations. Pipeline feasibility assessment.</w:t>
+              <w:t>Find DOE 2022 report cited in APTIM. Map Jacksonville-area landfill proximity to NAS JAX and Blount Island via GIS.</w:t>
             </w:r>
           </w:p>
         </w:tc>
@@ -2914,73 +2738,12 @@
       <w:tr>
         <w:tc>
           <w:tcPr>
-            <w:tcW w:type="dxa" w:w="2880"/>
+            <w:tcW w:type="dxa" w:w="2928"/>
+            <w:shd w:val="clear" w:color="auto" w:fill="F2F5FA"/>
           </w:tcPr>
           <w:p>
             <w:pPr>
-              <w:spacing w:after="40"/>
-            </w:pPr>
-            <w:r/>
-            <w:r>
-              <w:rPr>
-                <w:rFonts w:ascii="Calibri" w:hAnsi="Calibri"/>
-                <w:b w:val="0"/>
-                <w:i w:val="0"/>
-                <w:sz w:val="19"/>
-              </w:rPr>
-              <w:t>Tidal energy at NS Mayport / Blount Island</w:t>
-            </w:r>
-          </w:p>
-        </w:tc>
-        <w:tc>
-          <w:tcPr>
-            <w:tcW w:type="dxa" w:w="2880"/>
-          </w:tcPr>
-          <w:p>
-            <w:pPr>
-              <w:spacing w:after="40"/>
-            </w:pPr>
-            <w:r/>
-            <w:r>
-              <w:rPr>
-                <w:rFonts w:ascii="Calibri" w:hAnsi="Calibri"/>
-                <w:b w:val="0"/>
-                <w:i w:val="0"/>
-                <w:sz w:val="19"/>
-              </w:rPr>
-              <w:t>St. Johns River mouth has high tidal flow. Tidal converters sit below surge. No feasibility study found in MIRR documents.</w:t>
-            </w:r>
-          </w:p>
-        </w:tc>
-        <w:tc>
-          <w:tcPr>
-            <w:tcW w:type="dxa" w:w="2880"/>
-          </w:tcPr>
-          <w:p>
-            <w:pPr>
-              <w:spacing w:after="40"/>
-            </w:pPr>
-            <w:r/>
-            <w:r>
-              <w:rPr>
-                <w:rFonts w:ascii="Calibri" w:hAnsi="Calibri"/>
-                <w:b w:val="0"/>
-                <w:i w:val="0"/>
-                <w:sz w:val="19"/>
-              </w:rPr>
-              <w:t>DOE Water Power Technologies Office feasibility study search. Navigation channel and environmental permitting review. Site-specific flow rate data from USGS or NOAA.</w:t>
-            </w:r>
-          </w:p>
-        </w:tc>
-      </w:tr>
-      <w:tr>
-        <w:tc>
-          <w:tcPr>
-            <w:tcW w:type="dxa" w:w="2880"/>
-          </w:tcPr>
-          <w:p>
-            <w:pPr>
-              <w:spacing w:after="40"/>
+              <w:spacing w:after="20"/>
             </w:pPr>
             <w:r/>
             <w:r>
@@ -2996,11 +2759,12 @@
         </w:tc>
         <w:tc>
           <w:tcPr>
-            <w:tcW w:type="dxa" w:w="2880"/>
+            <w:tcW w:type="dxa" w:w="2928"/>
+            <w:shd w:val="clear" w:color="auto" w:fill="F2F5FA"/>
           </w:tcPr>
           <w:p>
             <w:pPr>
-              <w:spacing w:after="40"/>
+              <w:spacing w:after="20"/>
             </w:pPr>
             <w:r/>
             <w:r>
@@ -3010,17 +2774,18 @@
                 <w:i w:val="0"/>
                 <w:sz w:val="19"/>
               </w:rPr>
-              <w:t>Costs have declined. Land available. EUL authority exists. No Blanding-specific feasibility study found in MIRR documents.</w:t>
+              <w:t>Costs have declined significantly. 73,000 acres available. EUL authority exists. No Blanding-specific feasibility study found in MIRR documents.</w:t>
             </w:r>
           </w:p>
         </w:tc>
         <w:tc>
           <w:tcPr>
-            <w:tcW w:type="dxa" w:w="2880"/>
+            <w:tcW w:type="dxa" w:w="2928"/>
+            <w:shd w:val="clear" w:color="auto" w:fill="F2F5FA"/>
           </w:tcPr>
           <w:p>
             <w:pPr>
-              <w:spacing w:after="40"/>
+              <w:spacing w:after="20"/>
             </w:pPr>
             <w:r/>
             <w:r>
@@ -3030,7 +2795,7 @@
                 <w:i w:val="0"/>
                 <w:sz w:val="19"/>
               </w:rPr>
-              <w:t>ESTCP / ESPC prior study search. Camp Blanding load profile data. EUL process timeline and authority confirmation.</w:t>
+              <w:t>Search ESTCP and ESPC for prior studies at Blanding. Obtain load profile data. Confirm EUL process timeline.</w:t>
             </w:r>
           </w:p>
         </w:tc>
@@ -3038,11 +2803,11 @@
       <w:tr>
         <w:tc>
           <w:tcPr>
-            <w:tcW w:type="dxa" w:w="2880"/>
+            <w:tcW w:type="dxa" w:w="2928"/>
           </w:tcPr>
           <w:p>
             <w:pPr>
-              <w:spacing w:after="40"/>
+              <w:spacing w:after="20"/>
             </w:pPr>
             <w:r/>
             <w:r>
@@ -3052,17 +2817,17 @@
                 <w:i w:val="0"/>
                 <w:sz w:val="19"/>
               </w:rPr>
-              <w:t>JEA transmission routing upstream of substations</w:t>
+              <w:t>JEA upstream transmission routing</w:t>
             </w:r>
           </w:p>
         </w:tc>
         <w:tc>
           <w:tcPr>
-            <w:tcW w:type="dxa" w:w="2880"/>
+            <w:tcW w:type="dxa" w:w="2928"/>
           </w:tcPr>
           <w:p>
             <w:pPr>
-              <w:spacing w:after="40"/>
+              <w:spacing w:after="20"/>
             </w:pPr>
             <w:r/>
             <w:r>
@@ -3072,17 +2837,17 @@
                 <w:i w:val="0"/>
                 <w:sz w:val="19"/>
               </w:rPr>
-              <w:t>Confirmed data gap in MIRR — JEA has not shared infrastructure data as of Sept 2025 TAC.</w:t>
+              <w:t>Confirmed MIRR data gap — JEA has not shared infrastructure data as of Sept 2025 TAC.</w:t>
             </w:r>
           </w:p>
         </w:tc>
         <w:tc>
           <w:tcPr>
-            <w:tcW w:type="dxa" w:w="2880"/>
+            <w:tcW w:type="dxa" w:w="2928"/>
           </w:tcPr>
           <w:p>
             <w:pPr>
-              <w:spacing w:after="40"/>
+              <w:spacing w:after="20"/>
             </w:pPr>
             <w:r/>
             <w:r>
@@ -3092,7 +2857,7 @@
                 <w:i w:val="0"/>
                 <w:sz w:val="19"/>
               </w:rPr>
-              <w:t>JEA coordination under expanded IGSA. EIA Form 860 as proxy. Florida PSC storm hardening filings for JEA.</w:t>
+              <w:t>JEA coordination under expanded IGSA. EIA Form 860 as interim proxy. Florida PSC storm hardening filings for JEA planned investments.</w:t>
             </w:r>
           </w:p>
         </w:tc>
@@ -3100,11 +2865,12 @@
       <w:tr>
         <w:tc>
           <w:tcPr>
-            <w:tcW w:type="dxa" w:w="2880"/>
+            <w:tcW w:type="dxa" w:w="2928"/>
+            <w:shd w:val="clear" w:color="auto" w:fill="F2F5FA"/>
           </w:tcPr>
           <w:p>
             <w:pPr>
-              <w:spacing w:after="40"/>
+              <w:spacing w:after="20"/>
             </w:pPr>
             <w:r/>
             <w:r>
@@ -3114,17 +2880,18 @@
                 <w:i w:val="0"/>
                 <w:sz w:val="19"/>
               </w:rPr>
-              <w:t>Actual outage history at installations</w:t>
+              <w:t>Historical outage data at installations</w:t>
             </w:r>
           </w:p>
         </w:tc>
         <w:tc>
           <w:tcPr>
-            <w:tcW w:type="dxa" w:w="2880"/>
+            <w:tcW w:type="dxa" w:w="2928"/>
+            <w:shd w:val="clear" w:color="auto" w:fill="F2F5FA"/>
           </w:tcPr>
           <w:p>
             <w:pPr>
-              <w:spacing w:after="40"/>
+              <w:spacing w:after="20"/>
             </w:pPr>
             <w:r/>
             <w:r>
@@ -3134,17 +2901,18 @@
                 <w:i w:val="0"/>
                 <w:sz w:val="19"/>
               </w:rPr>
-              <w:t>Regional outages from Matthew and Irma are publicly documented. Installation-specific outage duration is not in public record.</w:t>
+              <w:t>Regional outages from Matthew and Irma are documented publicly. Installation-specific outage duration is not in public record.</w:t>
             </w:r>
           </w:p>
         </w:tc>
         <w:tc>
           <w:tcPr>
-            <w:tcW w:type="dxa" w:w="2880"/>
+            <w:tcW w:type="dxa" w:w="2928"/>
+            <w:shd w:val="clear" w:color="auto" w:fill="F2F5FA"/>
           </w:tcPr>
           <w:p>
             <w:pPr>
-              <w:spacing w:after="40"/>
+              <w:spacing w:after="20"/>
             </w:pPr>
             <w:r/>
             <w:r>
@@ -3163,7 +2931,36 @@
     <w:p/>
     <w:p>
       <w:pPr>
-        <w:spacing w:before="280" w:after="80"/>
+        <w:spacing w:after="100"/>
+        <w:ind w:left="360"/>
+      </w:pPr>
+      <w:r>
+        <w:rPr>
+          <w:rFonts w:ascii="Calibri" w:hAnsi="Calibri"/>
+          <w:b/>
+          <w:i w:val="0"/>
+          <w:color w:val="780000"/>
+          <w:sz w:val="19"/>
+        </w:rPr>
+        <w:t xml:space="preserve">○ Needs verification  </w:t>
+      </w:r>
+      <w:r>
+        <w:rPr>
+          <w:rFonts w:ascii="Calibri" w:hAnsi="Calibri"/>
+          <w:b w:val="0"/>
+          <w:i/>
+          <w:color w:val="595959"/>
+          <w:sz w:val="19"/>
+        </w:rPr>
+        <w:t>None of the above should appear in any client-facing document until the listed research is completed.</w:t>
+      </w:r>
+    </w:p>
+    <w:p>
+      <w:pPr>
+        <w:spacing w:before="320" w:after="40"/>
+        <w:pBdr>
+          <w:bottom w:val="single" w:sz="4" w:space="1" w:color="1F497D"/>
+        </w:pBdr>
       </w:pPr>
       <w:r>
         <w:rPr>
@@ -3171,28 +2968,14 @@
           <w:b/>
           <w:i w:val="0"/>
           <w:color w:val="1F497D"/>
-          <w:sz w:val="26"/>
+          <w:sz w:val="22"/>
         </w:rPr>
-        <w:t>2.7  Data Availability and Project Timeline</w:t>
+        <w:t>2.7  SOURCES</w:t>
       </w:r>
     </w:p>
     <w:p>
       <w:pPr>
-        <w:spacing w:after="120"/>
-      </w:pPr>
-      <w:r>
-        <w:rPr>
-          <w:rFonts w:ascii="Calibri" w:hAnsi="Calibri"/>
-          <w:b w:val="0"/>
-          <w:i w:val="0"/>
-          <w:sz w:val="22"/>
-        </w:rPr>
-        <w:t>Not all data needed for a complete redundancy assessment is publicly available or immediately accessible. The following reflects the project's current data situation and planned timeline.</w:t>
-      </w:r>
-    </w:p>
-    <w:p>
-      <w:pPr>
-        <w:spacing w:before="160" w:after="80"/>
+        <w:spacing w:before="200" w:after="40"/>
       </w:pPr>
       <w:r>
         <w:rPr>
@@ -3200,78 +2983,142 @@
           <w:b/>
           <w:i w:val="0"/>
           <w:color w:val="376092"/>
-          <w:sz w:val="22"/>
+          <w:sz w:val="21"/>
         </w:rPr>
-        <w:t>Two-Tier GIS Approach</w:t>
+        <w:t>Confirmed MIRR Project Documents</w:t>
       </w:r>
     </w:p>
     <w:p>
       <w:pPr>
-        <w:spacing w:after="120"/>
+        <w:pStyle w:val="ListBullet"/>
+        <w:spacing w:after="40"/>
+        <w:ind w:left="288"/>
       </w:pPr>
       <w:r>
         <w:rPr>
           <w:rFonts w:ascii="Calibri" w:hAnsi="Calibri"/>
           <w:b w:val="0"/>
           <w:i w:val="0"/>
-          <w:sz w:val="22"/>
+          <w:sz w:val="21"/>
         </w:rPr>
-        <w:t>GIS analysis will proceed in two tiers based on data availability:</w:t>
+        <w:t>NEFRC MIRR Vulnerability Assessment — January 2026 Steering Committee</w:t>
       </w:r>
     </w:p>
     <w:p>
       <w:pPr>
         <w:pStyle w:val="ListBullet"/>
-        <w:spacing w:after="80"/>
-        <w:ind w:left="360"/>
+        <w:spacing w:after="40"/>
+        <w:ind w:left="288"/>
       </w:pPr>
-      <w:r>
-        <w:rPr>
-          <w:rFonts w:ascii="Calibri" w:hAnsi="Calibri"/>
-          <w:b/>
-          <w:i w:val="0"/>
-          <w:sz w:val="22"/>
-        </w:rPr>
-        <w:t xml:space="preserve">Tier 1 — Available now: </w:t>
-      </w:r>
       <w:r>
         <w:rPr>
           <w:rFonts w:ascii="Calibri" w:hAnsi="Calibri"/>
           <w:b w:val="0"/>
           <w:i w:val="0"/>
-          <w:sz w:val="22"/>
+          <w:sz w:val="21"/>
         </w:rPr>
-        <w:t>Publicly accessible federal datasets: HIFLD, EIA Form 860, NOAA Digital Coast (SLOSH, SLR), FEMA NFHL (effective and preliminary), USDA FS wildfire, FDOT road network, USGS groundwater. These can be run immediately and will confirm the spatial extent of confirmed MIRR vulnerabilities.</w:t>
+        <w:t>MIRR Mutual Support Assessment — February 2026 TAC</w:t>
       </w:r>
     </w:p>
     <w:p>
       <w:pPr>
         <w:pStyle w:val="ListBullet"/>
-        <w:spacing w:after="80"/>
-        <w:ind w:left="360"/>
+        <w:spacing w:after="40"/>
+        <w:ind w:left="288"/>
       </w:pPr>
-      <w:r>
-        <w:rPr>
-          <w:rFonts w:ascii="Calibri" w:hAnsi="Calibri"/>
-          <w:b/>
-          <w:i w:val="0"/>
-          <w:sz w:val="22"/>
-        </w:rPr>
-        <w:t xml:space="preserve">Tier 2 — Requires data agreements: </w:t>
-      </w:r>
       <w:r>
         <w:rPr>
           <w:rFonts w:ascii="Calibri" w:hAnsi="Calibri"/>
           <w:b w:val="0"/>
           <w:i w:val="0"/>
-          <w:sz w:val="22"/>
+          <w:sz w:val="21"/>
         </w:rPr>
-        <w:t>JEA and FPL infrastructure routing, on-installation asset data, NAVFAC outage history, Army Corps damage model outputs. Budget approval expected August–September 2026 will enable formal data sharing agreements for these sources.</w:t>
+        <w:t>MIRR Adaptation Planning Framework — April 2026 Steering Committee</w:t>
       </w:r>
     </w:p>
     <w:p>
       <w:pPr>
-        <w:spacing w:before="160" w:after="80"/>
+        <w:pStyle w:val="ListBullet"/>
+        <w:spacing w:after="40"/>
+        <w:ind w:left="288"/>
+      </w:pPr>
+      <w:r>
+        <w:rPr>
+          <w:rFonts w:ascii="Calibri" w:hAnsi="Calibri"/>
+          <w:b w:val="0"/>
+          <w:i w:val="0"/>
+          <w:sz w:val="21"/>
+        </w:rPr>
+        <w:t>MCSF Blount Island Kickoff Briefing — April 2025</w:t>
+      </w:r>
+    </w:p>
+    <w:p>
+      <w:pPr>
+        <w:pStyle w:val="ListBullet"/>
+        <w:spacing w:after="40"/>
+        <w:ind w:left="288"/>
+      </w:pPr>
+      <w:r>
+        <w:rPr>
+          <w:rFonts w:ascii="Calibri" w:hAnsi="Calibri"/>
+          <w:b w:val="0"/>
+          <w:i w:val="0"/>
+          <w:sz w:val="21"/>
+        </w:rPr>
+        <w:t>NAS Jacksonville Site Visit Summary V3</w:t>
+      </w:r>
+    </w:p>
+    <w:p>
+      <w:pPr>
+        <w:pStyle w:val="ListBullet"/>
+        <w:spacing w:after="40"/>
+        <w:ind w:left="288"/>
+      </w:pPr>
+      <w:r>
+        <w:rPr>
+          <w:rFonts w:ascii="Calibri" w:hAnsi="Calibri"/>
+          <w:b w:val="0"/>
+          <w:i w:val="0"/>
+          <w:sz w:val="21"/>
+        </w:rPr>
+        <w:t>Camp Blanding Summary V2</w:t>
+      </w:r>
+    </w:p>
+    <w:p>
+      <w:pPr>
+        <w:pStyle w:val="ListBullet"/>
+        <w:spacing w:after="40"/>
+        <w:ind w:left="288"/>
+      </w:pPr>
+      <w:r>
+        <w:rPr>
+          <w:rFonts w:ascii="Calibri" w:hAnsi="Calibri"/>
+          <w:b w:val="0"/>
+          <w:i w:val="0"/>
+          <w:sz w:val="21"/>
+        </w:rPr>
+        <w:t>NEFRC MIRR Stakeholder Workshop 1 Summary V2</w:t>
+      </w:r>
+    </w:p>
+    <w:p>
+      <w:pPr>
+        <w:pStyle w:val="ListBullet"/>
+        <w:spacing w:after="40"/>
+        <w:ind w:left="288"/>
+      </w:pPr>
+      <w:r>
+        <w:rPr>
+          <w:rFonts w:ascii="Calibri" w:hAnsi="Calibri"/>
+          <w:b w:val="0"/>
+          <w:i w:val="0"/>
+          <w:sz w:val="21"/>
+        </w:rPr>
+        <w:t>APTIM Memo: NE MIRR Evaluating Potential Adaptation Solutions — May 22, 2026</w:t>
+      </w:r>
+    </w:p>
+    <w:p>
+      <w:pPr>
+        <w:spacing w:before="200" w:after="40"/>
       </w:pPr>
       <w:r>
         <w:rPr>
@@ -3279,235 +3126,39 @@
           <w:b/>
           <w:i w:val="0"/>
           <w:color w:val="376092"/>
-          <w:sz w:val="22"/>
+          <w:sz w:val="21"/>
         </w:rPr>
-        <w:t>Low-Resolution Data — Documented Uncertainty</w:t>
+        <w:t>To Verify — Historical Events</w:t>
       </w:r>
     </w:p>
     <w:p>
       <w:pPr>
-        <w:spacing w:after="120"/>
+        <w:pStyle w:val="ListBullet"/>
+        <w:spacing w:after="40"/>
+        <w:ind w:left="288"/>
       </w:pPr>
       <w:r>
         <w:rPr>
           <w:rFonts w:ascii="Calibri" w:hAnsi="Calibri"/>
           <w:b w:val="0"/>
           <w:i w:val="0"/>
-          <w:sz w:val="22"/>
+          <w:sz w:val="21"/>
         </w:rPr>
-        <w:t>Risk datasets in this space are often lower resolution than ideal for substation-level analysis. Where dataset resolution limits precision, analysis outputs will include explicit uncertainty bounds and the limitation will be documented in methodology notes. This is standard practice and does not invalidate the findings — it accurately represents what the data can and cannot show.</w:t>
+        <w:t>NOAA NHC Post-Storm Reports — Matthew (AL142016), Irma (AL112017)</w:t>
       </w:r>
     </w:p>
     <w:p>
       <w:pPr>
-        <w:spacing w:after="120"/>
-        <w:ind w:left="432" w:right="432"/>
-        <w:shd w:val="clear" w:color="auto" w:fill="FFF4E5"/>
-      </w:pPr>
-      <w:r>
-        <w:rPr>
-          <w:rFonts w:ascii="Calibri" w:hAnsi="Calibri"/>
-          <w:b/>
-          <w:i w:val="0"/>
-          <w:color w:val="663300"/>
-          <w:sz w:val="20"/>
-        </w:rPr>
-        <w:t xml:space="preserve">Needs GIS: </w:t>
-      </w:r>
-      <w:r>
-        <w:rPr>
-          <w:rFonts w:ascii="Calibri" w:hAnsi="Calibri"/>
-          <w:b w:val="0"/>
-          <w:i/>
-          <w:color w:val="663300"/>
-          <w:sz w:val="20"/>
-        </w:rPr>
-        <w:t>When downloading any dataset, read the methodology paper and contact the lead researcher with questions about resolution limitations and appropriate use cases. Researcher contact information is typically in dataset metadata.</w:t>
-      </w:r>
-    </w:p>
-    <w:p>
-      <w:pPr>
-        <w:spacing w:before="280" w:after="80"/>
-      </w:pPr>
-      <w:r>
-        <w:rPr>
-          <w:rFonts w:ascii="Calibri" w:hAnsi="Calibri"/>
-          <w:b/>
-          <w:i w:val="0"/>
-          <w:color w:val="1F497D"/>
-          <w:sz w:val="26"/>
-        </w:rPr>
-        <w:t>2.8  Sources</w:t>
-      </w:r>
-    </w:p>
-    <w:p>
-      <w:pPr>
-        <w:spacing w:after="120"/>
+        <w:pStyle w:val="ListBullet"/>
+        <w:spacing w:after="40"/>
+        <w:ind w:left="288"/>
       </w:pPr>
       <w:r>
         <w:rPr>
           <w:rFonts w:ascii="Calibri" w:hAnsi="Calibri"/>
           <w:b w:val="0"/>
           <w:i w:val="0"/>
-          <w:sz w:val="22"/>
-        </w:rPr>
-        <w:t>Confirmed MIRR project documents:</w:t>
-      </w:r>
-    </w:p>
-    <w:p>
-      <w:pPr>
-        <w:pStyle w:val="ListBullet"/>
-        <w:spacing w:after="60"/>
-        <w:ind w:left="360"/>
-      </w:pPr>
-      <w:r>
-        <w:rPr>
-          <w:rFonts w:ascii="Calibri" w:hAnsi="Calibri"/>
-          <w:b w:val="0"/>
-          <w:i w:val="0"/>
-          <w:sz w:val="22"/>
-        </w:rPr>
-        <w:t>NEFRC MIRR Vulnerability Assessment — January 2026 Steering Committee</w:t>
-      </w:r>
-    </w:p>
-    <w:p>
-      <w:pPr>
-        <w:pStyle w:val="ListBullet"/>
-        <w:spacing w:after="60"/>
-        <w:ind w:left="360"/>
-      </w:pPr>
-      <w:r>
-        <w:rPr>
-          <w:rFonts w:ascii="Calibri" w:hAnsi="Calibri"/>
-          <w:b w:val="0"/>
-          <w:i w:val="0"/>
-          <w:sz w:val="22"/>
-        </w:rPr>
-        <w:t>MIRR Mutual Support Assessment — February 2026 TAC</w:t>
-      </w:r>
-    </w:p>
-    <w:p>
-      <w:pPr>
-        <w:pStyle w:val="ListBullet"/>
-        <w:spacing w:after="60"/>
-        <w:ind w:left="360"/>
-      </w:pPr>
-      <w:r>
-        <w:rPr>
-          <w:rFonts w:ascii="Calibri" w:hAnsi="Calibri"/>
-          <w:b w:val="0"/>
-          <w:i w:val="0"/>
-          <w:sz w:val="22"/>
-        </w:rPr>
-        <w:t>MCSF Blount Island Kickoff Briefing — April 2025</w:t>
-      </w:r>
-    </w:p>
-    <w:p>
-      <w:pPr>
-        <w:pStyle w:val="ListBullet"/>
-        <w:spacing w:after="60"/>
-        <w:ind w:left="360"/>
-      </w:pPr>
-      <w:r>
-        <w:rPr>
-          <w:rFonts w:ascii="Calibri" w:hAnsi="Calibri"/>
-          <w:b w:val="0"/>
-          <w:i w:val="0"/>
-          <w:sz w:val="22"/>
-        </w:rPr>
-        <w:t>NAS Jacksonville Site Visit Summary V3</w:t>
-      </w:r>
-    </w:p>
-    <w:p>
-      <w:pPr>
-        <w:pStyle w:val="ListBullet"/>
-        <w:spacing w:after="60"/>
-        <w:ind w:left="360"/>
-      </w:pPr>
-      <w:r>
-        <w:rPr>
-          <w:rFonts w:ascii="Calibri" w:hAnsi="Calibri"/>
-          <w:b w:val="0"/>
-          <w:i w:val="0"/>
-          <w:sz w:val="22"/>
-        </w:rPr>
-        <w:t>Camp Blanding Summary V2</w:t>
-      </w:r>
-    </w:p>
-    <w:p>
-      <w:pPr>
-        <w:pStyle w:val="ListBullet"/>
-        <w:spacing w:after="60"/>
-        <w:ind w:left="360"/>
-      </w:pPr>
-      <w:r>
-        <w:rPr>
-          <w:rFonts w:ascii="Calibri" w:hAnsi="Calibri"/>
-          <w:b w:val="0"/>
-          <w:i w:val="0"/>
-          <w:sz w:val="22"/>
-        </w:rPr>
-        <w:t>NEFRC MIRR Stakeholder Workshop 1 Summary V2</w:t>
-      </w:r>
-    </w:p>
-    <w:p>
-      <w:pPr>
-        <w:pStyle w:val="ListBullet"/>
-        <w:spacing w:after="60"/>
-        <w:ind w:left="360"/>
-      </w:pPr>
-      <w:r>
-        <w:rPr>
-          <w:rFonts w:ascii="Calibri" w:hAnsi="Calibri"/>
-          <w:b w:val="0"/>
-          <w:i w:val="0"/>
-          <w:sz w:val="22"/>
-        </w:rPr>
-        <w:t>APTIM Memo: NE MIRR Evaluating Potential Adaptation Solutions — May 22, 2026</w:t>
-      </w:r>
-    </w:p>
-    <w:p>
-      <w:pPr>
-        <w:spacing w:after="60"/>
-      </w:pPr>
-      <w:r>
-        <w:rPr>
-          <w:rFonts w:ascii="Calibri" w:hAnsi="Calibri"/>
-          <w:b w:val="0"/>
-          <w:i w:val="0"/>
-          <w:sz w:val="22"/>
-        </w:rPr>
-        <w:t>Sources to verify for historical event evidence:</w:t>
-      </w:r>
-    </w:p>
-    <w:p>
-      <w:pPr>
-        <w:pStyle w:val="ListBullet"/>
-        <w:spacing w:after="60"/>
-        <w:ind w:left="360"/>
-      </w:pPr>
-      <w:r>
-        <w:rPr>
-          <w:rFonts w:ascii="Calibri" w:hAnsi="Calibri"/>
-          <w:b w:val="0"/>
-          <w:i w:val="0"/>
-          <w:sz w:val="22"/>
-        </w:rPr>
-        <w:t>NOAA NHC Post-Storm Reports — Hurricane Matthew (AL142016), Hurricane Irma (AL112017)</w:t>
-      </w:r>
-    </w:p>
-    <w:p>
-      <w:pPr>
-        <w:pStyle w:val="ListBullet"/>
-        <w:spacing w:after="60"/>
-        <w:ind w:left="360"/>
-      </w:pPr>
-      <w:r>
-        <w:rPr>
-          <w:rFonts w:ascii="Calibri" w:hAnsi="Calibri"/>
-          <w:b w:val="0"/>
-          <w:i w:val="0"/>
-          <w:sz w:val="22"/>
+          <w:sz w:val="21"/>
         </w:rPr>
         <w:t>NOAA Storm Events Database — Duval and Clay Counties, 2015–present</w:t>
       </w:r>
@@ -3515,77 +3166,78 @@
     <w:p>
       <w:pPr>
         <w:pStyle w:val="ListBullet"/>
-        <w:spacing w:after="60"/>
-        <w:ind w:left="360"/>
+        <w:spacing w:after="40"/>
+        <w:ind w:left="288"/>
       </w:pPr>
       <w:r>
         <w:rPr>
           <w:rFonts w:ascii="Calibri" w:hAnsi="Calibri"/>
           <w:b w:val="0"/>
           <w:i w:val="0"/>
-          <w:sz w:val="22"/>
+          <w:sz w:val="21"/>
         </w:rPr>
-        <w:t>Florida PSC Storm Protection Plan Filings — JEA and FPL annual reports</w:t>
+        <w:t>NWS Jacksonville Local Storm Event Archive</w:t>
       </w:r>
     </w:p>
     <w:p>
       <w:pPr>
         <w:pStyle w:val="ListBullet"/>
-        <w:spacing w:after="60"/>
-        <w:ind w:left="360"/>
+        <w:spacing w:after="40"/>
+        <w:ind w:left="288"/>
       </w:pPr>
       <w:r>
         <w:rPr>
           <w:rFonts w:ascii="Calibri" w:hAnsi="Calibri"/>
           <w:b w:val="0"/>
           <w:i w:val="0"/>
-          <w:sz w:val="22"/>
+          <w:sz w:val="21"/>
+        </w:rPr>
+        <w:t>Florida PSC Storm Protection Plan Filings — JEA and FPL</w:t>
+      </w:r>
+    </w:p>
+    <w:p>
+      <w:pPr>
+        <w:pStyle w:val="ListBullet"/>
+        <w:spacing w:after="40"/>
+        <w:ind w:left="288"/>
+      </w:pPr>
+      <w:r>
+        <w:rPr>
+          <w:rFonts w:ascii="Calibri" w:hAnsi="Calibri"/>
+          <w:b w:val="0"/>
+          <w:i w:val="0"/>
+          <w:sz w:val="21"/>
         </w:rPr>
         <w:t>FEMA Disaster Declarations — DR-4283 (Matthew), DR-4337 (Irma)</w:t>
       </w:r>
     </w:p>
     <w:p>
       <w:pPr>
+        <w:spacing w:before="200" w:after="40"/>
+      </w:pPr>
+      <w:r>
+        <w:rPr>
+          <w:rFonts w:ascii="Calibri" w:hAnsi="Calibri"/>
+          <w:b/>
+          <w:i w:val="0"/>
+          <w:color w:val="376092"/>
+          <w:sz w:val="21"/>
+        </w:rPr>
+        <w:t>GIS Datasets — Planned Use</w:t>
+      </w:r>
+    </w:p>
+    <w:p>
+      <w:pPr>
         <w:pStyle w:val="ListBullet"/>
-        <w:spacing w:after="60"/>
-        <w:ind w:left="360"/>
+        <w:spacing w:after="40"/>
+        <w:ind w:left="288"/>
       </w:pPr>
       <w:r>
         <w:rPr>
           <w:rFonts w:ascii="Calibri" w:hAnsi="Calibri"/>
           <w:b w:val="0"/>
           <w:i w:val="0"/>
-          <w:sz w:val="22"/>
-        </w:rPr>
-        <w:t>NWS Jacksonville Local Storm Event Archive</w:t>
-      </w:r>
-    </w:p>
-    <w:p>
-      <w:pPr>
-        <w:spacing w:after="60"/>
-      </w:pPr>
-      <w:r>
-        <w:rPr>
-          <w:rFonts w:ascii="Calibri" w:hAnsi="Calibri"/>
-          <w:b w:val="0"/>
-          <w:i w:val="0"/>
-          <w:sz w:val="22"/>
-        </w:rPr>
-        <w:t>GIS datasets to be used:</w:t>
-      </w:r>
-    </w:p>
-    <w:p>
-      <w:pPr>
-        <w:pStyle w:val="ListBullet"/>
-        <w:spacing w:after="60"/>
-        <w:ind w:left="360"/>
-      </w:pPr>
-      <w:r>
-        <w:rPr>
-          <w:rFonts w:ascii="Calibri" w:hAnsi="Calibri"/>
-          <w:b w:val="0"/>
-          <w:i w:val="0"/>
-          <w:sz w:val="22"/>
+          <w:sz w:val="21"/>
         </w:rPr>
         <w:t>HIFLD Open Data — military boundaries, transmission lines, substations</w:t>
       </w:r>
@@ -3593,15 +3245,15 @@
     <w:p>
       <w:pPr>
         <w:pStyle w:val="ListBullet"/>
-        <w:spacing w:after="60"/>
-        <w:ind w:left="360"/>
+        <w:spacing w:after="40"/>
+        <w:ind w:left="288"/>
       </w:pPr>
       <w:r>
         <w:rPr>
           <w:rFonts w:ascii="Calibri" w:hAnsi="Calibri"/>
           <w:b w:val="0"/>
           <w:i w:val="0"/>
-          <w:sz w:val="22"/>
+          <w:sz w:val="21"/>
         </w:rPr>
         <w:t>EIA Form 860 — substation and generation facility locations</w:t>
       </w:r>
@@ -3609,47 +3261,47 @@
     <w:p>
       <w:pPr>
         <w:pStyle w:val="ListBullet"/>
-        <w:spacing w:after="60"/>
-        <w:ind w:left="360"/>
+        <w:spacing w:after="40"/>
+        <w:ind w:left="288"/>
       </w:pPr>
       <w:r>
         <w:rPr>
           <w:rFonts w:ascii="Calibri" w:hAnsi="Calibri"/>
           <w:b w:val="0"/>
           <w:i w:val="0"/>
-          <w:sz w:val="22"/>
+          <w:sz w:val="21"/>
         </w:rPr>
-        <w:t>NOAA Digital Coast — SLOSH surge modeling, sea level rise viewer</w:t>
+        <w:t>NOAA Digital Coast — SLOSH surge modeling, sea level rise projections</w:t>
       </w:r>
     </w:p>
     <w:p>
       <w:pPr>
         <w:pStyle w:val="ListBullet"/>
-        <w:spacing w:after="60"/>
-        <w:ind w:left="360"/>
+        <w:spacing w:after="40"/>
+        <w:ind w:left="288"/>
       </w:pPr>
       <w:r>
         <w:rPr>
           <w:rFonts w:ascii="Calibri" w:hAnsi="Calibri"/>
           <w:b w:val="0"/>
           <w:i w:val="0"/>
-          <w:sz w:val="22"/>
+          <w:sz w:val="21"/>
         </w:rPr>
-        <w:t>FEMA Flood Map Service Center — National Flood Hazard Layer (effective and preliminary)</w:t>
+        <w:t>FEMA Flood Map Service Center — NFHL (effective and preliminary versions)</w:t>
       </w:r>
     </w:p>
     <w:p>
       <w:pPr>
         <w:pStyle w:val="ListBullet"/>
-        <w:spacing w:after="60"/>
-        <w:ind w:left="360"/>
+        <w:spacing w:after="40"/>
+        <w:ind w:left="288"/>
       </w:pPr>
       <w:r>
         <w:rPr>
           <w:rFonts w:ascii="Calibri" w:hAnsi="Calibri"/>
           <w:b w:val="0"/>
           <w:i w:val="0"/>
-          <w:sz w:val="22"/>
+          <w:sz w:val="21"/>
         </w:rPr>
         <w:t>FDOT GIS — Florida road network</w:t>
       </w:r>
@@ -3657,118 +3309,118 @@
     <w:p>
       <w:pPr>
         <w:pStyle w:val="ListBullet"/>
-        <w:spacing w:after="60"/>
-        <w:ind w:left="360"/>
+        <w:spacing w:after="40"/>
+        <w:ind w:left="288"/>
       </w:pPr>
       <w:r>
         <w:rPr>
           <w:rFonts w:ascii="Calibri" w:hAnsi="Calibri"/>
           <w:b w:val="0"/>
           <w:i w:val="0"/>
-          <w:sz w:val="22"/>
+          <w:sz w:val="21"/>
         </w:rPr>
-        <w:t>USDA Forest Service Wildfire Hazard Potential — national raster dataset</w:t>
+        <w:t>USDA Forest Service Wildfire Hazard Potential</w:t>
       </w:r>
     </w:p>
     <w:p>
       <w:pPr>
         <w:pStyle w:val="ListBullet"/>
-        <w:spacing w:after="60"/>
-        <w:ind w:left="360"/>
+        <w:spacing w:after="40"/>
+        <w:ind w:left="288"/>
       </w:pPr>
       <w:r>
         <w:rPr>
           <w:rFonts w:ascii="Calibri" w:hAnsi="Calibri"/>
           <w:b w:val="0"/>
           <w:i w:val="0"/>
-          <w:sz w:val="22"/>
+          <w:sz w:val="21"/>
         </w:rPr>
-        <w:t>USGS National Map / 3DEP — elevation and groundwater data</w:t>
+        <w:t>USGS National Map / 3DEP — elevation and groundwater</w:t>
       </w:r>
     </w:p>
     <w:p>
       <w:pPr>
         <w:pStyle w:val="ListBullet"/>
-        <w:spacing w:after="60"/>
-        <w:ind w:left="360"/>
+        <w:spacing w:after="40"/>
+        <w:ind w:left="288"/>
       </w:pPr>
       <w:r>
         <w:rPr>
           <w:rFonts w:ascii="Calibri" w:hAnsi="Calibri"/>
           <w:b w:val="0"/>
           <w:i w:val="0"/>
-          <w:sz w:val="22"/>
+          <w:sz w:val="21"/>
         </w:rPr>
-        <w:t>SJRWMD — St. Johns River Water Management District water resource data</w:t>
+        <w:t>SJRWMD — groundwater and water resource data</w:t>
       </w:r>
     </w:p>
     <w:p>
       <w:pPr>
         <w:pStyle w:val="ListBullet"/>
-        <w:spacing w:after="60"/>
-        <w:ind w:left="360"/>
+        <w:spacing w:after="40"/>
+        <w:ind w:left="288"/>
       </w:pPr>
       <w:r>
         <w:rPr>
           <w:rFonts w:ascii="Calibri" w:hAnsi="Calibri"/>
           <w:b w:val="0"/>
           <w:i w:val="0"/>
-          <w:sz w:val="22"/>
+          <w:sz w:val="21"/>
         </w:rPr>
-        <w:t>Resilient Jacksonville — NEFRC CDBG compound flood model outputs</w:t>
+        <w:t>Resilient Jacksonville — NEFRC CDBG compound flood model</w:t>
       </w:r>
     </w:p>
     <w:p>
       <w:pPr>
         <w:pStyle w:val="ListBullet"/>
-        <w:spacing w:after="60"/>
-        <w:ind w:left="360"/>
+        <w:spacing w:after="40"/>
+        <w:ind w:left="288"/>
       </w:pPr>
       <w:r>
         <w:rPr>
           <w:rFonts w:ascii="Calibri" w:hAnsi="Calibri"/>
           <w:b w:val="0"/>
           <w:i w:val="0"/>
-          <w:sz w:val="22"/>
+          <w:sz w:val="21"/>
         </w:rPr>
-        <w:t>USACE Jacksonville District — coastal damage modeling and infrastructure data</w:t>
+        <w:t>USACE Jacksonville District — coastal damage modeling</w:t>
       </w:r>
     </w:p>
     <w:p>
       <w:pPr>
         <w:pStyle w:val="ListBullet"/>
-        <w:spacing w:after="60"/>
-        <w:ind w:left="360"/>
+        <w:spacing w:after="40"/>
+        <w:ind w:left="288"/>
       </w:pPr>
       <w:r>
         <w:rPr>
           <w:rFonts w:ascii="Calibri" w:hAnsi="Calibri"/>
           <w:b w:val="0"/>
           <w:i w:val="0"/>
-          <w:sz w:val="22"/>
+          <w:sz w:val="21"/>
         </w:rPr>
-        <w:t>Department of Energy — energy resilience and infrastructure research</w:t>
+        <w:t>Department of Energy — energy resilience research and program data</w:t>
       </w:r>
     </w:p>
     <w:p>
       <w:pPr>
         <w:pStyle w:val="ListBullet"/>
-        <w:spacing w:after="60"/>
-        <w:ind w:left="360"/>
+        <w:spacing w:after="40"/>
+        <w:ind w:left="288"/>
       </w:pPr>
       <w:r>
         <w:rPr>
           <w:rFonts w:ascii="Calibri" w:hAnsi="Calibri"/>
           <w:b w:val="0"/>
           <w:i w:val="0"/>
-          <w:sz w:val="22"/>
+          <w:sz w:val="21"/>
         </w:rPr>
         <w:t>Florida PSC — utility storm hardening filings and niche utility data</w:t>
       </w:r>
     </w:p>
     <w:sectPr>
       <w:pgSz w:w="12240" w:h="15840"/>
-      <w:pgMar w:top="1440" w:right="1800" w:bottom="1440" w:left="1800" w:header="720" w:footer="720" w:gutter="0"/>
+      <w:pgMar w:top="1440" w:right="1728" w:bottom="1440" w:left="1728" w:header="720" w:footer="720" w:gutter="0"/>
       <w:cols w:space="720"/>
       <w:docGrid w:linePitch="360"/>
     </w:sectPr>

</xml_diff>

<commit_message>
Switch to warm cream/forest green theme for eye comfort
- Georgia serif font throughout (warmer and more readable than sans-serif for long docs)
- Body text in dark charcoal instead of pure black (reduces contrast harshness)
- Section headers: warm cream fill with thin forest green bottom rule
- Dividers: deep forest green band
- Table headers: deep forest green; alternating rows in pale sage vs warm white
- Blockquotes: warm tint background with forest green left border
- 14pt line spacing on body text for breathing room
- Status tag colors softened to muted green/amber/red

https://claude.ai/code/session_01FS9333VimrXDDCapeqZFSA
</commit_message>
<xml_diff>
--- a/resilience_review/MIRR_Energy_Combined_Contribution.docx
+++ b/resilience_review/MIRR_Energy_Combined_Contribution.docx
@@ -6,11 +6,11 @@
       <w:pPr>
         <w:spacing w:before="200" w:after="0"/>
         <w:jc w:val="center"/>
-        <w:shd w:val="clear" w:color="auto" w:fill="1F6096"/>
+        <w:shd w:val="clear" w:color="auto" w:fill="3D5436"/>
       </w:pPr>
       <w:r>
         <w:rPr>
-          <w:rFonts w:ascii="Calibri" w:hAnsi="Calibri"/>
+          <w:rFonts w:ascii="Georgia" w:hAnsi="Georgia"/>
           <w:b/>
           <w:i w:val="0"/>
           <w:color w:val="FFFFFF"/>
@@ -23,11 +23,11 @@
       <w:pPr>
         <w:spacing w:before="0" w:after="0"/>
         <w:jc w:val="center"/>
-        <w:shd w:val="clear" w:color="auto" w:fill="2E75B6"/>
+        <w:shd w:val="clear" w:color="auto" w:fill="4A7040"/>
       </w:pPr>
       <w:r>
         <w:rPr>
-          <w:rFonts w:ascii="Calibri" w:hAnsi="Calibri"/>
+          <w:rFonts w:ascii="Georgia" w:hAnsi="Georgia"/>
           <w:b/>
           <w:i w:val="0"/>
           <w:color w:val="FFFFFF"/>
@@ -48,10 +48,10 @@
       </w:pPr>
       <w:r>
         <w:rPr>
-          <w:rFonts w:ascii="Calibri" w:hAnsi="Calibri"/>
+          <w:rFonts w:ascii="Georgia" w:hAnsi="Georgia"/>
           <w:b w:val="0"/>
           <w:i w:val="0"/>
-          <w:color w:val="44546A"/>
+          <w:color w:val="465A3C"/>
           <w:sz w:val="20"/>
         </w:rPr>
         <w:t>NAS Jacksonville  ·  NS Mayport  ·  MCSF Blount Island  ·  Camp Blanding JTF</w:t>
@@ -64,10 +64,10 @@
       </w:pPr>
       <w:r>
         <w:rPr>
-          <w:rFonts w:ascii="Calibri" w:hAnsi="Calibri"/>
+          <w:rFonts w:ascii="Georgia" w:hAnsi="Georgia"/>
           <w:b w:val="0"/>
           <w:i/>
-          <w:color w:val="595959"/>
+          <w:color w:val="645F5A"/>
           <w:sz w:val="19"/>
         </w:rPr>
         <w:t>Duval County and Clay County, Florida   |   Supervisor Review Draft   |   May 2026</w:t>
@@ -80,60 +80,60 @@
       </w:pPr>
       <w:r>
         <w:rPr>
-          <w:rFonts w:ascii="Calibri" w:hAnsi="Calibri"/>
+          <w:rFonts w:ascii="Georgia" w:hAnsi="Georgia"/>
           <w:b/>
           <w:i w:val="0"/>
-          <w:color w:val="375623"/>
+          <w:color w:val="235523"/>
           <w:sz w:val="19"/>
         </w:rPr>
         <w:t>● Confirmed</w:t>
       </w:r>
       <w:r>
         <w:rPr>
-          <w:rFonts w:ascii="Calibri" w:hAnsi="Calibri"/>
+          <w:rFonts w:ascii="Georgia" w:hAnsi="Georgia"/>
           <w:b w:val="0"/>
           <w:i/>
-          <w:color w:val="595959"/>
+          <w:color w:val="645F5A"/>
           <w:sz w:val="19"/>
         </w:rPr>
         <w:t xml:space="preserve"> = sourced to confirmed MIRR document   </w:t>
       </w:r>
       <w:r>
         <w:rPr>
-          <w:rFonts w:ascii="Calibri" w:hAnsi="Calibri"/>
+          <w:rFonts w:ascii="Georgia" w:hAnsi="Georgia"/>
           <w:b/>
           <w:i w:val="0"/>
-          <w:color w:val="7C5400"/>
+          <w:color w:val="82500A"/>
           <w:sz w:val="19"/>
         </w:rPr>
         <w:t>◐ Pending GIS</w:t>
       </w:r>
       <w:r>
         <w:rPr>
-          <w:rFonts w:ascii="Calibri" w:hAnsi="Calibri"/>
+          <w:rFonts w:ascii="Georgia" w:hAnsi="Georgia"/>
           <w:b w:val="0"/>
           <w:i/>
-          <w:color w:val="595959"/>
+          <w:color w:val="645F5A"/>
           <w:sz w:val="19"/>
         </w:rPr>
         <w:t xml:space="preserve"> = needs GIS spatial verification   </w:t>
       </w:r>
       <w:r>
         <w:rPr>
-          <w:rFonts w:ascii="Calibri" w:hAnsi="Calibri"/>
+          <w:rFonts w:ascii="Georgia" w:hAnsi="Georgia"/>
           <w:b/>
           <w:i w:val="0"/>
-          <w:color w:val="9C0006"/>
+          <w:color w:val="8C1E1E"/>
           <w:sz w:val="19"/>
         </w:rPr>
         <w:t>○ Needs verification</w:t>
       </w:r>
       <w:r>
         <w:rPr>
-          <w:rFonts w:ascii="Calibri" w:hAnsi="Calibri"/>
+          <w:rFonts w:ascii="Georgia" w:hAnsi="Georgia"/>
           <w:b w:val="0"/>
           <w:i/>
-          <w:color w:val="595959"/>
+          <w:color w:val="645F5A"/>
           <w:sz w:val="19"/>
         </w:rPr>
         <w:t xml:space="preserve"> = needs external source before formal use</w:t>
@@ -141,17 +141,17 @@
     </w:p>
     <w:p>
       <w:pPr>
-        <w:spacing w:after="80" w:before="0"/>
+        <w:spacing w:after="80" w:before="20" w:line="280" w:lineRule="exact"/>
         <w:pBdr>
-          <w:bottom w:val="single" w:sz="4" w:space="1" w:color="1F6096"/>
+          <w:bottom w:val="single" w:sz="4" w:space="1" w:color="2D5A37"/>
         </w:pBdr>
       </w:pPr>
       <w:r>
         <w:rPr>
-          <w:rFonts w:ascii="Calibri" w:hAnsi="Calibri"/>
+          <w:rFonts w:ascii="Georgia" w:hAnsi="Georgia"/>
           <w:b w:val="0"/>
           <w:i/>
-          <w:color w:val="44546A"/>
+          <w:color w:val="505A4B"/>
           <w:sz w:val="22"/>
         </w:rPr>
         <w:t>This document has two parts. Part 1 preserves the first intern's research findings verbatim — no edits to their original text. Part 2 is the second intern's contribution, developed through a full review of all twelve MIRR project documents. It provides the geographic and operational context that explains why the redundancy gap identified in Part 1 is a serious mission risk in this specific region. No GIS analysis has been completed yet — that work is in progress and is documented with pending status. No formal solutions are proposed.</w:t>
@@ -164,16 +164,16 @@
     </w:p>
     <w:p>
       <w:pPr>
-        <w:spacing w:before="360" w:after="160"/>
-        <w:shd w:val="clear" w:color="auto" w:fill="1F6096"/>
+        <w:spacing w:before="400" w:after="200"/>
+        <w:shd w:val="clear" w:color="auto" w:fill="3D5436"/>
       </w:pPr>
       <w:r>
         <w:rPr>
-          <w:rFonts w:ascii="Calibri" w:hAnsi="Calibri"/>
+          <w:rFonts w:ascii="Georgia" w:hAnsi="Georgia"/>
           <w:b/>
           <w:i w:val="0"/>
           <w:color w:val="FFFFFF"/>
-          <w:sz w:val="23"/>
+          <w:sz w:val="24"/>
         </w:rPr>
         <w:t xml:space="preserve">  PART 1 — First Intern's Research Findings  (preserved verbatim)</w:t>
       </w:r>
@@ -185,31 +185,33 @@
     </w:p>
     <w:p>
       <w:pPr>
-        <w:spacing w:before="280" w:after="120"/>
-        <w:ind w:left="-72"/>
-        <w:shd w:val="clear" w:color="auto" w:fill="BDD7EE"/>
+        <w:spacing w:before="320" w:after="120"/>
+        <w:shd w:val="clear" w:color="auto" w:fill="F5F0E8"/>
+        <w:pBdr>
+          <w:bottom w:val="single" w:sz="4" w:space="1" w:color="2D5A37"/>
+        </w:pBdr>
       </w:pPr>
       <w:r>
         <w:rPr>
-          <w:rFonts w:ascii="Calibri" w:hAnsi="Calibri"/>
+          <w:rFonts w:ascii="Georgia" w:hAnsi="Georgia"/>
           <w:b/>
           <w:i w:val="0"/>
-          <w:color w:val="1F6097"/>
-          <w:sz w:val="23"/>
+          <w:color w:val="2D5A37"/>
+          <w:sz w:val="24"/>
         </w:rPr>
         <w:t xml:space="preserve">  Energy Resilience Overview</w:t>
       </w:r>
     </w:p>
     <w:p>
       <w:pPr>
-        <w:spacing w:after="120" w:before="0"/>
+        <w:spacing w:after="140" w:before="20" w:line="280" w:lineRule="exact"/>
       </w:pPr>
       <w:r>
         <w:rPr>
-          <w:rFonts w:ascii="Calibri" w:hAnsi="Calibri"/>
+          <w:rFonts w:ascii="Georgia" w:hAnsi="Georgia"/>
           <w:b w:val="0"/>
           <w:i w:val="0"/>
-          <w:color w:val="000000"/>
+          <w:color w:val="2D2D2D"/>
           <w:sz w:val="22"/>
         </w:rPr>
         <w:t>Common themes across the sites include dependence on outside grid and exposure to its shortcomings, namely single-point utility failures outside of these military sites that could cause failures that cascade onto military sites and threaten mission success. These failure points are typically substations or lines along the U.S. 17 highway.</w:t>
@@ -217,14 +219,14 @@
     </w:p>
     <w:p>
       <w:pPr>
-        <w:spacing w:after="120" w:before="0"/>
+        <w:spacing w:after="140" w:before="20" w:line="280" w:lineRule="exact"/>
       </w:pPr>
       <w:r>
         <w:rPr>
-          <w:rFonts w:ascii="Calibri" w:hAnsi="Calibri"/>
+          <w:rFonts w:ascii="Georgia" w:hAnsi="Georgia"/>
           <w:b w:val="0"/>
           <w:i w:val="0"/>
-          <w:color w:val="000000"/>
+          <w:color w:val="2D2D2D"/>
           <w:sz w:val="22"/>
         </w:rPr>
         <w:t>These risks are exasperated by increasing energy demand throughout the region and lack of redundancy of power supply to installations. There are reports of aging infrastructure serving the installations which only increases the likelihood of single-point failure.</w:t>
@@ -232,14 +234,14 @@
     </w:p>
     <w:p>
       <w:pPr>
-        <w:spacing w:after="120" w:before="0"/>
+        <w:spacing w:after="140" w:before="20" w:line="280" w:lineRule="exact"/>
       </w:pPr>
       <w:r>
         <w:rPr>
-          <w:rFonts w:ascii="Calibri" w:hAnsi="Calibri"/>
+          <w:rFonts w:ascii="Georgia" w:hAnsi="Georgia"/>
           <w:b w:val="0"/>
           <w:i w:val="0"/>
-          <w:color w:val="000000"/>
+          <w:color w:val="2D2D2D"/>
           <w:sz w:val="22"/>
         </w:rPr>
         <w:t>It's worth noting that one of the bases, Camp Blanding, relies on four separate power providers and Seminole Electric for generation. The Florida Power &amp; Light (FPL) substation north of the base is a high-risk asset vulnerable to natural hazards and a lack of redundancy.</w:t>
@@ -247,31 +249,33 @@
     </w:p>
     <w:p>
       <w:pPr>
-        <w:spacing w:before="280" w:after="120"/>
-        <w:ind w:left="-72"/>
-        <w:shd w:val="clear" w:color="auto" w:fill="BDD7EE"/>
+        <w:spacing w:before="320" w:after="120"/>
+        <w:shd w:val="clear" w:color="auto" w:fill="F5F0E8"/>
+        <w:pBdr>
+          <w:bottom w:val="single" w:sz="4" w:space="1" w:color="2D5A37"/>
+        </w:pBdr>
       </w:pPr>
       <w:r>
         <w:rPr>
-          <w:rFonts w:ascii="Calibri" w:hAnsi="Calibri"/>
+          <w:rFonts w:ascii="Georgia" w:hAnsi="Georgia"/>
           <w:b/>
           <w:i w:val="0"/>
-          <w:color w:val="1F6097"/>
-          <w:sz w:val="23"/>
+          <w:color w:val="2D5A37"/>
+          <w:sz w:val="24"/>
         </w:rPr>
         <w:t xml:space="preserve">  Adaptation Strategies — Summary Notes</w:t>
       </w:r>
     </w:p>
     <w:p>
       <w:pPr>
-        <w:spacing w:after="80" w:before="0"/>
+        <w:spacing w:after="80" w:before="20" w:line="280" w:lineRule="exact"/>
       </w:pPr>
       <w:r>
         <w:rPr>
-          <w:rFonts w:ascii="Calibri" w:hAnsi="Calibri"/>
+          <w:rFonts w:ascii="Georgia" w:hAnsi="Georgia"/>
           <w:b w:val="0"/>
           <w:i w:val="0"/>
-          <w:color w:val="000000"/>
+          <w:color w:val="2D2D2D"/>
           <w:sz w:val="22"/>
         </w:rPr>
         <w:t>The general theme of strategies discussed is moving from isolated but dependent islands into more connected hubs capable of offering and accepting support to and from the larger grid. This shift was motivated by Hurricane Michael's 2018 impact on Tyndall AFB, where hardening within the fence was undermined by failure of the surrounding civilian infrastructure.</w:t>
@@ -280,14 +284,15 @@
     <w:p>
       <w:pPr>
         <w:pStyle w:val="ListBullet"/>
-        <w:spacing w:after="60" w:before="20"/>
-        <w:ind w:left="360"/>
+        <w:spacing w:after="80" w:before="40" w:line="280" w:lineRule="exact"/>
+        <w:ind w:left="432"/>
       </w:pPr>
       <w:r>
         <w:rPr>
-          <w:rFonts w:ascii="Calibri" w:hAnsi="Calibri"/>
+          <w:rFonts w:ascii="Georgia" w:hAnsi="Georgia"/>
           <w:b w:val="0"/>
           <w:i w:val="0"/>
+          <w:color w:val="2D2D2D"/>
           <w:sz w:val="22"/>
         </w:rPr>
         <w:t>Flood-proofing substations and supply lines. Mutual Support Agreements (MSAs) to formalize utility-installation collaboration.</w:t>
@@ -296,14 +301,15 @@
     <w:p>
       <w:pPr>
         <w:pStyle w:val="ListBullet"/>
-        <w:spacing w:after="60" w:before="20"/>
-        <w:ind w:left="360"/>
+        <w:spacing w:after="80" w:before="40" w:line="280" w:lineRule="exact"/>
+        <w:ind w:left="432"/>
       </w:pPr>
       <w:r>
         <w:rPr>
-          <w:rFonts w:ascii="Calibri" w:hAnsi="Calibri"/>
+          <w:rFonts w:ascii="Georgia" w:hAnsi="Georgia"/>
           <w:b w:val="0"/>
           <w:i w:val="0"/>
+          <w:color w:val="2D2D2D"/>
           <w:sz w:val="22"/>
         </w:rPr>
         <w:t>Addressing redundancy gaps in electrical and fuel systems — backup paths and fuel stocks.</w:t>
@@ -312,14 +318,15 @@
     <w:p>
       <w:pPr>
         <w:pStyle w:val="ListBullet"/>
-        <w:spacing w:after="60" w:before="20"/>
-        <w:ind w:left="360"/>
+        <w:spacing w:after="80" w:before="40" w:line="280" w:lineRule="exact"/>
+        <w:ind w:left="432"/>
       </w:pPr>
       <w:r>
         <w:rPr>
-          <w:rFonts w:ascii="Calibri" w:hAnsi="Calibri"/>
+          <w:rFonts w:ascii="Georgia" w:hAnsi="Georgia"/>
           <w:b w:val="0"/>
           <w:i w:val="0"/>
+          <w:color w:val="2D2D2D"/>
           <w:sz w:val="22"/>
         </w:rPr>
         <w:t>Microgrids with battery storage — feasibility studies already underway at NAS JAX.</w:t>
@@ -328,14 +335,15 @@
     <w:p>
       <w:pPr>
         <w:pStyle w:val="ListBullet"/>
-        <w:spacing w:after="60" w:before="20"/>
-        <w:ind w:left="360"/>
+        <w:spacing w:after="80" w:before="40" w:line="280" w:lineRule="exact"/>
+        <w:ind w:left="432"/>
       </w:pPr>
       <w:r>
         <w:rPr>
-          <w:rFonts w:ascii="Calibri" w:hAnsi="Calibri"/>
+          <w:rFonts w:ascii="Georgia" w:hAnsi="Georgia"/>
           <w:b w:val="0"/>
           <w:i w:val="0"/>
+          <w:color w:val="2D2D2D"/>
           <w:sz w:val="22"/>
         </w:rPr>
         <w:t>Solar PV and battery storage: costs have fallen significantly; feasibility study warranted.</w:t>
@@ -343,25 +351,25 @@
     </w:p>
     <w:p>
       <w:pPr>
-        <w:spacing w:after="80" w:before="40"/>
+        <w:spacing w:after="80" w:before="60"/>
         <w:ind w:left="288"/>
       </w:pPr>
       <w:r>
         <w:rPr>
-          <w:rFonts w:ascii="Calibri" w:hAnsi="Calibri"/>
+          <w:rFonts w:ascii="Georgia" w:hAnsi="Georgia"/>
           <w:b/>
           <w:i w:val="0"/>
-          <w:color w:val="9C0006"/>
+          <w:color w:val="8C1E1E"/>
           <w:sz w:val="19"/>
         </w:rPr>
         <w:t xml:space="preserve">○ Needs verification  </w:t>
       </w:r>
       <w:r>
         <w:rPr>
-          <w:rFonts w:ascii="Calibri" w:hAnsi="Calibri"/>
+          <w:rFonts w:ascii="Georgia" w:hAnsi="Georgia"/>
           <w:b w:val="0"/>
           <w:i/>
-          <w:color w:val="595959"/>
+          <w:color w:val="645F5A"/>
           <w:sz w:val="19"/>
         </w:rPr>
         <w:t>Miramar 21-day islanding and landfill methane claim: primary source needed before formal use. See Part 2, Section 2.6 for verification steps.</w:t>
@@ -374,16 +382,16 @@
     </w:p>
     <w:p>
       <w:pPr>
-        <w:spacing w:before="360" w:after="160"/>
-        <w:shd w:val="clear" w:color="auto" w:fill="1F6096"/>
+        <w:spacing w:before="400" w:after="200"/>
+        <w:shd w:val="clear" w:color="auto" w:fill="3D5436"/>
       </w:pPr>
       <w:r>
         <w:rPr>
-          <w:rFonts w:ascii="Calibri" w:hAnsi="Calibri"/>
+          <w:rFonts w:ascii="Georgia" w:hAnsi="Georgia"/>
           <w:b/>
           <w:i w:val="0"/>
           <w:color w:val="FFFFFF"/>
-          <w:sz w:val="23"/>
+          <w:sz w:val="24"/>
         </w:rPr>
         <w:t xml:space="preserve">  PART 2 — Second Intern's Research Contribution</w:t>
       </w:r>
@@ -395,14 +403,14 @@
     </w:p>
     <w:p>
       <w:pPr>
-        <w:spacing w:after="120" w:before="0"/>
+        <w:spacing w:after="140" w:before="20" w:line="280" w:lineRule="exact"/>
       </w:pPr>
       <w:r>
         <w:rPr>
-          <w:rFonts w:ascii="Calibri" w:hAnsi="Calibri"/>
+          <w:rFonts w:ascii="Georgia" w:hAnsi="Georgia"/>
           <w:b w:val="0"/>
           <w:i/>
-          <w:color w:val="44546A"/>
+          <w:color w:val="505A4B"/>
           <w:sz w:val="22"/>
         </w:rPr>
         <w:t>The sections below expand on Part 1 by grounding the redundancy gap in the specific geographic, operational, and documented hazard context of Northeast Florida. Every finding is tied to a confirmed source or clearly annotated as pending. This is the foundation the GIS analysis will build on.</w:t>
@@ -410,31 +418,33 @@
     </w:p>
     <w:p>
       <w:pPr>
-        <w:spacing w:before="280" w:after="120"/>
-        <w:ind w:left="-72"/>
-        <w:shd w:val="clear" w:color="auto" w:fill="BDD7EE"/>
+        <w:spacing w:before="320" w:after="120"/>
+        <w:shd w:val="clear" w:color="auto" w:fill="F5F0E8"/>
+        <w:pBdr>
+          <w:bottom w:val="single" w:sz="4" w:space="1" w:color="2D5A37"/>
+        </w:pBdr>
       </w:pPr>
       <w:r>
         <w:rPr>
-          <w:rFonts w:ascii="Calibri" w:hAnsi="Calibri"/>
+          <w:rFonts w:ascii="Georgia" w:hAnsi="Georgia"/>
           <w:b/>
           <w:i w:val="0"/>
-          <w:color w:val="1F6097"/>
-          <w:sz w:val="23"/>
+          <w:color w:val="2D5A37"/>
+          <w:sz w:val="24"/>
         </w:rPr>
         <w:t xml:space="preserve">  2.1  The Core Problem: Zero Electrical Redundancy at All Four Installations</w:t>
       </w:r>
     </w:p>
     <w:p>
       <w:pPr>
-        <w:spacing w:after="120" w:before="0"/>
+        <w:spacing w:after="140" w:before="20" w:line="280" w:lineRule="exact"/>
       </w:pPr>
       <w:r>
         <w:rPr>
-          <w:rFonts w:ascii="Calibri" w:hAnsi="Calibri"/>
+          <w:rFonts w:ascii="Georgia" w:hAnsi="Georgia"/>
           <w:b w:val="0"/>
           <w:i w:val="0"/>
-          <w:color w:val="000000"/>
+          <w:color w:val="2D2D2D"/>
           <w:sz w:val="22"/>
         </w:rPr>
         <w:t>The MIRR vulnerability assessment's central energy finding is direct: all four installations each draw from a single external substation with no backup supply path. There is no secondary feed, no alternate routing, and no automatic switching to an alternative grid node. If the one substation serving a base loses power — whether from storm surge, wildfire, equipment failure, or any other cause — the installation loses commercial electricity entirely.</w:t>
@@ -442,14 +452,14 @@
     </w:p>
     <w:p>
       <w:pPr>
-        <w:spacing w:after="120" w:before="0"/>
+        <w:spacing w:after="140" w:before="20" w:line="280" w:lineRule="exact"/>
       </w:pPr>
       <w:r>
         <w:rPr>
-          <w:rFonts w:ascii="Calibri" w:hAnsi="Calibri"/>
+          <w:rFonts w:ascii="Georgia" w:hAnsi="Georgia"/>
           <w:b w:val="0"/>
           <w:i w:val="0"/>
-          <w:color w:val="000000"/>
+          <w:color w:val="2D2D2D"/>
           <w:sz w:val="22"/>
         </w:rPr>
         <w:t>This is not a concern about efficiency or cost. It is a structural single point of failure baked into how these installations are physically connected to the grid. The substations are located outside the installation fence on civilian utility property, hardened to commercial standards rather than military resilience standards, and covered under Intergovernmental Service Agreements (IGSAs) that address only routine operations and maintenance — not resilience, redundancy, or priority restoration timelines.</w:t>
@@ -457,14 +467,14 @@
     </w:p>
     <w:p>
       <w:pPr>
-        <w:spacing w:after="120" w:before="0"/>
+        <w:spacing w:after="140" w:before="20" w:line="280" w:lineRule="exact"/>
       </w:pPr>
       <w:r>
         <w:rPr>
-          <w:rFonts w:ascii="Calibri" w:hAnsi="Calibri"/>
+          <w:rFonts w:ascii="Georgia" w:hAnsi="Georgia"/>
           <w:b w:val="0"/>
           <w:i w:val="0"/>
-          <w:color w:val="000000"/>
+          <w:color w:val="2D2D2D"/>
           <w:sz w:val="22"/>
         </w:rPr>
         <w:t>The gap between how fast a utility restores power after a major event (measured in days) and how fast a military mission requires power to be restored (measured in hours) is not addressed anywhere in the current IGSA framework. This is the operational problem.</w:t>
@@ -472,29 +482,30 @@
     </w:p>
     <w:p>
       <w:pPr>
-        <w:spacing w:after="120" w:before="80"/>
-        <w:ind w:left="504" w:right="288"/>
+        <w:spacing w:after="160" w:before="120" w:line="300" w:lineRule="exact"/>
+        <w:ind w:left="576" w:right="360"/>
         <w:pBdr>
-          <w:left w:val="single" w:sz="14" w:space="6" w:color="1F6096"/>
+          <w:left w:val="single" w:sz="16" w:space="6" w:color="2D5A37"/>
         </w:pBdr>
+        <w:shd w:val="clear" w:color="auto" w:fill="F0EDE6"/>
       </w:pPr>
       <w:r>
         <w:rPr>
-          <w:rFonts w:ascii="Calibri" w:hAnsi="Calibri"/>
+          <w:rFonts w:ascii="Georgia" w:hAnsi="Georgia"/>
           <w:b w:val="0"/>
           <w:i/>
-          <w:color w:val="323232"/>
-          <w:sz w:val="21"/>
+          <w:color w:val="373732"/>
+          <w:sz w:val="22"/>
         </w:rPr>
         <w:t>"At the asset systems level there is no immediate risk to mission other than single points of failure at each installation."</w:t>
       </w:r>
       <w:r>
         <w:rPr>
-          <w:rFonts w:ascii="Calibri" w:hAnsi="Calibri"/>
+          <w:rFonts w:ascii="Georgia" w:hAnsi="Georgia"/>
           <w:b w:val="0"/>
           <w:i/>
-          <w:color w:val="595959"/>
-          <w:sz w:val="18"/>
+          <w:color w:val="645F5A"/>
+          <w:sz w:val="19"/>
         </w:rPr>
         <w:br/>
         <w:t xml:space="preserve">  — MIRR Vulnerability Assessment, January 2026 Steering Committee</w:t>
@@ -502,29 +513,30 @@
     </w:p>
     <w:p>
       <w:pPr>
-        <w:spacing w:after="120" w:before="80"/>
-        <w:ind w:left="504" w:right="288"/>
+        <w:spacing w:after="160" w:before="120" w:line="300" w:lineRule="exact"/>
+        <w:ind w:left="576" w:right="360"/>
         <w:pBdr>
-          <w:left w:val="single" w:sz="14" w:space="6" w:color="1F6096"/>
+          <w:left w:val="single" w:sz="16" w:space="6" w:color="2D5A37"/>
         </w:pBdr>
+        <w:shd w:val="clear" w:color="auto" w:fill="F0EDE6"/>
       </w:pPr>
       <w:r>
         <w:rPr>
-          <w:rFonts w:ascii="Calibri" w:hAnsi="Calibri"/>
+          <w:rFonts w:ascii="Georgia" w:hAnsi="Georgia"/>
           <w:b w:val="0"/>
           <w:i/>
-          <w:color w:val="323232"/>
-          <w:sz w:val="21"/>
+          <w:color w:val="373732"/>
+          <w:sz w:val="22"/>
         </w:rPr>
         <w:t>"Utility restoration timelines and fuel delivery continuity may ultimately affect operational recovery more than flood depth at individual facilities."</w:t>
       </w:r>
       <w:r>
         <w:rPr>
-          <w:rFonts w:ascii="Calibri" w:hAnsi="Calibri"/>
+          <w:rFonts w:ascii="Georgia" w:hAnsi="Georgia"/>
           <w:b w:val="0"/>
           <w:i/>
-          <w:color w:val="595959"/>
-          <w:sz w:val="18"/>
+          <w:color w:val="645F5A"/>
+          <w:sz w:val="19"/>
         </w:rPr>
         <w:br/>
         <w:t xml:space="preserve">  — APTIM Memo: NE MIRR Evaluating Potential Adaptation Solutions, May 22, 2026</w:t>
@@ -532,25 +544,25 @@
     </w:p>
     <w:p>
       <w:pPr>
-        <w:spacing w:after="80" w:before="40"/>
+        <w:spacing w:after="80" w:before="60"/>
         <w:ind w:left="288"/>
       </w:pPr>
       <w:r>
         <w:rPr>
-          <w:rFonts w:ascii="Calibri" w:hAnsi="Calibri"/>
+          <w:rFonts w:ascii="Georgia" w:hAnsi="Georgia"/>
           <w:b/>
           <w:i w:val="0"/>
-          <w:color w:val="375623"/>
+          <w:color w:val="235523"/>
           <w:sz w:val="19"/>
         </w:rPr>
         <w:t xml:space="preserve">● Confirmed  </w:t>
       </w:r>
       <w:r>
         <w:rPr>
-          <w:rFonts w:ascii="Calibri" w:hAnsi="Calibri"/>
+          <w:rFonts w:ascii="Georgia" w:hAnsi="Georgia"/>
           <w:b w:val="0"/>
           <w:i/>
-          <w:color w:val="595959"/>
+          <w:color w:val="645F5A"/>
           <w:sz w:val="19"/>
         </w:rPr>
         <w:t>Risk ratings and IGSA gap confirmed: MIRR VA (Jan 2026 SC) and Mutual Support Assessment (Feb 2026 TAC).</w:t>
@@ -563,14 +575,14 @@
     </w:p>
     <w:p>
       <w:pPr>
-        <w:spacing w:after="120" w:before="0"/>
+        <w:spacing w:after="140" w:before="20" w:line="280" w:lineRule="exact"/>
       </w:pPr>
       <w:r>
         <w:rPr>
-          <w:rFonts w:ascii="Calibri" w:hAnsi="Calibri"/>
+          <w:rFonts w:ascii="Georgia" w:hAnsi="Georgia"/>
           <w:b w:val="0"/>
           <w:i/>
-          <w:color w:val="44546A"/>
+          <w:color w:val="505A4B"/>
           <w:sz w:val="22"/>
         </w:rPr>
         <w:t>The table below summarizes the four confirmed energy single points of failure.</w:t>
@@ -593,16 +605,16 @@
         <w:tc>
           <w:tcPr>
             <w:tcW w:type="dxa" w:w="1728"/>
-            <w:shd w:val="clear" w:color="auto" w:fill="2E75B6"/>
+            <w:shd w:val="clear" w:color="auto" w:fill="3D5436"/>
           </w:tcPr>
           <w:p>
             <w:pPr>
-              <w:spacing w:after="40" w:before="40"/>
+              <w:spacing w:after="60" w:before="60"/>
             </w:pPr>
             <w:r/>
             <w:r>
               <w:rPr>
-                <w:rFonts w:ascii="Calibri" w:hAnsi="Calibri"/>
+                <w:rFonts w:ascii="Georgia" w:hAnsi="Georgia"/>
                 <w:b/>
                 <w:i w:val="0"/>
                 <w:color w:val="FFFFFF"/>
@@ -615,16 +627,16 @@
         <w:tc>
           <w:tcPr>
             <w:tcW w:type="dxa" w:w="1728"/>
-            <w:shd w:val="clear" w:color="auto" w:fill="2E75B6"/>
+            <w:shd w:val="clear" w:color="auto" w:fill="3D5436"/>
           </w:tcPr>
           <w:p>
             <w:pPr>
-              <w:spacing w:after="40" w:before="40"/>
+              <w:spacing w:after="60" w:before="60"/>
             </w:pPr>
             <w:r/>
             <w:r>
               <w:rPr>
-                <w:rFonts w:ascii="Calibri" w:hAnsi="Calibri"/>
+                <w:rFonts w:ascii="Georgia" w:hAnsi="Georgia"/>
                 <w:b/>
                 <w:i w:val="0"/>
                 <w:color w:val="FFFFFF"/>
@@ -637,16 +649,16 @@
         <w:tc>
           <w:tcPr>
             <w:tcW w:type="dxa" w:w="1728"/>
-            <w:shd w:val="clear" w:color="auto" w:fill="2E75B6"/>
+            <w:shd w:val="clear" w:color="auto" w:fill="3D5436"/>
           </w:tcPr>
           <w:p>
             <w:pPr>
-              <w:spacing w:after="40" w:before="40"/>
+              <w:spacing w:after="60" w:before="60"/>
             </w:pPr>
             <w:r/>
             <w:r>
               <w:rPr>
-                <w:rFonts w:ascii="Calibri" w:hAnsi="Calibri"/>
+                <w:rFonts w:ascii="Georgia" w:hAnsi="Georgia"/>
                 <w:b/>
                 <w:i w:val="0"/>
                 <w:color w:val="FFFFFF"/>
@@ -659,16 +671,16 @@
         <w:tc>
           <w:tcPr>
             <w:tcW w:type="dxa" w:w="1728"/>
-            <w:shd w:val="clear" w:color="auto" w:fill="2E75B6"/>
+            <w:shd w:val="clear" w:color="auto" w:fill="3D5436"/>
           </w:tcPr>
           <w:p>
             <w:pPr>
-              <w:spacing w:after="40" w:before="40"/>
+              <w:spacing w:after="60" w:before="60"/>
             </w:pPr>
             <w:r/>
             <w:r>
               <w:rPr>
-                <w:rFonts w:ascii="Calibri" w:hAnsi="Calibri"/>
+                <w:rFonts w:ascii="Georgia" w:hAnsi="Georgia"/>
                 <w:b/>
                 <w:i w:val="0"/>
                 <w:color w:val="FFFFFF"/>
@@ -681,16 +693,16 @@
         <w:tc>
           <w:tcPr>
             <w:tcW w:type="dxa" w:w="1728"/>
-            <w:shd w:val="clear" w:color="auto" w:fill="2E75B6"/>
+            <w:shd w:val="clear" w:color="auto" w:fill="3D5436"/>
           </w:tcPr>
           <w:p>
             <w:pPr>
-              <w:spacing w:after="40" w:before="40"/>
+              <w:spacing w:after="60" w:before="60"/>
             </w:pPr>
             <w:r/>
             <w:r>
               <w:rPr>
-                <w:rFonts w:ascii="Calibri" w:hAnsi="Calibri"/>
+                <w:rFonts w:ascii="Georgia" w:hAnsi="Georgia"/>
                 <w:b/>
                 <w:i w:val="0"/>
                 <w:color w:val="FFFFFF"/>
@@ -705,17 +717,19 @@
         <w:tc>
           <w:tcPr>
             <w:tcW w:type="dxa" w:w="1728"/>
+            <w:shd w:val="clear" w:color="auto" w:fill="FDFBF8"/>
           </w:tcPr>
           <w:p>
             <w:pPr>
-              <w:spacing w:after="40" w:before="40"/>
+              <w:spacing w:after="60" w:before="60" w:line="260" w:lineRule="exact"/>
             </w:pPr>
             <w:r/>
             <w:r>
               <w:rPr>
-                <w:rFonts w:ascii="Calibri" w:hAnsi="Calibri"/>
+                <w:rFonts w:ascii="Georgia" w:hAnsi="Georgia"/>
                 <w:b w:val="0"/>
                 <w:i w:val="0"/>
+                <w:color w:val="2D2D2D"/>
                 <w:sz w:val="20"/>
               </w:rPr>
               <w:t>NS Mayport</w:t>
@@ -725,17 +739,19 @@
         <w:tc>
           <w:tcPr>
             <w:tcW w:type="dxa" w:w="1728"/>
+            <w:shd w:val="clear" w:color="auto" w:fill="FDFBF8"/>
           </w:tcPr>
           <w:p>
             <w:pPr>
-              <w:spacing w:after="40" w:before="40"/>
+              <w:spacing w:after="60" w:before="60" w:line="260" w:lineRule="exact"/>
             </w:pPr>
             <w:r/>
             <w:r>
               <w:rPr>
-                <w:rFonts w:ascii="Calibri" w:hAnsi="Calibri"/>
+                <w:rFonts w:ascii="Georgia" w:hAnsi="Georgia"/>
                 <w:b w:val="0"/>
                 <w:i w:val="0"/>
+                <w:color w:val="2D2D2D"/>
                 <w:sz w:val="20"/>
               </w:rPr>
               <w:t>JEA</w:t>
@@ -745,17 +761,19 @@
         <w:tc>
           <w:tcPr>
             <w:tcW w:type="dxa" w:w="1728"/>
+            <w:shd w:val="clear" w:color="auto" w:fill="FDFBF8"/>
           </w:tcPr>
           <w:p>
             <w:pPr>
-              <w:spacing w:after="40" w:before="40"/>
+              <w:spacing w:after="60" w:before="60" w:line="260" w:lineRule="exact"/>
             </w:pPr>
             <w:r/>
             <w:r>
               <w:rPr>
-                <w:rFonts w:ascii="Calibri" w:hAnsi="Calibri"/>
+                <w:rFonts w:ascii="Georgia" w:hAnsi="Georgia"/>
                 <w:b w:val="0"/>
                 <w:i w:val="0"/>
+                <w:color w:val="2D2D2D"/>
                 <w:sz w:val="20"/>
               </w:rPr>
               <w:t>South of base — outside fence</w:t>
@@ -765,17 +783,19 @@
         <w:tc>
           <w:tcPr>
             <w:tcW w:type="dxa" w:w="1728"/>
+            <w:shd w:val="clear" w:color="auto" w:fill="FDFBF8"/>
           </w:tcPr>
           <w:p>
             <w:pPr>
-              <w:spacing w:after="40" w:before="40"/>
+              <w:spacing w:after="60" w:before="60" w:line="260" w:lineRule="exact"/>
             </w:pPr>
             <w:r/>
             <w:r>
               <w:rPr>
-                <w:rFonts w:ascii="Calibri" w:hAnsi="Calibri"/>
+                <w:rFonts w:ascii="Georgia" w:hAnsi="Georgia"/>
                 <w:b w:val="0"/>
                 <w:i w:val="0"/>
+                <w:color w:val="2D2D2D"/>
                 <w:sz w:val="20"/>
               </w:rPr>
               <w:t>HIGH</w:t>
@@ -785,17 +805,19 @@
         <w:tc>
           <w:tcPr>
             <w:tcW w:type="dxa" w:w="1728"/>
+            <w:shd w:val="clear" w:color="auto" w:fill="FDFBF8"/>
           </w:tcPr>
           <w:p>
             <w:pPr>
-              <w:spacing w:after="40" w:before="40"/>
+              <w:spacing w:after="60" w:before="60" w:line="260" w:lineRule="exact"/>
             </w:pPr>
             <w:r/>
             <w:r>
               <w:rPr>
-                <w:rFonts w:ascii="Calibri" w:hAnsi="Calibri"/>
+                <w:rFonts w:ascii="Georgia" w:hAnsi="Georgia"/>
                 <w:b w:val="0"/>
                 <w:i w:val="0"/>
+                <w:color w:val="2D2D2D"/>
                 <w:sz w:val="20"/>
               </w:rPr>
               <w:t>Immediate</w:t>
@@ -807,18 +829,19 @@
         <w:tc>
           <w:tcPr>
             <w:tcW w:type="dxa" w:w="1728"/>
-            <w:shd w:val="clear" w:color="auto" w:fill="DEEAF1"/>
+            <w:shd w:val="clear" w:color="auto" w:fill="EAF0E8"/>
           </w:tcPr>
           <w:p>
             <w:pPr>
-              <w:spacing w:after="40" w:before="40"/>
+              <w:spacing w:after="60" w:before="60" w:line="260" w:lineRule="exact"/>
             </w:pPr>
             <w:r/>
             <w:r>
               <w:rPr>
-                <w:rFonts w:ascii="Calibri" w:hAnsi="Calibri"/>
+                <w:rFonts w:ascii="Georgia" w:hAnsi="Georgia"/>
                 <w:b w:val="0"/>
                 <w:i w:val="0"/>
+                <w:color w:val="2D2D2D"/>
                 <w:sz w:val="20"/>
               </w:rPr>
               <w:t>MCSF Blount Island</w:t>
@@ -828,18 +851,19 @@
         <w:tc>
           <w:tcPr>
             <w:tcW w:type="dxa" w:w="1728"/>
-            <w:shd w:val="clear" w:color="auto" w:fill="DEEAF1"/>
+            <w:shd w:val="clear" w:color="auto" w:fill="EAF0E8"/>
           </w:tcPr>
           <w:p>
             <w:pPr>
-              <w:spacing w:after="40" w:before="40"/>
+              <w:spacing w:after="60" w:before="60" w:line="260" w:lineRule="exact"/>
             </w:pPr>
             <w:r/>
             <w:r>
               <w:rPr>
-                <w:rFonts w:ascii="Calibri" w:hAnsi="Calibri"/>
+                <w:rFonts w:ascii="Georgia" w:hAnsi="Georgia"/>
                 <w:b w:val="0"/>
                 <w:i w:val="0"/>
+                <w:color w:val="2D2D2D"/>
                 <w:sz w:val="20"/>
               </w:rPr>
               <w:t>JEA</w:t>
@@ -849,18 +873,19 @@
         <w:tc>
           <w:tcPr>
             <w:tcW w:type="dxa" w:w="1728"/>
-            <w:shd w:val="clear" w:color="auto" w:fill="DEEAF1"/>
+            <w:shd w:val="clear" w:color="auto" w:fill="EAF0E8"/>
           </w:tcPr>
           <w:p>
             <w:pPr>
-              <w:spacing w:after="40" w:before="40"/>
+              <w:spacing w:after="60" w:before="60" w:line="260" w:lineRule="exact"/>
             </w:pPr>
             <w:r/>
             <w:r>
               <w:rPr>
-                <w:rFonts w:ascii="Calibri" w:hAnsi="Calibri"/>
+                <w:rFonts w:ascii="Georgia" w:hAnsi="Georgia"/>
                 <w:b w:val="0"/>
                 <w:i w:val="0"/>
+                <w:color w:val="2D2D2D"/>
                 <w:sz w:val="20"/>
               </w:rPr>
               <w:t>JEA Substation (river island)</w:t>
@@ -870,18 +895,19 @@
         <w:tc>
           <w:tcPr>
             <w:tcW w:type="dxa" w:w="1728"/>
-            <w:shd w:val="clear" w:color="auto" w:fill="DEEAF1"/>
+            <w:shd w:val="clear" w:color="auto" w:fill="EAF0E8"/>
           </w:tcPr>
           <w:p>
             <w:pPr>
-              <w:spacing w:after="40" w:before="40"/>
+              <w:spacing w:after="60" w:before="60" w:line="260" w:lineRule="exact"/>
             </w:pPr>
             <w:r/>
             <w:r>
               <w:rPr>
-                <w:rFonts w:ascii="Calibri" w:hAnsi="Calibri"/>
+                <w:rFonts w:ascii="Georgia" w:hAnsi="Georgia"/>
                 <w:b w:val="0"/>
                 <w:i w:val="0"/>
+                <w:color w:val="2D2D2D"/>
                 <w:sz w:val="20"/>
               </w:rPr>
               <w:t>MEDIUM</w:t>
@@ -891,18 +917,19 @@
         <w:tc>
           <w:tcPr>
             <w:tcW w:type="dxa" w:w="1728"/>
-            <w:shd w:val="clear" w:color="auto" w:fill="DEEAF1"/>
+            <w:shd w:val="clear" w:color="auto" w:fill="EAF0E8"/>
           </w:tcPr>
           <w:p>
             <w:pPr>
-              <w:spacing w:after="40" w:before="40"/>
+              <w:spacing w:after="60" w:before="60" w:line="260" w:lineRule="exact"/>
             </w:pPr>
             <w:r/>
             <w:r>
               <w:rPr>
-                <w:rFonts w:ascii="Calibri" w:hAnsi="Calibri"/>
+                <w:rFonts w:ascii="Georgia" w:hAnsi="Georgia"/>
                 <w:b w:val="0"/>
                 <w:i w:val="0"/>
+                <w:color w:val="2D2D2D"/>
                 <w:sz w:val="20"/>
               </w:rPr>
               <w:t>Immediate</w:t>
@@ -914,17 +941,19 @@
         <w:tc>
           <w:tcPr>
             <w:tcW w:type="dxa" w:w="1728"/>
+            <w:shd w:val="clear" w:color="auto" w:fill="FDFBF8"/>
           </w:tcPr>
           <w:p>
             <w:pPr>
-              <w:spacing w:after="40" w:before="40"/>
+              <w:spacing w:after="60" w:before="60" w:line="260" w:lineRule="exact"/>
             </w:pPr>
             <w:r/>
             <w:r>
               <w:rPr>
-                <w:rFonts w:ascii="Calibri" w:hAnsi="Calibri"/>
+                <w:rFonts w:ascii="Georgia" w:hAnsi="Georgia"/>
                 <w:b w:val="0"/>
                 <w:i w:val="0"/>
+                <w:color w:val="2D2D2D"/>
                 <w:sz w:val="20"/>
               </w:rPr>
               <w:t>NAS Jacksonville</w:t>
@@ -934,17 +963,19 @@
         <w:tc>
           <w:tcPr>
             <w:tcW w:type="dxa" w:w="1728"/>
+            <w:shd w:val="clear" w:color="auto" w:fill="FDFBF8"/>
           </w:tcPr>
           <w:p>
             <w:pPr>
-              <w:spacing w:after="40" w:before="40"/>
+              <w:spacing w:after="60" w:before="60" w:line="260" w:lineRule="exact"/>
             </w:pPr>
             <w:r/>
             <w:r>
               <w:rPr>
-                <w:rFonts w:ascii="Calibri" w:hAnsi="Calibri"/>
+                <w:rFonts w:ascii="Georgia" w:hAnsi="Georgia"/>
                 <w:b w:val="0"/>
                 <w:i w:val="0"/>
+                <w:color w:val="2D2D2D"/>
                 <w:sz w:val="20"/>
               </w:rPr>
               <w:t>JEA (+ TECO natural gas)</w:t>
@@ -954,17 +985,19 @@
         <w:tc>
           <w:tcPr>
             <w:tcW w:type="dxa" w:w="1728"/>
+            <w:shd w:val="clear" w:color="auto" w:fill="FDFBF8"/>
           </w:tcPr>
           <w:p>
             <w:pPr>
-              <w:spacing w:after="40" w:before="40"/>
+              <w:spacing w:after="60" w:before="60" w:line="260" w:lineRule="exact"/>
             </w:pPr>
             <w:r/>
             <w:r>
               <w:rPr>
-                <w:rFonts w:ascii="Calibri" w:hAnsi="Calibri"/>
+                <w:rFonts w:ascii="Georgia" w:hAnsi="Georgia"/>
                 <w:b w:val="0"/>
                 <w:i w:val="0"/>
+                <w:color w:val="2D2D2D"/>
                 <w:sz w:val="20"/>
               </w:rPr>
               <w:t>North of base — outside fence</w:t>
@@ -974,17 +1007,19 @@
         <w:tc>
           <w:tcPr>
             <w:tcW w:type="dxa" w:w="1728"/>
+            <w:shd w:val="clear" w:color="auto" w:fill="FDFBF8"/>
           </w:tcPr>
           <w:p>
             <w:pPr>
-              <w:spacing w:after="40" w:before="40"/>
+              <w:spacing w:after="60" w:before="60" w:line="260" w:lineRule="exact"/>
             </w:pPr>
             <w:r/>
             <w:r>
               <w:rPr>
-                <w:rFonts w:ascii="Calibri" w:hAnsi="Calibri"/>
+                <w:rFonts w:ascii="Georgia" w:hAnsi="Georgia"/>
                 <w:b w:val="0"/>
                 <w:i w:val="0"/>
+                <w:color w:val="2D2D2D"/>
                 <w:sz w:val="20"/>
               </w:rPr>
               <w:t>MEDIUM</w:t>
@@ -994,17 +1029,19 @@
         <w:tc>
           <w:tcPr>
             <w:tcW w:type="dxa" w:w="1728"/>
+            <w:shd w:val="clear" w:color="auto" w:fill="FDFBF8"/>
           </w:tcPr>
           <w:p>
             <w:pPr>
-              <w:spacing w:after="40" w:before="40"/>
+              <w:spacing w:after="60" w:before="60" w:line="260" w:lineRule="exact"/>
             </w:pPr>
             <w:r/>
             <w:r>
               <w:rPr>
-                <w:rFonts w:ascii="Calibri" w:hAnsi="Calibri"/>
+                <w:rFonts w:ascii="Georgia" w:hAnsi="Georgia"/>
                 <w:b w:val="0"/>
                 <w:i w:val="0"/>
+                <w:color w:val="2D2D2D"/>
                 <w:sz w:val="20"/>
               </w:rPr>
               <w:t>Immediate</w:t>
@@ -1016,18 +1053,19 @@
         <w:tc>
           <w:tcPr>
             <w:tcW w:type="dxa" w:w="1728"/>
-            <w:shd w:val="clear" w:color="auto" w:fill="DEEAF1"/>
+            <w:shd w:val="clear" w:color="auto" w:fill="EAF0E8"/>
           </w:tcPr>
           <w:p>
             <w:pPr>
-              <w:spacing w:after="40" w:before="40"/>
+              <w:spacing w:after="60" w:before="60" w:line="260" w:lineRule="exact"/>
             </w:pPr>
             <w:r/>
             <w:r>
               <w:rPr>
-                <w:rFonts w:ascii="Calibri" w:hAnsi="Calibri"/>
+                <w:rFonts w:ascii="Georgia" w:hAnsi="Georgia"/>
                 <w:b w:val="0"/>
                 <w:i w:val="0"/>
+                <w:color w:val="2D2D2D"/>
                 <w:sz w:val="20"/>
               </w:rPr>
               <w:t>Camp Blanding JTF</w:t>
@@ -1037,18 +1075,19 @@
         <w:tc>
           <w:tcPr>
             <w:tcW w:type="dxa" w:w="1728"/>
-            <w:shd w:val="clear" w:color="auto" w:fill="DEEAF1"/>
+            <w:shd w:val="clear" w:color="auto" w:fill="EAF0E8"/>
           </w:tcPr>
           <w:p>
             <w:pPr>
-              <w:spacing w:after="40" w:before="40"/>
+              <w:spacing w:after="60" w:before="60" w:line="260" w:lineRule="exact"/>
             </w:pPr>
             <w:r/>
             <w:r>
               <w:rPr>
-                <w:rFonts w:ascii="Calibri" w:hAnsi="Calibri"/>
+                <w:rFonts w:ascii="Georgia" w:hAnsi="Georgia"/>
                 <w:b w:val="0"/>
                 <w:i w:val="0"/>
+                <w:color w:val="2D2D2D"/>
                 <w:sz w:val="20"/>
               </w:rPr>
               <w:t>FPL (4 providers total)</w:t>
@@ -1058,18 +1097,19 @@
         <w:tc>
           <w:tcPr>
             <w:tcW w:type="dxa" w:w="1728"/>
-            <w:shd w:val="clear" w:color="auto" w:fill="DEEAF1"/>
+            <w:shd w:val="clear" w:color="auto" w:fill="EAF0E8"/>
           </w:tcPr>
           <w:p>
             <w:pPr>
-              <w:spacing w:after="40" w:before="40"/>
+              <w:spacing w:after="60" w:before="60" w:line="260" w:lineRule="exact"/>
             </w:pPr>
             <w:r/>
             <w:r>
               <w:rPr>
-                <w:rFonts w:ascii="Calibri" w:hAnsi="Calibri"/>
+                <w:rFonts w:ascii="Georgia" w:hAnsi="Georgia"/>
                 <w:b w:val="0"/>
                 <w:i w:val="0"/>
+                <w:color w:val="2D2D2D"/>
                 <w:sz w:val="20"/>
               </w:rPr>
               <w:t>North of base — outside fence</w:t>
@@ -1079,18 +1119,19 @@
         <w:tc>
           <w:tcPr>
             <w:tcW w:type="dxa" w:w="1728"/>
-            <w:shd w:val="clear" w:color="auto" w:fill="DEEAF1"/>
+            <w:shd w:val="clear" w:color="auto" w:fill="EAF0E8"/>
           </w:tcPr>
           <w:p>
             <w:pPr>
-              <w:spacing w:after="40" w:before="40"/>
+              <w:spacing w:after="60" w:before="60" w:line="260" w:lineRule="exact"/>
             </w:pPr>
             <w:r/>
             <w:r>
               <w:rPr>
-                <w:rFonts w:ascii="Calibri" w:hAnsi="Calibri"/>
+                <w:rFonts w:ascii="Georgia" w:hAnsi="Georgia"/>
                 <w:b w:val="0"/>
                 <w:i w:val="0"/>
+                <w:color w:val="2D2D2D"/>
                 <w:sz w:val="20"/>
               </w:rPr>
               <w:t>HIGH</w:t>
@@ -1100,18 +1141,19 @@
         <w:tc>
           <w:tcPr>
             <w:tcW w:type="dxa" w:w="1728"/>
-            <w:shd w:val="clear" w:color="auto" w:fill="DEEAF1"/>
+            <w:shd w:val="clear" w:color="auto" w:fill="EAF0E8"/>
           </w:tcPr>
           <w:p>
             <w:pPr>
-              <w:spacing w:after="40" w:before="40"/>
+              <w:spacing w:after="60" w:before="60" w:line="260" w:lineRule="exact"/>
             </w:pPr>
             <w:r/>
             <w:r>
               <w:rPr>
-                <w:rFonts w:ascii="Calibri" w:hAnsi="Calibri"/>
+                <w:rFonts w:ascii="Georgia" w:hAnsi="Georgia"/>
                 <w:b w:val="0"/>
                 <w:i w:val="0"/>
+                <w:color w:val="2D2D2D"/>
                 <w:sz w:val="20"/>
               </w:rPr>
               <w:t>Near-Term</w:t>
@@ -1127,11 +1169,11 @@
     </w:p>
     <w:p>
       <w:pPr>
-        <w:spacing w:after="120" w:before="0"/>
+        <w:spacing w:after="140" w:before="20" w:line="280" w:lineRule="exact"/>
       </w:pPr>
       <w:r>
         <w:rPr>
-          <w:rFonts w:ascii="Calibri" w:hAnsi="Calibri"/>
+          <w:rFonts w:ascii="Georgia" w:hAnsi="Georgia"/>
           <w:b w:val="0"/>
           <w:i w:val="0"/>
           <w:color w:val="323232"/>
@@ -1142,11 +1184,11 @@
     </w:p>
     <w:p>
       <w:pPr>
-        <w:spacing w:after="120" w:before="0"/>
+        <w:spacing w:after="140" w:before="20" w:line="280" w:lineRule="exact"/>
       </w:pPr>
       <w:r>
         <w:rPr>
-          <w:rFonts w:ascii="Calibri" w:hAnsi="Calibri"/>
+          <w:rFonts w:ascii="Georgia" w:hAnsi="Georgia"/>
           <w:b w:val="0"/>
           <w:i w:val="0"/>
           <w:color w:val="323232"/>
@@ -1157,25 +1199,25 @@
     </w:p>
     <w:p>
       <w:pPr>
-        <w:spacing w:after="80" w:before="40"/>
+        <w:spacing w:after="80" w:before="60"/>
         <w:ind w:left="288"/>
       </w:pPr>
       <w:r>
         <w:rPr>
-          <w:rFonts w:ascii="Calibri" w:hAnsi="Calibri"/>
+          <w:rFonts w:ascii="Georgia" w:hAnsi="Georgia"/>
           <w:b/>
           <w:i w:val="0"/>
-          <w:color w:val="375623"/>
+          <w:color w:val="235523"/>
           <w:sz w:val="19"/>
         </w:rPr>
         <w:t xml:space="preserve">● Confirmed  </w:t>
       </w:r>
       <w:r>
         <w:rPr>
-          <w:rFonts w:ascii="Calibri" w:hAnsi="Calibri"/>
+          <w:rFonts w:ascii="Georgia" w:hAnsi="Georgia"/>
           <w:b w:val="0"/>
           <w:i/>
-          <w:color w:val="595959"/>
+          <w:color w:val="645F5A"/>
           <w:sz w:val="19"/>
         </w:rPr>
         <w:t>Camp Blanding four-provider complexity: Camp Blanding Summary V2. TECO gas dependency: NAS JAX Site Visit Summary V3.</w:t>
@@ -1183,31 +1225,33 @@
     </w:p>
     <w:p>
       <w:pPr>
-        <w:spacing w:before="280" w:after="120"/>
-        <w:ind w:left="-72"/>
-        <w:shd w:val="clear" w:color="auto" w:fill="BDD7EE"/>
+        <w:spacing w:before="320" w:after="120"/>
+        <w:shd w:val="clear" w:color="auto" w:fill="F5F0E8"/>
+        <w:pBdr>
+          <w:bottom w:val="single" w:sz="4" w:space="1" w:color="2D5A37"/>
+        </w:pBdr>
       </w:pPr>
       <w:r>
         <w:rPr>
-          <w:rFonts w:ascii="Calibri" w:hAnsi="Calibri"/>
+          <w:rFonts w:ascii="Georgia" w:hAnsi="Georgia"/>
           <w:b/>
           <w:i w:val="0"/>
-          <w:color w:val="1F6097"/>
-          <w:sz w:val="23"/>
+          <w:color w:val="2D5A37"/>
+          <w:sz w:val="24"/>
         </w:rPr>
         <w:t xml:space="preserve">  2.2  The Cascade: How a Flooding Event Becomes a Mission Outage</w:t>
       </w:r>
     </w:p>
     <w:p>
       <w:pPr>
-        <w:spacing w:after="120" w:before="0"/>
+        <w:spacing w:after="140" w:before="20" w:line="280" w:lineRule="exact"/>
       </w:pPr>
       <w:r>
         <w:rPr>
-          <w:rFonts w:ascii="Calibri" w:hAnsi="Calibri"/>
+          <w:rFonts w:ascii="Georgia" w:hAnsi="Georgia"/>
           <w:b w:val="0"/>
           <w:i w:val="0"/>
-          <w:color w:val="000000"/>
+          <w:color w:val="2D2D2D"/>
           <w:sz w:val="22"/>
         </w:rPr>
         <w:t>Power loss at a military installation is not just about the substation taking a direct hit. In Northeast Florida, flooding creates a failure chain — a cascade — that can cause a multi-day outage even when the substation itself is not fully inundated. Understanding this chain is critical to understanding why redundancy specifically (not just hardening) is the right framing.</w:t>
@@ -1215,18 +1259,18 @@
     </w:p>
     <w:p>
       <w:pPr>
-        <w:spacing w:before="200" w:after="60"/>
+        <w:spacing w:before="200" w:after="80"/>
         <w:pBdr>
-          <w:left w:val="single" w:sz="8" w:space="6" w:color="1F6096"/>
+          <w:left w:val="single" w:sz="10" w:space="6" w:color="2D5A37"/>
         </w:pBdr>
-        <w:ind w:left="173"/>
+        <w:ind w:left="202"/>
       </w:pPr>
       <w:r>
         <w:rPr>
-          <w:rFonts w:ascii="Calibri" w:hAnsi="Calibri"/>
+          <w:rFonts w:ascii="Georgia" w:hAnsi="Georgia"/>
           <w:b/>
           <w:i w:val="0"/>
-          <w:color w:val="44546A"/>
+          <w:color w:val="374632"/>
           <w:sz w:val="22"/>
         </w:rPr>
         <w:t xml:space="preserve"> The Cascade Sequence — Confirmed by MIRR Data</w:t>
@@ -1234,22 +1278,24 @@
     </w:p>
     <w:p>
       <w:pPr>
-        <w:spacing w:after="120"/>
+        <w:spacing w:after="140" w:line="280" w:lineRule="exact"/>
       </w:pPr>
       <w:r>
         <w:rPr>
-          <w:rFonts w:ascii="Calibri" w:hAnsi="Calibri"/>
+          <w:rFonts w:ascii="Georgia" w:hAnsi="Georgia"/>
           <w:b/>
           <w:i w:val="0"/>
+          <w:color w:val="2D2D2D"/>
           <w:sz w:val="22"/>
         </w:rPr>
         <w:t xml:space="preserve">Step 1: </w:t>
       </w:r>
       <w:r>
         <w:rPr>
-          <w:rFonts w:ascii="Calibri" w:hAnsi="Calibri"/>
+          <w:rFonts w:ascii="Georgia" w:hAnsi="Georgia"/>
           <w:b w:val="0"/>
           <w:i w:val="0"/>
+          <w:color w:val="2D2D2D"/>
           <w:sz w:val="22"/>
         </w:rPr>
         <w:t>A storm surge, compound rainfall flood, or wildfire occurs in the region.</w:t>
@@ -1257,22 +1303,24 @@
     </w:p>
     <w:p>
       <w:pPr>
-        <w:spacing w:after="120"/>
+        <w:spacing w:after="140" w:line="280" w:lineRule="exact"/>
       </w:pPr>
       <w:r>
         <w:rPr>
-          <w:rFonts w:ascii="Calibri" w:hAnsi="Calibri"/>
+          <w:rFonts w:ascii="Georgia" w:hAnsi="Georgia"/>
           <w:b/>
           <w:i w:val="0"/>
+          <w:color w:val="2D2D2D"/>
           <w:sz w:val="22"/>
         </w:rPr>
         <w:t xml:space="preserve">Step 2: </w:t>
       </w:r>
       <w:r>
         <w:rPr>
-          <w:rFonts w:ascii="Calibri" w:hAnsi="Calibri"/>
+          <w:rFonts w:ascii="Georgia" w:hAnsi="Georgia"/>
           <w:b w:val="0"/>
           <w:i w:val="0"/>
+          <w:color w:val="2D2D2D"/>
           <w:sz w:val="22"/>
         </w:rPr>
         <w:t>Transportation corridors flood or close — A1A at Mayport, Heckscher Drive at Blount Island, Roosevelt Blvd/US-17 at NAS JAX, SR-16 at Camp Blanding. These are confirmed SPOFs in the MIRR Vulnerability Assessment.</w:t>
@@ -1280,22 +1328,24 @@
     </w:p>
     <w:p>
       <w:pPr>
-        <w:spacing w:after="120"/>
+        <w:spacing w:after="140" w:line="280" w:lineRule="exact"/>
       </w:pPr>
       <w:r>
         <w:rPr>
-          <w:rFonts w:ascii="Calibri" w:hAnsi="Calibri"/>
+          <w:rFonts w:ascii="Georgia" w:hAnsi="Georgia"/>
           <w:b/>
           <w:i w:val="0"/>
+          <w:color w:val="2D2D2D"/>
           <w:sz w:val="22"/>
         </w:rPr>
         <w:t xml:space="preserve">Step 3: </w:t>
       </w:r>
       <w:r>
         <w:rPr>
-          <w:rFonts w:ascii="Calibri" w:hAnsi="Calibri"/>
+          <w:rFonts w:ascii="Georgia" w:hAnsi="Georgia"/>
           <w:b w:val="0"/>
           <w:i w:val="0"/>
+          <w:color w:val="2D2D2D"/>
           <w:sz w:val="22"/>
         </w:rPr>
         <w:t>Utility restoration crews cannot reach the damaged substation. Even if the substation sustained only partial damage and could be repaired quickly, no crew can get there.</w:t>
@@ -1303,22 +1353,24 @@
     </w:p>
     <w:p>
       <w:pPr>
-        <w:spacing w:after="120"/>
+        <w:spacing w:after="140" w:line="280" w:lineRule="exact"/>
       </w:pPr>
       <w:r>
         <w:rPr>
-          <w:rFonts w:ascii="Calibri" w:hAnsi="Calibri"/>
+          <w:rFonts w:ascii="Georgia" w:hAnsi="Georgia"/>
           <w:b/>
           <w:i w:val="0"/>
+          <w:color w:val="2D2D2D"/>
           <w:sz w:val="22"/>
         </w:rPr>
         <w:t xml:space="preserve">Step 4: </w:t>
       </w:r>
       <w:r>
         <w:rPr>
-          <w:rFonts w:ascii="Calibri" w:hAnsi="Calibri"/>
+          <w:rFonts w:ascii="Georgia" w:hAnsi="Georgia"/>
           <w:b w:val="0"/>
           <w:i w:val="0"/>
+          <w:color w:val="2D2D2D"/>
           <w:sz w:val="22"/>
         </w:rPr>
         <w:t>Backup generator fuel supply depletes. Generators are designed for hours-to-days of bridging, not extended multi-day outages. Fuel is delivered by truck — on the same flooded roads.</w:t>
@@ -1326,22 +1378,24 @@
     </w:p>
     <w:p>
       <w:pPr>
-        <w:spacing w:after="120"/>
+        <w:spacing w:after="140" w:line="280" w:lineRule="exact"/>
       </w:pPr>
       <w:r>
         <w:rPr>
-          <w:rFonts w:ascii="Calibri" w:hAnsi="Calibri"/>
+          <w:rFonts w:ascii="Georgia" w:hAnsi="Georgia"/>
           <w:b/>
           <w:i w:val="0"/>
+          <w:color w:val="2D2D2D"/>
           <w:sz w:val="22"/>
         </w:rPr>
         <w:t xml:space="preserve">Step 5: </w:t>
       </w:r>
       <w:r>
         <w:rPr>
-          <w:rFonts w:ascii="Calibri" w:hAnsi="Calibri"/>
+          <w:rFonts w:ascii="Georgia" w:hAnsi="Georgia"/>
           <w:b w:val="0"/>
           <w:i w:val="0"/>
+          <w:color w:val="2D2D2D"/>
           <w:sz w:val="22"/>
         </w:rPr>
         <w:t>Mission-critical systems — communications, mission operations, fueling, maintenance — lose power on a timeline driven by road conditions, not by the storm itself.</w:t>
@@ -1349,11 +1403,11 @@
     </w:p>
     <w:p>
       <w:pPr>
-        <w:spacing w:after="120" w:before="0"/>
+        <w:spacing w:after="140" w:before="20" w:line="280" w:lineRule="exact"/>
       </w:pPr>
       <w:r>
         <w:rPr>
-          <w:rFonts w:ascii="Calibri" w:hAnsi="Calibri"/>
+          <w:rFonts w:ascii="Georgia" w:hAnsi="Georgia"/>
           <w:b w:val="0"/>
           <w:i w:val="0"/>
           <w:color w:val="323232"/>
@@ -1364,25 +1418,25 @@
     </w:p>
     <w:p>
       <w:pPr>
-        <w:spacing w:after="80" w:before="40"/>
+        <w:spacing w:after="80" w:before="60"/>
         <w:ind w:left="288"/>
       </w:pPr>
       <w:r>
         <w:rPr>
-          <w:rFonts w:ascii="Calibri" w:hAnsi="Calibri"/>
+          <w:rFonts w:ascii="Georgia" w:hAnsi="Georgia"/>
           <w:b/>
           <w:i w:val="0"/>
-          <w:color w:val="375623"/>
+          <w:color w:val="235523"/>
           <w:sz w:val="19"/>
         </w:rPr>
         <w:t xml:space="preserve">● Confirmed  </w:t>
       </w:r>
       <w:r>
         <w:rPr>
-          <w:rFonts w:ascii="Calibri" w:hAnsi="Calibri"/>
+          <w:rFonts w:ascii="Georgia" w:hAnsi="Georgia"/>
           <w:b w:val="0"/>
           <w:i/>
-          <w:color w:val="595959"/>
+          <w:color w:val="645F5A"/>
           <w:sz w:val="19"/>
         </w:rPr>
         <w:t>Transportation SPOFs: MIRR VA (Jan 2026 SC). Mayport flooding: Stakeholder Workshop 1 Summary V2. Blount Island water intrusion: Kickoff Briefing (April 2025). Tyndall cascade: APTIM memo Section 1.1.</w:t>
@@ -1390,18 +1444,18 @@
     </w:p>
     <w:p>
       <w:pPr>
-        <w:spacing w:before="200" w:after="60"/>
+        <w:spacing w:before="200" w:after="80"/>
         <w:pBdr>
-          <w:left w:val="single" w:sz="8" w:space="6" w:color="1F6096"/>
+          <w:left w:val="single" w:sz="10" w:space="6" w:color="2D5A37"/>
         </w:pBdr>
-        <w:ind w:left="173"/>
+        <w:ind w:left="202"/>
       </w:pPr>
       <w:r>
         <w:rPr>
-          <w:rFonts w:ascii="Calibri" w:hAnsi="Calibri"/>
+          <w:rFonts w:ascii="Georgia" w:hAnsi="Georgia"/>
           <w:b/>
           <w:i w:val="0"/>
-          <w:color w:val="44546A"/>
+          <w:color w:val="374632"/>
           <w:sz w:val="22"/>
         </w:rPr>
         <w:t xml:space="preserve"> Why Backup Generators Are Not a Full Answer</w:t>
@@ -1409,14 +1463,14 @@
     </w:p>
     <w:p>
       <w:pPr>
-        <w:spacing w:after="120" w:before="0"/>
+        <w:spacing w:after="140" w:before="20" w:line="280" w:lineRule="exact"/>
       </w:pPr>
       <w:r>
         <w:rPr>
-          <w:rFonts w:ascii="Calibri" w:hAnsi="Calibri"/>
+          <w:rFonts w:ascii="Georgia" w:hAnsi="Georgia"/>
           <w:b w:val="0"/>
           <w:i w:val="0"/>
-          <w:color w:val="000000"/>
+          <w:color w:val="2D2D2D"/>
           <w:sz w:val="22"/>
         </w:rPr>
         <w:t>Backup generators provide a bridging capability, not a redundancy solution. Their limitations in this context are specific and documented:</w:t>
@@ -1425,14 +1479,15 @@
     <w:p>
       <w:pPr>
         <w:pStyle w:val="ListBullet"/>
-        <w:spacing w:after="60" w:before="20"/>
-        <w:ind w:left="360"/>
+        <w:spacing w:after="80" w:before="40" w:line="280" w:lineRule="exact"/>
+        <w:ind w:left="432"/>
       </w:pPr>
       <w:r>
         <w:rPr>
-          <w:rFonts w:ascii="Calibri" w:hAnsi="Calibri"/>
+          <w:rFonts w:ascii="Georgia" w:hAnsi="Georgia"/>
           <w:b w:val="0"/>
           <w:i w:val="0"/>
+          <w:color w:val="2D2D2D"/>
           <w:sz w:val="22"/>
         </w:rPr>
         <w:t>Generator fuel arrives by diesel truck on the same road corridors that flood during a surge or compound rainfall event. Extended outages under compound flooding — where roads remain impassable for multiple days — can exhaust fuel before grid restoration is possible.</w:t>
@@ -1441,14 +1496,15 @@
     <w:p>
       <w:pPr>
         <w:pStyle w:val="ListBullet"/>
-        <w:spacing w:after="60" w:before="20"/>
-        <w:ind w:left="360"/>
+        <w:spacing w:after="80" w:before="40" w:line="280" w:lineRule="exact"/>
+        <w:ind w:left="432"/>
       </w:pPr>
       <w:r>
         <w:rPr>
-          <w:rFonts w:ascii="Calibri" w:hAnsi="Calibri"/>
+          <w:rFonts w:ascii="Georgia" w:hAnsi="Georgia"/>
           <w:b w:val="0"/>
           <w:i w:val="0"/>
+          <w:color w:val="2D2D2D"/>
           <w:sz w:val="22"/>
         </w:rPr>
         <w:t>Backup systems at Blount Island are noted in MIRR materials as untested. Whether they perform to specification under actual load conditions has not been verified.</w:t>
@@ -1457,14 +1513,15 @@
     <w:p>
       <w:pPr>
         <w:pStyle w:val="ListBullet"/>
-        <w:spacing w:after="60" w:before="20"/>
-        <w:ind w:left="360"/>
+        <w:spacing w:after="80" w:before="40" w:line="280" w:lineRule="exact"/>
+        <w:ind w:left="432"/>
       </w:pPr>
       <w:r>
         <w:rPr>
-          <w:rFonts w:ascii="Calibri" w:hAnsi="Calibri"/>
+          <w:rFonts w:ascii="Georgia" w:hAnsi="Georgia"/>
           <w:b w:val="0"/>
           <w:i w:val="0"/>
+          <w:color w:val="2D2D2D"/>
           <w:sz w:val="22"/>
         </w:rPr>
         <w:t>Even when generators function correctly, they typically serve only a prioritized subset of loads — not full installation capacity. Determining which loads are covered and which are not requires installation-level data not currently available publicly.</w:t>
@@ -1473,14 +1530,15 @@
     <w:p>
       <w:pPr>
         <w:pStyle w:val="ListBullet"/>
-        <w:spacing w:after="60" w:before="20"/>
-        <w:ind w:left="360"/>
+        <w:spacing w:after="80" w:before="40" w:line="280" w:lineRule="exact"/>
+        <w:ind w:left="432"/>
       </w:pPr>
       <w:r>
         <w:rPr>
-          <w:rFonts w:ascii="Calibri" w:hAnsi="Calibri"/>
+          <w:rFonts w:ascii="Georgia" w:hAnsi="Georgia"/>
           <w:b w:val="0"/>
           <w:i w:val="0"/>
+          <w:color w:val="2D2D2D"/>
           <w:sz w:val="22"/>
         </w:rPr>
         <w:t>Saltwater intrusion after a surge event deposits corrosive residue on generator and substation equipment even when facilities are not fully inundated. This accelerates equipment degradation and increases the probability of failure in subsequent events.</w:t>
@@ -1488,25 +1546,25 @@
     </w:p>
     <w:p>
       <w:pPr>
-        <w:spacing w:after="80" w:before="40"/>
+        <w:spacing w:after="80" w:before="60"/>
         <w:ind w:left="288"/>
       </w:pPr>
       <w:r>
         <w:rPr>
-          <w:rFonts w:ascii="Calibri" w:hAnsi="Calibri"/>
+          <w:rFonts w:ascii="Georgia" w:hAnsi="Georgia"/>
           <w:b/>
           <w:i w:val="0"/>
-          <w:color w:val="375623"/>
+          <w:color w:val="235523"/>
           <w:sz w:val="19"/>
         </w:rPr>
         <w:t xml:space="preserve">● Confirmed  </w:t>
       </w:r>
       <w:r>
         <w:rPr>
-          <w:rFonts w:ascii="Calibri" w:hAnsi="Calibri"/>
+          <w:rFonts w:ascii="Georgia" w:hAnsi="Georgia"/>
           <w:b w:val="0"/>
           <w:i/>
-          <w:color w:val="595959"/>
+          <w:color w:val="645F5A"/>
           <w:sz w:val="19"/>
         </w:rPr>
         <w:t>Blount Island untested backup: MIRR project materials. Saltwater corrosion mechanism: APTIM memo.</w:t>
@@ -1514,25 +1572,25 @@
     </w:p>
     <w:p>
       <w:pPr>
-        <w:spacing w:after="80" w:before="40"/>
+        <w:spacing w:after="80" w:before="60"/>
         <w:ind w:left="288"/>
       </w:pPr>
       <w:r>
         <w:rPr>
-          <w:rFonts w:ascii="Calibri" w:hAnsi="Calibri"/>
+          <w:rFonts w:ascii="Georgia" w:hAnsi="Georgia"/>
           <w:b/>
           <w:i w:val="0"/>
-          <w:color w:val="9C0006"/>
+          <w:color w:val="8C1E1E"/>
           <w:sz w:val="19"/>
         </w:rPr>
         <w:t xml:space="preserve">○ Needs verification  </w:t>
       </w:r>
       <w:r>
         <w:rPr>
-          <w:rFonts w:ascii="Calibri" w:hAnsi="Calibri"/>
+          <w:rFonts w:ascii="Georgia" w:hAnsi="Georgia"/>
           <w:b w:val="0"/>
           <w:i/>
-          <w:color w:val="595959"/>
+          <w:color w:val="645F5A"/>
           <w:sz w:val="19"/>
         </w:rPr>
         <w:t>Generator fuel delivery protocols and backup system test records require coordination with NAVFAC.</w:t>
@@ -1540,31 +1598,33 @@
     </w:p>
     <w:p>
       <w:pPr>
-        <w:spacing w:before="280" w:after="120"/>
-        <w:ind w:left="-72"/>
-        <w:shd w:val="clear" w:color="auto" w:fill="BDD7EE"/>
+        <w:spacing w:before="320" w:after="120"/>
+        <w:shd w:val="clear" w:color="auto" w:fill="F5F0E8"/>
+        <w:pBdr>
+          <w:bottom w:val="single" w:sz="4" w:space="1" w:color="2D5A37"/>
+        </w:pBdr>
       </w:pPr>
       <w:r>
         <w:rPr>
-          <w:rFonts w:ascii="Calibri" w:hAnsi="Calibri"/>
+          <w:rFonts w:ascii="Georgia" w:hAnsi="Georgia"/>
           <w:b/>
           <w:i w:val="0"/>
-          <w:color w:val="1F6097"/>
-          <w:sz w:val="23"/>
+          <w:color w:val="2D5A37"/>
+          <w:sz w:val="24"/>
         </w:rPr>
         <w:t xml:space="preserve">  2.3  Why Redundancy Is Harder Here — Regional Geography</w:t>
       </w:r>
     </w:p>
     <w:p>
       <w:pPr>
-        <w:spacing w:after="120" w:before="0"/>
+        <w:spacing w:after="140" w:before="20" w:line="280" w:lineRule="exact"/>
       </w:pPr>
       <w:r>
         <w:rPr>
-          <w:rFonts w:ascii="Calibri" w:hAnsi="Calibri"/>
+          <w:rFonts w:ascii="Georgia" w:hAnsi="Georgia"/>
           <w:b w:val="0"/>
           <w:i w:val="0"/>
-          <w:color w:val="000000"/>
+          <w:color w:val="2D2D2D"/>
           <w:sz w:val="22"/>
         </w:rPr>
         <w:t>The Northeast Florida coastal environment creates specific structural constraints that make building energy redundancy more difficult and more expensive than in most other regions. These are not hypothetical complications — they are physical realities that must be accounted for in any serious analysis.</w:t>
@@ -1572,18 +1632,18 @@
     </w:p>
     <w:p>
       <w:pPr>
-        <w:spacing w:before="200" w:after="60"/>
+        <w:spacing w:before="200" w:after="80"/>
         <w:pBdr>
-          <w:left w:val="single" w:sz="8" w:space="6" w:color="1F6096"/>
+          <w:left w:val="single" w:sz="10" w:space="6" w:color="2D5A37"/>
         </w:pBdr>
-        <w:ind w:left="173"/>
+        <w:ind w:left="202"/>
       </w:pPr>
       <w:r>
         <w:rPr>
-          <w:rFonts w:ascii="Calibri" w:hAnsi="Calibri"/>
+          <w:rFonts w:ascii="Georgia" w:hAnsi="Georgia"/>
           <w:b/>
           <w:i w:val="0"/>
-          <w:color w:val="44546A"/>
+          <w:color w:val="374632"/>
           <w:sz w:val="22"/>
         </w:rPr>
         <w:t xml:space="preserve"> Shallow Water Table and the Undergrounding Problem</w:t>
@@ -1591,14 +1651,14 @@
     </w:p>
     <w:p>
       <w:pPr>
-        <w:spacing w:after="120" w:before="0"/>
+        <w:spacing w:after="140" w:before="20" w:line="280" w:lineRule="exact"/>
       </w:pPr>
       <w:r>
         <w:rPr>
-          <w:rFonts w:ascii="Calibri" w:hAnsi="Calibri"/>
+          <w:rFonts w:ascii="Georgia" w:hAnsi="Georgia"/>
           <w:b w:val="0"/>
           <w:i w:val="0"/>
-          <w:color w:val="000000"/>
+          <w:color w:val="2D2D2D"/>
           <w:sz w:val="22"/>
         </w:rPr>
         <w:t>Undergrounding power lines is often proposed as a solution to wind and debris damage. In coastal Duval County and along the St. Johns River corridor, the water table sits only a few feet below grade in many areas. Burying infrastructure here does not eliminate vulnerability — it trades above-ground wind and debris exposure for below-ground groundwater intrusion, saltwater corrosion from below, and significantly more difficult fault identification and repair when failures occur.</w:t>
@@ -1606,11 +1666,11 @@
     </w:p>
     <w:p>
       <w:pPr>
-        <w:spacing w:after="120" w:before="0"/>
+        <w:spacing w:after="140" w:before="20" w:line="280" w:lineRule="exact"/>
       </w:pPr>
       <w:r>
         <w:rPr>
-          <w:rFonts w:ascii="Calibri" w:hAnsi="Calibri"/>
+          <w:rFonts w:ascii="Georgia" w:hAnsi="Georgia"/>
           <w:b w:val="0"/>
           <w:i w:val="0"/>
           <w:color w:val="323232"/>
@@ -1621,25 +1681,25 @@
     </w:p>
     <w:p>
       <w:pPr>
-        <w:spacing w:after="80" w:before="40"/>
+        <w:spacing w:after="80" w:before="60"/>
         <w:ind w:left="288"/>
       </w:pPr>
       <w:r>
         <w:rPr>
-          <w:rFonts w:ascii="Calibri" w:hAnsi="Calibri"/>
+          <w:rFonts w:ascii="Georgia" w:hAnsi="Georgia"/>
           <w:b/>
           <w:i w:val="0"/>
-          <w:color w:val="7C5400"/>
+          <w:color w:val="82500A"/>
           <w:sz w:val="19"/>
         </w:rPr>
         <w:t xml:space="preserve">◐ Pending GIS  </w:t>
       </w:r>
       <w:r>
         <w:rPr>
-          <w:rFonts w:ascii="Calibri" w:hAnsi="Calibri"/>
+          <w:rFonts w:ascii="Georgia" w:hAnsi="Georgia"/>
           <w:b w:val="0"/>
           <w:i/>
-          <w:color w:val="595959"/>
+          <w:color w:val="645F5A"/>
           <w:sz w:val="19"/>
         </w:rPr>
         <w:t>Water table depths at specific substation locations need USGS 3DEP and SJRWMD groundwater data to map accurately.</w:t>
@@ -1647,18 +1707,18 @@
     </w:p>
     <w:p>
       <w:pPr>
-        <w:spacing w:before="200" w:after="60"/>
+        <w:spacing w:before="200" w:after="80"/>
         <w:pBdr>
-          <w:left w:val="single" w:sz="8" w:space="6" w:color="1F6096"/>
+          <w:left w:val="single" w:sz="10" w:space="6" w:color="2D5A37"/>
         </w:pBdr>
-        <w:ind w:left="173"/>
+        <w:ind w:left="202"/>
       </w:pPr>
       <w:r>
         <w:rPr>
-          <w:rFonts w:ascii="Calibri" w:hAnsi="Calibri"/>
+          <w:rFonts w:ascii="Georgia" w:hAnsi="Georgia"/>
           <w:b/>
           <w:i w:val="0"/>
-          <w:color w:val="44546A"/>
+          <w:color w:val="374632"/>
           <w:sz w:val="22"/>
         </w:rPr>
         <w:t xml:space="preserve"> Access Corridor Constraints by Installation</w:t>
@@ -1666,14 +1726,14 @@
     </w:p>
     <w:p>
       <w:pPr>
-        <w:spacing w:after="120" w:before="0"/>
+        <w:spacing w:after="140" w:before="20" w:line="280" w:lineRule="exact"/>
       </w:pPr>
       <w:r>
         <w:rPr>
-          <w:rFonts w:ascii="Calibri" w:hAnsi="Calibri"/>
+          <w:rFonts w:ascii="Georgia" w:hAnsi="Georgia"/>
           <w:b w:val="0"/>
           <w:i w:val="0"/>
-          <w:color w:val="000000"/>
+          <w:color w:val="2D2D2D"/>
           <w:sz w:val="22"/>
         </w:rPr>
         <w:t>Each installation's geography creates hard physical limits on how utility restoration crews and fuel delivery trucks can reach the site. These are not minor inconveniences — they determine how long an outage lasts.</w:t>
@@ -1682,23 +1742,25 @@
     <w:p>
       <w:pPr>
         <w:pStyle w:val="ListBullet"/>
-        <w:spacing w:after="80" w:before="20"/>
-        <w:ind w:left="360"/>
+        <w:spacing w:after="100" w:before="40" w:line="280" w:lineRule="exact"/>
+        <w:ind w:left="432"/>
       </w:pPr>
       <w:r>
         <w:rPr>
-          <w:rFonts w:ascii="Calibri" w:hAnsi="Calibri"/>
+          <w:rFonts w:ascii="Georgia" w:hAnsi="Georgia"/>
           <w:b/>
           <w:i w:val="0"/>
+          <w:color w:val="2D5A37"/>
           <w:sz w:val="22"/>
         </w:rPr>
         <w:t xml:space="preserve">NS Mayport — </w:t>
       </w:r>
       <w:r>
         <w:rPr>
-          <w:rFonts w:ascii="Calibri" w:hAnsi="Calibri"/>
+          <w:rFonts w:ascii="Georgia" w:hAnsi="Georgia"/>
           <w:b w:val="0"/>
           <w:i w:val="0"/>
+          <w:color w:val="2D2D2D"/>
           <w:sz w:val="22"/>
         </w:rPr>
         <w:t>A1A is the sole primary access route. NS Mayport sits on a coastal peninsula between the Atlantic and the St. Johns River mouth. When A1A floods — which it does multiple times per year — the installation is effectively cut off by road. The JEA Mayport Substation, located south of the base, is on the same flooded corridor. A restoration crew cannot reach it until A1A drains.</w:t>
@@ -1707,23 +1769,25 @@
     <w:p>
       <w:pPr>
         <w:pStyle w:val="ListBullet"/>
-        <w:spacing w:after="80" w:before="20"/>
-        <w:ind w:left="360"/>
+        <w:spacing w:after="100" w:before="40" w:line="280" w:lineRule="exact"/>
+        <w:ind w:left="432"/>
       </w:pPr>
       <w:r>
         <w:rPr>
-          <w:rFonts w:ascii="Calibri" w:hAnsi="Calibri"/>
+          <w:rFonts w:ascii="Georgia" w:hAnsi="Georgia"/>
           <w:b/>
           <w:i w:val="0"/>
+          <w:color w:val="2D5A37"/>
           <w:sz w:val="22"/>
         </w:rPr>
         <w:t xml:space="preserve">MCSF Blount Island — </w:t>
       </w:r>
       <w:r>
         <w:rPr>
-          <w:rFonts w:ascii="Calibri" w:hAnsi="Calibri"/>
+          <w:rFonts w:ascii="Georgia" w:hAnsi="Georgia"/>
           <w:b w:val="0"/>
           <w:i w:val="0"/>
+          <w:color w:val="2D2D2D"/>
           <w:sz w:val="22"/>
         </w:rPr>
         <w:t>Heckscher Drive is the primary access route to what is literally a river island in the St. Johns. Flooding on Heckscher Drive simultaneously blocks crew access to the JEA substation, fuel deliveries to on-site generators, and the personnel and equipment movement needed for the facility's prepositioning mission. All failure modes compound at the same bottleneck.</w:t>
@@ -1732,23 +1796,25 @@
     <w:p>
       <w:pPr>
         <w:pStyle w:val="ListBullet"/>
-        <w:spacing w:after="80" w:before="20"/>
-        <w:ind w:left="360"/>
+        <w:spacing w:after="100" w:before="40" w:line="280" w:lineRule="exact"/>
+        <w:ind w:left="432"/>
       </w:pPr>
       <w:r>
         <w:rPr>
-          <w:rFonts w:ascii="Calibri" w:hAnsi="Calibri"/>
+          <w:rFonts w:ascii="Georgia" w:hAnsi="Georgia"/>
           <w:b/>
           <w:i w:val="0"/>
+          <w:color w:val="2D5A37"/>
           <w:sz w:val="22"/>
         </w:rPr>
         <w:t xml:space="preserve">NAS Jacksonville — </w:t>
       </w:r>
       <w:r>
         <w:rPr>
-          <w:rFonts w:ascii="Calibri" w:hAnsi="Calibri"/>
+          <w:rFonts w:ascii="Georgia" w:hAnsi="Georgia"/>
           <w:b w:val="0"/>
           <w:i w:val="0"/>
+          <w:color w:val="2D2D2D"/>
           <w:sz w:val="22"/>
         </w:rPr>
         <w:t>Roosevelt Blvd and US-17 are the primary approaches. Both run through the St. Johns River floodplain. Under compound flooding conditions — where tidal backflow compounds rainfall — these corridors can flood even during events that would not otherwise reach the base perimeter. The JEA substation is north of the base on the same general corridor.</w:t>
@@ -1757,23 +1823,25 @@
     <w:p>
       <w:pPr>
         <w:pStyle w:val="ListBullet"/>
-        <w:spacing w:after="80" w:before="20"/>
-        <w:ind w:left="360"/>
+        <w:spacing w:after="100" w:before="40" w:line="280" w:lineRule="exact"/>
+        <w:ind w:left="432"/>
       </w:pPr>
       <w:r>
         <w:rPr>
-          <w:rFonts w:ascii="Calibri" w:hAnsi="Calibri"/>
+          <w:rFonts w:ascii="Georgia" w:hAnsi="Georgia"/>
           <w:b/>
           <w:i w:val="0"/>
+          <w:color w:val="2D5A37"/>
           <w:sz w:val="22"/>
         </w:rPr>
         <w:t xml:space="preserve">Camp Blanding — </w:t>
       </w:r>
       <w:r>
         <w:rPr>
-          <w:rFonts w:ascii="Calibri" w:hAnsi="Calibri"/>
+          <w:rFonts w:ascii="Georgia" w:hAnsi="Georgia"/>
           <w:b w:val="0"/>
           <w:i w:val="0"/>
+          <w:color w:val="2D2D2D"/>
           <w:sz w:val="22"/>
         </w:rPr>
         <w:t>SR-16 is the main approach, and Black Creek flooding is confirmed to close surrounding roadways even in tropical storm conditions — a lower storm threshold than hurricane-force events. Wildfire on the FPL transmission corridor is a separate access-independent disruption that requires no flooding at all to activate.</w:t>
@@ -1781,25 +1849,25 @@
     </w:p>
     <w:p>
       <w:pPr>
-        <w:spacing w:after="80" w:before="40"/>
+        <w:spacing w:after="80" w:before="60"/>
         <w:ind w:left="288"/>
       </w:pPr>
       <w:r>
         <w:rPr>
-          <w:rFonts w:ascii="Calibri" w:hAnsi="Calibri"/>
+          <w:rFonts w:ascii="Georgia" w:hAnsi="Georgia"/>
           <w:b/>
           <w:i w:val="0"/>
-          <w:color w:val="375623"/>
+          <w:color w:val="235523"/>
           <w:sz w:val="19"/>
         </w:rPr>
         <w:t xml:space="preserve">● Confirmed  </w:t>
       </w:r>
       <w:r>
         <w:rPr>
-          <w:rFonts w:ascii="Calibri" w:hAnsi="Calibri"/>
+          <w:rFonts w:ascii="Georgia" w:hAnsi="Georgia"/>
           <w:b w:val="0"/>
           <w:i/>
-          <w:color w:val="595959"/>
+          <w:color w:val="645F5A"/>
           <w:sz w:val="19"/>
         </w:rPr>
         <w:t>Access corridor SPOFs: MIRR VA (Jan 2026 SC). Black Creek / SR-16: Camp Blanding Summary V2.</w:t>
@@ -1807,25 +1875,25 @@
     </w:p>
     <w:p>
       <w:pPr>
-        <w:spacing w:after="80" w:before="40"/>
+        <w:spacing w:after="80" w:before="60"/>
         <w:ind w:left="288"/>
       </w:pPr>
       <w:r>
         <w:rPr>
-          <w:rFonts w:ascii="Calibri" w:hAnsi="Calibri"/>
+          <w:rFonts w:ascii="Georgia" w:hAnsi="Georgia"/>
           <w:b/>
           <w:i w:val="0"/>
-          <w:color w:val="7C5400"/>
+          <w:color w:val="82500A"/>
           <w:sz w:val="19"/>
         </w:rPr>
         <w:t xml:space="preserve">◐ Pending GIS  </w:t>
       </w:r>
       <w:r>
         <w:rPr>
-          <w:rFonts w:ascii="Calibri" w:hAnsi="Calibri"/>
+          <w:rFonts w:ascii="Georgia" w:hAnsi="Georgia"/>
           <w:b w:val="0"/>
           <w:i/>
-          <w:color w:val="595959"/>
+          <w:color w:val="645F5A"/>
           <w:sz w:val="19"/>
         </w:rPr>
         <w:t>FDOT road network overlaid against SLOSH and CDBG flood extents will confirm flood frequency for each corridor.</w:t>
@@ -1833,18 +1901,18 @@
     </w:p>
     <w:p>
       <w:pPr>
-        <w:spacing w:before="200" w:after="60"/>
+        <w:spacing w:before="200" w:after="80"/>
         <w:pBdr>
-          <w:left w:val="single" w:sz="8" w:space="6" w:color="1F6096"/>
+          <w:left w:val="single" w:sz="10" w:space="6" w:color="2D5A37"/>
         </w:pBdr>
-        <w:ind w:left="173"/>
+        <w:ind w:left="202"/>
       </w:pPr>
       <w:r>
         <w:rPr>
-          <w:rFonts w:ascii="Calibri" w:hAnsi="Calibri"/>
+          <w:rFonts w:ascii="Georgia" w:hAnsi="Georgia"/>
           <w:b/>
           <w:i w:val="0"/>
-          <w:color w:val="44546A"/>
+          <w:color w:val="374632"/>
           <w:sz w:val="22"/>
         </w:rPr>
         <w:t xml:space="preserve"> Regional Grid Topology — An Unresolved Gap</w:t>
@@ -1852,14 +1920,14 @@
     </w:p>
     <w:p>
       <w:pPr>
-        <w:spacing w:after="120" w:before="0"/>
+        <w:spacing w:after="140" w:before="20" w:line="280" w:lineRule="exact"/>
       </w:pPr>
       <w:r>
         <w:rPr>
-          <w:rFonts w:ascii="Calibri" w:hAnsi="Calibri"/>
+          <w:rFonts w:ascii="Georgia" w:hAnsi="Georgia"/>
           <w:b w:val="0"/>
           <w:i w:val="0"/>
-          <w:color w:val="000000"/>
+          <w:color w:val="2D2D2D"/>
           <w:sz w:val="22"/>
         </w:rPr>
         <w:t>A substation serving a military installation can lose power even if the substation itself sustains no direct damage. Regional flooding or wind can knock out an upstream node — a transmission tower, a switching station, a generator interconnection — and cascade a blackout downstream to the substation regardless of local conditions. How many such upstream nodes exist between the regional grid and each installation's substation, how much of that upstream path runs through flood-exposed terrain, and how redundant each upstream segment is — none of this is currently known.</w:t>
@@ -1867,11 +1935,11 @@
     </w:p>
     <w:p>
       <w:pPr>
-        <w:spacing w:after="120" w:before="0"/>
+        <w:spacing w:after="140" w:before="20" w:line="280" w:lineRule="exact"/>
       </w:pPr>
       <w:r>
         <w:rPr>
-          <w:rFonts w:ascii="Calibri" w:hAnsi="Calibri"/>
+          <w:rFonts w:ascii="Georgia" w:hAnsi="Georgia"/>
           <w:b w:val="0"/>
           <w:i w:val="0"/>
           <w:color w:val="323232"/>
@@ -1882,25 +1950,25 @@
     </w:p>
     <w:p>
       <w:pPr>
-        <w:spacing w:after="80" w:before="40"/>
+        <w:spacing w:after="80" w:before="60"/>
         <w:ind w:left="288"/>
       </w:pPr>
       <w:r>
         <w:rPr>
-          <w:rFonts w:ascii="Calibri" w:hAnsi="Calibri"/>
+          <w:rFonts w:ascii="Georgia" w:hAnsi="Georgia"/>
           <w:b/>
           <w:i w:val="0"/>
-          <w:color w:val="375623"/>
+          <w:color w:val="235523"/>
           <w:sz w:val="19"/>
         </w:rPr>
         <w:t xml:space="preserve">● Confirmed  </w:t>
       </w:r>
       <w:r>
         <w:rPr>
-          <w:rFonts w:ascii="Calibri" w:hAnsi="Calibri"/>
+          <w:rFonts w:ascii="Georgia" w:hAnsi="Georgia"/>
           <w:b w:val="0"/>
           <w:i/>
-          <w:color w:val="595959"/>
+          <w:color w:val="645F5A"/>
           <w:sz w:val="19"/>
         </w:rPr>
         <w:t>JEA data-sharing gap confirmed: MIRR project Sept 2025 TAC status notes.</w:t>
@@ -1908,25 +1976,25 @@
     </w:p>
     <w:p>
       <w:pPr>
-        <w:spacing w:after="80" w:before="40"/>
+        <w:spacing w:after="80" w:before="60"/>
         <w:ind w:left="288"/>
       </w:pPr>
       <w:r>
         <w:rPr>
-          <w:rFonts w:ascii="Calibri" w:hAnsi="Calibri"/>
+          <w:rFonts w:ascii="Georgia" w:hAnsi="Georgia"/>
           <w:b/>
           <w:i w:val="0"/>
-          <w:color w:val="7C5400"/>
+          <w:color w:val="82500A"/>
           <w:sz w:val="19"/>
         </w:rPr>
         <w:t xml:space="preserve">◐ Pending GIS  </w:t>
       </w:r>
       <w:r>
         <w:rPr>
-          <w:rFonts w:ascii="Calibri" w:hAnsi="Calibri"/>
+          <w:rFonts w:ascii="Georgia" w:hAnsi="Georgia"/>
           <w:b w:val="0"/>
           <w:i/>
-          <w:color w:val="595959"/>
+          <w:color w:val="645F5A"/>
           <w:sz w:val="19"/>
         </w:rPr>
         <w:t>EIA Form 860 and HIFLD transmission layers to be used as interim proxy. JEA routing data needed for accurate model.</w:t>
@@ -1934,31 +2002,33 @@
     </w:p>
     <w:p>
       <w:pPr>
-        <w:spacing w:before="280" w:after="120"/>
-        <w:ind w:left="-72"/>
-        <w:shd w:val="clear" w:color="auto" w:fill="BDD7EE"/>
+        <w:spacing w:before="320" w:after="120"/>
+        <w:shd w:val="clear" w:color="auto" w:fill="F5F0E8"/>
+        <w:pBdr>
+          <w:bottom w:val="single" w:sz="4" w:space="1" w:color="2D5A37"/>
+        </w:pBdr>
       </w:pPr>
       <w:r>
         <w:rPr>
-          <w:rFonts w:ascii="Calibri" w:hAnsi="Calibri"/>
+          <w:rFonts w:ascii="Georgia" w:hAnsi="Georgia"/>
           <w:b/>
           <w:i w:val="0"/>
-          <w:color w:val="1F6097"/>
-          <w:sz w:val="23"/>
+          <w:color w:val="2D5A37"/>
+          <w:sz w:val="24"/>
         </w:rPr>
         <w:t xml:space="preserve">  2.4  Confirmed Vulnerabilities by Installation</w:t>
       </w:r>
     </w:p>
     <w:p>
       <w:pPr>
-        <w:spacing w:after="120" w:before="0"/>
+        <w:spacing w:after="140" w:before="20" w:line="280" w:lineRule="exact"/>
       </w:pPr>
       <w:r>
         <w:rPr>
-          <w:rFonts w:ascii="Calibri" w:hAnsi="Calibri"/>
+          <w:rFonts w:ascii="Georgia" w:hAnsi="Georgia"/>
           <w:b w:val="0"/>
           <w:i w:val="0"/>
-          <w:color w:val="000000"/>
+          <w:color w:val="2D2D2D"/>
           <w:sz w:val="22"/>
         </w:rPr>
         <w:t>The four installations do not face identical risks. Each has a specific combination of hazard exposure, access constraints, and operational mission that shapes why the redundancy gap matters differently at each location. These summaries are drawn entirely from confirmed MIRR project documents.</w:t>
@@ -1966,18 +2036,18 @@
     </w:p>
     <w:p>
       <w:pPr>
-        <w:spacing w:before="200" w:after="60"/>
+        <w:spacing w:before="200" w:after="80"/>
         <w:pBdr>
-          <w:left w:val="single" w:sz="8" w:space="6" w:color="1F6096"/>
+          <w:left w:val="single" w:sz="10" w:space="6" w:color="2D5A37"/>
         </w:pBdr>
-        <w:ind w:left="173"/>
+        <w:ind w:left="202"/>
       </w:pPr>
       <w:r>
         <w:rPr>
-          <w:rFonts w:ascii="Calibri" w:hAnsi="Calibri"/>
+          <w:rFonts w:ascii="Georgia" w:hAnsi="Georgia"/>
           <w:b/>
           <w:i w:val="0"/>
-          <w:color w:val="44546A"/>
+          <w:color w:val="374632"/>
           <w:sz w:val="22"/>
         </w:rPr>
         <w:t xml:space="preserve"> Naval Station Mayport</w:t>
@@ -1985,14 +2055,14 @@
     </w:p>
     <w:p>
       <w:pPr>
-        <w:spacing w:after="120" w:before="0"/>
+        <w:spacing w:after="140" w:before="20" w:line="280" w:lineRule="exact"/>
       </w:pPr>
       <w:r>
         <w:rPr>
-          <w:rFonts w:ascii="Calibri" w:hAnsi="Calibri"/>
+          <w:rFonts w:ascii="Georgia" w:hAnsi="Georgia"/>
           <w:b w:val="0"/>
           <w:i w:val="0"/>
-          <w:color w:val="000000"/>
+          <w:color w:val="2D2D2D"/>
           <w:sz w:val="22"/>
         </w:rPr>
         <w:t>NS Mayport hosts the 4th Fleet headquarters and serves as a major Atlantic operations staging, fueling, and logistics node. The JEA Mayport Substation carries the highest single-asset energy risk rating in the entire MIRR study region: HIGH urgency, Immediate timeline. The substation sits south of the installation on a peninsula exposed to both Atlantic storm surge (confirmed SLOSH Cat 3–5 exposure) and St. Johns River backflow flooding.</w:t>
@@ -2000,11 +2070,11 @@
     </w:p>
     <w:p>
       <w:pPr>
-        <w:spacing w:after="120" w:before="0"/>
+        <w:spacing w:after="140" w:before="20" w:line="280" w:lineRule="exact"/>
       </w:pPr>
       <w:r>
         <w:rPr>
-          <w:rFonts w:ascii="Calibri" w:hAnsi="Calibri"/>
+          <w:rFonts w:ascii="Georgia" w:hAnsi="Georgia"/>
           <w:b w:val="0"/>
           <w:i w:val="0"/>
           <w:color w:val="323232"/>
@@ -2015,25 +2085,25 @@
     </w:p>
     <w:p>
       <w:pPr>
-        <w:spacing w:after="80" w:before="40"/>
+        <w:spacing w:after="80" w:before="60"/>
         <w:ind w:left="288"/>
       </w:pPr>
       <w:r>
         <w:rPr>
-          <w:rFonts w:ascii="Calibri" w:hAnsi="Calibri"/>
+          <w:rFonts w:ascii="Georgia" w:hAnsi="Georgia"/>
           <w:b/>
           <w:i w:val="0"/>
-          <w:color w:val="375623"/>
+          <w:color w:val="235523"/>
           <w:sz w:val="19"/>
         </w:rPr>
         <w:t xml:space="preserve">● Confirmed  </w:t>
       </w:r>
       <w:r>
         <w:rPr>
-          <w:rFonts w:ascii="Calibri" w:hAnsi="Calibri"/>
+          <w:rFonts w:ascii="Georgia" w:hAnsi="Georgia"/>
           <w:b w:val="0"/>
           <w:i/>
-          <w:color w:val="595959"/>
+          <w:color w:val="645F5A"/>
           <w:sz w:val="19"/>
         </w:rPr>
         <w:t>Risk rating HIGH/Immediate: MIRR VA (Jan 2026 SC). Active erosion and recurring flooding: Stakeholder Workshop 1 Summary V2.</w:t>
@@ -2041,18 +2111,18 @@
     </w:p>
     <w:p>
       <w:pPr>
-        <w:spacing w:before="200" w:after="60"/>
+        <w:spacing w:before="200" w:after="80"/>
         <w:pBdr>
-          <w:left w:val="single" w:sz="8" w:space="6" w:color="1F6096"/>
+          <w:left w:val="single" w:sz="10" w:space="6" w:color="2D5A37"/>
         </w:pBdr>
-        <w:ind w:left="173"/>
+        <w:ind w:left="202"/>
       </w:pPr>
       <w:r>
         <w:rPr>
-          <w:rFonts w:ascii="Calibri" w:hAnsi="Calibri"/>
+          <w:rFonts w:ascii="Georgia" w:hAnsi="Georgia"/>
           <w:b/>
           <w:i w:val="0"/>
-          <w:color w:val="44546A"/>
+          <w:color w:val="374632"/>
           <w:sz w:val="22"/>
         </w:rPr>
         <w:t xml:space="preserve"> MCSF Blount Island</w:t>
@@ -2060,14 +2130,14 @@
     </w:p>
     <w:p>
       <w:pPr>
-        <w:spacing w:after="120" w:before="0"/>
+        <w:spacing w:after="140" w:before="20" w:line="280" w:lineRule="exact"/>
       </w:pPr>
       <w:r>
         <w:rPr>
-          <w:rFonts w:ascii="Calibri" w:hAnsi="Calibri"/>
+          <w:rFonts w:ascii="Georgia" w:hAnsi="Georgia"/>
           <w:b w:val="0"/>
           <w:i w:val="0"/>
-          <w:color w:val="000000"/>
+          <w:color w:val="2D2D2D"/>
           <w:sz w:val="22"/>
         </w:rPr>
         <w:t>Blount Island houses the Maritime Prepositioning Force — prepositioned ships loaded with Marine Corps equipment and supplies capable of deploying to a global crisis within 72 hours. The entire operational model depends on continuous powered crane and conveyor operations for ship loading and unloading, climate-controlled equipment storage, and logistics coordination.</w:t>
@@ -2075,11 +2145,11 @@
     </w:p>
     <w:p>
       <w:pPr>
-        <w:spacing w:after="120" w:before="0"/>
+        <w:spacing w:after="140" w:before="20" w:line="280" w:lineRule="exact"/>
       </w:pPr>
       <w:r>
         <w:rPr>
-          <w:rFonts w:ascii="Calibri" w:hAnsi="Calibri"/>
+          <w:rFonts w:ascii="Georgia" w:hAnsi="Georgia"/>
           <w:b w:val="0"/>
           <w:i w:val="0"/>
           <w:color w:val="323232"/>
@@ -2090,11 +2160,11 @@
     </w:p>
     <w:p>
       <w:pPr>
-        <w:spacing w:after="120" w:before="0"/>
+        <w:spacing w:after="140" w:before="20" w:line="280" w:lineRule="exact"/>
       </w:pPr>
       <w:r>
         <w:rPr>
-          <w:rFonts w:ascii="Calibri" w:hAnsi="Calibri"/>
+          <w:rFonts w:ascii="Georgia" w:hAnsi="Georgia"/>
           <w:b w:val="0"/>
           <w:i w:val="0"/>
           <w:color w:val="323232"/>
@@ -2105,25 +2175,25 @@
     </w:p>
     <w:p>
       <w:pPr>
-        <w:spacing w:after="80" w:before="40"/>
+        <w:spacing w:after="80" w:before="60"/>
         <w:ind w:left="288"/>
       </w:pPr>
       <w:r>
         <w:rPr>
-          <w:rFonts w:ascii="Calibri" w:hAnsi="Calibri"/>
+          <w:rFonts w:ascii="Georgia" w:hAnsi="Georgia"/>
           <w:b/>
           <w:i w:val="0"/>
-          <w:color w:val="375623"/>
+          <w:color w:val="235523"/>
           <w:sz w:val="19"/>
         </w:rPr>
         <w:t xml:space="preserve">● Confirmed  </w:t>
       </w:r>
       <w:r>
         <w:rPr>
-          <w:rFonts w:ascii="Calibri" w:hAnsi="Calibri"/>
+          <w:rFonts w:ascii="Georgia" w:hAnsi="Georgia"/>
           <w:b w:val="0"/>
           <w:i/>
-          <w:color w:val="595959"/>
+          <w:color w:val="645F5A"/>
           <w:sz w:val="19"/>
         </w:rPr>
         <w:t>Active water intrusion: MCSF Blount Island Kickoff Briefing (April 2025). P035 status: MIRR project documents. Risk MEDIUM/Immediate: MIRR VA (Jan 2026 SC).</w:t>
@@ -2131,18 +2201,18 @@
     </w:p>
     <w:p>
       <w:pPr>
-        <w:spacing w:before="200" w:after="60"/>
+        <w:spacing w:before="200" w:after="80"/>
         <w:pBdr>
-          <w:left w:val="single" w:sz="8" w:space="6" w:color="1F6096"/>
+          <w:left w:val="single" w:sz="10" w:space="6" w:color="2D5A37"/>
         </w:pBdr>
-        <w:ind w:left="173"/>
+        <w:ind w:left="202"/>
       </w:pPr>
       <w:r>
         <w:rPr>
-          <w:rFonts w:ascii="Calibri" w:hAnsi="Calibri"/>
+          <w:rFonts w:ascii="Georgia" w:hAnsi="Georgia"/>
           <w:b/>
           <w:i w:val="0"/>
-          <w:color w:val="44546A"/>
+          <w:color w:val="374632"/>
           <w:sz w:val="22"/>
         </w:rPr>
         <w:t xml:space="preserve"> Naval Air Station Jacksonville</w:t>
@@ -2150,14 +2220,14 @@
     </w:p>
     <w:p>
       <w:pPr>
-        <w:spacing w:after="120" w:before="0"/>
+        <w:spacing w:after="140" w:before="20" w:line="280" w:lineRule="exact"/>
       </w:pPr>
       <w:r>
         <w:rPr>
-          <w:rFonts w:ascii="Calibri" w:hAnsi="Calibri"/>
+          <w:rFonts w:ascii="Georgia" w:hAnsi="Georgia"/>
           <w:b w:val="0"/>
           <w:i w:val="0"/>
-          <w:color w:val="000000"/>
+          <w:color w:val="2D2D2D"/>
           <w:sz w:val="22"/>
         </w:rPr>
         <w:t>NAS JAX is the primary East Coast hub for the P-8 Poseidon maritime patrol aircraft and supports major logistics and supply chain operations for other East Coast installations. Continuous power is required for aircraft maintenance cycles, fueling, pre-flight system checks, and communications. The JEA substation north of the base is the sole electrical supply point, rated MEDIUM risk at Immediate urgency, with lack of redundancy as the primary stressor.</w:t>
@@ -2165,11 +2235,11 @@
     </w:p>
     <w:p>
       <w:pPr>
-        <w:spacing w:after="120" w:before="0"/>
+        <w:spacing w:after="140" w:before="20" w:line="280" w:lineRule="exact"/>
       </w:pPr>
       <w:r>
         <w:rPr>
-          <w:rFonts w:ascii="Calibri" w:hAnsi="Calibri"/>
+          <w:rFonts w:ascii="Georgia" w:hAnsi="Georgia"/>
           <w:b w:val="0"/>
           <w:i w:val="0"/>
           <w:color w:val="323232"/>
@@ -2180,25 +2250,25 @@
     </w:p>
     <w:p>
       <w:pPr>
-        <w:spacing w:after="80" w:before="40"/>
+        <w:spacing w:after="80" w:before="60"/>
         <w:ind w:left="288"/>
       </w:pPr>
       <w:r>
         <w:rPr>
-          <w:rFonts w:ascii="Calibri" w:hAnsi="Calibri"/>
+          <w:rFonts w:ascii="Georgia" w:hAnsi="Georgia"/>
           <w:b/>
           <w:i w:val="0"/>
-          <w:color w:val="375623"/>
+          <w:color w:val="235523"/>
           <w:sz w:val="19"/>
         </w:rPr>
         <w:t xml:space="preserve">● Confirmed  </w:t>
       </w:r>
       <w:r>
         <w:rPr>
-          <w:rFonts w:ascii="Calibri" w:hAnsi="Calibri"/>
+          <w:rFonts w:ascii="Georgia" w:hAnsi="Georgia"/>
           <w:b w:val="0"/>
           <w:i/>
-          <w:color w:val="595959"/>
+          <w:color w:val="645F5A"/>
           <w:sz w:val="19"/>
         </w:rPr>
         <w:t>JEA hardening and microgrid study underway: NAS JAX Site Visit Summary V3. TECO gas dependency: NAS JAX Summary V3. Risk MEDIUM/Immediate: MIRR VA (Jan 2026 SC).</w:t>
@@ -2206,18 +2276,18 @@
     </w:p>
     <w:p>
       <w:pPr>
-        <w:spacing w:before="200" w:after="60"/>
+        <w:spacing w:before="200" w:after="80"/>
         <w:pBdr>
-          <w:left w:val="single" w:sz="8" w:space="6" w:color="1F6096"/>
+          <w:left w:val="single" w:sz="10" w:space="6" w:color="2D5A37"/>
         </w:pBdr>
-        <w:ind w:left="173"/>
+        <w:ind w:left="202"/>
       </w:pPr>
       <w:r>
         <w:rPr>
-          <w:rFonts w:ascii="Calibri" w:hAnsi="Calibri"/>
+          <w:rFonts w:ascii="Georgia" w:hAnsi="Georgia"/>
           <w:b/>
           <w:i w:val="0"/>
-          <w:color w:val="44546A"/>
+          <w:color w:val="374632"/>
           <w:sz w:val="22"/>
         </w:rPr>
         <w:t xml:space="preserve"> Camp Blanding Joint Training Center</w:t>
@@ -2225,14 +2295,14 @@
     </w:p>
     <w:p>
       <w:pPr>
-        <w:spacing w:after="120" w:before="0"/>
+        <w:spacing w:after="140" w:before="20" w:line="280" w:lineRule="exact"/>
       </w:pPr>
       <w:r>
         <w:rPr>
-          <w:rFonts w:ascii="Calibri" w:hAnsi="Calibri"/>
+          <w:rFonts w:ascii="Georgia" w:hAnsi="Georgia"/>
           <w:b w:val="0"/>
           <w:i w:val="0"/>
-          <w:color w:val="000000"/>
+          <w:color w:val="2D2D2D"/>
           <w:sz w:val="22"/>
         </w:rPr>
         <w:t>Camp Blanding is Florida's primary National Guard training and mobilization hub. In a major conflict, emergency declaration, or domestic response, Guard units activate and mobilize through Blanding — requiring powered training ranges, communications, fuel distribution, and logistics at maximum capacity. The FPL substation north of the base is rated HIGH risk at Near-Term urgency.</w:t>
@@ -2240,11 +2310,11 @@
     </w:p>
     <w:p>
       <w:pPr>
-        <w:spacing w:after="120" w:before="0"/>
+        <w:spacing w:after="140" w:before="20" w:line="280" w:lineRule="exact"/>
       </w:pPr>
       <w:r>
         <w:rPr>
-          <w:rFonts w:ascii="Calibri" w:hAnsi="Calibri"/>
+          <w:rFonts w:ascii="Georgia" w:hAnsi="Georgia"/>
           <w:b w:val="0"/>
           <w:i w:val="0"/>
           <w:color w:val="323232"/>
@@ -2255,25 +2325,25 @@
     </w:p>
     <w:p>
       <w:pPr>
-        <w:spacing w:after="80" w:before="40"/>
+        <w:spacing w:after="80" w:before="60"/>
         <w:ind w:left="288"/>
       </w:pPr>
       <w:r>
         <w:rPr>
-          <w:rFonts w:ascii="Calibri" w:hAnsi="Calibri"/>
+          <w:rFonts w:ascii="Georgia" w:hAnsi="Georgia"/>
           <w:b/>
           <w:i w:val="0"/>
-          <w:color w:val="375623"/>
+          <w:color w:val="235523"/>
           <w:sz w:val="19"/>
         </w:rPr>
         <w:t xml:space="preserve">● Confirmed  </w:t>
       </w:r>
       <w:r>
         <w:rPr>
-          <w:rFonts w:ascii="Calibri" w:hAnsi="Calibri"/>
+          <w:rFonts w:ascii="Georgia" w:hAnsi="Georgia"/>
           <w:b w:val="0"/>
           <w:i/>
-          <w:color w:val="595959"/>
+          <w:color w:val="645F5A"/>
           <w:sz w:val="19"/>
         </w:rPr>
         <w:t>Four-provider complexity and FPL substation risk HIGH/Near-Term: Camp Blanding Summary V2 and MIRR VA (Jan 2026 SC).</w:t>
@@ -2281,31 +2351,33 @@
     </w:p>
     <w:p>
       <w:pPr>
-        <w:spacing w:before="280" w:after="120"/>
-        <w:ind w:left="-72"/>
-        <w:shd w:val="clear" w:color="auto" w:fill="BDD7EE"/>
+        <w:spacing w:before="320" w:after="120"/>
+        <w:shd w:val="clear" w:color="auto" w:fill="F5F0E8"/>
+        <w:pBdr>
+          <w:bottom w:val="single" w:sz="4" w:space="1" w:color="2D5A37"/>
+        </w:pBdr>
       </w:pPr>
       <w:r>
         <w:rPr>
-          <w:rFonts w:ascii="Calibri" w:hAnsi="Calibri"/>
+          <w:rFonts w:ascii="Georgia" w:hAnsi="Georgia"/>
           <w:b/>
           <w:i w:val="0"/>
-          <w:color w:val="1F6097"/>
-          <w:sz w:val="23"/>
+          <w:color w:val="2D5A37"/>
+          <w:sz w:val="24"/>
         </w:rPr>
         <w:t xml:space="preserve">  2.5  Historical Events — Evidence the Vulnerability Is Real</w:t>
       </w:r>
     </w:p>
     <w:p>
       <w:pPr>
-        <w:spacing w:after="120" w:before="0"/>
+        <w:spacing w:after="140" w:before="20" w:line="280" w:lineRule="exact"/>
       </w:pPr>
       <w:r>
         <w:rPr>
-          <w:rFonts w:ascii="Calibri" w:hAnsi="Calibri"/>
+          <w:rFonts w:ascii="Georgia" w:hAnsi="Georgia"/>
           <w:b w:val="0"/>
           <w:i w:val="0"/>
-          <w:color w:val="000000"/>
+          <w:color w:val="2D2D2D"/>
           <w:sz w:val="22"/>
         </w:rPr>
         <w:t>The following events demonstrate that the hazards driving the redundancy gap are not theoretical. They have occurred in this region within the last decade.</w:t>
@@ -2313,18 +2385,18 @@
     </w:p>
     <w:p>
       <w:pPr>
-        <w:spacing w:before="200" w:after="60"/>
+        <w:spacing w:before="200" w:after="80"/>
         <w:pBdr>
-          <w:left w:val="single" w:sz="8" w:space="6" w:color="1F6096"/>
+          <w:left w:val="single" w:sz="10" w:space="6" w:color="2D5A37"/>
         </w:pBdr>
-        <w:ind w:left="173"/>
+        <w:ind w:left="202"/>
       </w:pPr>
       <w:r>
         <w:rPr>
-          <w:rFonts w:ascii="Calibri" w:hAnsi="Calibri"/>
+          <w:rFonts w:ascii="Georgia" w:hAnsi="Georgia"/>
           <w:b/>
           <w:i w:val="0"/>
-          <w:color w:val="44546A"/>
+          <w:color w:val="374632"/>
           <w:sz w:val="22"/>
         </w:rPr>
         <w:t xml:space="preserve"> Confirmed in MIRR Project Documents</w:t>
@@ -2333,23 +2405,25 @@
     <w:p>
       <w:pPr>
         <w:pStyle w:val="ListBullet"/>
-        <w:spacing w:after="80" w:before="20"/>
-        <w:ind w:left="360"/>
+        <w:spacing w:after="100" w:before="40" w:line="280" w:lineRule="exact"/>
+        <w:ind w:left="432"/>
       </w:pPr>
       <w:r>
         <w:rPr>
-          <w:rFonts w:ascii="Calibri" w:hAnsi="Calibri"/>
+          <w:rFonts w:ascii="Georgia" w:hAnsi="Georgia"/>
           <w:b/>
           <w:i w:val="0"/>
+          <w:color w:val="2D5A37"/>
           <w:sz w:val="22"/>
         </w:rPr>
         <w:t xml:space="preserve">NS Mayport — recurring flooding, ongoing: </w:t>
       </w:r>
       <w:r>
         <w:rPr>
-          <w:rFonts w:ascii="Calibri" w:hAnsi="Calibri"/>
+          <w:rFonts w:ascii="Georgia" w:hAnsi="Georgia"/>
           <w:b w:val="0"/>
           <w:i w:val="0"/>
+          <w:color w:val="2D2D2D"/>
           <w:sz w:val="22"/>
         </w:rPr>
         <w:t>Multiple flooding events per year confirmed. Commanding officer cited this as the most pressing operational concern at Stakeholder Workshop 1.</w:t>
@@ -2358,23 +2432,25 @@
     <w:p>
       <w:pPr>
         <w:pStyle w:val="ListBullet"/>
-        <w:spacing w:after="80" w:before="20"/>
-        <w:ind w:left="360"/>
+        <w:spacing w:after="100" w:before="40" w:line="280" w:lineRule="exact"/>
+        <w:ind w:left="432"/>
       </w:pPr>
       <w:r>
         <w:rPr>
-          <w:rFonts w:ascii="Calibri" w:hAnsi="Calibri"/>
+          <w:rFonts w:ascii="Georgia" w:hAnsi="Georgia"/>
           <w:b/>
           <w:i w:val="0"/>
+          <w:color w:val="2D5A37"/>
           <w:sz w:val="22"/>
         </w:rPr>
         <w:t xml:space="preserve">NAS Jacksonville — 106 mph wind gust, 1997: </w:t>
       </w:r>
       <w:r>
         <w:rPr>
-          <w:rFonts w:ascii="Calibri" w:hAnsi="Calibri"/>
+          <w:rFonts w:ascii="Georgia" w:hAnsi="Georgia"/>
           <w:b w:val="0"/>
           <w:i w:val="0"/>
+          <w:color w:val="2D2D2D"/>
           <w:sz w:val="22"/>
         </w:rPr>
         <w:t>Documented in MIRR evaluation methodology materials. Establishes that hurricane-force wind is a demonstrated regional hazard at this specific location.</w:t>
@@ -2383,23 +2459,25 @@
     <w:p>
       <w:pPr>
         <w:pStyle w:val="ListBullet"/>
-        <w:spacing w:after="80" w:before="20"/>
-        <w:ind w:left="360"/>
+        <w:spacing w:after="100" w:before="40" w:line="280" w:lineRule="exact"/>
+        <w:ind w:left="432"/>
       </w:pPr>
       <w:r>
         <w:rPr>
-          <w:rFonts w:ascii="Calibri" w:hAnsi="Calibri"/>
+          <w:rFonts w:ascii="Georgia" w:hAnsi="Georgia"/>
           <w:b/>
           <w:i w:val="0"/>
+          <w:color w:val="2D5A37"/>
           <w:sz w:val="22"/>
         </w:rPr>
         <w:t xml:space="preserve">MCSF Blount Island — active water intrusion, current: </w:t>
       </w:r>
       <w:r>
         <w:rPr>
-          <w:rFonts w:ascii="Calibri" w:hAnsi="Calibri"/>
+          <w:rFonts w:ascii="Georgia" w:hAnsi="Georgia"/>
           <w:b w:val="0"/>
           <w:i w:val="0"/>
+          <w:color w:val="2D2D2D"/>
           <w:sz w:val="22"/>
         </w:rPr>
         <w:t>Water intrusion is already threatening electrical systems as of the April 2025 project kickoff. This is an ongoing condition, not a past event.</w:t>
@@ -2408,23 +2486,25 @@
     <w:p>
       <w:pPr>
         <w:pStyle w:val="ListBullet"/>
-        <w:spacing w:after="80" w:before="20"/>
-        <w:ind w:left="360"/>
+        <w:spacing w:after="100" w:before="40" w:line="280" w:lineRule="exact"/>
+        <w:ind w:left="432"/>
       </w:pPr>
       <w:r>
         <w:rPr>
-          <w:rFonts w:ascii="Calibri" w:hAnsi="Calibri"/>
+          <w:rFonts w:ascii="Georgia" w:hAnsi="Georgia"/>
           <w:b/>
           <w:i w:val="0"/>
+          <w:color w:val="2D5A37"/>
           <w:sz w:val="22"/>
         </w:rPr>
         <w:t xml:space="preserve">Tyndall AFB — Hurricane Michael, October 2018: </w:t>
       </w:r>
       <w:r>
         <w:rPr>
-          <w:rFonts w:ascii="Calibri" w:hAnsi="Calibri"/>
+          <w:rFonts w:ascii="Georgia" w:hAnsi="Georgia"/>
           <w:b w:val="0"/>
           <w:i w:val="0"/>
+          <w:color w:val="2D2D2D"/>
           <w:sz w:val="22"/>
         </w:rPr>
         <w:t>On-base hardening investments proved insufficient when surrounding utilities and transportation infrastructure failed regionally. The installation sustained mission disruption not primarily from direct wind damage but from civilian infrastructure collapse around it. This is the foundational case study for the APTIM memo's framing.</w:t>
@@ -2432,25 +2512,25 @@
     </w:p>
     <w:p>
       <w:pPr>
-        <w:spacing w:after="80" w:before="40"/>
+        <w:spacing w:after="80" w:before="60"/>
         <w:ind w:left="288"/>
       </w:pPr>
       <w:r>
         <w:rPr>
-          <w:rFonts w:ascii="Calibri" w:hAnsi="Calibri"/>
+          <w:rFonts w:ascii="Georgia" w:hAnsi="Georgia"/>
           <w:b/>
           <w:i w:val="0"/>
-          <w:color w:val="375623"/>
+          <w:color w:val="235523"/>
           <w:sz w:val="19"/>
         </w:rPr>
         <w:t xml:space="preserve">● Confirmed  </w:t>
       </w:r>
       <w:r>
         <w:rPr>
-          <w:rFonts w:ascii="Calibri" w:hAnsi="Calibri"/>
+          <w:rFonts w:ascii="Georgia" w:hAnsi="Georgia"/>
           <w:b w:val="0"/>
           <w:i/>
-          <w:color w:val="595959"/>
+          <w:color w:val="645F5A"/>
           <w:sz w:val="19"/>
         </w:rPr>
         <w:t>All four items: confirmed MIRR project documents as cited above.</w:t>
@@ -2458,18 +2538,18 @@
     </w:p>
     <w:p>
       <w:pPr>
-        <w:spacing w:before="200" w:after="60"/>
+        <w:spacing w:before="200" w:after="80"/>
         <w:pBdr>
-          <w:left w:val="single" w:sz="8" w:space="6" w:color="1F6096"/>
+          <w:left w:val="single" w:sz="10" w:space="6" w:color="2D5A37"/>
         </w:pBdr>
-        <w:ind w:left="173"/>
+        <w:ind w:left="202"/>
       </w:pPr>
       <w:r>
         <w:rPr>
-          <w:rFonts w:ascii="Calibri" w:hAnsi="Calibri"/>
+          <w:rFonts w:ascii="Georgia" w:hAnsi="Georgia"/>
           <w:b/>
           <w:i w:val="0"/>
-          <w:color w:val="44546A"/>
+          <w:color w:val="374632"/>
           <w:sz w:val="22"/>
         </w:rPr>
         <w:t xml:space="preserve"> Regional Events — Needs Primary Source Before Formal Use</w:t>
@@ -2477,14 +2557,14 @@
     </w:p>
     <w:p>
       <w:pPr>
-        <w:spacing w:after="120" w:before="0"/>
+        <w:spacing w:after="140" w:before="20" w:line="280" w:lineRule="exact"/>
       </w:pPr>
       <w:r>
         <w:rPr>
-          <w:rFonts w:ascii="Calibri" w:hAnsi="Calibri"/>
+          <w:rFonts w:ascii="Georgia" w:hAnsi="Georgia"/>
           <w:b w:val="0"/>
           <w:i/>
-          <w:color w:val="595959"/>
+          <w:color w:val="645F5A"/>
           <w:sz w:val="22"/>
         </w:rPr>
         <w:t>The following regional events are widely documented in public record but have not been pulled to primary sources (NHC reports, PSC storm filings, FEMA declarations) for this analysis. They should not be cited in any client-facing document until the verification steps below are completed.</w:t>
@@ -2493,23 +2573,25 @@
     <w:p>
       <w:pPr>
         <w:pStyle w:val="ListBullet"/>
-        <w:spacing w:after="80" w:before="20"/>
-        <w:ind w:left="360"/>
+        <w:spacing w:after="100" w:before="40" w:line="280" w:lineRule="exact"/>
+        <w:ind w:left="432"/>
       </w:pPr>
       <w:r>
         <w:rPr>
-          <w:rFonts w:ascii="Calibri" w:hAnsi="Calibri"/>
+          <w:rFonts w:ascii="Georgia" w:hAnsi="Georgia"/>
           <w:b/>
           <w:i w:val="0"/>
+          <w:color w:val="2D5A37"/>
           <w:sz w:val="22"/>
         </w:rPr>
         <w:t xml:space="preserve">Hurricane Matthew, October 2016 — </w:t>
       </w:r>
       <w:r>
         <w:rPr>
-          <w:rFonts w:ascii="Calibri" w:hAnsi="Calibri"/>
+          <w:rFonts w:ascii="Georgia" w:hAnsi="Georgia"/>
           <w:b w:val="0"/>
           <w:i w:val="0"/>
+          <w:color w:val="2D2D2D"/>
           <w:sz w:val="22"/>
         </w:rPr>
         <w:t>Caused historic St. Johns River flooding through Jacksonville. A1A reported as flooded. JEA reported widespread Duval County outages. Access corridors serving Mayport and Blount Island would have been affected by documented flood levels.</w:t>
@@ -2520,23 +2602,25 @@
     <w:p>
       <w:pPr>
         <w:pStyle w:val="ListBullet"/>
-        <w:spacing w:after="80" w:before="20"/>
-        <w:ind w:left="360"/>
+        <w:spacing w:after="100" w:before="40" w:line="280" w:lineRule="exact"/>
+        <w:ind w:left="432"/>
       </w:pPr>
       <w:r>
         <w:rPr>
-          <w:rFonts w:ascii="Calibri" w:hAnsi="Calibri"/>
+          <w:rFonts w:ascii="Georgia" w:hAnsi="Georgia"/>
           <w:b/>
           <w:i w:val="0"/>
+          <w:color w:val="2D5A37"/>
           <w:sz w:val="22"/>
         </w:rPr>
         <w:t xml:space="preserve">Hurricane Irma, September 2017 — </w:t>
       </w:r>
       <w:r>
         <w:rPr>
-          <w:rFonts w:ascii="Calibri" w:hAnsi="Calibri"/>
+          <w:rFonts w:ascii="Georgia" w:hAnsi="Georgia"/>
           <w:b w:val="0"/>
           <w:i w:val="0"/>
+          <w:color w:val="2D2D2D"/>
           <w:sz w:val="22"/>
         </w:rPr>
         <w:t>JEA publicly reported approximately 200,000 customers without power at peak across the Jacksonville service territory.</w:t>
@@ -2546,25 +2630,25 @@
     </w:p>
     <w:p>
       <w:pPr>
-        <w:spacing w:after="80" w:before="40"/>
+        <w:spacing w:after="80" w:before="60"/>
         <w:ind w:left="288"/>
       </w:pPr>
       <w:r>
         <w:rPr>
-          <w:rFonts w:ascii="Calibri" w:hAnsi="Calibri"/>
+          <w:rFonts w:ascii="Georgia" w:hAnsi="Georgia"/>
           <w:b/>
           <w:i w:val="0"/>
-          <w:color w:val="9C0006"/>
+          <w:color w:val="8C1E1E"/>
           <w:sz w:val="19"/>
         </w:rPr>
         <w:t xml:space="preserve">○ Needs verification  </w:t>
       </w:r>
       <w:r>
         <w:rPr>
-          <w:rFonts w:ascii="Calibri" w:hAnsi="Calibri"/>
+          <w:rFonts w:ascii="Georgia" w:hAnsi="Georgia"/>
           <w:b w:val="0"/>
           <w:i/>
-          <w:color w:val="595959"/>
+          <w:color w:val="645F5A"/>
           <w:sz w:val="19"/>
         </w:rPr>
         <w:t>Do not cite Matthew or Irma in any formal deliverable until PSC filings and NHC reports are in hand.</w:t>
@@ -2572,31 +2656,33 @@
     </w:p>
     <w:p>
       <w:pPr>
-        <w:spacing w:before="280" w:after="120"/>
-        <w:ind w:left="-72"/>
-        <w:shd w:val="clear" w:color="auto" w:fill="BDD7EE"/>
+        <w:spacing w:before="320" w:after="120"/>
+        <w:shd w:val="clear" w:color="auto" w:fill="F5F0E8"/>
+        <w:pBdr>
+          <w:bottom w:val="single" w:sz="4" w:space="1" w:color="2D5A37"/>
+        </w:pBdr>
       </w:pPr>
       <w:r>
         <w:rPr>
-          <w:rFonts w:ascii="Calibri" w:hAnsi="Calibri"/>
+          <w:rFonts w:ascii="Georgia" w:hAnsi="Georgia"/>
           <w:b/>
           <w:i w:val="0"/>
-          <w:color w:val="1F6097"/>
-          <w:sz w:val="23"/>
+          <w:color w:val="2D5A37"/>
+          <w:sz w:val="24"/>
         </w:rPr>
         <w:t xml:space="preserve">  2.6  GIS Analyses Planned</w:t>
       </w:r>
     </w:p>
     <w:p>
       <w:pPr>
-        <w:spacing w:after="120" w:before="0"/>
+        <w:spacing w:after="140" w:before="20" w:line="280" w:lineRule="exact"/>
       </w:pPr>
       <w:r>
         <w:rPr>
-          <w:rFonts w:ascii="Calibri" w:hAnsi="Calibri"/>
+          <w:rFonts w:ascii="Georgia" w:hAnsi="Georgia"/>
           <w:b w:val="0"/>
           <w:i w:val="0"/>
-          <w:color w:val="000000"/>
+          <w:color w:val="2D2D2D"/>
           <w:sz w:val="22"/>
         </w:rPr>
         <w:t>The following spatial analyses will confirm and quantify what the document review has established conceptually. Each is tied to specific publicly available datasets that can be accessed now, plus additional datasets that require data-sharing agreements expected after the August–September budget approval period.</w:t>
@@ -2617,16 +2703,16 @@
         <w:tc>
           <w:tcPr>
             <w:tcW w:type="dxa" w:w="2880"/>
-            <w:shd w:val="clear" w:color="auto" w:fill="2E75B6"/>
+            <w:shd w:val="clear" w:color="auto" w:fill="3D5436"/>
           </w:tcPr>
           <w:p>
             <w:pPr>
-              <w:spacing w:after="40" w:before="40"/>
+              <w:spacing w:after="60" w:before="60"/>
             </w:pPr>
             <w:r/>
             <w:r>
               <w:rPr>
-                <w:rFonts w:ascii="Calibri" w:hAnsi="Calibri"/>
+                <w:rFonts w:ascii="Georgia" w:hAnsi="Georgia"/>
                 <w:b/>
                 <w:i w:val="0"/>
                 <w:color w:val="FFFFFF"/>
@@ -2639,16 +2725,16 @@
         <w:tc>
           <w:tcPr>
             <w:tcW w:type="dxa" w:w="2880"/>
-            <w:shd w:val="clear" w:color="auto" w:fill="2E75B6"/>
+            <w:shd w:val="clear" w:color="auto" w:fill="3D5436"/>
           </w:tcPr>
           <w:p>
             <w:pPr>
-              <w:spacing w:after="40" w:before="40"/>
+              <w:spacing w:after="60" w:before="60"/>
             </w:pPr>
             <w:r/>
             <w:r>
               <w:rPr>
-                <w:rFonts w:ascii="Calibri" w:hAnsi="Calibri"/>
+                <w:rFonts w:ascii="Georgia" w:hAnsi="Georgia"/>
                 <w:b/>
                 <w:i w:val="0"/>
                 <w:color w:val="FFFFFF"/>
@@ -2661,16 +2747,16 @@
         <w:tc>
           <w:tcPr>
             <w:tcW w:type="dxa" w:w="2880"/>
-            <w:shd w:val="clear" w:color="auto" w:fill="2E75B6"/>
+            <w:shd w:val="clear" w:color="auto" w:fill="3D5436"/>
           </w:tcPr>
           <w:p>
             <w:pPr>
-              <w:spacing w:after="40" w:before="40"/>
+              <w:spacing w:after="60" w:before="60"/>
             </w:pPr>
             <w:r/>
             <w:r>
               <w:rPr>
-                <w:rFonts w:ascii="Calibri" w:hAnsi="Calibri"/>
+                <w:rFonts w:ascii="Georgia" w:hAnsi="Georgia"/>
                 <w:b/>
                 <w:i w:val="0"/>
                 <w:color w:val="FFFFFF"/>
@@ -2685,17 +2771,19 @@
         <w:tc>
           <w:tcPr>
             <w:tcW w:type="dxa" w:w="2880"/>
+            <w:shd w:val="clear" w:color="auto" w:fill="FDFBF8"/>
           </w:tcPr>
           <w:p>
             <w:pPr>
-              <w:spacing w:after="40" w:before="40"/>
+              <w:spacing w:after="60" w:before="60" w:line="260" w:lineRule="exact"/>
             </w:pPr>
             <w:r/>
             <w:r>
               <w:rPr>
-                <w:rFonts w:ascii="Calibri" w:hAnsi="Calibri"/>
+                <w:rFonts w:ascii="Georgia" w:hAnsi="Georgia"/>
                 <w:b w:val="0"/>
                 <w:i w:val="0"/>
+                <w:color w:val="2D2D2D"/>
                 <w:sz w:val="20"/>
               </w:rPr>
               <w:t>Substation locations vs. storm surge zones</w:t>
@@ -2707,17 +2795,19 @@
         <w:tc>
           <w:tcPr>
             <w:tcW w:type="dxa" w:w="2880"/>
+            <w:shd w:val="clear" w:color="auto" w:fill="FDFBF8"/>
           </w:tcPr>
           <w:p>
             <w:pPr>
-              <w:spacing w:after="40" w:before="40"/>
+              <w:spacing w:after="60" w:before="60" w:line="260" w:lineRule="exact"/>
             </w:pPr>
             <w:r/>
             <w:r>
               <w:rPr>
-                <w:rFonts w:ascii="Calibri" w:hAnsi="Calibri"/>
+                <w:rFonts w:ascii="Georgia" w:hAnsi="Georgia"/>
                 <w:b w:val="0"/>
                 <w:i w:val="0"/>
+                <w:color w:val="2D2D2D"/>
                 <w:sz w:val="20"/>
               </w:rPr>
               <w:t>HIFLD Open substations</w:t>
@@ -2731,17 +2821,19 @@
         <w:tc>
           <w:tcPr>
             <w:tcW w:type="dxa" w:w="2880"/>
+            <w:shd w:val="clear" w:color="auto" w:fill="FDFBF8"/>
           </w:tcPr>
           <w:p>
             <w:pPr>
-              <w:spacing w:after="40" w:before="40"/>
+              <w:spacing w:after="60" w:before="60" w:line="260" w:lineRule="exact"/>
             </w:pPr>
             <w:r/>
             <w:r>
               <w:rPr>
-                <w:rFonts w:ascii="Calibri" w:hAnsi="Calibri"/>
+                <w:rFonts w:ascii="Georgia" w:hAnsi="Georgia"/>
                 <w:b w:val="0"/>
                 <w:i w:val="0"/>
+                <w:color w:val="2D2D2D"/>
                 <w:sz w:val="20"/>
               </w:rPr>
               <w:t>Which substations fall within surge inundation zones; whether preliminary FEMA maps reveal higher exposure than currently reflected in the effective map</w:t>
@@ -2753,18 +2845,19 @@
         <w:tc>
           <w:tcPr>
             <w:tcW w:type="dxa" w:w="2880"/>
-            <w:shd w:val="clear" w:color="auto" w:fill="DEEAF1"/>
+            <w:shd w:val="clear" w:color="auto" w:fill="EAF0E8"/>
           </w:tcPr>
           <w:p>
             <w:pPr>
-              <w:spacing w:after="40" w:before="40"/>
+              <w:spacing w:after="60" w:before="60" w:line="260" w:lineRule="exact"/>
             </w:pPr>
             <w:r/>
             <w:r>
               <w:rPr>
-                <w:rFonts w:ascii="Calibri" w:hAnsi="Calibri"/>
+                <w:rFonts w:ascii="Georgia" w:hAnsi="Georgia"/>
                 <w:b w:val="0"/>
                 <w:i w:val="0"/>
+                <w:color w:val="2D2D2D"/>
                 <w:sz w:val="20"/>
               </w:rPr>
               <w:t>Access corridors vs. flood extents</w:t>
@@ -2774,18 +2867,19 @@
         <w:tc>
           <w:tcPr>
             <w:tcW w:type="dxa" w:w="2880"/>
-            <w:shd w:val="clear" w:color="auto" w:fill="DEEAF1"/>
+            <w:shd w:val="clear" w:color="auto" w:fill="EAF0E8"/>
           </w:tcPr>
           <w:p>
             <w:pPr>
-              <w:spacing w:after="40" w:before="40"/>
+              <w:spacing w:after="60" w:before="60" w:line="260" w:lineRule="exact"/>
             </w:pPr>
             <w:r/>
             <w:r>
               <w:rPr>
-                <w:rFonts w:ascii="Calibri" w:hAnsi="Calibri"/>
+                <w:rFonts w:ascii="Georgia" w:hAnsi="Georgia"/>
                 <w:b w:val="0"/>
                 <w:i w:val="0"/>
+                <w:color w:val="2D2D2D"/>
                 <w:sz w:val="20"/>
               </w:rPr>
               <w:t>FDOT Florida road network</w:t>
@@ -2801,18 +2895,19 @@
         <w:tc>
           <w:tcPr>
             <w:tcW w:type="dxa" w:w="2880"/>
-            <w:shd w:val="clear" w:color="auto" w:fill="DEEAF1"/>
+            <w:shd w:val="clear" w:color="auto" w:fill="EAF0E8"/>
           </w:tcPr>
           <w:p>
             <w:pPr>
-              <w:spacing w:after="40" w:before="40"/>
+              <w:spacing w:after="60" w:before="60" w:line="260" w:lineRule="exact"/>
             </w:pPr>
             <w:r/>
             <w:r>
               <w:rPr>
-                <w:rFonts w:ascii="Calibri" w:hAnsi="Calibri"/>
+                <w:rFonts w:ascii="Georgia" w:hAnsi="Georgia"/>
                 <w:b w:val="0"/>
                 <w:i w:val="0"/>
+                <w:color w:val="2D2D2D"/>
                 <w:sz w:val="20"/>
               </w:rPr>
               <w:t>Which specific corridors flood at what storm frequency and projected future conditions; confirms which installations lose road access under each scenario</w:t>
@@ -2824,17 +2919,19 @@
         <w:tc>
           <w:tcPr>
             <w:tcW w:type="dxa" w:w="2880"/>
+            <w:shd w:val="clear" w:color="auto" w:fill="FDFBF8"/>
           </w:tcPr>
           <w:p>
             <w:pPr>
-              <w:spacing w:after="40" w:before="40"/>
+              <w:spacing w:after="60" w:before="60" w:line="260" w:lineRule="exact"/>
             </w:pPr>
             <w:r/>
             <w:r>
               <w:rPr>
-                <w:rFonts w:ascii="Calibri" w:hAnsi="Calibri"/>
+                <w:rFonts w:ascii="Georgia" w:hAnsi="Georgia"/>
                 <w:b w:val="0"/>
                 <w:i w:val="0"/>
+                <w:color w:val="2D2D2D"/>
                 <w:sz w:val="20"/>
               </w:rPr>
               <w:t>Upstream transmission routing — substations back to regional grid</w:t>
@@ -2844,17 +2941,19 @@
         <w:tc>
           <w:tcPr>
             <w:tcW w:type="dxa" w:w="2880"/>
+            <w:shd w:val="clear" w:color="auto" w:fill="FDFBF8"/>
           </w:tcPr>
           <w:p>
             <w:pPr>
-              <w:spacing w:after="40" w:before="40"/>
+              <w:spacing w:after="60" w:before="60" w:line="260" w:lineRule="exact"/>
             </w:pPr>
             <w:r/>
             <w:r>
               <w:rPr>
-                <w:rFonts w:ascii="Calibri" w:hAnsi="Calibri"/>
+                <w:rFonts w:ascii="Georgia" w:hAnsi="Georgia"/>
                 <w:b w:val="0"/>
                 <w:i w:val="0"/>
+                <w:color w:val="2D2D2D"/>
                 <w:sz w:val="20"/>
               </w:rPr>
               <w:t>EIA Form 860</w:t>
@@ -2868,17 +2967,19 @@
         <w:tc>
           <w:tcPr>
             <w:tcW w:type="dxa" w:w="2880"/>
+            <w:shd w:val="clear" w:color="auto" w:fill="FDFBF8"/>
           </w:tcPr>
           <w:p>
             <w:pPr>
-              <w:spacing w:after="40" w:before="40"/>
+              <w:spacing w:after="60" w:before="60" w:line="260" w:lineRule="exact"/>
             </w:pPr>
             <w:r/>
             <w:r>
               <w:rPr>
-                <w:rFonts w:ascii="Calibri" w:hAnsi="Calibri"/>
+                <w:rFonts w:ascii="Georgia" w:hAnsi="Georgia"/>
                 <w:b w:val="0"/>
                 <w:i w:val="0"/>
+                <w:color w:val="2D2D2D"/>
                 <w:sz w:val="20"/>
               </w:rPr>
               <w:t>Node count and flood / wildfire exposure between installations and regional grid; confirms or refutes the upstream cascade vulnerability; verifies Part 1 US-17 SPOF claim</w:t>
@@ -2890,18 +2991,19 @@
         <w:tc>
           <w:tcPr>
             <w:tcW w:type="dxa" w:w="2880"/>
-            <w:shd w:val="clear" w:color="auto" w:fill="DEEAF1"/>
+            <w:shd w:val="clear" w:color="auto" w:fill="EAF0E8"/>
           </w:tcPr>
           <w:p>
             <w:pPr>
-              <w:spacing w:after="40" w:before="40"/>
+              <w:spacing w:after="60" w:before="60" w:line="260" w:lineRule="exact"/>
             </w:pPr>
             <w:r/>
             <w:r>
               <w:rPr>
-                <w:rFonts w:ascii="Calibri" w:hAnsi="Calibri"/>
+                <w:rFonts w:ascii="Georgia" w:hAnsi="Georgia"/>
                 <w:b w:val="0"/>
                 <w:i w:val="0"/>
+                <w:color w:val="2D2D2D"/>
                 <w:sz w:val="20"/>
               </w:rPr>
               <w:t>FPL corridor wildfire hazard — Camp Blanding</w:t>
@@ -2911,18 +3013,19 @@
         <w:tc>
           <w:tcPr>
             <w:tcW w:type="dxa" w:w="2880"/>
-            <w:shd w:val="clear" w:color="auto" w:fill="DEEAF1"/>
+            <w:shd w:val="clear" w:color="auto" w:fill="EAF0E8"/>
           </w:tcPr>
           <w:p>
             <w:pPr>
-              <w:spacing w:after="40" w:before="40"/>
+              <w:spacing w:after="60" w:before="60" w:line="260" w:lineRule="exact"/>
             </w:pPr>
             <w:r/>
             <w:r>
               <w:rPr>
-                <w:rFonts w:ascii="Calibri" w:hAnsi="Calibri"/>
+                <w:rFonts w:ascii="Georgia" w:hAnsi="Georgia"/>
                 <w:b w:val="0"/>
                 <w:i w:val="0"/>
+                <w:color w:val="2D2D2D"/>
                 <w:sz w:val="20"/>
               </w:rPr>
               <w:t>USDA Forest Service Wildfire Hazard Potential</w:t>
@@ -2936,18 +3039,19 @@
         <w:tc>
           <w:tcPr>
             <w:tcW w:type="dxa" w:w="2880"/>
-            <w:shd w:val="clear" w:color="auto" w:fill="DEEAF1"/>
+            <w:shd w:val="clear" w:color="auto" w:fill="EAF0E8"/>
           </w:tcPr>
           <w:p>
             <w:pPr>
-              <w:spacing w:after="40" w:before="40"/>
+              <w:spacing w:after="60" w:before="60" w:line="260" w:lineRule="exact"/>
             </w:pPr>
             <w:r/>
             <w:r>
               <w:rPr>
-                <w:rFonts w:ascii="Calibri" w:hAnsi="Calibri"/>
+                <w:rFonts w:ascii="Georgia" w:hAnsi="Georgia"/>
                 <w:b w:val="0"/>
                 <w:i w:val="0"/>
+                <w:color w:val="2D2D2D"/>
                 <w:sz w:val="20"/>
               </w:rPr>
               <w:t>Spatial extent of high wildfire hazard along FPL supply corridor; how much of the corridor runs through WUI-rated terrain</w:t>
@@ -2959,17 +3063,19 @@
         <w:tc>
           <w:tcPr>
             <w:tcW w:type="dxa" w:w="2880"/>
+            <w:shd w:val="clear" w:color="auto" w:fill="FDFBF8"/>
           </w:tcPr>
           <w:p>
             <w:pPr>
-              <w:spacing w:after="40" w:before="40"/>
+              <w:spacing w:after="60" w:before="60" w:line="260" w:lineRule="exact"/>
             </w:pPr>
             <w:r/>
             <w:r>
               <w:rPr>
-                <w:rFonts w:ascii="Calibri" w:hAnsi="Calibri"/>
+                <w:rFonts w:ascii="Georgia" w:hAnsi="Georgia"/>
                 <w:b w:val="0"/>
                 <w:i w:val="0"/>
+                <w:color w:val="2D2D2D"/>
                 <w:sz w:val="20"/>
               </w:rPr>
               <w:t>Water table depth at substation sites</w:t>
@@ -2979,17 +3085,19 @@
         <w:tc>
           <w:tcPr>
             <w:tcW w:type="dxa" w:w="2880"/>
+            <w:shd w:val="clear" w:color="auto" w:fill="FDFBF8"/>
           </w:tcPr>
           <w:p>
             <w:pPr>
-              <w:spacing w:after="40" w:before="40"/>
+              <w:spacing w:after="60" w:before="60" w:line="260" w:lineRule="exact"/>
             </w:pPr>
             <w:r/>
             <w:r>
               <w:rPr>
-                <w:rFonts w:ascii="Calibri" w:hAnsi="Calibri"/>
+                <w:rFonts w:ascii="Georgia" w:hAnsi="Georgia"/>
                 <w:b w:val="0"/>
                 <w:i w:val="0"/>
+                <w:color w:val="2D2D2D"/>
                 <w:sz w:val="20"/>
               </w:rPr>
               <w:t>USGS National Map / 3DEP elevation</w:t>
@@ -3001,17 +3109,19 @@
         <w:tc>
           <w:tcPr>
             <w:tcW w:type="dxa" w:w="2880"/>
+            <w:shd w:val="clear" w:color="auto" w:fill="FDFBF8"/>
           </w:tcPr>
           <w:p>
             <w:pPr>
-              <w:spacing w:after="40" w:before="40"/>
+              <w:spacing w:after="60" w:before="60" w:line="260" w:lineRule="exact"/>
             </w:pPr>
             <w:r/>
             <w:r>
               <w:rPr>
-                <w:rFonts w:ascii="Calibri" w:hAnsi="Calibri"/>
+                <w:rFonts w:ascii="Georgia" w:hAnsi="Georgia"/>
                 <w:b w:val="0"/>
                 <w:i w:val="0"/>
+                <w:color w:val="2D2D2D"/>
                 <w:sz w:val="20"/>
               </w:rPr>
               <w:t>Undergrounding feasibility constraints at each substation location; depth-to-water table as a design constraint, not just an abstract concern</w:t>
@@ -3023,18 +3133,19 @@
         <w:tc>
           <w:tcPr>
             <w:tcW w:type="dxa" w:w="2880"/>
-            <w:shd w:val="clear" w:color="auto" w:fill="DEEAF1"/>
+            <w:shd w:val="clear" w:color="auto" w:fill="EAF0E8"/>
           </w:tcPr>
           <w:p>
             <w:pPr>
-              <w:spacing w:after="40" w:before="40"/>
+              <w:spacing w:after="60" w:before="60" w:line="260" w:lineRule="exact"/>
             </w:pPr>
             <w:r/>
             <w:r>
               <w:rPr>
-                <w:rFonts w:ascii="Calibri" w:hAnsi="Calibri"/>
+                <w:rFonts w:ascii="Georgia" w:hAnsi="Georgia"/>
                 <w:b w:val="0"/>
                 <w:i w:val="0"/>
+                <w:color w:val="2D2D2D"/>
                 <w:sz w:val="20"/>
               </w:rPr>
               <w:t>Coastal exposure and erosion — Mayport and Blount Island shorelines</w:t>
@@ -3044,18 +3155,19 @@
         <w:tc>
           <w:tcPr>
             <w:tcW w:type="dxa" w:w="2880"/>
-            <w:shd w:val="clear" w:color="auto" w:fill="DEEAF1"/>
+            <w:shd w:val="clear" w:color="auto" w:fill="EAF0E8"/>
           </w:tcPr>
           <w:p>
             <w:pPr>
-              <w:spacing w:after="40" w:before="40"/>
+              <w:spacing w:after="60" w:before="60" w:line="260" w:lineRule="exact"/>
             </w:pPr>
             <w:r/>
             <w:r>
               <w:rPr>
-                <w:rFonts w:ascii="Calibri" w:hAnsi="Calibri"/>
+                <w:rFonts w:ascii="Georgia" w:hAnsi="Georgia"/>
                 <w:b w:val="0"/>
                 <w:i w:val="0"/>
+                <w:color w:val="2D2D2D"/>
                 <w:sz w:val="20"/>
               </w:rPr>
               <w:t>USACE Jacksonville District coastal damage models</w:t>
@@ -3069,18 +3181,19 @@
         <w:tc>
           <w:tcPr>
             <w:tcW w:type="dxa" w:w="2880"/>
-            <w:shd w:val="clear" w:color="auto" w:fill="DEEAF1"/>
+            <w:shd w:val="clear" w:color="auto" w:fill="EAF0E8"/>
           </w:tcPr>
           <w:p>
             <w:pPr>
-              <w:spacing w:after="40" w:before="40"/>
+              <w:spacing w:after="60" w:before="60" w:line="260" w:lineRule="exact"/>
             </w:pPr>
             <w:r/>
             <w:r>
               <w:rPr>
-                <w:rFonts w:ascii="Calibri" w:hAnsi="Calibri"/>
+                <w:rFonts w:ascii="Georgia" w:hAnsi="Georgia"/>
                 <w:b w:val="0"/>
                 <w:i w:val="0"/>
+                <w:color w:val="2D2D2D"/>
                 <w:sz w:val="20"/>
               </w:rPr>
               <w:t>Rate of shoreline migration toward infrastructure at Mayport; how surge inundation thresholds change under 2040 and 2070 SLR scenarios</w:t>
@@ -3096,25 +3209,25 @@
     </w:p>
     <w:p>
       <w:pPr>
-        <w:spacing w:after="80" w:before="40"/>
+        <w:spacing w:after="80" w:before="60"/>
         <w:ind w:left="288"/>
       </w:pPr>
       <w:r>
         <w:rPr>
-          <w:rFonts w:ascii="Calibri" w:hAnsi="Calibri"/>
+          <w:rFonts w:ascii="Georgia" w:hAnsi="Georgia"/>
           <w:b/>
           <w:i w:val="0"/>
-          <w:color w:val="7C5400"/>
+          <w:color w:val="82500A"/>
           <w:sz w:val="19"/>
         </w:rPr>
         <w:t xml:space="preserve">◐ Pending GIS  </w:t>
       </w:r>
       <w:r>
         <w:rPr>
-          <w:rFonts w:ascii="Calibri" w:hAnsi="Calibri"/>
+          <w:rFonts w:ascii="Georgia" w:hAnsi="Georgia"/>
           <w:b w:val="0"/>
           <w:i/>
-          <w:color w:val="595959"/>
+          <w:color w:val="645F5A"/>
           <w:sz w:val="19"/>
         </w:rPr>
         <w:t>Tier 1 (public data, available now): HIFLD, EIA Form 860, NOAA Digital Coast, FEMA MSC, FDOT, USDA FS, USGS, SJRWMD. Tier 2 (data agreement required, expected after August–September): JEA transmission routing, NAVFAC installation energy data, USACE detailed coastal damage models.</w:t>
@@ -3122,31 +3235,33 @@
     </w:p>
     <w:p>
       <w:pPr>
-        <w:spacing w:before="280" w:after="120"/>
-        <w:ind w:left="-72"/>
-        <w:shd w:val="clear" w:color="auto" w:fill="BDD7EE"/>
+        <w:spacing w:before="320" w:after="120"/>
+        <w:shd w:val="clear" w:color="auto" w:fill="F5F0E8"/>
+        <w:pBdr>
+          <w:bottom w:val="single" w:sz="4" w:space="1" w:color="2D5A37"/>
+        </w:pBdr>
       </w:pPr>
       <w:r>
         <w:rPr>
-          <w:rFonts w:ascii="Calibri" w:hAnsi="Calibri"/>
+          <w:rFonts w:ascii="Georgia" w:hAnsi="Georgia"/>
           <w:b/>
           <w:i w:val="0"/>
-          <w:color w:val="1F6097"/>
-          <w:sz w:val="23"/>
+          <w:color w:val="2D5A37"/>
+          <w:sz w:val="24"/>
         </w:rPr>
         <w:t xml:space="preserve">  2.7  Items Requiring Research Before Any Proposal Can Be Made</w:t>
       </w:r>
     </w:p>
     <w:p>
       <w:pPr>
-        <w:spacing w:after="120" w:before="0"/>
+        <w:spacing w:after="140" w:before="20" w:line="280" w:lineRule="exact"/>
       </w:pPr>
       <w:r>
         <w:rPr>
-          <w:rFonts w:ascii="Calibri" w:hAnsi="Calibri"/>
+          <w:rFonts w:ascii="Georgia" w:hAnsi="Georgia"/>
           <w:b w:val="0"/>
           <w:i w:val="0"/>
-          <w:color w:val="000000"/>
+          <w:color w:val="2D2D2D"/>
           <w:sz w:val="22"/>
         </w:rPr>
         <w:t>These topics have appeared in prior research conversations or in project document review but are not ready for any formal deliverable. Each entry documents what is known, what is not, and what specific steps are needed next. Nothing here should be presented to a client until those steps are completed.</w:t>
@@ -3167,16 +3282,16 @@
         <w:tc>
           <w:tcPr>
             <w:tcW w:type="dxa" w:w="2880"/>
-            <w:shd w:val="clear" w:color="auto" w:fill="2E75B6"/>
+            <w:shd w:val="clear" w:color="auto" w:fill="3D5436"/>
           </w:tcPr>
           <w:p>
             <w:pPr>
-              <w:spacing w:after="40" w:before="40"/>
+              <w:spacing w:after="60" w:before="60"/>
             </w:pPr>
             <w:r/>
             <w:r>
               <w:rPr>
-                <w:rFonts w:ascii="Calibri" w:hAnsi="Calibri"/>
+                <w:rFonts w:ascii="Georgia" w:hAnsi="Georgia"/>
                 <w:b/>
                 <w:i w:val="0"/>
                 <w:color w:val="FFFFFF"/>
@@ -3189,16 +3304,16 @@
         <w:tc>
           <w:tcPr>
             <w:tcW w:type="dxa" w:w="2880"/>
-            <w:shd w:val="clear" w:color="auto" w:fill="2E75B6"/>
+            <w:shd w:val="clear" w:color="auto" w:fill="3D5436"/>
           </w:tcPr>
           <w:p>
             <w:pPr>
-              <w:spacing w:after="40" w:before="40"/>
+              <w:spacing w:after="60" w:before="60"/>
             </w:pPr>
             <w:r/>
             <w:r>
               <w:rPr>
-                <w:rFonts w:ascii="Calibri" w:hAnsi="Calibri"/>
+                <w:rFonts w:ascii="Georgia" w:hAnsi="Georgia"/>
                 <w:b/>
                 <w:i w:val="0"/>
                 <w:color w:val="FFFFFF"/>
@@ -3211,16 +3326,16 @@
         <w:tc>
           <w:tcPr>
             <w:tcW w:type="dxa" w:w="2880"/>
-            <w:shd w:val="clear" w:color="auto" w:fill="2E75B6"/>
+            <w:shd w:val="clear" w:color="auto" w:fill="3D5436"/>
           </w:tcPr>
           <w:p>
             <w:pPr>
-              <w:spacing w:after="40" w:before="40"/>
+              <w:spacing w:after="60" w:before="60"/>
             </w:pPr>
             <w:r/>
             <w:r>
               <w:rPr>
-                <w:rFonts w:ascii="Calibri" w:hAnsi="Calibri"/>
+                <w:rFonts w:ascii="Georgia" w:hAnsi="Georgia"/>
                 <w:b/>
                 <w:i w:val="0"/>
                 <w:color w:val="FFFFFF"/>
@@ -3235,17 +3350,19 @@
         <w:tc>
           <w:tcPr>
             <w:tcW w:type="dxa" w:w="2880"/>
+            <w:shd w:val="clear" w:color="auto" w:fill="FDFBF8"/>
           </w:tcPr>
           <w:p>
             <w:pPr>
-              <w:spacing w:after="40" w:before="40"/>
+              <w:spacing w:after="60" w:before="60" w:line="260" w:lineRule="exact"/>
             </w:pPr>
             <w:r/>
             <w:r>
               <w:rPr>
-                <w:rFonts w:ascii="Calibri" w:hAnsi="Calibri"/>
+                <w:rFonts w:ascii="Georgia" w:hAnsi="Georgia"/>
                 <w:b w:val="0"/>
                 <w:i w:val="0"/>
+                <w:color w:val="2D2D2D"/>
                 <w:sz w:val="20"/>
               </w:rPr>
               <w:t>Small Modular Reactors / DoD Microreactors</w:t>
@@ -3257,17 +3374,19 @@
         <w:tc>
           <w:tcPr>
             <w:tcW w:type="dxa" w:w="2880"/>
+            <w:shd w:val="clear" w:color="auto" w:fill="FDFBF8"/>
           </w:tcPr>
           <w:p>
             <w:pPr>
-              <w:spacing w:after="40" w:before="40"/>
+              <w:spacing w:after="60" w:before="60" w:line="260" w:lineRule="exact"/>
             </w:pPr>
             <w:r/>
             <w:r>
               <w:rPr>
-                <w:rFonts w:ascii="Calibri" w:hAnsi="Calibri"/>
+                <w:rFonts w:ascii="Georgia" w:hAnsi="Georgia"/>
                 <w:b w:val="0"/>
                 <w:i w:val="0"/>
+                <w:color w:val="2D2D2D"/>
                 <w:sz w:val="20"/>
               </w:rPr>
               <w:t>DoD's Project Pele program pursues on-site microreactors for military installations — would eliminate civilian grid dependency entirely if deployed. Most complete redundancy solution in concept; also most complex, longest lead time, and most regulatory-intensive. No NE Florida installation has been publicly identified as a Pele candidate site.</w:t>
@@ -3277,17 +3396,19 @@
         <w:tc>
           <w:tcPr>
             <w:tcW w:type="dxa" w:w="2880"/>
+            <w:shd w:val="clear" w:color="auto" w:fill="FDFBF8"/>
           </w:tcPr>
           <w:p>
             <w:pPr>
-              <w:spacing w:after="40" w:before="40"/>
+              <w:spacing w:after="60" w:before="60" w:line="260" w:lineRule="exact"/>
             </w:pPr>
             <w:r/>
             <w:r>
               <w:rPr>
-                <w:rFonts w:ascii="Calibri" w:hAnsi="Calibri"/>
+                <w:rFonts w:ascii="Georgia" w:hAnsi="Georgia"/>
                 <w:b w:val="0"/>
                 <w:i w:val="0"/>
+                <w:color w:val="2D2D2D"/>
                 <w:sz w:val="20"/>
               </w:rPr>
               <w:t>Research Project Pele program status and site selection criteria. Confirm ENRIL organization name with manager before any outreach. Assess NRC regulatory pathway and typical deployment timeline. Determine whether any MIRR installations have submitted ERCIP or ESTCP applications.</w:t>
@@ -3299,18 +3420,19 @@
         <w:tc>
           <w:tcPr>
             <w:tcW w:type="dxa" w:w="2880"/>
-            <w:shd w:val="clear" w:color="auto" w:fill="DEEAF1"/>
+            <w:shd w:val="clear" w:color="auto" w:fill="EAF0E8"/>
           </w:tcPr>
           <w:p>
             <w:pPr>
-              <w:spacing w:after="40" w:before="40"/>
+              <w:spacing w:after="60" w:before="60" w:line="260" w:lineRule="exact"/>
             </w:pPr>
             <w:r/>
             <w:r>
               <w:rPr>
-                <w:rFonts w:ascii="Calibri" w:hAnsi="Calibri"/>
+                <w:rFonts w:ascii="Georgia" w:hAnsi="Georgia"/>
                 <w:b w:val="0"/>
                 <w:i w:val="0"/>
+                <w:color w:val="2D2D2D"/>
                 <w:sz w:val="20"/>
               </w:rPr>
               <w:t>Electrical infrastructure insurance coverage</w:t>
@@ -3320,18 +3442,19 @@
         <w:tc>
           <w:tcPr>
             <w:tcW w:type="dxa" w:w="2880"/>
-            <w:shd w:val="clear" w:color="auto" w:fill="DEEAF1"/>
+            <w:shd w:val="clear" w:color="auto" w:fill="EAF0E8"/>
           </w:tcPr>
           <w:p>
             <w:pPr>
-              <w:spacing w:after="40" w:before="40"/>
+              <w:spacing w:after="60" w:before="60" w:line="260" w:lineRule="exact"/>
             </w:pPr>
             <w:r/>
             <w:r>
               <w:rPr>
-                <w:rFonts w:ascii="Calibri" w:hAnsi="Calibri"/>
+                <w:rFonts w:ascii="Georgia" w:hAnsi="Georgia"/>
                 <w:b w:val="0"/>
                 <w:i w:val="0"/>
+                <w:color w:val="2D2D2D"/>
                 <w:sz w:val="20"/>
               </w:rPr>
               <w:t>The type and scope of insurance JEA and FPL carry on the substations serving these installations is not known. Claims processing timelines after a storm event directly affect how long an outage persists — if a utility cannot begin repairs until an insurance assessment is completed, that adds to restoration time. Not currently captured in any MIRR analysis.</w:t>
@@ -3341,18 +3464,19 @@
         <w:tc>
           <w:tcPr>
             <w:tcW w:type="dxa" w:w="2880"/>
-            <w:shd w:val="clear" w:color="auto" w:fill="DEEAF1"/>
+            <w:shd w:val="clear" w:color="auto" w:fill="EAF0E8"/>
           </w:tcPr>
           <w:p>
             <w:pPr>
-              <w:spacing w:after="40" w:before="40"/>
+              <w:spacing w:after="60" w:before="60" w:line="260" w:lineRule="exact"/>
             </w:pPr>
             <w:r/>
             <w:r>
               <w:rPr>
-                <w:rFonts w:ascii="Calibri" w:hAnsi="Calibri"/>
+                <w:rFonts w:ascii="Georgia" w:hAnsi="Georgia"/>
                 <w:b w:val="0"/>
                 <w:i w:val="0"/>
+                <w:color w:val="2D2D2D"/>
                 <w:sz w:val="20"/>
               </w:rPr>
               <w:t>Review Florida PSC annual utility filings and storm protection plans for JEA and FPL. Check JEA and FPL annual reports for infrastructure insurance disclosures. Determine whether FEMA NFIP policies apply to privately-owned utility substations.</w:t>
@@ -3364,17 +3488,19 @@
         <w:tc>
           <w:tcPr>
             <w:tcW w:type="dxa" w:w="2880"/>
+            <w:shd w:val="clear" w:color="auto" w:fill="FDFBF8"/>
           </w:tcPr>
           <w:p>
             <w:pPr>
-              <w:spacing w:after="40" w:before="40"/>
+              <w:spacing w:after="60" w:before="60" w:line="260" w:lineRule="exact"/>
             </w:pPr>
             <w:r/>
             <w:r>
               <w:rPr>
-                <w:rFonts w:ascii="Calibri" w:hAnsi="Calibri"/>
+                <w:rFonts w:ascii="Georgia" w:hAnsi="Georgia"/>
                 <w:b w:val="0"/>
                 <w:i w:val="0"/>
+                <w:color w:val="2D2D2D"/>
                 <w:sz w:val="20"/>
               </w:rPr>
               <w:t>Miramar MC Air Station — landfill methane and 21-day islanding</w:t>
@@ -3386,17 +3512,19 @@
         <w:tc>
           <w:tcPr>
             <w:tcW w:type="dxa" w:w="2880"/>
+            <w:shd w:val="clear" w:color="auto" w:fill="FDFBF8"/>
           </w:tcPr>
           <w:p>
             <w:pPr>
-              <w:spacing w:after="40" w:before="40"/>
+              <w:spacing w:after="60" w:before="60" w:line="260" w:lineRule="exact"/>
             </w:pPr>
             <w:r/>
             <w:r>
               <w:rPr>
-                <w:rFonts w:ascii="Calibri" w:hAnsi="Calibri"/>
+                <w:rFonts w:ascii="Georgia" w:hAnsi="Georgia"/>
                 <w:b w:val="0"/>
                 <w:i w:val="0"/>
+                <w:color w:val="2D2D2D"/>
                 <w:sz w:val="20"/>
               </w:rPr>
               <w:t>APTIM memo confirms only 'microgrid and energy resilience investments' at Miramar. The 21-day islanding figure and landfill methane fuel source are not cited to a primary source in any MIRR document reviewed. Cannot be presented as a confirmed parallel without verification.</w:t>
@@ -3406,17 +3534,19 @@
         <w:tc>
           <w:tcPr>
             <w:tcW w:type="dxa" w:w="2880"/>
+            <w:shd w:val="clear" w:color="auto" w:fill="FDFBF8"/>
           </w:tcPr>
           <w:p>
             <w:pPr>
-              <w:spacing w:after="40" w:before="40"/>
+              <w:spacing w:after="60" w:before="60" w:line="260" w:lineRule="exact"/>
             </w:pPr>
             <w:r/>
             <w:r>
               <w:rPr>
-                <w:rFonts w:ascii="Calibri" w:hAnsi="Calibri"/>
+                <w:rFonts w:ascii="Georgia" w:hAnsi="Georgia"/>
                 <w:b w:val="0"/>
                 <w:i w:val="0"/>
+                <w:color w:val="2D2D2D"/>
                 <w:sz w:val="20"/>
               </w:rPr>
               <w:t>Find the DOE 2022 report cited in the APTIM memo regarding Miramar. Confirm the 21-day figure, the energy sources, and the installed capacity. GIS: map Jacksonville-area landfill locations relative to NAS JAX and Blount Island to assess whether a parallel opportunity could exist geographically.</w:t>
@@ -3428,18 +3558,19 @@
         <w:tc>
           <w:tcPr>
             <w:tcW w:type="dxa" w:w="2880"/>
-            <w:shd w:val="clear" w:color="auto" w:fill="DEEAF1"/>
+            <w:shd w:val="clear" w:color="auto" w:fill="EAF0E8"/>
           </w:tcPr>
           <w:p>
             <w:pPr>
-              <w:spacing w:after="40" w:before="40"/>
+              <w:spacing w:after="60" w:before="60" w:line="260" w:lineRule="exact"/>
             </w:pPr>
             <w:r/>
             <w:r>
               <w:rPr>
-                <w:rFonts w:ascii="Calibri" w:hAnsi="Calibri"/>
+                <w:rFonts w:ascii="Georgia" w:hAnsi="Georgia"/>
                 <w:b w:val="0"/>
                 <w:i w:val="0"/>
+                <w:color w:val="2D2D2D"/>
                 <w:sz w:val="20"/>
               </w:rPr>
               <w:t>JEA upstream transmission routing</w:t>
@@ -3449,18 +3580,19 @@
         <w:tc>
           <w:tcPr>
             <w:tcW w:type="dxa" w:w="2880"/>
-            <w:shd w:val="clear" w:color="auto" w:fill="DEEAF1"/>
+            <w:shd w:val="clear" w:color="auto" w:fill="EAF0E8"/>
           </w:tcPr>
           <w:p>
             <w:pPr>
-              <w:spacing w:after="40" w:before="40"/>
+              <w:spacing w:after="60" w:before="60" w:line="260" w:lineRule="exact"/>
             </w:pPr>
             <w:r/>
             <w:r>
               <w:rPr>
-                <w:rFonts w:ascii="Calibri" w:hAnsi="Calibri"/>
+                <w:rFonts w:ascii="Georgia" w:hAnsi="Georgia"/>
                 <w:b w:val="0"/>
                 <w:i w:val="0"/>
+                <w:color w:val="2D2D2D"/>
                 <w:sz w:val="20"/>
               </w:rPr>
               <w:t>Confirmed data gap in MIRR project materials. JEA has not shared infrastructure data with the MIRR team as of September 2025 TAC. Upstream topology directly determines how many nodes can fail before each installation loses power — cannot be analyzed without this data.</w:t>
@@ -3470,18 +3602,19 @@
         <w:tc>
           <w:tcPr>
             <w:tcW w:type="dxa" w:w="2880"/>
-            <w:shd w:val="clear" w:color="auto" w:fill="DEEAF1"/>
+            <w:shd w:val="clear" w:color="auto" w:fill="EAF0E8"/>
           </w:tcPr>
           <w:p>
             <w:pPr>
-              <w:spacing w:after="40" w:before="40"/>
+              <w:spacing w:after="60" w:before="60" w:line="260" w:lineRule="exact"/>
             </w:pPr>
             <w:r/>
             <w:r>
               <w:rPr>
-                <w:rFonts w:ascii="Calibri" w:hAnsi="Calibri"/>
+                <w:rFonts w:ascii="Georgia" w:hAnsi="Georgia"/>
                 <w:b w:val="0"/>
                 <w:i w:val="0"/>
+                <w:color w:val="2D2D2D"/>
                 <w:sz w:val="20"/>
               </w:rPr>
               <w:t>EIA Form 860 and HIFLD as interim proxy for GIS phase. JEA coordination under expanded IGSA as the path to actual routing data. Florida PSC storm hardening annual filings may include planned transmission investments relevant to these corridors.</w:t>
@@ -3493,17 +3626,19 @@
         <w:tc>
           <w:tcPr>
             <w:tcW w:type="dxa" w:w="2880"/>
+            <w:shd w:val="clear" w:color="auto" w:fill="FDFBF8"/>
           </w:tcPr>
           <w:p>
             <w:pPr>
-              <w:spacing w:after="40" w:before="40"/>
+              <w:spacing w:after="60" w:before="60" w:line="260" w:lineRule="exact"/>
             </w:pPr>
             <w:r/>
             <w:r>
               <w:rPr>
-                <w:rFonts w:ascii="Calibri" w:hAnsi="Calibri"/>
+                <w:rFonts w:ascii="Georgia" w:hAnsi="Georgia"/>
                 <w:b w:val="0"/>
                 <w:i w:val="0"/>
+                <w:color w:val="2D2D2D"/>
                 <w:sz w:val="20"/>
               </w:rPr>
               <w:t>Installation-level outage history</w:t>
@@ -3513,17 +3648,19 @@
         <w:tc>
           <w:tcPr>
             <w:tcW w:type="dxa" w:w="2880"/>
+            <w:shd w:val="clear" w:color="auto" w:fill="FDFBF8"/>
           </w:tcPr>
           <w:p>
             <w:pPr>
-              <w:spacing w:after="40" w:before="40"/>
+              <w:spacing w:after="60" w:before="60" w:line="260" w:lineRule="exact"/>
             </w:pPr>
             <w:r/>
             <w:r>
               <w:rPr>
-                <w:rFonts w:ascii="Calibri" w:hAnsi="Calibri"/>
+                <w:rFonts w:ascii="Georgia" w:hAnsi="Georgia"/>
                 <w:b w:val="0"/>
                 <w:i w:val="0"/>
+                <w:color w:val="2D2D2D"/>
                 <w:sz w:val="20"/>
               </w:rPr>
               <w:t>Regional outage data from Matthew (2016) and Irma (2017) is publicly available in aggregate through Florida PSC and NHC reports. Installation-specific outage duration — how long each base was actually without commercial power and how long it ran on backup — is not in the public record and is not in current MIRR project documents.</w:t>
@@ -3533,17 +3670,19 @@
         <w:tc>
           <w:tcPr>
             <w:tcW w:type="dxa" w:w="2880"/>
+            <w:shd w:val="clear" w:color="auto" w:fill="FDFBF8"/>
           </w:tcPr>
           <w:p>
             <w:pPr>
-              <w:spacing w:after="40" w:before="40"/>
+              <w:spacing w:after="60" w:before="60" w:line="260" w:lineRule="exact"/>
             </w:pPr>
             <w:r/>
             <w:r>
               <w:rPr>
-                <w:rFonts w:ascii="Calibri" w:hAnsi="Calibri"/>
+                <w:rFonts w:ascii="Georgia" w:hAnsi="Georgia"/>
                 <w:b w:val="0"/>
                 <w:i w:val="0"/>
+                <w:color w:val="2D2D2D"/>
                 <w:sz w:val="20"/>
               </w:rPr>
               <w:t>Florida PSC JEA storm filings for Matthew and Irma. EIA Form 417 post-event disturbance reports for Duval and Clay Counties. NAVFAC coordination required for installation-level data — not publicly available.</w:t>
@@ -3555,18 +3694,19 @@
         <w:tc>
           <w:tcPr>
             <w:tcW w:type="dxa" w:w="2880"/>
-            <w:shd w:val="clear" w:color="auto" w:fill="DEEAF1"/>
+            <w:shd w:val="clear" w:color="auto" w:fill="EAF0E8"/>
           </w:tcPr>
           <w:p>
             <w:pPr>
-              <w:spacing w:after="40" w:before="40"/>
+              <w:spacing w:after="60" w:before="60" w:line="260" w:lineRule="exact"/>
             </w:pPr>
             <w:r/>
             <w:r>
               <w:rPr>
-                <w:rFonts w:ascii="Calibri" w:hAnsi="Calibri"/>
+                <w:rFonts w:ascii="Georgia" w:hAnsi="Georgia"/>
                 <w:b w:val="0"/>
                 <w:i w:val="0"/>
+                <w:color w:val="2D2D2D"/>
                 <w:sz w:val="20"/>
               </w:rPr>
               <w:t>Solar PV + Battery Storage at Camp Blanding</w:t>
@@ -3576,18 +3716,19 @@
         <w:tc>
           <w:tcPr>
             <w:tcW w:type="dxa" w:w="2880"/>
-            <w:shd w:val="clear" w:color="auto" w:fill="DEEAF1"/>
+            <w:shd w:val="clear" w:color="auto" w:fill="EAF0E8"/>
           </w:tcPr>
           <w:p>
             <w:pPr>
-              <w:spacing w:after="40" w:before="40"/>
+              <w:spacing w:after="60" w:before="60" w:line="260" w:lineRule="exact"/>
             </w:pPr>
             <w:r/>
             <w:r>
               <w:rPr>
-                <w:rFonts w:ascii="Calibri" w:hAnsi="Calibri"/>
+                <w:rFonts w:ascii="Georgia" w:hAnsi="Georgia"/>
                 <w:b w:val="0"/>
                 <w:i w:val="0"/>
+                <w:color w:val="2D2D2D"/>
                 <w:sz w:val="20"/>
               </w:rPr>
               <w:t>Costs for utility-scale solar and battery storage have declined substantially. Camp Blanding has 73,000 acres and rural land availability. Enhanced Use Lease (EUL) authority exists for DoD installations. No Blanding-specific feasibility study has been found in MIRR project documents or public DoD energy program databases.</w:t>
@@ -3597,18 +3738,19 @@
         <w:tc>
           <w:tcPr>
             <w:tcW w:type="dxa" w:w="2880"/>
-            <w:shd w:val="clear" w:color="auto" w:fill="DEEAF1"/>
+            <w:shd w:val="clear" w:color="auto" w:fill="EAF0E8"/>
           </w:tcPr>
           <w:p>
             <w:pPr>
-              <w:spacing w:after="40" w:before="40"/>
+              <w:spacing w:after="60" w:before="60" w:line="260" w:lineRule="exact"/>
             </w:pPr>
             <w:r/>
             <w:r>
               <w:rPr>
-                <w:rFonts w:ascii="Calibri" w:hAnsi="Calibri"/>
+                <w:rFonts w:ascii="Georgia" w:hAnsi="Georgia"/>
                 <w:b w:val="0"/>
                 <w:i w:val="0"/>
+                <w:color w:val="2D2D2D"/>
                 <w:sz w:val="20"/>
               </w:rPr>
               <w:t>Search ESTCP and ESPC program databases for any prior studies scoped to Camp Blanding. Obtain load profile data for Blanding from NAVFAC or Army energy program contacts. Confirm EUL process, timeline, and applicable authority for National Guard installations.</w:t>
@@ -3624,25 +3766,25 @@
     </w:p>
     <w:p>
       <w:pPr>
-        <w:spacing w:after="80" w:before="40"/>
+        <w:spacing w:after="80" w:before="60"/>
         <w:ind w:left="288"/>
       </w:pPr>
       <w:r>
         <w:rPr>
-          <w:rFonts w:ascii="Calibri" w:hAnsi="Calibri"/>
+          <w:rFonts w:ascii="Georgia" w:hAnsi="Georgia"/>
           <w:b/>
           <w:i w:val="0"/>
-          <w:color w:val="9C0006"/>
+          <w:color w:val="8C1E1E"/>
           <w:sz w:val="19"/>
         </w:rPr>
         <w:t xml:space="preserve">○ Needs verification  </w:t>
       </w:r>
       <w:r>
         <w:rPr>
-          <w:rFonts w:ascii="Calibri" w:hAnsi="Calibri"/>
+          <w:rFonts w:ascii="Georgia" w:hAnsi="Georgia"/>
           <w:b w:val="0"/>
           <w:i/>
-          <w:color w:val="595959"/>
+          <w:color w:val="645F5A"/>
           <w:sz w:val="19"/>
         </w:rPr>
         <w:t>None of the above items should appear in any client-facing document until the verification steps listed are completed.</w:t>
@@ -3650,35 +3792,37 @@
     </w:p>
     <w:p>
       <w:pPr>
-        <w:spacing w:before="280" w:after="120"/>
-        <w:ind w:left="-72"/>
-        <w:shd w:val="clear" w:color="auto" w:fill="BDD7EE"/>
+        <w:spacing w:before="320" w:after="120"/>
+        <w:shd w:val="clear" w:color="auto" w:fill="F5F0E8"/>
+        <w:pBdr>
+          <w:bottom w:val="single" w:sz="4" w:space="1" w:color="2D5A37"/>
+        </w:pBdr>
       </w:pPr>
       <w:r>
         <w:rPr>
-          <w:rFonts w:ascii="Calibri" w:hAnsi="Calibri"/>
+          <w:rFonts w:ascii="Georgia" w:hAnsi="Georgia"/>
           <w:b/>
           <w:i w:val="0"/>
-          <w:color w:val="1F6097"/>
-          <w:sz w:val="23"/>
+          <w:color w:val="2D5A37"/>
+          <w:sz w:val="24"/>
         </w:rPr>
         <w:t xml:space="preserve">  2.8  Sources</w:t>
       </w:r>
     </w:p>
     <w:p>
       <w:pPr>
-        <w:spacing w:before="200" w:after="60"/>
+        <w:spacing w:before="200" w:after="80"/>
         <w:pBdr>
-          <w:left w:val="single" w:sz="8" w:space="6" w:color="1F6096"/>
+          <w:left w:val="single" w:sz="10" w:space="6" w:color="2D5A37"/>
         </w:pBdr>
-        <w:ind w:left="173"/>
+        <w:ind w:left="202"/>
       </w:pPr>
       <w:r>
         <w:rPr>
-          <w:rFonts w:ascii="Calibri" w:hAnsi="Calibri"/>
+          <w:rFonts w:ascii="Georgia" w:hAnsi="Georgia"/>
           <w:b/>
           <w:i w:val="0"/>
-          <w:color w:val="44546A"/>
+          <w:color w:val="374632"/>
           <w:sz w:val="22"/>
         </w:rPr>
         <w:t xml:space="preserve"> Confirmed MIRR Project Documents (all reviewed for this analysis)</w:t>
@@ -3687,14 +3831,15 @@
     <w:p>
       <w:pPr>
         <w:pStyle w:val="ListBullet"/>
-        <w:spacing w:after="60" w:before="20"/>
-        <w:ind w:left="360"/>
+        <w:spacing w:after="80" w:before="40" w:line="280" w:lineRule="exact"/>
+        <w:ind w:left="432"/>
       </w:pPr>
       <w:r>
         <w:rPr>
-          <w:rFonts w:ascii="Calibri" w:hAnsi="Calibri"/>
+          <w:rFonts w:ascii="Georgia" w:hAnsi="Georgia"/>
           <w:b w:val="0"/>
           <w:i w:val="0"/>
+          <w:color w:val="2D2D2D"/>
           <w:sz w:val="22"/>
         </w:rPr>
         <w:t>NEFRC MIRR Vulnerability Assessment — January 2026 Steering Committee</w:t>
@@ -3703,14 +3848,15 @@
     <w:p>
       <w:pPr>
         <w:pStyle w:val="ListBullet"/>
-        <w:spacing w:after="60" w:before="20"/>
-        <w:ind w:left="360"/>
+        <w:spacing w:after="80" w:before="40" w:line="280" w:lineRule="exact"/>
+        <w:ind w:left="432"/>
       </w:pPr>
       <w:r>
         <w:rPr>
-          <w:rFonts w:ascii="Calibri" w:hAnsi="Calibri"/>
+          <w:rFonts w:ascii="Georgia" w:hAnsi="Georgia"/>
           <w:b w:val="0"/>
           <w:i w:val="0"/>
+          <w:color w:val="2D2D2D"/>
           <w:sz w:val="22"/>
         </w:rPr>
         <w:t>MIRR Mutual Support Assessment — February 2026 TAC</w:t>
@@ -3719,14 +3865,15 @@
     <w:p>
       <w:pPr>
         <w:pStyle w:val="ListBullet"/>
-        <w:spacing w:after="60" w:before="20"/>
-        <w:ind w:left="360"/>
+        <w:spacing w:after="80" w:before="40" w:line="280" w:lineRule="exact"/>
+        <w:ind w:left="432"/>
       </w:pPr>
       <w:r>
         <w:rPr>
-          <w:rFonts w:ascii="Calibri" w:hAnsi="Calibri"/>
+          <w:rFonts w:ascii="Georgia" w:hAnsi="Georgia"/>
           <w:b w:val="0"/>
           <w:i w:val="0"/>
+          <w:color w:val="2D2D2D"/>
           <w:sz w:val="22"/>
         </w:rPr>
         <w:t>MIRR Adaptation Planning Framework — April 2026 Steering Committee</w:t>
@@ -3735,14 +3882,15 @@
     <w:p>
       <w:pPr>
         <w:pStyle w:val="ListBullet"/>
-        <w:spacing w:after="60" w:before="20"/>
-        <w:ind w:left="360"/>
+        <w:spacing w:after="80" w:before="40" w:line="280" w:lineRule="exact"/>
+        <w:ind w:left="432"/>
       </w:pPr>
       <w:r>
         <w:rPr>
-          <w:rFonts w:ascii="Calibri" w:hAnsi="Calibri"/>
+          <w:rFonts w:ascii="Georgia" w:hAnsi="Georgia"/>
           <w:b w:val="0"/>
           <w:i w:val="0"/>
+          <w:color w:val="2D2D2D"/>
           <w:sz w:val="22"/>
         </w:rPr>
         <w:t>MCSF Blount Island Kickoff Briefing — April 2025</w:t>
@@ -3751,14 +3899,15 @@
     <w:p>
       <w:pPr>
         <w:pStyle w:val="ListBullet"/>
-        <w:spacing w:after="60" w:before="20"/>
-        <w:ind w:left="360"/>
+        <w:spacing w:after="80" w:before="40" w:line="280" w:lineRule="exact"/>
+        <w:ind w:left="432"/>
       </w:pPr>
       <w:r>
         <w:rPr>
-          <w:rFonts w:ascii="Calibri" w:hAnsi="Calibri"/>
+          <w:rFonts w:ascii="Georgia" w:hAnsi="Georgia"/>
           <w:b w:val="0"/>
           <w:i w:val="0"/>
+          <w:color w:val="2D2D2D"/>
           <w:sz w:val="22"/>
         </w:rPr>
         <w:t>NAS Jacksonville Site Visit Summary V3</w:t>
@@ -3767,14 +3916,15 @@
     <w:p>
       <w:pPr>
         <w:pStyle w:val="ListBullet"/>
-        <w:spacing w:after="60" w:before="20"/>
-        <w:ind w:left="360"/>
+        <w:spacing w:after="80" w:before="40" w:line="280" w:lineRule="exact"/>
+        <w:ind w:left="432"/>
       </w:pPr>
       <w:r>
         <w:rPr>
-          <w:rFonts w:ascii="Calibri" w:hAnsi="Calibri"/>
+          <w:rFonts w:ascii="Georgia" w:hAnsi="Georgia"/>
           <w:b w:val="0"/>
           <w:i w:val="0"/>
+          <w:color w:val="2D2D2D"/>
           <w:sz w:val="22"/>
         </w:rPr>
         <w:t>Camp Blanding Summary V2</w:t>
@@ -3783,14 +3933,15 @@
     <w:p>
       <w:pPr>
         <w:pStyle w:val="ListBullet"/>
-        <w:spacing w:after="60" w:before="20"/>
-        <w:ind w:left="360"/>
+        <w:spacing w:after="80" w:before="40" w:line="280" w:lineRule="exact"/>
+        <w:ind w:left="432"/>
       </w:pPr>
       <w:r>
         <w:rPr>
-          <w:rFonts w:ascii="Calibri" w:hAnsi="Calibri"/>
+          <w:rFonts w:ascii="Georgia" w:hAnsi="Georgia"/>
           <w:b w:val="0"/>
           <w:i w:val="0"/>
+          <w:color w:val="2D2D2D"/>
           <w:sz w:val="22"/>
         </w:rPr>
         <w:t>NEFRC MIRR Stakeholder Workshop 1 Summary V2</w:t>
@@ -3799,14 +3950,15 @@
     <w:p>
       <w:pPr>
         <w:pStyle w:val="ListBullet"/>
-        <w:spacing w:after="60" w:before="20"/>
-        <w:ind w:left="360"/>
+        <w:spacing w:after="80" w:before="40" w:line="280" w:lineRule="exact"/>
+        <w:ind w:left="432"/>
       </w:pPr>
       <w:r>
         <w:rPr>
-          <w:rFonts w:ascii="Calibri" w:hAnsi="Calibri"/>
+          <w:rFonts w:ascii="Georgia" w:hAnsi="Georgia"/>
           <w:b w:val="0"/>
           <w:i w:val="0"/>
+          <w:color w:val="2D2D2D"/>
           <w:sz w:val="22"/>
         </w:rPr>
         <w:t>NS Mayport Stakeholder Summary</w:t>
@@ -3815,14 +3967,15 @@
     <w:p>
       <w:pPr>
         <w:pStyle w:val="ListBullet"/>
-        <w:spacing w:after="60" w:before="20"/>
-        <w:ind w:left="360"/>
+        <w:spacing w:after="80" w:before="40" w:line="280" w:lineRule="exact"/>
+        <w:ind w:left="432"/>
       </w:pPr>
       <w:r>
         <w:rPr>
-          <w:rFonts w:ascii="Calibri" w:hAnsi="Calibri"/>
+          <w:rFonts w:ascii="Georgia" w:hAnsi="Georgia"/>
           <w:b w:val="0"/>
           <w:i w:val="0"/>
+          <w:color w:val="2D2D2D"/>
           <w:sz w:val="22"/>
         </w:rPr>
         <w:t>APTIM Memo: NE MIRR Evaluating Potential Adaptation Solutions — May 22, 2026</w:t>
@@ -3831,14 +3984,15 @@
     <w:p>
       <w:pPr>
         <w:pStyle w:val="ListBullet"/>
-        <w:spacing w:after="60" w:before="20"/>
-        <w:ind w:left="360"/>
+        <w:spacing w:after="80" w:before="40" w:line="280" w:lineRule="exact"/>
+        <w:ind w:left="432"/>
       </w:pPr>
       <w:r>
         <w:rPr>
-          <w:rFonts w:ascii="Calibri" w:hAnsi="Calibri"/>
+          <w:rFonts w:ascii="Georgia" w:hAnsi="Georgia"/>
           <w:b w:val="0"/>
           <w:i w:val="0"/>
+          <w:color w:val="2D2D2D"/>
           <w:sz w:val="22"/>
         </w:rPr>
         <w:t>NEFRC MIRR TAC November 2025 Vulnerability Assessment Presentation</w:t>
@@ -3846,18 +4000,18 @@
     </w:p>
     <w:p>
       <w:pPr>
-        <w:spacing w:before="200" w:after="60"/>
+        <w:spacing w:before="200" w:after="80"/>
         <w:pBdr>
-          <w:left w:val="single" w:sz="8" w:space="6" w:color="1F6096"/>
+          <w:left w:val="single" w:sz="10" w:space="6" w:color="2D5A37"/>
         </w:pBdr>
-        <w:ind w:left="173"/>
+        <w:ind w:left="202"/>
       </w:pPr>
       <w:r>
         <w:rPr>
-          <w:rFonts w:ascii="Calibri" w:hAnsi="Calibri"/>
+          <w:rFonts w:ascii="Georgia" w:hAnsi="Georgia"/>
           <w:b/>
           <w:i w:val="0"/>
-          <w:color w:val="44546A"/>
+          <w:color w:val="374632"/>
           <w:sz w:val="22"/>
         </w:rPr>
         <w:t xml:space="preserve"> To Obtain — Historical Events (before formal use)</w:t>
@@ -3866,14 +4020,15 @@
     <w:p>
       <w:pPr>
         <w:pStyle w:val="ListBullet"/>
-        <w:spacing w:after="60" w:before="20"/>
-        <w:ind w:left="360"/>
+        <w:spacing w:after="80" w:before="40" w:line="280" w:lineRule="exact"/>
+        <w:ind w:left="432"/>
       </w:pPr>
       <w:r>
         <w:rPr>
-          <w:rFonts w:ascii="Calibri" w:hAnsi="Calibri"/>
+          <w:rFonts w:ascii="Georgia" w:hAnsi="Georgia"/>
           <w:b w:val="0"/>
           <w:i w:val="0"/>
+          <w:color w:val="2D2D2D"/>
           <w:sz w:val="22"/>
         </w:rPr>
         <w:t>NOAA NHC Post-Storm Report AL142016 (Hurricane Matthew, 2016)</w:t>
@@ -3882,14 +4037,15 @@
     <w:p>
       <w:pPr>
         <w:pStyle w:val="ListBullet"/>
-        <w:spacing w:after="60" w:before="20"/>
-        <w:ind w:left="360"/>
+        <w:spacing w:after="80" w:before="40" w:line="280" w:lineRule="exact"/>
+        <w:ind w:left="432"/>
       </w:pPr>
       <w:r>
         <w:rPr>
-          <w:rFonts w:ascii="Calibri" w:hAnsi="Calibri"/>
+          <w:rFonts w:ascii="Georgia" w:hAnsi="Georgia"/>
           <w:b w:val="0"/>
           <w:i w:val="0"/>
+          <w:color w:val="2D2D2D"/>
           <w:sz w:val="22"/>
         </w:rPr>
         <w:t>NOAA NHC Post-Storm Report AL112017 (Hurricane Irma, 2017)</w:t>
@@ -3898,14 +4054,15 @@
     <w:p>
       <w:pPr>
         <w:pStyle w:val="ListBullet"/>
-        <w:spacing w:after="60" w:before="20"/>
-        <w:ind w:left="360"/>
+        <w:spacing w:after="80" w:before="40" w:line="280" w:lineRule="exact"/>
+        <w:ind w:left="432"/>
       </w:pPr>
       <w:r>
         <w:rPr>
-          <w:rFonts w:ascii="Calibri" w:hAnsi="Calibri"/>
+          <w:rFonts w:ascii="Georgia" w:hAnsi="Georgia"/>
           <w:b w:val="0"/>
           <w:i w:val="0"/>
+          <w:color w:val="2D2D2D"/>
           <w:sz w:val="22"/>
         </w:rPr>
         <w:t>NOAA Storm Events Database — Duval and Clay Counties, 2015–present</w:t>
@@ -3914,14 +4071,15 @@
     <w:p>
       <w:pPr>
         <w:pStyle w:val="ListBullet"/>
-        <w:spacing w:after="60" w:before="20"/>
-        <w:ind w:left="360"/>
+        <w:spacing w:after="80" w:before="40" w:line="280" w:lineRule="exact"/>
+        <w:ind w:left="432"/>
       </w:pPr>
       <w:r>
         <w:rPr>
-          <w:rFonts w:ascii="Calibri" w:hAnsi="Calibri"/>
+          <w:rFonts w:ascii="Georgia" w:hAnsi="Georgia"/>
           <w:b w:val="0"/>
           <w:i w:val="0"/>
+          <w:color w:val="2D2D2D"/>
           <w:sz w:val="22"/>
         </w:rPr>
         <w:t>Florida PSC Storm Protection Plan Annual Filings — JEA and FPL</w:t>
@@ -3930,14 +4088,15 @@
     <w:p>
       <w:pPr>
         <w:pStyle w:val="ListBullet"/>
-        <w:spacing w:after="60" w:before="20"/>
-        <w:ind w:left="360"/>
+        <w:spacing w:after="80" w:before="40" w:line="280" w:lineRule="exact"/>
+        <w:ind w:left="432"/>
       </w:pPr>
       <w:r>
         <w:rPr>
-          <w:rFonts w:ascii="Calibri" w:hAnsi="Calibri"/>
+          <w:rFonts w:ascii="Georgia" w:hAnsi="Georgia"/>
           <w:b w:val="0"/>
           <w:i w:val="0"/>
+          <w:color w:val="2D2D2D"/>
           <w:sz w:val="22"/>
         </w:rPr>
         <w:t>FEMA Disaster Declarations — DR-4283 (Matthew), DR-4337 (Irma)</w:t>
@@ -3946,14 +4105,15 @@
     <w:p>
       <w:pPr>
         <w:pStyle w:val="ListBullet"/>
-        <w:spacing w:after="60" w:before="20"/>
-        <w:ind w:left="360"/>
+        <w:spacing w:after="80" w:before="40" w:line="280" w:lineRule="exact"/>
+        <w:ind w:left="432"/>
       </w:pPr>
       <w:r>
         <w:rPr>
-          <w:rFonts w:ascii="Calibri" w:hAnsi="Calibri"/>
+          <w:rFonts w:ascii="Georgia" w:hAnsi="Georgia"/>
           <w:b w:val="0"/>
           <w:i w:val="0"/>
+          <w:color w:val="2D2D2D"/>
           <w:sz w:val="22"/>
         </w:rPr>
         <w:t>EIA Form 417 Post-Event Disturbance Reports — Duval and Clay Counties</w:t>
@@ -3961,18 +4121,18 @@
     </w:p>
     <w:p>
       <w:pPr>
-        <w:spacing w:before="200" w:after="60"/>
+        <w:spacing w:before="200" w:after="80"/>
         <w:pBdr>
-          <w:left w:val="single" w:sz="8" w:space="6" w:color="1F6096"/>
+          <w:left w:val="single" w:sz="10" w:space="6" w:color="2D5A37"/>
         </w:pBdr>
-        <w:ind w:left="173"/>
+        <w:ind w:left="202"/>
       </w:pPr>
       <w:r>
         <w:rPr>
-          <w:rFonts w:ascii="Calibri" w:hAnsi="Calibri"/>
+          <w:rFonts w:ascii="Georgia" w:hAnsi="Georgia"/>
           <w:b/>
           <w:i w:val="0"/>
-          <w:color w:val="44546A"/>
+          <w:color w:val="374632"/>
           <w:sz w:val="22"/>
         </w:rPr>
         <w:t xml:space="preserve"> GIS Datasets — Planned Tier 1 (public access, available now)</w:t>
@@ -3981,14 +4141,15 @@
     <w:p>
       <w:pPr>
         <w:pStyle w:val="ListBullet"/>
-        <w:spacing w:after="60" w:before="20"/>
-        <w:ind w:left="360"/>
+        <w:spacing w:after="80" w:before="40" w:line="280" w:lineRule="exact"/>
+        <w:ind w:left="432"/>
       </w:pPr>
       <w:r>
         <w:rPr>
-          <w:rFonts w:ascii="Calibri" w:hAnsi="Calibri"/>
+          <w:rFonts w:ascii="Georgia" w:hAnsi="Georgia"/>
           <w:b w:val="0"/>
           <w:i w:val="0"/>
+          <w:color w:val="2D2D2D"/>
           <w:sz w:val="22"/>
         </w:rPr>
         <w:t>HIFLD Open Data — military installation boundaries, transmission lines, substations</w:t>
@@ -3997,14 +4158,15 @@
     <w:p>
       <w:pPr>
         <w:pStyle w:val="ListBullet"/>
-        <w:spacing w:after="60" w:before="20"/>
-        <w:ind w:left="360"/>
+        <w:spacing w:after="80" w:before="40" w:line="280" w:lineRule="exact"/>
+        <w:ind w:left="432"/>
       </w:pPr>
       <w:r>
         <w:rPr>
-          <w:rFonts w:ascii="Calibri" w:hAnsi="Calibri"/>
+          <w:rFonts w:ascii="Georgia" w:hAnsi="Georgia"/>
           <w:b w:val="0"/>
           <w:i w:val="0"/>
+          <w:color w:val="2D2D2D"/>
           <w:sz w:val="22"/>
         </w:rPr>
         <w:t>EIA Form 860 — substation and generation facility locations</w:t>
@@ -4013,14 +4175,15 @@
     <w:p>
       <w:pPr>
         <w:pStyle w:val="ListBullet"/>
-        <w:spacing w:after="60" w:before="20"/>
-        <w:ind w:left="360"/>
+        <w:spacing w:after="80" w:before="40" w:line="280" w:lineRule="exact"/>
+        <w:ind w:left="432"/>
       </w:pPr>
       <w:r>
         <w:rPr>
-          <w:rFonts w:ascii="Calibri" w:hAnsi="Calibri"/>
+          <w:rFonts w:ascii="Georgia" w:hAnsi="Georgia"/>
           <w:b w:val="0"/>
           <w:i w:val="0"/>
+          <w:color w:val="2D2D2D"/>
           <w:sz w:val="22"/>
         </w:rPr>
         <w:t>NOAA Digital Coast — SLOSH surge modeling, SLR projections</w:t>
@@ -4029,14 +4192,15 @@
     <w:p>
       <w:pPr>
         <w:pStyle w:val="ListBullet"/>
-        <w:spacing w:after="60" w:before="20"/>
-        <w:ind w:left="360"/>
+        <w:spacing w:after="80" w:before="40" w:line="280" w:lineRule="exact"/>
+        <w:ind w:left="432"/>
       </w:pPr>
       <w:r>
         <w:rPr>
-          <w:rFonts w:ascii="Calibri" w:hAnsi="Calibri"/>
+          <w:rFonts w:ascii="Georgia" w:hAnsi="Georgia"/>
           <w:b w:val="0"/>
           <w:i w:val="0"/>
+          <w:color w:val="2D2D2D"/>
           <w:sz w:val="22"/>
         </w:rPr>
         <w:t>FEMA Flood Map Service Center — NFHL (effective and preliminary versions)</w:t>
@@ -4045,14 +4209,15 @@
     <w:p>
       <w:pPr>
         <w:pStyle w:val="ListBullet"/>
-        <w:spacing w:after="60" w:before="20"/>
-        <w:ind w:left="360"/>
+        <w:spacing w:after="80" w:before="40" w:line="280" w:lineRule="exact"/>
+        <w:ind w:left="432"/>
       </w:pPr>
       <w:r>
         <w:rPr>
-          <w:rFonts w:ascii="Calibri" w:hAnsi="Calibri"/>
+          <w:rFonts w:ascii="Georgia" w:hAnsi="Georgia"/>
           <w:b w:val="0"/>
           <w:i w:val="0"/>
+          <w:color w:val="2D2D2D"/>
           <w:sz w:val="22"/>
         </w:rPr>
         <w:t>FDOT GIS Open Data — Florida road network</w:t>
@@ -4061,14 +4226,15 @@
     <w:p>
       <w:pPr>
         <w:pStyle w:val="ListBullet"/>
-        <w:spacing w:after="60" w:before="20"/>
-        <w:ind w:left="360"/>
+        <w:spacing w:after="80" w:before="40" w:line="280" w:lineRule="exact"/>
+        <w:ind w:left="432"/>
       </w:pPr>
       <w:r>
         <w:rPr>
-          <w:rFonts w:ascii="Calibri" w:hAnsi="Calibri"/>
+          <w:rFonts w:ascii="Georgia" w:hAnsi="Georgia"/>
           <w:b w:val="0"/>
           <w:i w:val="0"/>
+          <w:color w:val="2D2D2D"/>
           <w:sz w:val="22"/>
         </w:rPr>
         <w:t>USDA Forest Service Wildfire Hazard Potential (Research Data Archive)</w:t>
@@ -4077,14 +4243,15 @@
     <w:p>
       <w:pPr>
         <w:pStyle w:val="ListBullet"/>
-        <w:spacing w:after="60" w:before="20"/>
-        <w:ind w:left="360"/>
+        <w:spacing w:after="80" w:before="40" w:line="280" w:lineRule="exact"/>
+        <w:ind w:left="432"/>
       </w:pPr>
       <w:r>
         <w:rPr>
-          <w:rFonts w:ascii="Calibri" w:hAnsi="Calibri"/>
+          <w:rFonts w:ascii="Georgia" w:hAnsi="Georgia"/>
           <w:b w:val="0"/>
           <w:i w:val="0"/>
+          <w:color w:val="2D2D2D"/>
           <w:sz w:val="22"/>
         </w:rPr>
         <w:t>USGS National Map / 3DEP — elevation data</w:t>
@@ -4093,14 +4260,15 @@
     <w:p>
       <w:pPr>
         <w:pStyle w:val="ListBullet"/>
-        <w:spacing w:after="60" w:before="20"/>
-        <w:ind w:left="360"/>
+        <w:spacing w:after="80" w:before="40" w:line="280" w:lineRule="exact"/>
+        <w:ind w:left="432"/>
       </w:pPr>
       <w:r>
         <w:rPr>
-          <w:rFonts w:ascii="Calibri" w:hAnsi="Calibri"/>
+          <w:rFonts w:ascii="Georgia" w:hAnsi="Georgia"/>
           <w:b w:val="0"/>
           <w:i w:val="0"/>
+          <w:color w:val="2D2D2D"/>
           <w:sz w:val="22"/>
         </w:rPr>
         <w:t>SJRWMD — groundwater and water resource data</w:t>
@@ -4109,14 +4277,15 @@
     <w:p>
       <w:pPr>
         <w:pStyle w:val="ListBullet"/>
-        <w:spacing w:after="60" w:before="20"/>
-        <w:ind w:left="360"/>
+        <w:spacing w:after="80" w:before="40" w:line="280" w:lineRule="exact"/>
+        <w:ind w:left="432"/>
       </w:pPr>
       <w:r>
         <w:rPr>
-          <w:rFonts w:ascii="Calibri" w:hAnsi="Calibri"/>
+          <w:rFonts w:ascii="Georgia" w:hAnsi="Georgia"/>
           <w:b w:val="0"/>
           <w:i w:val="0"/>
+          <w:color w:val="2D2D2D"/>
           <w:sz w:val="22"/>
         </w:rPr>
         <w:t>Resilient Jacksonville — NEFRC CDBG compound flood model</w:t>
@@ -4124,18 +4293,18 @@
     </w:p>
     <w:p>
       <w:pPr>
-        <w:spacing w:before="200" w:after="60"/>
+        <w:spacing w:before="200" w:after="80"/>
         <w:pBdr>
-          <w:left w:val="single" w:sz="8" w:space="6" w:color="1F6096"/>
+          <w:left w:val="single" w:sz="10" w:space="6" w:color="2D5A37"/>
         </w:pBdr>
-        <w:ind w:left="173"/>
+        <w:ind w:left="202"/>
       </w:pPr>
       <w:r>
         <w:rPr>
-          <w:rFonts w:ascii="Calibri" w:hAnsi="Calibri"/>
+          <w:rFonts w:ascii="Georgia" w:hAnsi="Georgia"/>
           <w:b/>
           <w:i w:val="0"/>
-          <w:color w:val="44546A"/>
+          <w:color w:val="374632"/>
           <w:sz w:val="22"/>
         </w:rPr>
         <w:t xml:space="preserve"> GIS Datasets — Planned Tier 2 (data agreement / coordination required)</w:t>
@@ -4144,14 +4313,15 @@
     <w:p>
       <w:pPr>
         <w:pStyle w:val="ListBullet"/>
-        <w:spacing w:after="60" w:before="20"/>
-        <w:ind w:left="360"/>
+        <w:spacing w:after="80" w:before="40" w:line="280" w:lineRule="exact"/>
+        <w:ind w:left="432"/>
       </w:pPr>
       <w:r>
         <w:rPr>
-          <w:rFonts w:ascii="Calibri" w:hAnsi="Calibri"/>
+          <w:rFonts w:ascii="Georgia" w:hAnsi="Georgia"/>
           <w:b w:val="0"/>
           <w:i w:val="0"/>
+          <w:color w:val="2D2D2D"/>
           <w:sz w:val="22"/>
         </w:rPr>
         <w:t>JEA transmission and substation routing data — follow-up meetings pending as of Sept 2025</w:t>
@@ -4160,14 +4330,15 @@
     <w:p>
       <w:pPr>
         <w:pStyle w:val="ListBullet"/>
-        <w:spacing w:after="60" w:before="20"/>
-        <w:ind w:left="360"/>
+        <w:spacing w:after="80" w:before="40" w:line="280" w:lineRule="exact"/>
+        <w:ind w:left="432"/>
       </w:pPr>
       <w:r>
         <w:rPr>
-          <w:rFonts w:ascii="Calibri" w:hAnsi="Calibri"/>
+          <w:rFonts w:ascii="Georgia" w:hAnsi="Georgia"/>
           <w:b w:val="0"/>
           <w:i w:val="0"/>
+          <w:color w:val="2D2D2D"/>
           <w:sz w:val="22"/>
         </w:rPr>
         <w:t>NAVFAC / installation energy operations data — data request submitted, unresolved</w:t>
@@ -4176,14 +4347,15 @@
     <w:p>
       <w:pPr>
         <w:pStyle w:val="ListBullet"/>
-        <w:spacing w:after="60" w:before="20"/>
-        <w:ind w:left="360"/>
+        <w:spacing w:after="80" w:before="40" w:line="280" w:lineRule="exact"/>
+        <w:ind w:left="432"/>
       </w:pPr>
       <w:r>
         <w:rPr>
-          <w:rFonts w:ascii="Calibri" w:hAnsi="Calibri"/>
+          <w:rFonts w:ascii="Georgia" w:hAnsi="Georgia"/>
           <w:b w:val="0"/>
           <w:i w:val="0"/>
+          <w:color w:val="2D2D2D"/>
           <w:sz w:val="22"/>
         </w:rPr>
         <w:t>USACE Jacksonville District — detailed coastal damage models</w:t>
@@ -4192,14 +4364,15 @@
     <w:p>
       <w:pPr>
         <w:pStyle w:val="ListBullet"/>
-        <w:spacing w:after="60" w:before="20"/>
-        <w:ind w:left="360"/>
+        <w:spacing w:after="80" w:before="40" w:line="280" w:lineRule="exact"/>
+        <w:ind w:left="432"/>
       </w:pPr>
       <w:r>
         <w:rPr>
-          <w:rFonts w:ascii="Calibri" w:hAnsi="Calibri"/>
+          <w:rFonts w:ascii="Georgia" w:hAnsi="Georgia"/>
           <w:b w:val="0"/>
           <w:i w:val="0"/>
+          <w:color w:val="2D2D2D"/>
           <w:sz w:val="22"/>
         </w:rPr>
         <w:t>Clay County Utility Authority (CCUA) — utility infrastructure data</w:t>
@@ -4208,14 +4381,15 @@
     <w:p>
       <w:pPr>
         <w:pStyle w:val="ListBullet"/>
-        <w:spacing w:after="60" w:before="20"/>
-        <w:ind w:left="360"/>
+        <w:spacing w:after="80" w:before="40" w:line="280" w:lineRule="exact"/>
+        <w:ind w:left="432"/>
       </w:pPr>
       <w:r>
         <w:rPr>
-          <w:rFonts w:ascii="Calibri" w:hAnsi="Calibri"/>
+          <w:rFonts w:ascii="Georgia" w:hAnsi="Georgia"/>
           <w:b w:val="0"/>
           <w:i w:val="0"/>
+          <w:color w:val="2D2D2D"/>
           <w:sz w:val="22"/>
         </w:rPr>
         <w:t>Florida PSC utility storm hardening filings — JEA and FPL annual filings</w:t>

</xml_diff>